<commit_message>
Add final MSc BDS project report and updates
</commit_message>
<xml_diff>
--- a/report/AI-Driven Retail Demand Forecasting and Intelligent Inventory Decision Support for Food Waste Reduction.docx
+++ b/report/AI-Driven Retail Demand Forecasting and Intelligent Inventory Decision Support for Food Waste Reduction.docx
@@ -312,7 +312,6 @@
     </w:p>
     <w:p>
       <w:pPr>
-        <w:jc w:val="both"/>
         <w:rPr>
           <w:rFonts w:ascii="Times New Roman" w:eastAsia="Times New Roman" w:hAnsi="Times New Roman" w:cs="Times New Roman"/>
           <w:b/>
@@ -340,770 +339,864 @@
           <w:szCs w:val="24"/>
         </w:rPr>
       </w:pPr>
-    </w:p>
-    <w:p>
-      <w:pPr>
-        <w:jc w:val="both"/>
-        <w:rPr>
-          <w:rFonts w:ascii="Times New Roman" w:eastAsia="Times New Roman" w:hAnsi="Times New Roman" w:cs="Times New Roman"/>
-          <w:sz w:val="24"/>
-          <w:szCs w:val="24"/>
-        </w:rPr>
-      </w:pPr>
-      <w:r>
-        <w:rPr>
-          <w:rFonts w:ascii="Times New Roman" w:eastAsia="Times New Roman" w:hAnsi="Times New Roman" w:cs="Times New Roman"/>
-          <w:sz w:val="24"/>
-          <w:szCs w:val="24"/>
-        </w:rPr>
-        <w:t>Abstract ................................................................. 5</w:t>
-      </w:r>
-    </w:p>
-    <w:p>
-      <w:pPr>
-        <w:jc w:val="both"/>
-        <w:rPr>
-          <w:rFonts w:ascii="Times New Roman" w:eastAsia="Times New Roman" w:hAnsi="Times New Roman" w:cs="Times New Roman"/>
-          <w:sz w:val="24"/>
-          <w:szCs w:val="24"/>
-        </w:rPr>
-      </w:pPr>
-    </w:p>
-    <w:p>
-      <w:pPr>
-        <w:jc w:val="both"/>
-        <w:rPr>
-          <w:rFonts w:ascii="Times New Roman" w:eastAsia="Times New Roman" w:hAnsi="Times New Roman" w:cs="Times New Roman"/>
-          <w:sz w:val="24"/>
-          <w:szCs w:val="24"/>
-        </w:rPr>
-      </w:pPr>
-      <w:r>
-        <w:rPr>
-          <w:rFonts w:ascii="Times New Roman" w:eastAsia="Times New Roman" w:hAnsi="Times New Roman" w:cs="Times New Roman"/>
-          <w:sz w:val="24"/>
-          <w:szCs w:val="24"/>
-        </w:rPr>
-        <w:t>Chapter 1: Introduction ................................................... 6</w:t>
-      </w:r>
-    </w:p>
-    <w:p>
-      <w:pPr>
-        <w:jc w:val="both"/>
-        <w:rPr>
-          <w:rFonts w:ascii="Times New Roman" w:eastAsia="Times New Roman" w:hAnsi="Times New Roman" w:cs="Times New Roman"/>
-          <w:sz w:val="24"/>
-          <w:szCs w:val="24"/>
-        </w:rPr>
-      </w:pPr>
-      <w:r>
-        <w:rPr>
-          <w:rFonts w:ascii="Times New Roman" w:eastAsia="Times New Roman" w:hAnsi="Times New Roman" w:cs="Times New Roman"/>
-          <w:sz w:val="24"/>
-          <w:szCs w:val="24"/>
-        </w:rPr>
-        <w:t>1.1 Background ........................................................... 6</w:t>
-      </w:r>
-    </w:p>
-    <w:p>
-      <w:pPr>
-        <w:jc w:val="both"/>
-        <w:rPr>
-          <w:rFonts w:ascii="Times New Roman" w:eastAsia="Times New Roman" w:hAnsi="Times New Roman" w:cs="Times New Roman"/>
-          <w:sz w:val="24"/>
-          <w:szCs w:val="24"/>
-        </w:rPr>
-      </w:pPr>
-      <w:r>
-        <w:rPr>
-          <w:rFonts w:ascii="Times New Roman" w:eastAsia="Times New Roman" w:hAnsi="Times New Roman" w:cs="Times New Roman"/>
-          <w:sz w:val="24"/>
-          <w:szCs w:val="24"/>
-        </w:rPr>
-        <w:t>1.2 Problem Statement .................................................... 7</w:t>
-      </w:r>
-    </w:p>
-    <w:p>
-      <w:pPr>
-        <w:jc w:val="both"/>
-        <w:rPr>
-          <w:rFonts w:ascii="Times New Roman" w:eastAsia="Times New Roman" w:hAnsi="Times New Roman" w:cs="Times New Roman"/>
-          <w:sz w:val="24"/>
-          <w:szCs w:val="24"/>
-        </w:rPr>
-      </w:pPr>
-      <w:r>
-        <w:rPr>
-          <w:rFonts w:ascii="Times New Roman" w:eastAsia="Times New Roman" w:hAnsi="Times New Roman" w:cs="Times New Roman"/>
-          <w:sz w:val="24"/>
-          <w:szCs w:val="24"/>
-        </w:rPr>
-        <w:t>1.3 Artificial Intelligence and Machine Learning in Retail Forecasting ... 8</w:t>
-      </w:r>
-    </w:p>
-    <w:p>
-      <w:pPr>
-        <w:jc w:val="both"/>
-        <w:rPr>
-          <w:rFonts w:ascii="Times New Roman" w:eastAsia="Times New Roman" w:hAnsi="Times New Roman" w:cs="Times New Roman"/>
-          <w:sz w:val="24"/>
-          <w:szCs w:val="24"/>
-        </w:rPr>
-      </w:pPr>
-      <w:r>
-        <w:rPr>
-          <w:rFonts w:ascii="Times New Roman" w:eastAsia="Times New Roman" w:hAnsi="Times New Roman" w:cs="Times New Roman"/>
-          <w:sz w:val="24"/>
-          <w:szCs w:val="24"/>
+      <w:r>
+        <w:rPr>
+          <w:rFonts w:ascii="Times New Roman" w:hAnsi="Times New Roman" w:cs="Times New Roman"/>
+        </w:rPr>
+        <w:t>Abstract ..............................</w:t>
+      </w:r>
+      <w:r>
+        <w:rPr>
+          <w:rFonts w:ascii="Times New Roman" w:hAnsi="Times New Roman" w:cs="Times New Roman"/>
+        </w:rPr>
+        <w:t>.............................. 4</w:t>
+      </w:r>
+    </w:p>
+    <w:p>
+      <w:pPr>
+        <w:jc w:val="both"/>
+        <w:rPr>
+          <w:rFonts w:ascii="Times New Roman" w:eastAsia="Times New Roman" w:hAnsi="Times New Roman" w:cs="Times New Roman"/>
+          <w:sz w:val="24"/>
+          <w:szCs w:val="24"/>
+        </w:rPr>
+      </w:pPr>
+      <w:r>
+        <w:rPr>
+          <w:rFonts w:ascii="Times New Roman" w:hAnsi="Times New Roman" w:cs="Times New Roman"/>
+        </w:rPr>
+        <w:t>Chapter 1: Introduction ...............</w:t>
+      </w:r>
+      <w:r>
+        <w:rPr>
+          <w:rFonts w:ascii="Times New Roman" w:hAnsi="Times New Roman" w:cs="Times New Roman"/>
+        </w:rPr>
+        <w:t>.............................. 5</w:t>
+      </w:r>
+    </w:p>
+    <w:p>
+      <w:pPr>
+        <w:jc w:val="both"/>
+        <w:rPr>
+          <w:rFonts w:ascii="Times New Roman" w:eastAsia="Times New Roman" w:hAnsi="Times New Roman" w:cs="Times New Roman"/>
+          <w:sz w:val="24"/>
+          <w:szCs w:val="24"/>
+        </w:rPr>
+      </w:pPr>
+      <w:r>
+        <w:rPr>
+          <w:rFonts w:ascii="Times New Roman" w:hAnsi="Times New Roman" w:cs="Times New Roman"/>
+        </w:rPr>
+        <w:t>1.1 Background ........................</w:t>
+      </w:r>
+      <w:r>
+        <w:rPr>
+          <w:rFonts w:ascii="Times New Roman" w:hAnsi="Times New Roman" w:cs="Times New Roman"/>
+        </w:rPr>
+        <w:t>.............................. 5</w:t>
+      </w:r>
+    </w:p>
+    <w:p>
+      <w:pPr>
+        <w:jc w:val="both"/>
+        <w:rPr>
+          <w:rFonts w:ascii="Times New Roman" w:eastAsia="Times New Roman" w:hAnsi="Times New Roman" w:cs="Times New Roman"/>
+          <w:sz w:val="24"/>
+          <w:szCs w:val="24"/>
+        </w:rPr>
+      </w:pPr>
+      <w:r>
+        <w:rPr>
+          <w:rFonts w:ascii="Times New Roman" w:hAnsi="Times New Roman" w:cs="Times New Roman"/>
+        </w:rPr>
+        <w:t>1.2 Problem Statement ..............................</w:t>
+      </w:r>
+      <w:r>
+        <w:rPr>
+          <w:rFonts w:ascii="Times New Roman" w:hAnsi="Times New Roman" w:cs="Times New Roman"/>
+        </w:rPr>
+        <w:t>................. 6</w:t>
+      </w:r>
+    </w:p>
+    <w:p>
+      <w:pPr>
+        <w:jc w:val="both"/>
+        <w:rPr>
+          <w:rFonts w:ascii="Times New Roman" w:eastAsia="Times New Roman" w:hAnsi="Times New Roman" w:cs="Times New Roman"/>
+          <w:sz w:val="24"/>
+          <w:szCs w:val="24"/>
+        </w:rPr>
+      </w:pPr>
+      <w:r>
+        <w:rPr>
+          <w:rFonts w:ascii="Times New Roman" w:hAnsi="Times New Roman" w:cs="Times New Roman"/>
+        </w:rPr>
+        <w:t>1.3 Artificial Intelligence and Machine Learning in</w:t>
+      </w:r>
+      <w:r>
+        <w:rPr>
+          <w:rFonts w:ascii="Times New Roman" w:hAnsi="Times New Roman" w:cs="Times New Roman"/>
+        </w:rPr>
+        <w:t xml:space="preserve"> Retail Forecasting .......... 7</w:t>
+      </w:r>
+    </w:p>
+    <w:p>
+      <w:pPr>
+        <w:jc w:val="both"/>
+        <w:rPr>
+          <w:rFonts w:ascii="Times New Roman" w:eastAsia="Times New Roman" w:hAnsi="Times New Roman" w:cs="Times New Roman"/>
+          <w:sz w:val="24"/>
+          <w:szCs w:val="24"/>
+        </w:rPr>
+      </w:pPr>
+      <w:r>
+        <w:rPr>
+          <w:rFonts w:ascii="Times New Roman" w:hAnsi="Times New Roman" w:cs="Times New Roman"/>
         </w:rPr>
         <w:t xml:space="preserve">1.4 Importance of </w:t>
       </w:r>
       <w:proofErr w:type="spellStart"/>
       <w:r>
         <w:rPr>
-          <w:rFonts w:ascii="Times New Roman" w:eastAsia="Times New Roman" w:hAnsi="Times New Roman" w:cs="Times New Roman"/>
-          <w:sz w:val="24"/>
-          <w:szCs w:val="24"/>
+          <w:rFonts w:ascii="Times New Roman" w:hAnsi="Times New Roman" w:cs="Times New Roman"/>
         </w:rPr>
         <w:t>MLOps</w:t>
       </w:r>
       <w:proofErr w:type="spellEnd"/>
       <w:r>
         <w:rPr>
-          <w:rFonts w:ascii="Times New Roman" w:eastAsia="Times New Roman" w:hAnsi="Times New Roman" w:cs="Times New Roman"/>
-          <w:sz w:val="24"/>
-          <w:szCs w:val="24"/>
-        </w:rPr>
-        <w:t xml:space="preserve"> in Production Machine Learning Systems ........... 9</w:t>
-      </w:r>
-    </w:p>
-    <w:p>
-      <w:pPr>
-        <w:jc w:val="both"/>
-        <w:rPr>
-          <w:rFonts w:ascii="Times New Roman" w:eastAsia="Times New Roman" w:hAnsi="Times New Roman" w:cs="Times New Roman"/>
-          <w:sz w:val="24"/>
-          <w:szCs w:val="24"/>
-        </w:rPr>
-      </w:pPr>
-      <w:r>
-        <w:rPr>
-          <w:rFonts w:ascii="Times New Roman" w:eastAsia="Times New Roman" w:hAnsi="Times New Roman" w:cs="Times New Roman"/>
-          <w:sz w:val="24"/>
-          <w:szCs w:val="24"/>
-        </w:rPr>
-        <w:t>1.5 Research Aim and Objectives ......................................... 10</w:t>
-      </w:r>
-    </w:p>
-    <w:p>
-      <w:pPr>
-        <w:jc w:val="both"/>
-        <w:rPr>
-          <w:rFonts w:ascii="Times New Roman" w:eastAsia="Times New Roman" w:hAnsi="Times New Roman" w:cs="Times New Roman"/>
-          <w:sz w:val="24"/>
-          <w:szCs w:val="24"/>
-        </w:rPr>
-      </w:pPr>
-      <w:r>
-        <w:rPr>
-          <w:rFonts w:ascii="Times New Roman" w:eastAsia="Times New Roman" w:hAnsi="Times New Roman" w:cs="Times New Roman"/>
-          <w:sz w:val="24"/>
-          <w:szCs w:val="24"/>
-        </w:rPr>
-        <w:t>1.6 Research Question ................................................... 10</w:t>
-      </w:r>
-    </w:p>
-    <w:p>
-      <w:pPr>
-        <w:jc w:val="both"/>
-        <w:rPr>
-          <w:rFonts w:ascii="Times New Roman" w:eastAsia="Times New Roman" w:hAnsi="Times New Roman" w:cs="Times New Roman"/>
-          <w:sz w:val="24"/>
-          <w:szCs w:val="24"/>
-        </w:rPr>
-      </w:pPr>
-      <w:r>
-        <w:rPr>
-          <w:rFonts w:ascii="Times New Roman" w:eastAsia="Times New Roman" w:hAnsi="Times New Roman" w:cs="Times New Roman"/>
-          <w:sz w:val="24"/>
-          <w:szCs w:val="24"/>
-        </w:rPr>
-        <w:t>1.7 Scope of the Study .................................................. 11</w:t>
-      </w:r>
-    </w:p>
-    <w:p>
-      <w:pPr>
-        <w:jc w:val="both"/>
-        <w:rPr>
-          <w:rFonts w:ascii="Times New Roman" w:eastAsia="Times New Roman" w:hAnsi="Times New Roman" w:cs="Times New Roman"/>
-          <w:sz w:val="24"/>
-          <w:szCs w:val="24"/>
-        </w:rPr>
-      </w:pPr>
-      <w:r>
-        <w:rPr>
-          <w:rFonts w:ascii="Times New Roman" w:eastAsia="Times New Roman" w:hAnsi="Times New Roman" w:cs="Times New Roman"/>
-          <w:sz w:val="24"/>
-          <w:szCs w:val="24"/>
-        </w:rPr>
-        <w:t>1.8 Dissertation Structure .............................................. 11</w:t>
-      </w:r>
-    </w:p>
-    <w:p>
-      <w:pPr>
-        <w:jc w:val="both"/>
-        <w:rPr>
-          <w:rFonts w:ascii="Times New Roman" w:eastAsia="Times New Roman" w:hAnsi="Times New Roman" w:cs="Times New Roman"/>
-          <w:sz w:val="24"/>
-          <w:szCs w:val="24"/>
-        </w:rPr>
-      </w:pPr>
-    </w:p>
-    <w:p>
-      <w:pPr>
-        <w:jc w:val="both"/>
-        <w:rPr>
-          <w:rFonts w:ascii="Times New Roman" w:eastAsia="Times New Roman" w:hAnsi="Times New Roman" w:cs="Times New Roman"/>
-          <w:sz w:val="24"/>
-          <w:szCs w:val="24"/>
-        </w:rPr>
-      </w:pPr>
-      <w:r>
-        <w:rPr>
-          <w:rFonts w:ascii="Times New Roman" w:eastAsia="Times New Roman" w:hAnsi="Times New Roman" w:cs="Times New Roman"/>
-          <w:sz w:val="24"/>
-          <w:szCs w:val="24"/>
-        </w:rPr>
-        <w:t>Chapter 2: Literature Review ............................................ 13</w:t>
-      </w:r>
-    </w:p>
-    <w:p>
-      <w:pPr>
-        <w:jc w:val="both"/>
-        <w:rPr>
-          <w:rFonts w:ascii="Times New Roman" w:eastAsia="Times New Roman" w:hAnsi="Times New Roman" w:cs="Times New Roman"/>
-          <w:sz w:val="24"/>
-          <w:szCs w:val="24"/>
-        </w:rPr>
-      </w:pPr>
-      <w:r>
-        <w:rPr>
-          <w:rFonts w:ascii="Times New Roman" w:eastAsia="Times New Roman" w:hAnsi="Times New Roman" w:cs="Times New Roman"/>
-          <w:sz w:val="24"/>
-          <w:szCs w:val="24"/>
-        </w:rPr>
-        <w:t>2.1 Retail Inventory Challenges and Sustainability Concerns ............. 13</w:t>
-      </w:r>
-    </w:p>
-    <w:p>
-      <w:pPr>
-        <w:jc w:val="both"/>
-        <w:rPr>
-          <w:rFonts w:ascii="Times New Roman" w:eastAsia="Times New Roman" w:hAnsi="Times New Roman" w:cs="Times New Roman"/>
-          <w:sz w:val="24"/>
-          <w:szCs w:val="24"/>
-        </w:rPr>
-      </w:pPr>
-      <w:r>
-        <w:rPr>
-          <w:rFonts w:ascii="Times New Roman" w:eastAsia="Times New Roman" w:hAnsi="Times New Roman" w:cs="Times New Roman"/>
-          <w:sz w:val="24"/>
-          <w:szCs w:val="24"/>
-        </w:rPr>
-        <w:t>2.2 Machine Learning in Retail Demand Forecasting ....................... 14</w:t>
-      </w:r>
-    </w:p>
-    <w:p>
-      <w:pPr>
-        <w:jc w:val="both"/>
-        <w:rPr>
-          <w:rFonts w:ascii="Times New Roman" w:eastAsia="Times New Roman" w:hAnsi="Times New Roman" w:cs="Times New Roman"/>
-          <w:sz w:val="24"/>
-          <w:szCs w:val="24"/>
-        </w:rPr>
-      </w:pPr>
-      <w:r>
-        <w:rPr>
-          <w:rFonts w:ascii="Times New Roman" w:eastAsia="Times New Roman" w:hAnsi="Times New Roman" w:cs="Times New Roman"/>
-          <w:sz w:val="24"/>
-          <w:szCs w:val="24"/>
-        </w:rPr>
-        <w:t>2.3 AI-Driven Inventory Optimization .................................... 15</w:t>
-      </w:r>
-    </w:p>
-    <w:p>
-      <w:pPr>
-        <w:jc w:val="both"/>
-        <w:rPr>
-          <w:rFonts w:ascii="Times New Roman" w:eastAsia="Times New Roman" w:hAnsi="Times New Roman" w:cs="Times New Roman"/>
-          <w:sz w:val="24"/>
-          <w:szCs w:val="24"/>
-        </w:rPr>
-      </w:pPr>
-      <w:r>
-        <w:rPr>
-          <w:rFonts w:ascii="Times New Roman" w:eastAsia="Times New Roman" w:hAnsi="Times New Roman" w:cs="Times New Roman"/>
-          <w:sz w:val="24"/>
-          <w:szCs w:val="24"/>
+          <w:rFonts w:ascii="Times New Roman" w:hAnsi="Times New Roman" w:cs="Times New Roman"/>
+        </w:rPr>
+        <w:t xml:space="preserve"> in Production Machi</w:t>
+      </w:r>
+      <w:r>
+        <w:rPr>
+          <w:rFonts w:ascii="Times New Roman" w:hAnsi="Times New Roman" w:cs="Times New Roman"/>
+        </w:rPr>
+        <w:t>ne Learning Systems .......... 8</w:t>
+      </w:r>
+    </w:p>
+    <w:p>
+      <w:pPr>
+        <w:jc w:val="both"/>
+        <w:rPr>
+          <w:rFonts w:ascii="Times New Roman" w:eastAsia="Times New Roman" w:hAnsi="Times New Roman" w:cs="Times New Roman"/>
+          <w:sz w:val="24"/>
+          <w:szCs w:val="24"/>
+        </w:rPr>
+      </w:pPr>
+      <w:r>
+        <w:rPr>
+          <w:rFonts w:ascii="Times New Roman" w:hAnsi="Times New Roman" w:cs="Times New Roman"/>
+        </w:rPr>
+        <w:t>1.5 Research Aim and Objectives ........</w:t>
+      </w:r>
+      <w:r>
+        <w:rPr>
+          <w:rFonts w:ascii="Times New Roman" w:hAnsi="Times New Roman" w:cs="Times New Roman"/>
+        </w:rPr>
+        <w:t>............................. 9</w:t>
+      </w:r>
+    </w:p>
+    <w:p>
+      <w:pPr>
+        <w:jc w:val="both"/>
+        <w:rPr>
+          <w:rFonts w:ascii="Times New Roman" w:eastAsia="Times New Roman" w:hAnsi="Times New Roman" w:cs="Times New Roman"/>
+          <w:sz w:val="24"/>
+          <w:szCs w:val="24"/>
+        </w:rPr>
+      </w:pPr>
+      <w:r>
+        <w:rPr>
+          <w:rFonts w:ascii="Times New Roman" w:hAnsi="Times New Roman" w:cs="Times New Roman"/>
+        </w:rPr>
+        <w:t>1.6 Research Question ..................</w:t>
+      </w:r>
+      <w:r>
+        <w:rPr>
+          <w:rFonts w:ascii="Times New Roman" w:hAnsi="Times New Roman" w:cs="Times New Roman"/>
+        </w:rPr>
+        <w:t>............................. 9</w:t>
+      </w:r>
+    </w:p>
+    <w:p>
+      <w:pPr>
+        <w:jc w:val="both"/>
+        <w:rPr>
+          <w:rFonts w:ascii="Times New Roman" w:eastAsia="Times New Roman" w:hAnsi="Times New Roman" w:cs="Times New Roman"/>
+          <w:sz w:val="24"/>
+          <w:szCs w:val="24"/>
+        </w:rPr>
+      </w:pPr>
+      <w:r>
+        <w:rPr>
+          <w:rFonts w:ascii="Times New Roman" w:hAnsi="Times New Roman" w:cs="Times New Roman"/>
+        </w:rPr>
+        <w:t>1.7 Scope of the Study .................</w:t>
+      </w:r>
+      <w:r>
+        <w:rPr>
+          <w:rFonts w:ascii="Times New Roman" w:hAnsi="Times New Roman" w:cs="Times New Roman"/>
+        </w:rPr>
+        <w:t>............................. 10</w:t>
+      </w:r>
+    </w:p>
+    <w:p>
+      <w:pPr>
+        <w:jc w:val="both"/>
+        <w:rPr>
+          <w:rFonts w:ascii="Times New Roman" w:eastAsia="Times New Roman" w:hAnsi="Times New Roman" w:cs="Times New Roman"/>
+          <w:sz w:val="24"/>
+          <w:szCs w:val="24"/>
+        </w:rPr>
+      </w:pPr>
+      <w:r>
+        <w:rPr>
+          <w:rFonts w:ascii="Times New Roman" w:hAnsi="Times New Roman" w:cs="Times New Roman"/>
+        </w:rPr>
+        <w:t>1.8 Dissertation Structure .............</w:t>
+      </w:r>
+      <w:r>
+        <w:rPr>
+          <w:rFonts w:ascii="Times New Roman" w:hAnsi="Times New Roman" w:cs="Times New Roman"/>
+        </w:rPr>
+        <w:t>............................. 11</w:t>
+      </w:r>
+    </w:p>
+    <w:p>
+      <w:pPr>
+        <w:jc w:val="both"/>
+        <w:rPr>
+          <w:rFonts w:ascii="Times New Roman" w:eastAsia="Times New Roman" w:hAnsi="Times New Roman" w:cs="Times New Roman"/>
+          <w:sz w:val="24"/>
+          <w:szCs w:val="24"/>
+        </w:rPr>
+      </w:pPr>
+      <w:r>
+        <w:rPr>
+          <w:rFonts w:ascii="Times New Roman" w:hAnsi="Times New Roman" w:cs="Times New Roman"/>
+        </w:rPr>
+        <w:t>Chapter 2: Literature Review ...........</w:t>
+      </w:r>
+      <w:r>
+        <w:rPr>
+          <w:rFonts w:ascii="Times New Roman" w:hAnsi="Times New Roman" w:cs="Times New Roman"/>
+        </w:rPr>
+        <w:t>............................. 12</w:t>
+      </w:r>
+    </w:p>
+    <w:p>
+      <w:pPr>
+        <w:jc w:val="both"/>
+        <w:rPr>
+          <w:rFonts w:ascii="Times New Roman" w:eastAsia="Times New Roman" w:hAnsi="Times New Roman" w:cs="Times New Roman"/>
+          <w:sz w:val="24"/>
+          <w:szCs w:val="24"/>
+        </w:rPr>
+      </w:pPr>
+      <w:r>
+        <w:rPr>
+          <w:rFonts w:ascii="Times New Roman" w:hAnsi="Times New Roman" w:cs="Times New Roman"/>
+        </w:rPr>
+        <w:t>2.1 Retail Inventory Challenges and Susta</w:t>
+      </w:r>
+      <w:r>
+        <w:rPr>
+          <w:rFonts w:ascii="Times New Roman" w:hAnsi="Times New Roman" w:cs="Times New Roman"/>
+        </w:rPr>
+        <w:t>inability Concerns .......... 12</w:t>
+      </w:r>
+    </w:p>
+    <w:p>
+      <w:pPr>
+        <w:jc w:val="both"/>
+        <w:rPr>
+          <w:rFonts w:ascii="Times New Roman" w:eastAsia="Times New Roman" w:hAnsi="Times New Roman" w:cs="Times New Roman"/>
+          <w:sz w:val="24"/>
+          <w:szCs w:val="24"/>
+        </w:rPr>
+      </w:pPr>
+      <w:r>
+        <w:rPr>
+          <w:rFonts w:ascii="Times New Roman" w:hAnsi="Times New Roman" w:cs="Times New Roman"/>
+        </w:rPr>
+        <w:t>2.2 Machine Learning in Retail Demand Fo</w:t>
+      </w:r>
+      <w:r>
+        <w:rPr>
+          <w:rFonts w:ascii="Times New Roman" w:hAnsi="Times New Roman" w:cs="Times New Roman"/>
+        </w:rPr>
+        <w:t>recasting ................... 13</w:t>
+      </w:r>
+    </w:p>
+    <w:p>
+      <w:pPr>
+        <w:jc w:val="both"/>
+        <w:rPr>
+          <w:rFonts w:ascii="Times New Roman" w:eastAsia="Times New Roman" w:hAnsi="Times New Roman" w:cs="Times New Roman"/>
+          <w:sz w:val="24"/>
+          <w:szCs w:val="24"/>
+        </w:rPr>
+      </w:pPr>
+      <w:r>
+        <w:rPr>
+          <w:rFonts w:ascii="Times New Roman" w:hAnsi="Times New Roman" w:cs="Times New Roman"/>
+        </w:rPr>
+        <w:t>2.3 AI-Driven Inventory Optimization ...</w:t>
+      </w:r>
+      <w:r>
+        <w:rPr>
+          <w:rFonts w:ascii="Times New Roman" w:hAnsi="Times New Roman" w:cs="Times New Roman"/>
+        </w:rPr>
+        <w:t>............................. 14</w:t>
+      </w:r>
+    </w:p>
+    <w:p>
+      <w:pPr>
+        <w:jc w:val="both"/>
+        <w:rPr>
+          <w:rFonts w:ascii="Times New Roman" w:eastAsia="Times New Roman" w:hAnsi="Times New Roman" w:cs="Times New Roman"/>
+          <w:sz w:val="24"/>
+          <w:szCs w:val="24"/>
+        </w:rPr>
+      </w:pPr>
+      <w:r>
+        <w:rPr>
+          <w:rFonts w:ascii="Times New Roman" w:hAnsi="Times New Roman" w:cs="Times New Roman"/>
         </w:rPr>
         <w:t xml:space="preserve">2.4 Forecasting Reliability and </w:t>
       </w:r>
       <w:proofErr w:type="spellStart"/>
       <w:r>
         <w:rPr>
-          <w:rFonts w:ascii="Times New Roman" w:eastAsia="Times New Roman" w:hAnsi="Times New Roman" w:cs="Times New Roman"/>
-          <w:sz w:val="24"/>
-          <w:szCs w:val="24"/>
+          <w:rFonts w:ascii="Times New Roman" w:hAnsi="Times New Roman" w:cs="Times New Roman"/>
         </w:rPr>
         <w:t>MLOps</w:t>
       </w:r>
       <w:proofErr w:type="spellEnd"/>
       <w:r>
         <w:rPr>
-          <w:rFonts w:ascii="Times New Roman" w:eastAsia="Times New Roman" w:hAnsi="Times New Roman" w:cs="Times New Roman"/>
-          <w:sz w:val="24"/>
-          <w:szCs w:val="24"/>
-        </w:rPr>
-        <w:t xml:space="preserve"> in Retail Environments ............ 16</w:t>
-      </w:r>
-    </w:p>
-    <w:p>
-      <w:pPr>
-        <w:jc w:val="both"/>
-        <w:rPr>
-          <w:rFonts w:ascii="Times New Roman" w:eastAsia="Times New Roman" w:hAnsi="Times New Roman" w:cs="Times New Roman"/>
-          <w:sz w:val="24"/>
-          <w:szCs w:val="24"/>
-        </w:rPr>
-      </w:pPr>
-      <w:r>
-        <w:rPr>
-          <w:rFonts w:ascii="Times New Roman" w:eastAsia="Times New Roman" w:hAnsi="Times New Roman" w:cs="Times New Roman"/>
-          <w:sz w:val="24"/>
-          <w:szCs w:val="24"/>
-        </w:rPr>
-        <w:t>2.5 Research Gap ........................................................ 17</w:t>
-      </w:r>
-    </w:p>
-    <w:p>
-      <w:pPr>
-        <w:jc w:val="both"/>
-        <w:rPr>
-          <w:rFonts w:ascii="Times New Roman" w:eastAsia="Times New Roman" w:hAnsi="Times New Roman" w:cs="Times New Roman"/>
-          <w:sz w:val="24"/>
-          <w:szCs w:val="24"/>
-        </w:rPr>
-      </w:pPr>
-    </w:p>
-    <w:p>
-      <w:pPr>
-        <w:jc w:val="both"/>
-        <w:rPr>
-          <w:rFonts w:ascii="Times New Roman" w:eastAsia="Times New Roman" w:hAnsi="Times New Roman" w:cs="Times New Roman"/>
-          <w:sz w:val="24"/>
-          <w:szCs w:val="24"/>
-        </w:rPr>
-      </w:pPr>
-      <w:r>
-        <w:rPr>
-          <w:rFonts w:ascii="Times New Roman" w:eastAsia="Times New Roman" w:hAnsi="Times New Roman" w:cs="Times New Roman"/>
-          <w:sz w:val="24"/>
-          <w:szCs w:val="24"/>
-        </w:rPr>
-        <w:t>Chapter 3: Research Methodology ......................................... 18</w:t>
-      </w:r>
-    </w:p>
-    <w:p>
-      <w:pPr>
-        <w:jc w:val="both"/>
-        <w:rPr>
-          <w:rFonts w:ascii="Times New Roman" w:eastAsia="Times New Roman" w:hAnsi="Times New Roman" w:cs="Times New Roman"/>
-          <w:sz w:val="24"/>
-          <w:szCs w:val="24"/>
-        </w:rPr>
-      </w:pPr>
-      <w:r>
-        <w:rPr>
-          <w:rFonts w:ascii="Times New Roman" w:eastAsia="Times New Roman" w:hAnsi="Times New Roman" w:cs="Times New Roman"/>
-          <w:sz w:val="24"/>
-          <w:szCs w:val="24"/>
-        </w:rPr>
-        <w:t>3.1 Research Methodology and CRISP-DM Framework ......................... 18</w:t>
-      </w:r>
-    </w:p>
-    <w:p>
-      <w:pPr>
-        <w:jc w:val="both"/>
-        <w:rPr>
-          <w:rFonts w:ascii="Times New Roman" w:eastAsia="Times New Roman" w:hAnsi="Times New Roman" w:cs="Times New Roman"/>
-          <w:sz w:val="24"/>
-          <w:szCs w:val="24"/>
-        </w:rPr>
-      </w:pPr>
-      <w:r>
-        <w:rPr>
-          <w:rFonts w:ascii="Times New Roman" w:eastAsia="Times New Roman" w:hAnsi="Times New Roman" w:cs="Times New Roman"/>
-          <w:sz w:val="24"/>
-          <w:szCs w:val="24"/>
-        </w:rPr>
-        <w:t>3.2 Business Understanding .............................................. 19</w:t>
-      </w:r>
-    </w:p>
-    <w:p>
-      <w:pPr>
-        <w:jc w:val="both"/>
-        <w:rPr>
-          <w:rFonts w:ascii="Times New Roman" w:eastAsia="Times New Roman" w:hAnsi="Times New Roman" w:cs="Times New Roman"/>
-          <w:sz w:val="24"/>
-          <w:szCs w:val="24"/>
-        </w:rPr>
-      </w:pPr>
-      <w:r>
-        <w:rPr>
-          <w:rFonts w:ascii="Times New Roman" w:eastAsia="Times New Roman" w:hAnsi="Times New Roman" w:cs="Times New Roman"/>
-          <w:sz w:val="24"/>
-          <w:szCs w:val="24"/>
-        </w:rPr>
-        <w:t>3.2.1 Business Problem .................................................. 19</w:t>
-      </w:r>
-    </w:p>
-    <w:p>
-      <w:pPr>
-        <w:jc w:val="both"/>
-        <w:rPr>
-          <w:rFonts w:ascii="Times New Roman" w:eastAsia="Times New Roman" w:hAnsi="Times New Roman" w:cs="Times New Roman"/>
-          <w:sz w:val="24"/>
-          <w:szCs w:val="24"/>
-        </w:rPr>
-      </w:pPr>
-      <w:r>
-        <w:rPr>
-          <w:rFonts w:ascii="Times New Roman" w:eastAsia="Times New Roman" w:hAnsi="Times New Roman" w:cs="Times New Roman"/>
-          <w:sz w:val="24"/>
-          <w:szCs w:val="24"/>
-        </w:rPr>
-        <w:t>3.2.2 Business Objectives ............................................... 20</w:t>
-      </w:r>
-    </w:p>
-    <w:p>
-      <w:pPr>
-        <w:jc w:val="both"/>
-        <w:rPr>
-          <w:rFonts w:ascii="Times New Roman" w:eastAsia="Times New Roman" w:hAnsi="Times New Roman" w:cs="Times New Roman"/>
-          <w:sz w:val="24"/>
-          <w:szCs w:val="24"/>
-        </w:rPr>
-      </w:pPr>
-      <w:r>
-        <w:rPr>
-          <w:rFonts w:ascii="Times New Roman" w:eastAsia="Times New Roman" w:hAnsi="Times New Roman" w:cs="Times New Roman"/>
-          <w:sz w:val="24"/>
-          <w:szCs w:val="24"/>
-        </w:rPr>
-        <w:t>3.2.3 Success Criteria .................................................. 20</w:t>
-      </w:r>
-    </w:p>
-    <w:p>
-      <w:pPr>
-        <w:jc w:val="both"/>
-        <w:rPr>
-          <w:rFonts w:ascii="Times New Roman" w:eastAsia="Times New Roman" w:hAnsi="Times New Roman" w:cs="Times New Roman"/>
-          <w:sz w:val="24"/>
-          <w:szCs w:val="24"/>
-        </w:rPr>
-      </w:pPr>
-      <w:r>
-        <w:rPr>
-          <w:rFonts w:ascii="Times New Roman" w:eastAsia="Times New Roman" w:hAnsi="Times New Roman" w:cs="Times New Roman"/>
-          <w:sz w:val="24"/>
-          <w:szCs w:val="24"/>
-        </w:rPr>
-        <w:t>3.2.4 Risks, Constraints, and Governance Considerations ................. 20</w:t>
-      </w:r>
-    </w:p>
-    <w:p>
-      <w:pPr>
-        <w:jc w:val="both"/>
-        <w:rPr>
-          <w:rFonts w:ascii="Times New Roman" w:eastAsia="Times New Roman" w:hAnsi="Times New Roman" w:cs="Times New Roman"/>
-          <w:sz w:val="24"/>
-          <w:szCs w:val="24"/>
-        </w:rPr>
-      </w:pPr>
-      <w:r>
-        <w:rPr>
-          <w:rFonts w:ascii="Times New Roman" w:eastAsia="Times New Roman" w:hAnsi="Times New Roman" w:cs="Times New Roman"/>
-          <w:sz w:val="24"/>
-          <w:szCs w:val="24"/>
+          <w:rFonts w:ascii="Times New Roman" w:hAnsi="Times New Roman" w:cs="Times New Roman"/>
+        </w:rPr>
+        <w:t xml:space="preserve"> in R</w:t>
+      </w:r>
+      <w:r>
+        <w:rPr>
+          <w:rFonts w:ascii="Times New Roman" w:hAnsi="Times New Roman" w:cs="Times New Roman"/>
+        </w:rPr>
+        <w:t>etail Environments .......... 15</w:t>
+      </w:r>
+    </w:p>
+    <w:p>
+      <w:pPr>
+        <w:jc w:val="both"/>
+        <w:rPr>
+          <w:rFonts w:ascii="Times New Roman" w:eastAsia="Times New Roman" w:hAnsi="Times New Roman" w:cs="Times New Roman"/>
+          <w:sz w:val="24"/>
+          <w:szCs w:val="24"/>
+        </w:rPr>
+      </w:pPr>
+      <w:r>
+        <w:rPr>
+          <w:rFonts w:ascii="Times New Roman" w:hAnsi="Times New Roman" w:cs="Times New Roman"/>
+        </w:rPr>
+        <w:t>2.5 Research Gap .......................</w:t>
+      </w:r>
+      <w:r>
+        <w:rPr>
+          <w:rFonts w:ascii="Times New Roman" w:hAnsi="Times New Roman" w:cs="Times New Roman"/>
+        </w:rPr>
+        <w:t>............................. 1</w:t>
+      </w:r>
+      <w:r>
+        <w:rPr>
+          <w:rFonts w:ascii="Times New Roman" w:hAnsi="Times New Roman" w:cs="Times New Roman"/>
+        </w:rPr>
+        <w:t>6</w:t>
+      </w:r>
+    </w:p>
+    <w:p>
+      <w:pPr>
+        <w:jc w:val="both"/>
+        <w:rPr>
+          <w:rFonts w:ascii="Times New Roman" w:eastAsia="Times New Roman" w:hAnsi="Times New Roman" w:cs="Times New Roman"/>
+          <w:sz w:val="24"/>
+          <w:szCs w:val="24"/>
+        </w:rPr>
+      </w:pPr>
+      <w:r>
+        <w:rPr>
+          <w:rFonts w:ascii="Times New Roman" w:hAnsi="Times New Roman" w:cs="Times New Roman"/>
+        </w:rPr>
+        <w:t>Chapter 3: Research Methodology ........</w:t>
+      </w:r>
+      <w:r>
+        <w:rPr>
+          <w:rFonts w:ascii="Times New Roman" w:hAnsi="Times New Roman" w:cs="Times New Roman"/>
+        </w:rPr>
+        <w:t>............................. 17</w:t>
+      </w:r>
+    </w:p>
+    <w:p>
+      <w:pPr>
+        <w:jc w:val="both"/>
+        <w:rPr>
+          <w:rFonts w:ascii="Times New Roman" w:eastAsia="Times New Roman" w:hAnsi="Times New Roman" w:cs="Times New Roman"/>
+          <w:sz w:val="24"/>
+          <w:szCs w:val="24"/>
+        </w:rPr>
+      </w:pPr>
+      <w:r>
+        <w:rPr>
+          <w:rFonts w:ascii="Times New Roman" w:hAnsi="Times New Roman" w:cs="Times New Roman"/>
+        </w:rPr>
+        <w:t>3.1 Research Methodology and CRISP-DM Fr</w:t>
+      </w:r>
+      <w:r>
+        <w:rPr>
+          <w:rFonts w:ascii="Times New Roman" w:hAnsi="Times New Roman" w:cs="Times New Roman"/>
+        </w:rPr>
+        <w:t>amework ..................... 17</w:t>
+      </w:r>
+    </w:p>
+    <w:p>
+      <w:pPr>
+        <w:jc w:val="both"/>
+        <w:rPr>
+          <w:rFonts w:ascii="Times New Roman" w:eastAsia="Times New Roman" w:hAnsi="Times New Roman" w:cs="Times New Roman"/>
+          <w:sz w:val="24"/>
+          <w:szCs w:val="24"/>
+        </w:rPr>
+      </w:pPr>
+      <w:r>
+        <w:rPr>
+          <w:rFonts w:ascii="Times New Roman" w:hAnsi="Times New Roman" w:cs="Times New Roman"/>
+        </w:rPr>
+        <w:t>3.2 Business Understanding .............</w:t>
+      </w:r>
+      <w:r>
+        <w:rPr>
+          <w:rFonts w:ascii="Times New Roman" w:hAnsi="Times New Roman" w:cs="Times New Roman"/>
+        </w:rPr>
+        <w:t>............................. 18</w:t>
+      </w:r>
+    </w:p>
+    <w:p>
+      <w:pPr>
+        <w:jc w:val="both"/>
+        <w:rPr>
+          <w:rFonts w:ascii="Times New Roman" w:eastAsia="Times New Roman" w:hAnsi="Times New Roman" w:cs="Times New Roman"/>
+          <w:sz w:val="24"/>
+          <w:szCs w:val="24"/>
+        </w:rPr>
+      </w:pPr>
+      <w:r>
+        <w:rPr>
+          <w:rFonts w:ascii="Times New Roman" w:hAnsi="Times New Roman" w:cs="Times New Roman"/>
+        </w:rPr>
+        <w:t>3.2.1 Business Problem .................</w:t>
+      </w:r>
+      <w:r>
+        <w:rPr>
+          <w:rFonts w:ascii="Times New Roman" w:hAnsi="Times New Roman" w:cs="Times New Roman"/>
+        </w:rPr>
+        <w:t>............................. 18</w:t>
+      </w:r>
+    </w:p>
+    <w:p>
+      <w:pPr>
+        <w:jc w:val="both"/>
+        <w:rPr>
+          <w:rFonts w:ascii="Times New Roman" w:eastAsia="Times New Roman" w:hAnsi="Times New Roman" w:cs="Times New Roman"/>
+          <w:sz w:val="24"/>
+          <w:szCs w:val="24"/>
+        </w:rPr>
+      </w:pPr>
+      <w:r>
+        <w:rPr>
+          <w:rFonts w:ascii="Times New Roman" w:hAnsi="Times New Roman" w:cs="Times New Roman"/>
+        </w:rPr>
+        <w:t>3.2.2 Business Objectives ..............</w:t>
+      </w:r>
+      <w:r>
+        <w:rPr>
+          <w:rFonts w:ascii="Times New Roman" w:hAnsi="Times New Roman" w:cs="Times New Roman"/>
+        </w:rPr>
+        <w:t>............................. 19</w:t>
+      </w:r>
+    </w:p>
+    <w:p>
+      <w:pPr>
+        <w:jc w:val="both"/>
+        <w:rPr>
+          <w:rFonts w:ascii="Times New Roman" w:eastAsia="Times New Roman" w:hAnsi="Times New Roman" w:cs="Times New Roman"/>
+          <w:sz w:val="24"/>
+          <w:szCs w:val="24"/>
+        </w:rPr>
+      </w:pPr>
+      <w:r>
+        <w:rPr>
+          <w:rFonts w:ascii="Times New Roman" w:hAnsi="Times New Roman" w:cs="Times New Roman"/>
+        </w:rPr>
+        <w:t>3.2.3 Success Criteria .................</w:t>
+      </w:r>
+      <w:r>
+        <w:rPr>
+          <w:rFonts w:ascii="Times New Roman" w:hAnsi="Times New Roman" w:cs="Times New Roman"/>
+        </w:rPr>
+        <w:t>............................. 19</w:t>
+      </w:r>
+    </w:p>
+    <w:p>
+      <w:pPr>
+        <w:jc w:val="both"/>
+        <w:rPr>
+          <w:rFonts w:ascii="Times New Roman" w:eastAsia="Times New Roman" w:hAnsi="Times New Roman" w:cs="Times New Roman"/>
+          <w:sz w:val="24"/>
+          <w:szCs w:val="24"/>
+        </w:rPr>
+      </w:pPr>
+      <w:r>
+        <w:rPr>
+          <w:rFonts w:ascii="Times New Roman" w:hAnsi="Times New Roman" w:cs="Times New Roman"/>
+        </w:rPr>
+        <w:t>3.2.4 Risks, Constraints, and Governance</w:t>
+      </w:r>
+      <w:r>
+        <w:rPr>
+          <w:rFonts w:ascii="Times New Roman" w:hAnsi="Times New Roman" w:cs="Times New Roman"/>
+        </w:rPr>
+        <w:t xml:space="preserve"> Considerations ............. 19</w:t>
+      </w:r>
+    </w:p>
+    <w:p>
+      <w:pPr>
+        <w:jc w:val="both"/>
+        <w:rPr>
+          <w:rFonts w:ascii="Times New Roman" w:eastAsia="Times New Roman" w:hAnsi="Times New Roman" w:cs="Times New Roman"/>
+          <w:sz w:val="24"/>
+          <w:szCs w:val="24"/>
+        </w:rPr>
+      </w:pPr>
+      <w:r>
+        <w:rPr>
+          <w:rFonts w:ascii="Times New Roman" w:hAnsi="Times New Roman" w:cs="Times New Roman"/>
+        </w:rPr>
+        <w:t>3.3 Data Understanding .................</w:t>
+      </w:r>
+      <w:r>
+        <w:rPr>
+          <w:rFonts w:ascii="Times New Roman" w:hAnsi="Times New Roman" w:cs="Times New Roman"/>
+        </w:rPr>
+        <w:t>............................. 20</w:t>
+      </w:r>
+    </w:p>
+    <w:p>
+      <w:pPr>
+        <w:jc w:val="both"/>
+        <w:rPr>
+          <w:rFonts w:ascii="Times New Roman" w:eastAsia="Times New Roman" w:hAnsi="Times New Roman" w:cs="Times New Roman"/>
+          <w:sz w:val="24"/>
+          <w:szCs w:val="24"/>
+        </w:rPr>
+      </w:pPr>
+      <w:r>
+        <w:rPr>
+          <w:rFonts w:ascii="Times New Roman" w:hAnsi="Times New Roman" w:cs="Times New Roman"/>
+        </w:rPr>
+        <w:t>3.3.1 Dataset Description ..............</w:t>
+      </w:r>
+      <w:r>
+        <w:rPr>
+          <w:rFonts w:ascii="Times New Roman" w:hAnsi="Times New Roman" w:cs="Times New Roman"/>
+        </w:rPr>
+        <w:t>............................. 20</w:t>
+      </w:r>
+    </w:p>
+    <w:p>
+      <w:pPr>
+        <w:jc w:val="both"/>
+        <w:rPr>
+          <w:rFonts w:ascii="Times New Roman" w:eastAsia="Times New Roman" w:hAnsi="Times New Roman" w:cs="Times New Roman"/>
+          <w:sz w:val="24"/>
+          <w:szCs w:val="24"/>
+        </w:rPr>
+      </w:pPr>
+      <w:r>
+        <w:rPr>
+          <w:rFonts w:ascii="Times New Roman" w:hAnsi="Times New Roman" w:cs="Times New Roman"/>
+        </w:rPr>
+        <w:t>3.3.2 Dataset Variables ................</w:t>
+      </w:r>
+      <w:r>
+        <w:rPr>
+          <w:rFonts w:ascii="Times New Roman" w:hAnsi="Times New Roman" w:cs="Times New Roman"/>
+        </w:rPr>
+        <w:t>............................. 21</w:t>
+      </w:r>
+    </w:p>
+    <w:p>
+      <w:pPr>
+        <w:jc w:val="both"/>
+        <w:rPr>
+          <w:rFonts w:ascii="Times New Roman" w:eastAsia="Times New Roman" w:hAnsi="Times New Roman" w:cs="Times New Roman"/>
+          <w:sz w:val="24"/>
+          <w:szCs w:val="24"/>
+        </w:rPr>
+      </w:pPr>
+      <w:r>
+        <w:rPr>
+          <w:rFonts w:ascii="Times New Roman" w:hAnsi="Times New Roman" w:cs="Times New Roman"/>
+        </w:rPr>
+        <w:t>3.3.3 Data Quality Assessment ..........</w:t>
+      </w:r>
+      <w:r>
+        <w:rPr>
+          <w:rFonts w:ascii="Times New Roman" w:hAnsi="Times New Roman" w:cs="Times New Roman"/>
+        </w:rPr>
+        <w:t>............................. 21</w:t>
+      </w:r>
+    </w:p>
+    <w:p>
+      <w:pPr>
+        <w:jc w:val="both"/>
+        <w:rPr>
+          <w:rFonts w:ascii="Times New Roman" w:eastAsia="Times New Roman" w:hAnsi="Times New Roman" w:cs="Times New Roman"/>
+          <w:sz w:val="24"/>
+          <w:szCs w:val="24"/>
+        </w:rPr>
+      </w:pPr>
+      <w:r>
+        <w:rPr>
+          <w:rFonts w:ascii="Times New Roman" w:hAnsi="Times New Roman" w:cs="Times New Roman"/>
+        </w:rPr>
+        <w:t>3.3.4 Exploratory Data Analysis ........</w:t>
+      </w:r>
+      <w:r>
+        <w:rPr>
+          <w:rFonts w:ascii="Times New Roman" w:hAnsi="Times New Roman" w:cs="Times New Roman"/>
+        </w:rPr>
+        <w:t>............................. 22</w:t>
+      </w:r>
+    </w:p>
+    <w:p>
+      <w:pPr>
+        <w:jc w:val="both"/>
+        <w:rPr>
+          <w:rFonts w:ascii="Times New Roman" w:eastAsia="Times New Roman" w:hAnsi="Times New Roman" w:cs="Times New Roman"/>
+          <w:sz w:val="24"/>
+          <w:szCs w:val="24"/>
+        </w:rPr>
+      </w:pPr>
+      <w:r>
+        <w:rPr>
+          <w:rFonts w:ascii="Times New Roman" w:hAnsi="Times New Roman" w:cs="Times New Roman"/>
         </w:rPr>
         <w:lastRenderedPageBreak/>
-        <w:t>3.3 Data Understanding .................................................. 21</w:t>
-      </w:r>
-    </w:p>
-    <w:p>
-      <w:pPr>
-        <w:jc w:val="both"/>
-        <w:rPr>
-          <w:rFonts w:ascii="Times New Roman" w:eastAsia="Times New Roman" w:hAnsi="Times New Roman" w:cs="Times New Roman"/>
-          <w:sz w:val="24"/>
-          <w:szCs w:val="24"/>
-        </w:rPr>
-      </w:pPr>
-      <w:r>
-        <w:rPr>
-          <w:rFonts w:ascii="Times New Roman" w:eastAsia="Times New Roman" w:hAnsi="Times New Roman" w:cs="Times New Roman"/>
-          <w:sz w:val="24"/>
-          <w:szCs w:val="24"/>
-        </w:rPr>
-        <w:t>3.3.1 Dataset Description ............................................... 21</w:t>
-      </w:r>
-    </w:p>
-    <w:p>
-      <w:pPr>
-        <w:jc w:val="both"/>
-        <w:rPr>
-          <w:rFonts w:ascii="Times New Roman" w:eastAsia="Times New Roman" w:hAnsi="Times New Roman" w:cs="Times New Roman"/>
-          <w:sz w:val="24"/>
-          <w:szCs w:val="24"/>
-        </w:rPr>
-      </w:pPr>
-      <w:r>
-        <w:rPr>
-          <w:rFonts w:ascii="Times New Roman" w:eastAsia="Times New Roman" w:hAnsi="Times New Roman" w:cs="Times New Roman"/>
-          <w:sz w:val="24"/>
-          <w:szCs w:val="24"/>
-        </w:rPr>
-        <w:t>3.3.2 Dataset Variables ................................................. 22</w:t>
-      </w:r>
-    </w:p>
-    <w:p>
-      <w:pPr>
-        <w:jc w:val="both"/>
-        <w:rPr>
-          <w:rFonts w:ascii="Times New Roman" w:eastAsia="Times New Roman" w:hAnsi="Times New Roman" w:cs="Times New Roman"/>
-          <w:sz w:val="24"/>
-          <w:szCs w:val="24"/>
-        </w:rPr>
-      </w:pPr>
-      <w:r>
-        <w:rPr>
-          <w:rFonts w:ascii="Times New Roman" w:eastAsia="Times New Roman" w:hAnsi="Times New Roman" w:cs="Times New Roman"/>
-          <w:sz w:val="24"/>
-          <w:szCs w:val="24"/>
-        </w:rPr>
-        <w:t>3.3.3 Data Quality Assessment ........................................... 22</w:t>
-      </w:r>
-    </w:p>
-    <w:p>
-      <w:pPr>
-        <w:jc w:val="both"/>
-        <w:rPr>
-          <w:rFonts w:ascii="Times New Roman" w:eastAsia="Times New Roman" w:hAnsi="Times New Roman" w:cs="Times New Roman"/>
-          <w:sz w:val="24"/>
-          <w:szCs w:val="24"/>
-        </w:rPr>
-      </w:pPr>
-      <w:r>
-        <w:rPr>
-          <w:rFonts w:ascii="Times New Roman" w:eastAsia="Times New Roman" w:hAnsi="Times New Roman" w:cs="Times New Roman"/>
-          <w:sz w:val="24"/>
-          <w:szCs w:val="24"/>
-        </w:rPr>
-        <w:t>3.3.4 Exploratory Data Analysis ......................................... 23</w:t>
-      </w:r>
-    </w:p>
-    <w:p>
-      <w:pPr>
-        <w:jc w:val="both"/>
-        <w:rPr>
-          <w:rFonts w:ascii="Times New Roman" w:eastAsia="Times New Roman" w:hAnsi="Times New Roman" w:cs="Times New Roman"/>
-          <w:sz w:val="24"/>
-          <w:szCs w:val="24"/>
-        </w:rPr>
-      </w:pPr>
-      <w:r>
-        <w:rPr>
-          <w:rFonts w:ascii="Times New Roman" w:eastAsia="Times New Roman" w:hAnsi="Times New Roman" w:cs="Times New Roman"/>
-          <w:sz w:val="24"/>
-          <w:szCs w:val="24"/>
-        </w:rPr>
-        <w:t>3.3.5 Dataset Limitations ............................................... 23</w:t>
-      </w:r>
-    </w:p>
-    <w:p>
-      <w:pPr>
-        <w:jc w:val="both"/>
-        <w:rPr>
-          <w:rFonts w:ascii="Times New Roman" w:eastAsia="Times New Roman" w:hAnsi="Times New Roman" w:cs="Times New Roman"/>
-          <w:sz w:val="24"/>
-          <w:szCs w:val="24"/>
-        </w:rPr>
-      </w:pPr>
-      <w:r>
-        <w:rPr>
-          <w:rFonts w:ascii="Times New Roman" w:eastAsia="Times New Roman" w:hAnsi="Times New Roman" w:cs="Times New Roman"/>
-          <w:sz w:val="24"/>
-          <w:szCs w:val="24"/>
-        </w:rPr>
-        <w:t>3.4 Data Preparation .................................................... 23</w:t>
-      </w:r>
-    </w:p>
-    <w:p>
-      <w:pPr>
-        <w:jc w:val="both"/>
-        <w:rPr>
-          <w:rFonts w:ascii="Times New Roman" w:eastAsia="Times New Roman" w:hAnsi="Times New Roman" w:cs="Times New Roman"/>
-          <w:sz w:val="24"/>
-          <w:szCs w:val="24"/>
-        </w:rPr>
-      </w:pPr>
-      <w:r>
-        <w:rPr>
-          <w:rFonts w:ascii="Times New Roman" w:eastAsia="Times New Roman" w:hAnsi="Times New Roman" w:cs="Times New Roman"/>
-          <w:sz w:val="24"/>
-          <w:szCs w:val="24"/>
-        </w:rPr>
-        <w:t>3.4.1 Data Cleaning and Preprocessing ................................... 23</w:t>
-      </w:r>
-    </w:p>
-    <w:p>
-      <w:pPr>
-        <w:jc w:val="both"/>
-        <w:rPr>
-          <w:rFonts w:ascii="Times New Roman" w:eastAsia="Times New Roman" w:hAnsi="Times New Roman" w:cs="Times New Roman"/>
-          <w:sz w:val="24"/>
-          <w:szCs w:val="24"/>
-        </w:rPr>
-      </w:pPr>
-      <w:r>
-        <w:rPr>
-          <w:rFonts w:ascii="Times New Roman" w:eastAsia="Times New Roman" w:hAnsi="Times New Roman" w:cs="Times New Roman"/>
-          <w:sz w:val="24"/>
-          <w:szCs w:val="24"/>
-        </w:rPr>
-        <w:t>3.4.2 Temporal Feature Engineering ...................................... 24</w:t>
-      </w:r>
-    </w:p>
-    <w:p>
-      <w:pPr>
-        <w:jc w:val="both"/>
-        <w:rPr>
-          <w:rFonts w:ascii="Times New Roman" w:eastAsia="Times New Roman" w:hAnsi="Times New Roman" w:cs="Times New Roman"/>
-          <w:sz w:val="24"/>
-          <w:szCs w:val="24"/>
-        </w:rPr>
-      </w:pPr>
-      <w:r>
-        <w:rPr>
-          <w:rFonts w:ascii="Times New Roman" w:eastAsia="Times New Roman" w:hAnsi="Times New Roman" w:cs="Times New Roman"/>
-          <w:sz w:val="24"/>
-          <w:szCs w:val="24"/>
-        </w:rPr>
-        <w:t>3.4.3 Inventory-Related Feature Engineering ............................. 24</w:t>
-      </w:r>
-    </w:p>
-    <w:p>
-      <w:pPr>
-        <w:jc w:val="both"/>
-        <w:rPr>
-          <w:rFonts w:ascii="Times New Roman" w:eastAsia="Times New Roman" w:hAnsi="Times New Roman" w:cs="Times New Roman"/>
-          <w:sz w:val="24"/>
-          <w:szCs w:val="24"/>
-        </w:rPr>
-      </w:pPr>
-      <w:r>
-        <w:rPr>
-          <w:rFonts w:ascii="Times New Roman" w:eastAsia="Times New Roman" w:hAnsi="Times New Roman" w:cs="Times New Roman"/>
-          <w:sz w:val="24"/>
-          <w:szCs w:val="24"/>
-        </w:rPr>
-        <w:t>3.4.4 Waste-Risk Indicators ............................................. 25</w:t>
-      </w:r>
-    </w:p>
-    <w:p>
-      <w:pPr>
-        <w:jc w:val="both"/>
-        <w:rPr>
-          <w:rFonts w:ascii="Times New Roman" w:eastAsia="Times New Roman" w:hAnsi="Times New Roman" w:cs="Times New Roman"/>
-          <w:sz w:val="24"/>
-          <w:szCs w:val="24"/>
-        </w:rPr>
-      </w:pPr>
-      <w:r>
-        <w:rPr>
-          <w:rFonts w:ascii="Times New Roman" w:eastAsia="Times New Roman" w:hAnsi="Times New Roman" w:cs="Times New Roman"/>
-          <w:sz w:val="24"/>
-          <w:szCs w:val="24"/>
-        </w:rPr>
-        <w:t xml:space="preserve">3.4.5 Data Transformation and Final Dataset </w:t>
-      </w:r>
-      <w:r>
-        <w:rPr>
-          <w:rFonts w:ascii="Times New Roman" w:eastAsia="Times New Roman" w:hAnsi="Times New Roman" w:cs="Times New Roman"/>
-          <w:sz w:val="24"/>
-          <w:szCs w:val="24"/>
-        </w:rPr>
-        <w:t>Preparation ................. 26</w:t>
-      </w:r>
-    </w:p>
-    <w:p>
-      <w:pPr>
-        <w:jc w:val="both"/>
-        <w:rPr>
-          <w:rFonts w:ascii="Times New Roman" w:eastAsia="Times New Roman" w:hAnsi="Times New Roman" w:cs="Times New Roman"/>
-          <w:sz w:val="24"/>
-          <w:szCs w:val="24"/>
-        </w:rPr>
-      </w:pPr>
-    </w:p>
-    <w:p>
-      <w:pPr>
-        <w:jc w:val="both"/>
-        <w:rPr>
-          <w:rFonts w:ascii="Times New Roman" w:eastAsia="Times New Roman" w:hAnsi="Times New Roman" w:cs="Times New Roman"/>
-          <w:sz w:val="24"/>
-          <w:szCs w:val="24"/>
-        </w:rPr>
-      </w:pPr>
-      <w:r>
-        <w:rPr>
-          <w:rFonts w:ascii="Times New Roman" w:eastAsia="Times New Roman" w:hAnsi="Times New Roman" w:cs="Times New Roman"/>
-          <w:sz w:val="24"/>
-          <w:szCs w:val="24"/>
-        </w:rPr>
-        <w:t>Chapter 4: Implementation, Evaluation and Deployment of the Forecasting Framework .................................</w:t>
-      </w:r>
-      <w:r>
-        <w:rPr>
-          <w:rFonts w:ascii="Times New Roman" w:eastAsia="Times New Roman" w:hAnsi="Times New Roman" w:cs="Times New Roman"/>
-          <w:sz w:val="24"/>
-          <w:szCs w:val="24"/>
-        </w:rPr>
-        <w:t>............................. 27</w:t>
-      </w:r>
-    </w:p>
-    <w:p>
-      <w:pPr>
-        <w:jc w:val="both"/>
-        <w:rPr>
-          <w:rFonts w:ascii="Times New Roman" w:eastAsia="Times New Roman" w:hAnsi="Times New Roman" w:cs="Times New Roman"/>
-          <w:sz w:val="24"/>
-          <w:szCs w:val="24"/>
-        </w:rPr>
-      </w:pPr>
-      <w:r>
-        <w:rPr>
-          <w:rFonts w:ascii="Times New Roman" w:eastAsia="Times New Roman" w:hAnsi="Times New Roman" w:cs="Times New Roman"/>
-          <w:sz w:val="24"/>
-          <w:szCs w:val="24"/>
-        </w:rPr>
-        <w:t>4.1 Forecasting Framework Overview .........</w:t>
-      </w:r>
-      <w:r>
-        <w:rPr>
-          <w:rFonts w:ascii="Times New Roman" w:eastAsia="Times New Roman" w:hAnsi="Times New Roman" w:cs="Times New Roman"/>
-          <w:sz w:val="24"/>
-          <w:szCs w:val="24"/>
+        <w:t>3.3.5 Dataset Limitations ..............</w:t>
+      </w:r>
+      <w:r>
+        <w:rPr>
+          <w:rFonts w:ascii="Times New Roman" w:hAnsi="Times New Roman" w:cs="Times New Roman"/>
+        </w:rPr>
+        <w:t>............................. 22</w:t>
+      </w:r>
+    </w:p>
+    <w:p>
+      <w:pPr>
+        <w:jc w:val="both"/>
+        <w:rPr>
+          <w:rFonts w:ascii="Times New Roman" w:eastAsia="Times New Roman" w:hAnsi="Times New Roman" w:cs="Times New Roman"/>
+          <w:sz w:val="24"/>
+          <w:szCs w:val="24"/>
+        </w:rPr>
+      </w:pPr>
+      <w:r>
+        <w:rPr>
+          <w:rFonts w:ascii="Times New Roman" w:hAnsi="Times New Roman" w:cs="Times New Roman"/>
+        </w:rPr>
+        <w:t>3.4 Data Preparation ...................</w:t>
+      </w:r>
+      <w:r>
+        <w:rPr>
+          <w:rFonts w:ascii="Times New Roman" w:hAnsi="Times New Roman" w:cs="Times New Roman"/>
+        </w:rPr>
+        <w:t>............................. 22</w:t>
+      </w:r>
+    </w:p>
+    <w:p>
+      <w:pPr>
+        <w:jc w:val="both"/>
+        <w:rPr>
+          <w:rFonts w:ascii="Times New Roman" w:eastAsia="Times New Roman" w:hAnsi="Times New Roman" w:cs="Times New Roman"/>
+          <w:sz w:val="24"/>
+          <w:szCs w:val="24"/>
+        </w:rPr>
+      </w:pPr>
+      <w:r>
+        <w:rPr>
+          <w:rFonts w:ascii="Times New Roman" w:hAnsi="Times New Roman" w:cs="Times New Roman"/>
+        </w:rPr>
+        <w:t>3.4.1 Data Cleaning and Preprocessing ..</w:t>
+      </w:r>
+      <w:r>
+        <w:rPr>
+          <w:rFonts w:ascii="Times New Roman" w:hAnsi="Times New Roman" w:cs="Times New Roman"/>
+        </w:rPr>
+        <w:t>............................. 22</w:t>
+      </w:r>
+    </w:p>
+    <w:p>
+      <w:pPr>
+        <w:jc w:val="both"/>
+        <w:rPr>
+          <w:rFonts w:ascii="Times New Roman" w:eastAsia="Times New Roman" w:hAnsi="Times New Roman" w:cs="Times New Roman"/>
+          <w:sz w:val="24"/>
+          <w:szCs w:val="24"/>
+        </w:rPr>
+      </w:pPr>
+      <w:r>
+        <w:rPr>
+          <w:rFonts w:ascii="Times New Roman" w:hAnsi="Times New Roman" w:cs="Times New Roman"/>
+        </w:rPr>
+        <w:t>3.4.2 Temporal Feature Engineering .....</w:t>
+      </w:r>
+      <w:r>
+        <w:rPr>
+          <w:rFonts w:ascii="Times New Roman" w:hAnsi="Times New Roman" w:cs="Times New Roman"/>
+        </w:rPr>
+        <w:t>............................. 23</w:t>
+      </w:r>
+    </w:p>
+    <w:p>
+      <w:pPr>
+        <w:jc w:val="both"/>
+        <w:rPr>
+          <w:rFonts w:ascii="Times New Roman" w:eastAsia="Times New Roman" w:hAnsi="Times New Roman" w:cs="Times New Roman"/>
+          <w:sz w:val="24"/>
+          <w:szCs w:val="24"/>
+        </w:rPr>
+      </w:pPr>
+      <w:r>
+        <w:rPr>
+          <w:rFonts w:ascii="Times New Roman" w:hAnsi="Times New Roman" w:cs="Times New Roman"/>
+        </w:rPr>
+        <w:t>3.4.3 Inventory-Related Feature Engineer</w:t>
+      </w:r>
+      <w:r>
+        <w:rPr>
+          <w:rFonts w:ascii="Times New Roman" w:hAnsi="Times New Roman" w:cs="Times New Roman"/>
+        </w:rPr>
+        <w:t>ing ......................... 23</w:t>
+      </w:r>
+    </w:p>
+    <w:p>
+      <w:pPr>
+        <w:jc w:val="both"/>
+        <w:rPr>
+          <w:rFonts w:ascii="Times New Roman" w:eastAsia="Times New Roman" w:hAnsi="Times New Roman" w:cs="Times New Roman"/>
+          <w:sz w:val="24"/>
+          <w:szCs w:val="24"/>
+        </w:rPr>
+      </w:pPr>
+      <w:r>
+        <w:rPr>
+          <w:rFonts w:ascii="Times New Roman" w:hAnsi="Times New Roman" w:cs="Times New Roman"/>
+        </w:rPr>
+        <w:t>3.4.4 Waste-Risk Indicators ............</w:t>
+      </w:r>
+      <w:r>
+        <w:rPr>
+          <w:rFonts w:ascii="Times New Roman" w:hAnsi="Times New Roman" w:cs="Times New Roman"/>
+        </w:rPr>
+        <w:t>............................. 24</w:t>
+      </w:r>
+    </w:p>
+    <w:p>
+      <w:pPr>
+        <w:jc w:val="both"/>
+        <w:rPr>
+          <w:rFonts w:ascii="Times New Roman" w:eastAsia="Times New Roman" w:hAnsi="Times New Roman" w:cs="Times New Roman"/>
+          <w:sz w:val="24"/>
+          <w:szCs w:val="24"/>
+        </w:rPr>
+      </w:pPr>
+      <w:r>
+        <w:rPr>
+          <w:rFonts w:ascii="Times New Roman" w:hAnsi="Times New Roman" w:cs="Times New Roman"/>
+        </w:rPr>
+        <w:t>3.4.5 Data Transformation and Final Data</w:t>
+      </w:r>
+      <w:r>
+        <w:rPr>
+          <w:rFonts w:ascii="Times New Roman" w:hAnsi="Times New Roman" w:cs="Times New Roman"/>
+        </w:rPr>
+        <w:t>set Preparation ............. 24</w:t>
+      </w:r>
+    </w:p>
+    <w:p>
+      <w:pPr>
+        <w:jc w:val="both"/>
+        <w:rPr>
+          <w:rFonts w:ascii="Times New Roman" w:eastAsia="Times New Roman" w:hAnsi="Times New Roman" w:cs="Times New Roman"/>
+          <w:sz w:val="24"/>
+          <w:szCs w:val="24"/>
+        </w:rPr>
+      </w:pPr>
+      <w:r>
+        <w:rPr>
+          <w:rFonts w:ascii="Times New Roman" w:hAnsi="Times New Roman" w:cs="Times New Roman"/>
+        </w:rPr>
+        <w:t>Chapter 4: Implementation, Evaluation and Deployment of the For</w:t>
+      </w:r>
+      <w:r>
+        <w:rPr>
+          <w:rFonts w:ascii="Times New Roman" w:hAnsi="Times New Roman" w:cs="Times New Roman"/>
+        </w:rPr>
+        <w:t>ecasting Framework .......... 25</w:t>
+      </w:r>
+    </w:p>
+    <w:p>
+      <w:pPr>
+        <w:jc w:val="both"/>
+        <w:rPr>
+          <w:rFonts w:ascii="Times New Roman" w:eastAsia="Times New Roman" w:hAnsi="Times New Roman" w:cs="Times New Roman"/>
+          <w:sz w:val="24"/>
+          <w:szCs w:val="24"/>
+        </w:rPr>
+      </w:pPr>
+      <w:r>
+        <w:rPr>
+          <w:rFonts w:ascii="Times New Roman" w:hAnsi="Times New Roman" w:cs="Times New Roman"/>
+        </w:rPr>
+        <w:t>4.1 Forecasting Framework Overview .....</w:t>
+      </w:r>
+      <w:r>
+        <w:rPr>
+          <w:rFonts w:ascii="Times New Roman" w:hAnsi="Times New Roman" w:cs="Times New Roman"/>
+        </w:rPr>
+        <w:t>............................. 25</w:t>
+      </w:r>
+    </w:p>
+    <w:p>
+      <w:pPr>
+        <w:jc w:val="both"/>
+        <w:rPr>
+          <w:rFonts w:ascii="Times New Roman" w:eastAsia="Times New Roman" w:hAnsi="Times New Roman" w:cs="Times New Roman"/>
+          <w:sz w:val="24"/>
+          <w:szCs w:val="24"/>
+        </w:rPr>
+      </w:pPr>
+      <w:r>
+        <w:rPr>
+          <w:rFonts w:ascii="Times New Roman" w:hAnsi="Times New Roman" w:cs="Times New Roman"/>
+        </w:rPr>
+        <w:t>4.2 Forecasting Model Development ......</w:t>
+      </w:r>
+      <w:r>
+        <w:rPr>
+          <w:rFonts w:ascii="Times New Roman" w:hAnsi="Times New Roman" w:cs="Times New Roman"/>
         </w:rPr>
         <w:t>............................. 28</w:t>
       </w:r>
@@ -1119,266 +1212,285 @@
       </w:pPr>
       <w:r>
         <w:rPr>
-          <w:rFonts w:ascii="Times New Roman" w:eastAsia="Times New Roman" w:hAnsi="Times New Roman" w:cs="Times New Roman"/>
-          <w:sz w:val="24"/>
-          <w:szCs w:val="24"/>
-        </w:rPr>
-        <w:t>4.2 Forecasting Model Development ....................................... 29</w:t>
-      </w:r>
-    </w:p>
-    <w:p>
-      <w:pPr>
-        <w:jc w:val="both"/>
-        <w:rPr>
-          <w:rFonts w:ascii="Times New Roman" w:eastAsia="Times New Roman" w:hAnsi="Times New Roman" w:cs="Times New Roman"/>
-          <w:sz w:val="24"/>
-          <w:szCs w:val="24"/>
-        </w:rPr>
-      </w:pPr>
-      <w:r>
-        <w:rPr>
-          <w:rFonts w:ascii="Times New Roman" w:eastAsia="Times New Roman" w:hAnsi="Times New Roman" w:cs="Times New Roman"/>
-          <w:sz w:val="24"/>
-          <w:szCs w:val="24"/>
-        </w:rPr>
-        <w:t>4.3 Demand Forecasting Performance Evaluation ........................... 30</w:t>
-      </w:r>
-    </w:p>
-    <w:p>
-      <w:pPr>
-        <w:jc w:val="both"/>
-        <w:rPr>
-          <w:rFonts w:ascii="Times New Roman" w:eastAsia="Times New Roman" w:hAnsi="Times New Roman" w:cs="Times New Roman"/>
-          <w:sz w:val="24"/>
-          <w:szCs w:val="24"/>
-        </w:rPr>
-      </w:pPr>
-      <w:r>
-        <w:rPr>
-          <w:rFonts w:ascii="Times New Roman" w:eastAsia="Times New Roman" w:hAnsi="Times New Roman" w:cs="Times New Roman"/>
-          <w:sz w:val="24"/>
-          <w:szCs w:val="24"/>
-        </w:rPr>
-        <w:t>4.4 Inventory Risk Assessment and Recommendation Support ............... 31</w:t>
-      </w:r>
-    </w:p>
-    <w:p>
-      <w:pPr>
-        <w:jc w:val="both"/>
-        <w:rPr>
-          <w:rFonts w:ascii="Times New Roman" w:eastAsia="Times New Roman" w:hAnsi="Times New Roman" w:cs="Times New Roman"/>
-          <w:sz w:val="24"/>
-          <w:szCs w:val="24"/>
-        </w:rPr>
-      </w:pPr>
-      <w:r>
-        <w:rPr>
-          <w:rFonts w:ascii="Times New Roman" w:eastAsia="Times New Roman" w:hAnsi="Times New Roman" w:cs="Times New Roman"/>
-          <w:sz w:val="24"/>
-          <w:szCs w:val="24"/>
-        </w:rPr>
-        <w:t>4.5 Forecasting Reliability Through Monitoring and Retraining ........... 33</w:t>
-      </w:r>
-    </w:p>
-    <w:p>
-      <w:pPr>
-        <w:jc w:val="both"/>
-        <w:rPr>
-          <w:rFonts w:ascii="Times New Roman" w:eastAsia="Times New Roman" w:hAnsi="Times New Roman" w:cs="Times New Roman"/>
-          <w:sz w:val="24"/>
-          <w:szCs w:val="24"/>
-        </w:rPr>
-      </w:pPr>
-      <w:r>
-        <w:rPr>
-          <w:rFonts w:ascii="Times New Roman" w:eastAsia="Times New Roman" w:hAnsi="Times New Roman" w:cs="Times New Roman"/>
-          <w:sz w:val="24"/>
-          <w:szCs w:val="24"/>
-        </w:rPr>
-        <w:t>4.6 Deployment of the Forecasting Framework ............................. 34</w:t>
-      </w:r>
-    </w:p>
-    <w:p>
-      <w:pPr>
-        <w:jc w:val="both"/>
-        <w:rPr>
-          <w:rFonts w:ascii="Times New Roman" w:eastAsia="Times New Roman" w:hAnsi="Times New Roman" w:cs="Times New Roman"/>
-          <w:sz w:val="24"/>
-          <w:szCs w:val="24"/>
-        </w:rPr>
-      </w:pPr>
-      <w:r>
-        <w:rPr>
-          <w:rFonts w:ascii="Times New Roman" w:eastAsia="Times New Roman" w:hAnsi="Times New Roman" w:cs="Times New Roman"/>
-          <w:sz w:val="24"/>
-          <w:szCs w:val="24"/>
-        </w:rPr>
-        <w:t>4.7 Business and Sustainability Impact .................................. 36</w:t>
-      </w:r>
-    </w:p>
-    <w:p>
-      <w:pPr>
-        <w:jc w:val="both"/>
-        <w:rPr>
-          <w:rFonts w:ascii="Times New Roman" w:eastAsia="Times New Roman" w:hAnsi="Times New Roman" w:cs="Times New Roman"/>
-          <w:sz w:val="24"/>
-          <w:szCs w:val="24"/>
-        </w:rPr>
-      </w:pPr>
-    </w:p>
-    <w:p>
-      <w:pPr>
-        <w:jc w:val="both"/>
-        <w:rPr>
-          <w:rFonts w:ascii="Times New Roman" w:eastAsia="Times New Roman" w:hAnsi="Times New Roman" w:cs="Times New Roman"/>
-          <w:sz w:val="24"/>
-          <w:szCs w:val="24"/>
-        </w:rPr>
-      </w:pPr>
-      <w:r>
-        <w:rPr>
-          <w:rFonts w:ascii="Times New Roman" w:eastAsia="Times New Roman" w:hAnsi="Times New Roman" w:cs="Times New Roman"/>
-          <w:sz w:val="24"/>
-          <w:szCs w:val="24"/>
-        </w:rPr>
-        <w:t>Chapter 5: Discussion, Conclusion and Future Perspectives ............... 37</w:t>
-      </w:r>
-    </w:p>
-    <w:p>
-      <w:pPr>
-        <w:jc w:val="both"/>
-        <w:rPr>
-          <w:rFonts w:ascii="Times New Roman" w:eastAsia="Times New Roman" w:hAnsi="Times New Roman" w:cs="Times New Roman"/>
-          <w:sz w:val="24"/>
-          <w:szCs w:val="24"/>
-        </w:rPr>
-      </w:pPr>
-      <w:r>
-        <w:rPr>
-          <w:rFonts w:ascii="Times New Roman" w:eastAsia="Times New Roman" w:hAnsi="Times New Roman" w:cs="Times New Roman"/>
-          <w:sz w:val="24"/>
-          <w:szCs w:val="24"/>
-        </w:rPr>
-        <w:t>5.1 Interpretation of Findings .......................................... 37</w:t>
-      </w:r>
-    </w:p>
-    <w:p>
-      <w:pPr>
-        <w:jc w:val="both"/>
-        <w:rPr>
-          <w:rFonts w:ascii="Times New Roman" w:eastAsia="Times New Roman" w:hAnsi="Times New Roman" w:cs="Times New Roman"/>
-          <w:sz w:val="24"/>
-          <w:szCs w:val="24"/>
-        </w:rPr>
-      </w:pPr>
-      <w:r>
-        <w:rPr>
-          <w:rFonts w:ascii="Times New Roman" w:eastAsia="Times New Roman" w:hAnsi="Times New Roman" w:cs="Times New Roman"/>
-          <w:sz w:val="24"/>
-          <w:szCs w:val="24"/>
-        </w:rPr>
-        <w:t>5.2 Comparison with Existing Research ................................... 38</w:t>
-      </w:r>
-    </w:p>
-    <w:p>
-      <w:pPr>
-        <w:jc w:val="both"/>
-        <w:rPr>
-          <w:rFonts w:ascii="Times New Roman" w:eastAsia="Times New Roman" w:hAnsi="Times New Roman" w:cs="Times New Roman"/>
-          <w:sz w:val="24"/>
-          <w:szCs w:val="24"/>
-        </w:rPr>
-      </w:pPr>
-      <w:r>
-        <w:rPr>
-          <w:rFonts w:ascii="Times New Roman" w:eastAsia="Times New Roman" w:hAnsi="Times New Roman" w:cs="Times New Roman"/>
-          <w:sz w:val="24"/>
-          <w:szCs w:val="24"/>
-        </w:rPr>
-        <w:t>5.3 Business and Sustainability Implications ............................ 39</w:t>
-      </w:r>
-    </w:p>
-    <w:p>
-      <w:pPr>
-        <w:jc w:val="both"/>
-        <w:rPr>
-          <w:rFonts w:ascii="Times New Roman" w:eastAsia="Times New Roman" w:hAnsi="Times New Roman" w:cs="Times New Roman"/>
-          <w:sz w:val="24"/>
-          <w:szCs w:val="24"/>
-        </w:rPr>
-      </w:pPr>
-      <w:r>
-        <w:rPr>
-          <w:rFonts w:ascii="Times New Roman" w:eastAsia="Times New Roman" w:hAnsi="Times New Roman" w:cs="Times New Roman"/>
-          <w:sz w:val="24"/>
-          <w:szCs w:val="24"/>
-        </w:rPr>
-        <w:t>5.4 Limitations of the Study ............................................ 40</w:t>
-      </w:r>
-    </w:p>
-    <w:p>
-      <w:pPr>
-        <w:jc w:val="both"/>
-        <w:rPr>
-          <w:rFonts w:ascii="Times New Roman" w:eastAsia="Times New Roman" w:hAnsi="Times New Roman" w:cs="Times New Roman"/>
-          <w:sz w:val="24"/>
-          <w:szCs w:val="24"/>
-        </w:rPr>
-      </w:pPr>
-      <w:r>
-        <w:rPr>
-          <w:rFonts w:ascii="Times New Roman" w:eastAsia="Times New Roman" w:hAnsi="Times New Roman" w:cs="Times New Roman"/>
-          <w:sz w:val="24"/>
-          <w:szCs w:val="24"/>
-        </w:rPr>
-        <w:t>5.5 Governance, Ethical Considerations and Operational Risks ............ 41</w:t>
-      </w:r>
-    </w:p>
-    <w:p>
-      <w:pPr>
-        <w:jc w:val="both"/>
-        <w:rPr>
-          <w:rFonts w:ascii="Times New Roman" w:eastAsia="Times New Roman" w:hAnsi="Times New Roman" w:cs="Times New Roman"/>
-          <w:sz w:val="24"/>
-          <w:szCs w:val="24"/>
-        </w:rPr>
-      </w:pPr>
-      <w:r>
-        <w:rPr>
-          <w:rFonts w:ascii="Times New Roman" w:eastAsia="Times New Roman" w:hAnsi="Times New Roman" w:cs="Times New Roman"/>
-          <w:sz w:val="24"/>
-          <w:szCs w:val="24"/>
-        </w:rPr>
-        <w:lastRenderedPageBreak/>
-        <w:t>5.6 Conclusion and Future Research ...................................... 42</w:t>
-      </w:r>
-    </w:p>
-    <w:p>
-      <w:pPr>
-        <w:jc w:val="both"/>
-        <w:rPr>
-          <w:rFonts w:ascii="Times New Roman" w:eastAsia="Times New Roman" w:hAnsi="Times New Roman" w:cs="Times New Roman"/>
-          <w:sz w:val="24"/>
-          <w:szCs w:val="24"/>
-        </w:rPr>
-      </w:pPr>
-    </w:p>
-    <w:p>
-      <w:pPr>
-        <w:jc w:val="both"/>
-        <w:rPr>
-          <w:rFonts w:ascii="Times New Roman" w:eastAsia="Times New Roman" w:hAnsi="Times New Roman" w:cs="Times New Roman"/>
-          <w:sz w:val="24"/>
-          <w:szCs w:val="24"/>
-        </w:rPr>
-      </w:pPr>
-      <w:r>
-        <w:rPr>
-          <w:rFonts w:ascii="Times New Roman" w:eastAsia="Times New Roman" w:hAnsi="Times New Roman" w:cs="Times New Roman"/>
-          <w:sz w:val="24"/>
-          <w:szCs w:val="24"/>
-        </w:rPr>
-        <w:t>References .............................................................. 43</w:t>
+          <w:rFonts w:ascii="Times New Roman" w:hAnsi="Times New Roman" w:cs="Times New Roman"/>
+        </w:rPr>
+        <w:t>4.3 Demand Forecasting Performance Evalu</w:t>
+      </w:r>
+      <w:r>
+        <w:rPr>
+          <w:rFonts w:ascii="Times New Roman" w:hAnsi="Times New Roman" w:cs="Times New Roman"/>
+        </w:rPr>
+        <w:t>ation ....................... 29</w:t>
+      </w:r>
+    </w:p>
+    <w:p>
+      <w:pPr>
+        <w:jc w:val="both"/>
+        <w:rPr>
+          <w:rFonts w:ascii="Times New Roman" w:eastAsia="Times New Roman" w:hAnsi="Times New Roman" w:cs="Times New Roman"/>
+          <w:sz w:val="24"/>
+          <w:szCs w:val="24"/>
+        </w:rPr>
+      </w:pPr>
+      <w:r>
+        <w:rPr>
+          <w:rFonts w:ascii="Times New Roman" w:hAnsi="Times New Roman" w:cs="Times New Roman"/>
+        </w:rPr>
+        <w:t>4.4 Inventory Assessment and Intelligent Reco</w:t>
+      </w:r>
+      <w:r>
+        <w:rPr>
+          <w:rFonts w:ascii="Times New Roman" w:hAnsi="Times New Roman" w:cs="Times New Roman"/>
+        </w:rPr>
+        <w:t>mmendation Support .......... 31</w:t>
+      </w:r>
+    </w:p>
+    <w:p>
+      <w:pPr>
+        <w:jc w:val="both"/>
+        <w:rPr>
+          <w:rFonts w:ascii="Times New Roman" w:eastAsia="Times New Roman" w:hAnsi="Times New Roman" w:cs="Times New Roman"/>
+          <w:sz w:val="24"/>
+          <w:szCs w:val="24"/>
+        </w:rPr>
+      </w:pPr>
+      <w:r>
+        <w:rPr>
+          <w:rFonts w:ascii="Times New Roman" w:hAnsi="Times New Roman" w:cs="Times New Roman"/>
+        </w:rPr>
+        <w:t>4.5 Forecasting Reliability Through Monitoring and Au</w:t>
+      </w:r>
+      <w:r>
+        <w:rPr>
+          <w:rFonts w:ascii="Times New Roman" w:hAnsi="Times New Roman" w:cs="Times New Roman"/>
+        </w:rPr>
+        <w:t>tomatic Retraining .......... 34</w:t>
+      </w:r>
+    </w:p>
+    <w:p>
+      <w:pPr>
+        <w:jc w:val="both"/>
+        <w:rPr>
+          <w:rFonts w:ascii="Times New Roman" w:eastAsia="Times New Roman" w:hAnsi="Times New Roman" w:cs="Times New Roman"/>
+          <w:sz w:val="24"/>
+          <w:szCs w:val="24"/>
+        </w:rPr>
+      </w:pPr>
+      <w:r>
+        <w:rPr>
+          <w:rFonts w:ascii="Times New Roman" w:hAnsi="Times New Roman" w:cs="Times New Roman"/>
+        </w:rPr>
+        <w:t>4.6 Deployment of the Forecasting Framew</w:t>
+      </w:r>
+      <w:r>
+        <w:rPr>
+          <w:rFonts w:ascii="Times New Roman" w:hAnsi="Times New Roman" w:cs="Times New Roman"/>
+        </w:rPr>
+        <w:t>ork ......................... 35</w:t>
+      </w:r>
+    </w:p>
+    <w:p>
+      <w:pPr>
+        <w:jc w:val="both"/>
+        <w:rPr>
+          <w:rFonts w:ascii="Times New Roman" w:eastAsia="Times New Roman" w:hAnsi="Times New Roman" w:cs="Times New Roman"/>
+          <w:sz w:val="24"/>
+          <w:szCs w:val="24"/>
+        </w:rPr>
+      </w:pPr>
+      <w:r>
+        <w:rPr>
+          <w:rFonts w:ascii="Times New Roman" w:hAnsi="Times New Roman" w:cs="Times New Roman"/>
+        </w:rPr>
+        <w:t>4.7 Business and Sustainability Impact .</w:t>
+      </w:r>
+      <w:r>
+        <w:rPr>
+          <w:rFonts w:ascii="Times New Roman" w:hAnsi="Times New Roman" w:cs="Times New Roman"/>
+        </w:rPr>
+        <w:t>............................. 36</w:t>
+      </w:r>
+    </w:p>
+    <w:p>
+      <w:pPr>
+        <w:jc w:val="both"/>
+        <w:rPr>
+          <w:rFonts w:ascii="Times New Roman" w:eastAsia="Times New Roman" w:hAnsi="Times New Roman" w:cs="Times New Roman"/>
+          <w:sz w:val="24"/>
+          <w:szCs w:val="24"/>
+        </w:rPr>
+      </w:pPr>
+      <w:r>
+        <w:rPr>
+          <w:rFonts w:ascii="Times New Roman" w:hAnsi="Times New Roman" w:cs="Times New Roman"/>
+        </w:rPr>
+        <w:t>Chapter 5: Discussion, Conclusion and Future Perspectives ........... 38</w:t>
+      </w:r>
+    </w:p>
+    <w:p>
+      <w:pPr>
+        <w:jc w:val="both"/>
+        <w:rPr>
+          <w:rFonts w:ascii="Times New Roman" w:eastAsia="Times New Roman" w:hAnsi="Times New Roman" w:cs="Times New Roman"/>
+          <w:sz w:val="24"/>
+          <w:szCs w:val="24"/>
+        </w:rPr>
+      </w:pPr>
+      <w:r>
+        <w:rPr>
+          <w:rFonts w:ascii="Times New Roman" w:hAnsi="Times New Roman" w:cs="Times New Roman"/>
+        </w:rPr>
+        <w:t>5.1 Interpretation of Findings ...................................... 38</w:t>
+      </w:r>
+    </w:p>
+    <w:p>
+      <w:pPr>
+        <w:jc w:val="both"/>
+        <w:rPr>
+          <w:rFonts w:ascii="Times New Roman" w:eastAsia="Times New Roman" w:hAnsi="Times New Roman" w:cs="Times New Roman"/>
+          <w:sz w:val="24"/>
+          <w:szCs w:val="24"/>
+        </w:rPr>
+      </w:pPr>
+      <w:r>
+        <w:rPr>
+          <w:rFonts w:ascii="Times New Roman" w:hAnsi="Times New Roman" w:cs="Times New Roman"/>
+        </w:rPr>
+        <w:t>5.2 Comparison with Existing Research ..</w:t>
+      </w:r>
+      <w:r>
+        <w:rPr>
+          <w:rFonts w:ascii="Times New Roman" w:hAnsi="Times New Roman" w:cs="Times New Roman"/>
+        </w:rPr>
+        <w:t>............................. 39</w:t>
+      </w:r>
+    </w:p>
+    <w:p>
+      <w:pPr>
+        <w:jc w:val="both"/>
+        <w:rPr>
+          <w:rFonts w:ascii="Times New Roman" w:eastAsia="Times New Roman" w:hAnsi="Times New Roman" w:cs="Times New Roman"/>
+          <w:sz w:val="24"/>
+          <w:szCs w:val="24"/>
+        </w:rPr>
+      </w:pPr>
+      <w:r>
+        <w:rPr>
+          <w:rFonts w:ascii="Times New Roman" w:hAnsi="Times New Roman" w:cs="Times New Roman"/>
+        </w:rPr>
+        <w:t>5.3 Business and Sustainability Implicat</w:t>
+      </w:r>
+      <w:r>
+        <w:rPr>
+          <w:rFonts w:ascii="Times New Roman" w:hAnsi="Times New Roman" w:cs="Times New Roman"/>
+        </w:rPr>
+        <w:t>ions ........................ 40</w:t>
+      </w:r>
+    </w:p>
+    <w:p>
+      <w:pPr>
+        <w:jc w:val="both"/>
+        <w:rPr>
+          <w:rFonts w:ascii="Times New Roman" w:eastAsia="Times New Roman" w:hAnsi="Times New Roman" w:cs="Times New Roman"/>
+          <w:sz w:val="24"/>
+          <w:szCs w:val="24"/>
+        </w:rPr>
+      </w:pPr>
+      <w:r>
+        <w:rPr>
+          <w:rFonts w:ascii="Times New Roman" w:hAnsi="Times New Roman" w:cs="Times New Roman"/>
+        </w:rPr>
+        <w:t>5.4 Limitations of the Study ...........</w:t>
+      </w:r>
+      <w:r>
+        <w:rPr>
+          <w:rFonts w:ascii="Times New Roman" w:hAnsi="Times New Roman" w:cs="Times New Roman"/>
+        </w:rPr>
+        <w:t>............................. 41</w:t>
+      </w:r>
+    </w:p>
+    <w:p>
+      <w:pPr>
+        <w:jc w:val="both"/>
+        <w:rPr>
+          <w:rFonts w:ascii="Times New Roman" w:eastAsia="Times New Roman" w:hAnsi="Times New Roman" w:cs="Times New Roman"/>
+          <w:sz w:val="24"/>
+          <w:szCs w:val="24"/>
+        </w:rPr>
+      </w:pPr>
+      <w:r>
+        <w:rPr>
+          <w:rFonts w:ascii="Times New Roman" w:hAnsi="Times New Roman" w:cs="Times New Roman"/>
+        </w:rPr>
+        <w:t>5.5 Governance, Ethical Considerations and Operational Risks .......... 44</w:t>
+      </w:r>
+    </w:p>
+    <w:p>
+      <w:pPr>
+        <w:jc w:val="both"/>
+        <w:rPr>
+          <w:rFonts w:ascii="Times New Roman" w:eastAsia="Times New Roman" w:hAnsi="Times New Roman" w:cs="Times New Roman"/>
+          <w:sz w:val="24"/>
+          <w:szCs w:val="24"/>
+        </w:rPr>
+      </w:pPr>
+      <w:r>
+        <w:rPr>
+          <w:rFonts w:ascii="Times New Roman" w:hAnsi="Times New Roman" w:cs="Times New Roman"/>
+        </w:rPr>
+        <w:t>5.6 Future Research Opportunities ................................... 45</w:t>
+      </w:r>
+    </w:p>
+    <w:p>
+      <w:pPr>
+        <w:jc w:val="both"/>
+        <w:rPr>
+          <w:rFonts w:ascii="Times New Roman" w:eastAsia="Times New Roman" w:hAnsi="Times New Roman" w:cs="Times New Roman"/>
+          <w:sz w:val="24"/>
+          <w:szCs w:val="24"/>
+        </w:rPr>
+      </w:pPr>
+      <w:r>
+        <w:rPr>
+          <w:rFonts w:ascii="Times New Roman" w:hAnsi="Times New Roman" w:cs="Times New Roman"/>
+        </w:rPr>
+        <w:t>5.7 Conclusion .........................</w:t>
+      </w:r>
+      <w:r>
+        <w:rPr>
+          <w:rFonts w:ascii="Times New Roman" w:hAnsi="Times New Roman" w:cs="Times New Roman"/>
+        </w:rPr>
+        <w:t>............................. 47</w:t>
+      </w:r>
+      <w:bookmarkStart w:id="0" w:name="_GoBack"/>
+      <w:bookmarkEnd w:id="0"/>
+    </w:p>
+    <w:p>
+      <w:pPr>
+        <w:jc w:val="both"/>
+        <w:rPr>
+          <w:rFonts w:ascii="Times New Roman" w:eastAsia="Times New Roman" w:hAnsi="Times New Roman" w:cs="Times New Roman"/>
+          <w:sz w:val="24"/>
+          <w:szCs w:val="24"/>
+        </w:rPr>
+      </w:pPr>
+      <w:r>
+        <w:rPr>
+          <w:rFonts w:ascii="Times New Roman" w:hAnsi="Times New Roman" w:cs="Times New Roman"/>
+        </w:rPr>
+        <w:t>References .............................</w:t>
+      </w:r>
+      <w:r>
+        <w:rPr>
+          <w:rFonts w:ascii="Times New Roman" w:hAnsi="Times New Roman" w:cs="Times New Roman"/>
+        </w:rPr>
+        <w:t>............................. 4</w:t>
+      </w:r>
+      <w:r>
+        <w:rPr>
+          <w:rFonts w:ascii="Times New Roman" w:hAnsi="Times New Roman" w:cs="Times New Roman"/>
+        </w:rPr>
+        <w:t>9</w:t>
       </w:r>
     </w:p>
     <w:p>
@@ -1400,11 +1512,21 @@
       </w:pPr>
       <w:r>
         <w:rPr>
-          <w:rFonts w:ascii="Times New Roman" w:eastAsia="Times New Roman" w:hAnsi="Times New Roman" w:cs="Times New Roman"/>
-          <w:sz w:val="24"/>
-          <w:szCs w:val="24"/>
-        </w:rPr>
-        <w:t>Appendix A: Declaration of Generative AI Use ............................ 44</w:t>
+          <w:rFonts w:ascii="Times New Roman" w:hAnsi="Times New Roman" w:cs="Times New Roman"/>
+        </w:rPr>
+        <w:t>Appendix A: Declaration of Generative AI</w:t>
+      </w:r>
+      <w:r>
+        <w:rPr>
+          <w:rFonts w:ascii="Times New Roman" w:hAnsi="Times New Roman" w:cs="Times New Roman"/>
+        </w:rPr>
+        <w:t xml:space="preserve"> Use ........................ </w:t>
+      </w:r>
+      <w:r>
+        <w:rPr>
+          <w:rFonts w:ascii="Times New Roman" w:hAnsi="Times New Roman" w:cs="Times New Roman"/>
+        </w:rPr>
+        <w:t>50</w:t>
       </w:r>
     </w:p>
     <w:p>
@@ -8177,8 +8299,8 @@
         <w:tblLook w:val="04A0" w:firstRow="1" w:lastRow="0" w:firstColumn="1" w:lastColumn="0" w:noHBand="0" w:noVBand="1"/>
       </w:tblPr>
       <w:tblGrid>
-        <w:gridCol w:w="5589"/>
-        <w:gridCol w:w="1175"/>
+        <w:gridCol w:w="5617"/>
+        <w:gridCol w:w="1147"/>
       </w:tblGrid>
       <w:tr>
         <w:trPr>
@@ -8197,12 +8319,14 @@
             <w:pPr>
               <w:jc w:val="center"/>
               <w:rPr>
+                <w:rFonts w:ascii="Times New Roman" w:hAnsi="Times New Roman" w:cs="Times New Roman"/>
                 <w:b/>
                 <w:bCs/>
               </w:rPr>
             </w:pPr>
             <w:r>
               <w:rPr>
+                <w:rFonts w:ascii="Times New Roman" w:hAnsi="Times New Roman" w:cs="Times New Roman"/>
                 <w:b/>
                 <w:bCs/>
               </w:rPr>
@@ -8220,12 +8344,14 @@
             <w:pPr>
               <w:jc w:val="center"/>
               <w:rPr>
+                <w:rFonts w:ascii="Times New Roman" w:hAnsi="Times New Roman" w:cs="Times New Roman"/>
                 <w:b/>
                 <w:bCs/>
               </w:rPr>
             </w:pPr>
             <w:r>
               <w:rPr>
+                <w:rFonts w:ascii="Times New Roman" w:hAnsi="Times New Roman" w:cs="Times New Roman"/>
                 <w:b/>
                 <w:bCs/>
               </w:rPr>
@@ -8247,7 +8373,15 @@
             <w:hideMark/>
           </w:tcPr>
           <w:p>
+            <w:pPr>
+              <w:rPr>
+                <w:rFonts w:ascii="Times New Roman" w:hAnsi="Times New Roman" w:cs="Times New Roman"/>
+              </w:rPr>
+            </w:pPr>
             <w:r>
+              <w:rPr>
+                <w:rFonts w:ascii="Times New Roman" w:hAnsi="Times New Roman" w:cs="Times New Roman"/>
+              </w:rPr>
               <w:t>Test MAE</w:t>
             </w:r>
           </w:p>
@@ -8259,9 +8393,15 @@
             <w:hideMark/>
           </w:tcPr>
           <w:p>
+            <w:pPr>
+              <w:rPr>
+                <w:rFonts w:ascii="Times New Roman" w:hAnsi="Times New Roman" w:cs="Times New Roman"/>
+              </w:rPr>
+            </w:pPr>
             <w:r>
               <w:rPr>
                 <w:rStyle w:val="Strong"/>
+                <w:rFonts w:ascii="Times New Roman" w:hAnsi="Times New Roman" w:cs="Times New Roman"/>
               </w:rPr>
               <w:t>215.36</w:t>
             </w:r>
@@ -8281,7 +8421,15 @@
             <w:hideMark/>
           </w:tcPr>
           <w:p>
+            <w:pPr>
+              <w:rPr>
+                <w:rFonts w:ascii="Times New Roman" w:hAnsi="Times New Roman" w:cs="Times New Roman"/>
+              </w:rPr>
+            </w:pPr>
             <w:r>
+              <w:rPr>
+                <w:rFonts w:ascii="Times New Roman" w:hAnsi="Times New Roman" w:cs="Times New Roman"/>
+              </w:rPr>
               <w:t>Test RMSE</w:t>
             </w:r>
           </w:p>
@@ -8293,9 +8441,15 @@
             <w:hideMark/>
           </w:tcPr>
           <w:p>
+            <w:pPr>
+              <w:rPr>
+                <w:rFonts w:ascii="Times New Roman" w:hAnsi="Times New Roman" w:cs="Times New Roman"/>
+              </w:rPr>
+            </w:pPr>
             <w:r>
               <w:rPr>
                 <w:rStyle w:val="Strong"/>
+                <w:rFonts w:ascii="Times New Roman" w:hAnsi="Times New Roman" w:cs="Times New Roman"/>
               </w:rPr>
               <w:t>482.89</w:t>
             </w:r>
@@ -8315,7 +8469,15 @@
             <w:hideMark/>
           </w:tcPr>
           <w:p>
+            <w:pPr>
+              <w:rPr>
+                <w:rFonts w:ascii="Times New Roman" w:hAnsi="Times New Roman" w:cs="Times New Roman"/>
+              </w:rPr>
+            </w:pPr>
             <w:r>
+              <w:rPr>
+                <w:rFonts w:ascii="Times New Roman" w:hAnsi="Times New Roman" w:cs="Times New Roman"/>
+              </w:rPr>
               <w:t>Test R² Score</w:t>
             </w:r>
           </w:p>
@@ -8327,9 +8489,15 @@
             <w:hideMark/>
           </w:tcPr>
           <w:p>
+            <w:pPr>
+              <w:rPr>
+                <w:rFonts w:ascii="Times New Roman" w:hAnsi="Times New Roman" w:cs="Times New Roman"/>
+              </w:rPr>
+            </w:pPr>
             <w:r>
               <w:rPr>
                 <w:rStyle w:val="Strong"/>
+                <w:rFonts w:ascii="Times New Roman" w:hAnsi="Times New Roman" w:cs="Times New Roman"/>
               </w:rPr>
               <w:t>0.9515</w:t>
             </w:r>
@@ -8349,7 +8517,15 @@
             <w:hideMark/>
           </w:tcPr>
           <w:p>
+            <w:pPr>
+              <w:rPr>
+                <w:rFonts w:ascii="Times New Roman" w:hAnsi="Times New Roman" w:cs="Times New Roman"/>
+              </w:rPr>
+            </w:pPr>
             <w:r>
+              <w:rPr>
+                <w:rFonts w:ascii="Times New Roman" w:hAnsi="Times New Roman" w:cs="Times New Roman"/>
+              </w:rPr>
               <w:t>Train RMSE</w:t>
             </w:r>
           </w:p>
@@ -8361,9 +8537,15 @@
             <w:hideMark/>
           </w:tcPr>
           <w:p>
+            <w:pPr>
+              <w:rPr>
+                <w:rFonts w:ascii="Times New Roman" w:hAnsi="Times New Roman" w:cs="Times New Roman"/>
+              </w:rPr>
+            </w:pPr>
             <w:r>
               <w:rPr>
                 <w:rStyle w:val="Strong"/>
+                <w:rFonts w:ascii="Times New Roman" w:hAnsi="Times New Roman" w:cs="Times New Roman"/>
               </w:rPr>
               <w:t>475.98</w:t>
             </w:r>
@@ -8383,7 +8565,15 @@
             <w:hideMark/>
           </w:tcPr>
           <w:p>
+            <w:pPr>
+              <w:rPr>
+                <w:rFonts w:ascii="Times New Roman" w:hAnsi="Times New Roman" w:cs="Times New Roman"/>
+              </w:rPr>
+            </w:pPr>
             <w:r>
+              <w:rPr>
+                <w:rFonts w:ascii="Times New Roman" w:hAnsi="Times New Roman" w:cs="Times New Roman"/>
+              </w:rPr>
               <w:t>Cross-Validation RMSE</w:t>
             </w:r>
           </w:p>
@@ -8395,9 +8585,15 @@
             <w:hideMark/>
           </w:tcPr>
           <w:p>
+            <w:pPr>
+              <w:rPr>
+                <w:rFonts w:ascii="Times New Roman" w:hAnsi="Times New Roman" w:cs="Times New Roman"/>
+              </w:rPr>
+            </w:pPr>
             <w:r>
               <w:rPr>
                 <w:rStyle w:val="Strong"/>
+                <w:rFonts w:ascii="Times New Roman" w:hAnsi="Times New Roman" w:cs="Times New Roman"/>
               </w:rPr>
               <w:t>784.76</w:t>
             </w:r>
@@ -8417,7 +8613,15 @@
             <w:hideMark/>
           </w:tcPr>
           <w:p>
+            <w:pPr>
+              <w:rPr>
+                <w:rFonts w:ascii="Times New Roman" w:hAnsi="Times New Roman" w:cs="Times New Roman"/>
+              </w:rPr>
+            </w:pPr>
             <w:r>
+              <w:rPr>
+                <w:rFonts w:ascii="Times New Roman" w:hAnsi="Times New Roman" w:cs="Times New Roman"/>
+              </w:rPr>
               <w:t>Cross-Validation Standard Deviation</w:t>
             </w:r>
           </w:p>
@@ -8429,9 +8633,15 @@
             <w:hideMark/>
           </w:tcPr>
           <w:p>
+            <w:pPr>
+              <w:rPr>
+                <w:rFonts w:ascii="Times New Roman" w:hAnsi="Times New Roman" w:cs="Times New Roman"/>
+              </w:rPr>
+            </w:pPr>
             <w:r>
               <w:rPr>
                 <w:rStyle w:val="Strong"/>
+                <w:rFonts w:ascii="Times New Roman" w:hAnsi="Times New Roman" w:cs="Times New Roman"/>
               </w:rPr>
               <w:t>237.02</w:t>
             </w:r>
@@ -8451,7 +8661,15 @@
             <w:hideMark/>
           </w:tcPr>
           <w:p>
+            <w:pPr>
+              <w:rPr>
+                <w:rFonts w:ascii="Times New Roman" w:hAnsi="Times New Roman" w:cs="Times New Roman"/>
+              </w:rPr>
+            </w:pPr>
             <w:r>
+              <w:rPr>
+                <w:rFonts w:ascii="Times New Roman" w:hAnsi="Times New Roman" w:cs="Times New Roman"/>
+              </w:rPr>
               <w:t>Generalization Gap</w:t>
             </w:r>
           </w:p>
@@ -8463,9 +8681,15 @@
             <w:hideMark/>
           </w:tcPr>
           <w:p>
+            <w:pPr>
+              <w:rPr>
+                <w:rFonts w:ascii="Times New Roman" w:hAnsi="Times New Roman" w:cs="Times New Roman"/>
+              </w:rPr>
+            </w:pPr>
             <w:r>
               <w:rPr>
                 <w:rStyle w:val="Strong"/>
+                <w:rFonts w:ascii="Times New Roman" w:hAnsi="Times New Roman" w:cs="Times New Roman"/>
               </w:rPr>
               <w:t>6.91</w:t>
             </w:r>
@@ -8612,6 +8836,9 @@
         <w:pStyle w:val="NormalWeb"/>
       </w:pPr>
       <w:r>
+        <w:rPr>
+          <w:noProof/>
+        </w:rPr>
         <w:drawing>
           <wp:inline distT="0" distB="0" distL="0" distR="0" wp14:anchorId="4542CF95" wp14:editId="341309B7">
             <wp:extent cx="5943027" cy="2581155"/>
@@ -8654,6 +8881,9 @@
         <w:pStyle w:val="NormalWeb"/>
       </w:pPr>
       <w:r>
+        <w:rPr>
+          <w:noProof/>
+        </w:rPr>
         <w:drawing>
           <wp:inline distT="0" distB="0" distL="0" distR="0" wp14:anchorId="06FCA571" wp14:editId="29B653BF">
             <wp:extent cx="5942225" cy="1678329"/>
@@ -8821,13 +9051,7 @@
         <w:t>current stock levels, expiry-related conditions, and engineered waste-risk indicators</w:t>
       </w:r>
       <w:r>
-        <w:t xml:space="preserve">. By </w:t>
-      </w:r>
-      <w:r>
-        <w:t>analyzing</w:t>
-      </w:r>
-      <w:r>
-        <w:t xml:space="preserve"> the relationship between expected demand and available inventory, the framework identifies situations that may increase the likelihood of inventory inefficiencies or </w:t>
+        <w:t xml:space="preserve">. By analyzing the relationship between expected demand and available inventory, the framework identifies situations that may increase the likelihood of inventory inefficiencies or </w:t>
       </w:r>
       <w:r>
         <w:rPr>
@@ -8957,9 +9181,9 @@
         <w:tblLook w:val="04A0" w:firstRow="1" w:lastRow="0" w:firstColumn="1" w:lastColumn="0" w:noHBand="0" w:noVBand="1"/>
       </w:tblPr>
       <w:tblGrid>
-        <w:gridCol w:w="3069"/>
-        <w:gridCol w:w="1722"/>
-        <w:gridCol w:w="4559"/>
+        <w:gridCol w:w="3105"/>
+        <w:gridCol w:w="1732"/>
+        <w:gridCol w:w="4513"/>
       </w:tblGrid>
       <w:tr>
         <w:trPr>
@@ -9067,7 +9291,15 @@
             <w:hideMark/>
           </w:tcPr>
           <w:p>
+            <w:pPr>
+              <w:rPr>
+                <w:rFonts w:ascii="Times New Roman" w:hAnsi="Times New Roman" w:cs="Times New Roman"/>
+              </w:rPr>
+            </w:pPr>
             <w:r>
+              <w:rPr>
+                <w:rFonts w:ascii="Times New Roman" w:hAnsi="Times New Roman" w:cs="Times New Roman"/>
+              </w:rPr>
               <w:t>Forecasted Demand &gt; Current Stock</w:t>
             </w:r>
           </w:p>
@@ -9079,12 +9311,23 @@
             <w:hideMark/>
           </w:tcPr>
           <w:p>
+            <w:pPr>
+              <w:rPr>
+                <w:rFonts w:ascii="Times New Roman" w:hAnsi="Times New Roman" w:cs="Times New Roman"/>
+              </w:rPr>
+            </w:pPr>
             <w:proofErr w:type="spellStart"/>
             <w:r>
+              <w:rPr>
+                <w:rFonts w:ascii="Times New Roman" w:hAnsi="Times New Roman" w:cs="Times New Roman"/>
+              </w:rPr>
               <w:t>Stockout</w:t>
             </w:r>
             <w:proofErr w:type="spellEnd"/>
             <w:r>
+              <w:rPr>
+                <w:rFonts w:ascii="Times New Roman" w:hAnsi="Times New Roman" w:cs="Times New Roman"/>
+              </w:rPr>
               <w:t xml:space="preserve"> Risk</w:t>
             </w:r>
           </w:p>
@@ -9096,7 +9339,15 @@
             <w:hideMark/>
           </w:tcPr>
           <w:p>
+            <w:pPr>
+              <w:rPr>
+                <w:rFonts w:ascii="Times New Roman" w:hAnsi="Times New Roman" w:cs="Times New Roman"/>
+              </w:rPr>
+            </w:pPr>
             <w:r>
+              <w:rPr>
+                <w:rFonts w:ascii="Times New Roman" w:hAnsi="Times New Roman" w:cs="Times New Roman"/>
+              </w:rPr>
               <w:t>Increase replenishment quantity</w:t>
             </w:r>
           </w:p>
@@ -9114,7 +9365,15 @@
             <w:hideMark/>
           </w:tcPr>
           <w:p>
+            <w:pPr>
+              <w:rPr>
+                <w:rFonts w:ascii="Times New Roman" w:hAnsi="Times New Roman" w:cs="Times New Roman"/>
+              </w:rPr>
+            </w:pPr>
             <w:r>
+              <w:rPr>
+                <w:rFonts w:ascii="Times New Roman" w:hAnsi="Times New Roman" w:cs="Times New Roman"/>
+              </w:rPr>
               <w:t>Forecasted Demand &lt; Current Stock</w:t>
             </w:r>
           </w:p>
@@ -9126,7 +9385,15 @@
             <w:hideMark/>
           </w:tcPr>
           <w:p>
+            <w:pPr>
+              <w:rPr>
+                <w:rFonts w:ascii="Times New Roman" w:hAnsi="Times New Roman" w:cs="Times New Roman"/>
+              </w:rPr>
+            </w:pPr>
             <w:r>
+              <w:rPr>
+                <w:rFonts w:ascii="Times New Roman" w:hAnsi="Times New Roman" w:cs="Times New Roman"/>
+              </w:rPr>
               <w:t>Overstock Risk</w:t>
             </w:r>
           </w:p>
@@ -9138,7 +9405,15 @@
             <w:hideMark/>
           </w:tcPr>
           <w:p>
+            <w:pPr>
+              <w:rPr>
+                <w:rFonts w:ascii="Times New Roman" w:hAnsi="Times New Roman" w:cs="Times New Roman"/>
+              </w:rPr>
+            </w:pPr>
             <w:r>
+              <w:rPr>
+                <w:rFonts w:ascii="Times New Roman" w:hAnsi="Times New Roman" w:cs="Times New Roman"/>
+              </w:rPr>
               <w:t>Reduce future ordering and monitor inventory</w:t>
             </w:r>
           </w:p>
@@ -9156,7 +9431,15 @@
             <w:hideMark/>
           </w:tcPr>
           <w:p>
+            <w:pPr>
+              <w:rPr>
+                <w:rFonts w:ascii="Times New Roman" w:hAnsi="Times New Roman" w:cs="Times New Roman"/>
+              </w:rPr>
+            </w:pPr>
             <w:r>
+              <w:rPr>
+                <w:rFonts w:ascii="Times New Roman" w:hAnsi="Times New Roman" w:cs="Times New Roman"/>
+              </w:rPr>
               <w:t>Excess Stock + Short Expiry</w:t>
             </w:r>
           </w:p>
@@ -9168,7 +9451,15 @@
             <w:hideMark/>
           </w:tcPr>
           <w:p>
+            <w:pPr>
+              <w:rPr>
+                <w:rFonts w:ascii="Times New Roman" w:hAnsi="Times New Roman" w:cs="Times New Roman"/>
+              </w:rPr>
+            </w:pPr>
             <w:r>
+              <w:rPr>
+                <w:rFonts w:ascii="Times New Roman" w:hAnsi="Times New Roman" w:cs="Times New Roman"/>
+              </w:rPr>
               <w:t>High Waste Risk</w:t>
             </w:r>
           </w:p>
@@ -9180,7 +9471,15 @@
             <w:hideMark/>
           </w:tcPr>
           <w:p>
+            <w:pPr>
+              <w:rPr>
+                <w:rFonts w:ascii="Times New Roman" w:hAnsi="Times New Roman" w:cs="Times New Roman"/>
+              </w:rPr>
+            </w:pPr>
             <w:r>
+              <w:rPr>
+                <w:rFonts w:ascii="Times New Roman" w:hAnsi="Times New Roman" w:cs="Times New Roman"/>
+              </w:rPr>
               <w:t>Promotion, stock redistribution, inventory adjustment</w:t>
             </w:r>
           </w:p>
@@ -9199,6 +9498,7 @@
         <w:rPr>
           <w:rStyle w:val="Strong"/>
           <w:rFonts w:eastAsiaTheme="majorEastAsia"/>
+          <w:noProof/>
         </w:rPr>
         <w:drawing>
           <wp:inline distT="0" distB="0" distL="0" distR="0" wp14:anchorId="3A15B268" wp14:editId="3E1F970E">
@@ -9249,6 +9549,7 @@
         <w:rPr>
           <w:rStyle w:val="Strong"/>
           <w:rFonts w:eastAsiaTheme="majorEastAsia"/>
+          <w:noProof/>
         </w:rPr>
         <w:lastRenderedPageBreak/>
         <w:drawing>
@@ -9573,6 +9874,7 @@
       <w:r>
         <w:rPr>
           <w:rStyle w:val="HTMLCode"/>
+          <w:rFonts w:ascii="Times New Roman" w:hAnsi="Times New Roman" w:cs="Times New Roman"/>
         </w:rPr>
         <w:t>demand_model.pkl</w:t>
       </w:r>
@@ -9609,17 +9911,17 @@
         <w:t xml:space="preserve"> under the predefined threshold. The detection of drift triggered the automatic retraining process, after which a new version of the selected forecasting model was generated and stored. This demonstrates the connection between operational monitoring, </w:t>
       </w:r>
       <w:r>
-        <w:t xml:space="preserve">drift identification, and model </w:t>
-      </w:r>
-      <w:r>
-        <w:t>maintenance within the implemented framework.</w:t>
-      </w:r>
-    </w:p>
-    <w:p>
-      <w:pPr>
-        <w:pStyle w:val="NormalWeb"/>
-      </w:pPr>
-      <w:r>
+        <w:t>drift identification, and model maintenance within the implemented framework.</w:t>
+      </w:r>
+    </w:p>
+    <w:p>
+      <w:pPr>
+        <w:pStyle w:val="NormalWeb"/>
+      </w:pPr>
+      <w:r>
+        <w:rPr>
+          <w:noProof/>
+        </w:rPr>
         <w:lastRenderedPageBreak/>
         <w:drawing>
           <wp:inline distT="0" distB="0" distL="0" distR="0" wp14:anchorId="57D74EC4" wp14:editId="6176DD73">
@@ -9783,6 +10085,7 @@
       <w:r>
         <w:rPr>
           <w:rStyle w:val="HTMLCode"/>
+          <w:rFonts w:ascii="Times New Roman" w:hAnsi="Times New Roman" w:cs="Times New Roman"/>
           <w:b/>
           <w:bCs/>
         </w:rPr>
@@ -9794,6 +10097,7 @@
       <w:r>
         <w:rPr>
           <w:rStyle w:val="HTMLCode"/>
+          <w:rFonts w:ascii="Times New Roman" w:hAnsi="Times New Roman" w:cs="Times New Roman"/>
           <w:b/>
           <w:bCs/>
         </w:rPr>
@@ -9996,9 +10300,11 @@
     </w:p>
     <w:p>
       <w:pPr>
-        <w:pStyle w:val="Heading1"/>
-        <w:jc w:val="both"/>
-        <w:rPr>
+        <w:rPr>
+          <w:rFonts w:ascii="Times New Roman" w:eastAsia="Times New Roman" w:hAnsi="Times New Roman" w:cs="Times New Roman"/>
+          <w:b/>
+          <w:bCs/>
+          <w:kern w:val="36"/>
           <w:sz w:val="36"/>
           <w:szCs w:val="36"/>
         </w:rPr>
@@ -10008,13 +10314,31 @@
           <w:sz w:val="36"/>
           <w:szCs w:val="36"/>
         </w:rPr>
-        <w:t xml:space="preserve">Chapter 5: </w:t>
-      </w:r>
-      <w:r>
+        <w:br w:type="page"/>
+      </w:r>
+    </w:p>
+    <w:p>
+      <w:pPr>
+        <w:pStyle w:val="Heading1"/>
+        <w:jc w:val="both"/>
         <w:rPr>
           <w:sz w:val="36"/>
           <w:szCs w:val="36"/>
         </w:rPr>
+      </w:pPr>
+      <w:r>
+        <w:rPr>
+          <w:sz w:val="36"/>
+          <w:szCs w:val="36"/>
+        </w:rPr>
+        <w:lastRenderedPageBreak/>
+        <w:t xml:space="preserve">Chapter 5: </w:t>
+      </w:r>
+      <w:r>
+        <w:rPr>
+          <w:sz w:val="36"/>
+          <w:szCs w:val="36"/>
+        </w:rPr>
         <w:t>Discussion, Conclusion and Future Perspectives</w:t>
       </w:r>
     </w:p>
@@ -10078,68 +10402,374 @@
         <w:t>Test MAE of 215.36, Test RMSE of 482.89, and Test R² Score of 0.9515</w:t>
       </w:r>
       <w:r>
-        <w:t xml:space="preserve">, indicating strong predictive performance </w:t>
+        <w:t xml:space="preserve">, indicating strong predictive performance on the final test dataset. The relatively small difference between the training RMSE of </w:t>
+      </w:r>
+      <w:r>
+        <w:rPr>
+          <w:rStyle w:val="Strong"/>
+          <w:rFonts w:eastAsiaTheme="majorEastAsia"/>
+        </w:rPr>
+        <w:t>475.98</w:t>
+      </w:r>
+      <w:r>
+        <w:t xml:space="preserve"> and testing RMSE of </w:t>
+      </w:r>
+      <w:r>
+        <w:rPr>
+          <w:rStyle w:val="Strong"/>
+          <w:rFonts w:eastAsiaTheme="majorEastAsia"/>
+        </w:rPr>
+        <w:t>482.89</w:t>
+      </w:r>
+      <w:r>
+        <w:t xml:space="preserve"> also suggests that substantial overfitting was not observed on the final train-test split. However, the higher </w:t>
+      </w:r>
+      <w:proofErr w:type="spellStart"/>
+      <w:r>
+        <w:rPr>
+          <w:rStyle w:val="Strong"/>
+          <w:rFonts w:eastAsiaTheme="majorEastAsia"/>
+        </w:rPr>
+        <w:t>TimeSeriesSplit</w:t>
+      </w:r>
+      <w:proofErr w:type="spellEnd"/>
+      <w:r>
+        <w:rPr>
+          <w:rStyle w:val="Strong"/>
+          <w:rFonts w:eastAsiaTheme="majorEastAsia"/>
+        </w:rPr>
+        <w:t xml:space="preserve"> cross-validation RMSE of 784.76</w:t>
+      </w:r>
+      <w:r>
+        <w:t xml:space="preserve">, with a standard deviation of </w:t>
+      </w:r>
+      <w:r>
+        <w:rPr>
+          <w:rStyle w:val="Strong"/>
+          <w:rFonts w:eastAsiaTheme="majorEastAsia"/>
+        </w:rPr>
+        <w:t>237.02</w:t>
+      </w:r>
+      <w:r>
+        <w:t>, indicates that forecasting performance varied across different chronological periods. This variation highlights the importance of evaluating retail forecasting models across changing temporal conditions rather than relying solely on a single test result.</w:t>
+      </w:r>
+    </w:p>
+    <w:p>
+      <w:pPr>
+        <w:pStyle w:val="NormalWeb"/>
+      </w:pPr>
+      <w:r>
+        <w:t xml:space="preserve">From an inventory planning perspective, the findings suggest that the value of forecasting extends beyond predictive accuracy. Forecasting outputs provide greater visibility into expected demand, allowing inventory conditions to be assessed in relation to anticipated sales. When predicted demand is considered together with current stock levels, expiry-related conditions, and engineered waste-risk indicators, the framework can identify situations associated with </w:t>
+      </w:r>
+      <w:proofErr w:type="spellStart"/>
+      <w:r>
+        <w:rPr>
+          <w:rStyle w:val="Strong"/>
+          <w:rFonts w:eastAsiaTheme="majorEastAsia"/>
+        </w:rPr>
+        <w:t>stockout</w:t>
+      </w:r>
+      <w:proofErr w:type="spellEnd"/>
+      <w:r>
+        <w:rPr>
+          <w:rStyle w:val="Strong"/>
+          <w:rFonts w:eastAsiaTheme="majorEastAsia"/>
+        </w:rPr>
+        <w:t xml:space="preserve"> risk, overstock risk, and elevated inventory-related waste risk</w:t>
+      </w:r>
+      <w:r>
+        <w:t>. This demonstrates how demand forecasting can serve as an analytical foundation for more proactive inventory management rather than functioning solely as a prediction exercise.</w:t>
+      </w:r>
+    </w:p>
+    <w:p>
+      <w:pPr>
+        <w:pStyle w:val="NormalWeb"/>
+      </w:pPr>
+      <w:r>
+        <w:t xml:space="preserve">The findings also demonstrate the importance of translating forecasting outputs into </w:t>
+      </w:r>
+      <w:r>
+        <w:rPr>
+          <w:rStyle w:val="Strong"/>
+          <w:rFonts w:eastAsiaTheme="majorEastAsia"/>
+        </w:rPr>
+        <w:t>actionable inventory recommendations</w:t>
+      </w:r>
+      <w:r>
+        <w:t>. Within the proposed framework, predefined inventory assessment rules convert demand predictions and inventory conditions into recommendations such as increasing replenishment, reducing future ordering, monitoring excess inventory, or considering promotional and stock redistribution actions. This connection between prediction and recommendation improves the practical usefulness of the forecasting system by providing decision-makers with interpretable guidance rather than requiring them to interpret forecasting values independently.</w:t>
+      </w:r>
+    </w:p>
+    <w:p>
+      <w:pPr>
+        <w:pStyle w:val="NormalWeb"/>
+      </w:pPr>
+      <w:r>
+        <w:t xml:space="preserve">Another important finding concerns </w:t>
+      </w:r>
+      <w:r>
+        <w:rPr>
+          <w:rStyle w:val="Strong"/>
+          <w:rFonts w:eastAsiaTheme="majorEastAsia"/>
+        </w:rPr>
+        <w:t>forecasting reliability under changing operational conditions</w:t>
+      </w:r>
+      <w:r>
+        <w:t xml:space="preserve">. The implemented monitoring mechanism identified drift in </w:t>
+      </w:r>
+      <w:r>
+        <w:rPr>
+          <w:rStyle w:val="Strong"/>
+          <w:rFonts w:eastAsiaTheme="majorEastAsia"/>
+        </w:rPr>
+        <w:t>units sold, current stock, and waste quantity</w:t>
+      </w:r>
+      <w:r>
+        <w:t xml:space="preserve">, while temperature remained stable during the evaluated drift </w:t>
       </w:r>
       <w:r>
         <w:lastRenderedPageBreak/>
-        <w:t xml:space="preserve">on the final test dataset. The relatively small difference between the training RMSE of </w:t>
+        <w:t>scenario. The detection of significant drift triggered the automatic retraining process and resulted in the creation of a new versioned forecasting model. This demonstrates how monitoring, drift detection, model versioning, and automatic retraining can be integrated with demand forecasting to support model maintenance when operational data patterns change. The finding is consistent with previous research emphasizing the importance of continuous monitoring and lifecycle management for operational machine learning systems (</w:t>
+      </w:r>
+      <w:proofErr w:type="spellStart"/>
+      <w:r>
+        <w:t>Sculley</w:t>
+      </w:r>
+      <w:proofErr w:type="spellEnd"/>
+      <w:r>
+        <w:t xml:space="preserve"> et al., 2015; </w:t>
+      </w:r>
+      <w:proofErr w:type="spellStart"/>
+      <w:r>
+        <w:t>Kreuzberger</w:t>
+      </w:r>
+      <w:proofErr w:type="spellEnd"/>
+      <w:r>
+        <w:t xml:space="preserve"> et al., 2023).</w:t>
+      </w:r>
+    </w:p>
+    <w:p>
+      <w:pPr>
+        <w:pStyle w:val="NormalWeb"/>
+      </w:pPr>
+      <w:r>
+        <w:t xml:space="preserve">The findings should nevertheless be interpreted within the boundaries of the available data. The Walmart dataset does not contain direct observations of </w:t>
       </w:r>
       <w:r>
         <w:rPr>
           <w:rStyle w:val="Strong"/>
           <w:rFonts w:eastAsiaTheme="majorEastAsia"/>
         </w:rPr>
-        <w:t>475.98</w:t>
-      </w:r>
-      <w:r>
-        <w:t xml:space="preserve"> and testing RMSE of </w:t>
+        <w:t>food waste, spoilage, or product disposal</w:t>
+      </w:r>
+      <w:r>
+        <w:t xml:space="preserve">. Therefore, this study does not demonstrate that a specific quantity of food waste was actually reduced. Instead, the engineered inventory and waste-risk indicators enable the framework to identify conditions that may be associated with a greater likelihood of inventory-related waste. The contribution should therefore be understood as </w:t>
       </w:r>
       <w:r>
         <w:rPr>
           <w:rStyle w:val="Strong"/>
           <w:rFonts w:eastAsiaTheme="majorEastAsia"/>
         </w:rPr>
-        <w:t>482.89</w:t>
-      </w:r>
-      <w:r>
-        <w:t xml:space="preserve"> also suggests that substantial overfitting was not observed on the final train-test split. However, the higher </w:t>
+        <w:t>supporting inventory-related waste-risk identification and preventive decision-making</w:t>
+      </w:r>
+      <w:r>
+        <w:t>, rather than directly measuring food-waste reduction.</w:t>
+      </w:r>
+    </w:p>
+    <w:p>
+      <w:pPr>
+        <w:pStyle w:val="NormalWeb"/>
+      </w:pPr>
+      <w:r>
+        <w:t xml:space="preserve">Overall, the findings suggest that the greatest value of the proposed framework comes from integrating </w:t>
+      </w:r>
+      <w:r>
+        <w:rPr>
+          <w:rStyle w:val="Strong"/>
+          <w:rFonts w:eastAsiaTheme="majorEastAsia"/>
+        </w:rPr>
+        <w:t>demand forecasting, inventory assessment, intelligent recommendation support, and forecasting reliability mechanisms</w:t>
+      </w:r>
+      <w:r>
+        <w:t xml:space="preserve"> within a single decision-support environment. Rather than treating machine learning forecasting as an isolated predictive task, the framework demonstrates how forecasting outputs can be connected with operational inventory information to support more informed, adaptive, and sustainability-oriented retail decision-making.</w:t>
+      </w:r>
+    </w:p>
+    <w:p>
+      <w:pPr>
+        <w:pStyle w:val="Heading2"/>
+      </w:pPr>
+      <w:r>
+        <w:t>5.2 Comparison with Existing Research</w:t>
+      </w:r>
+    </w:p>
+    <w:p>
+      <w:pPr>
+        <w:pStyle w:val="NormalWeb"/>
+      </w:pPr>
+      <w:r>
+        <w:t>The findings of this study are broadly consistent with existing research on the application of machine learning to retail demand forecasting. Previous studies have demonstrated that machine learning models can capture complex and non-linear relationships within structured data and can incorporate multiple factors that influence demand. The strong test performance achieved by the Random Forest model in this study is consistent with the wider literature suggesting that ensemble-based machine learning methods can be suitable for forecasting problems involving multiple interacting retail variables.</w:t>
+      </w:r>
+    </w:p>
+    <w:p>
+      <w:pPr>
+        <w:pStyle w:val="NormalWeb"/>
+      </w:pPr>
+      <w:r>
+        <w:t xml:space="preserve">The findings also support the broader literature emphasizing the importance of demand forecasting for inventory planning. Improved visibility into expected demand can assist retailers in making more informed decisions regarding replenishment, stock allocation, and inventory management. In the present study, this relationship was extended by combining demand predictions with </w:t>
+      </w:r>
+      <w:r>
+        <w:rPr>
+          <w:rStyle w:val="Strong"/>
+          <w:rFonts w:eastAsiaTheme="majorEastAsia"/>
+        </w:rPr>
+        <w:t>current stock levels, expiry-related conditions, and engineered waste-risk indicators</w:t>
+      </w:r>
+      <w:r>
+        <w:t>. This enabled forecasting outputs to be interpreted in relation to operational inventory conditions rather than being evaluated only through predictive performance metrics.</w:t>
+      </w:r>
+    </w:p>
+    <w:p>
+      <w:pPr>
+        <w:pStyle w:val="NormalWeb"/>
+      </w:pPr>
+      <w:r>
+        <w:t xml:space="preserve">An important distinction of the proposed framework is the integration of </w:t>
+      </w:r>
+      <w:r>
+        <w:rPr>
+          <w:rStyle w:val="Strong"/>
+          <w:rFonts w:eastAsiaTheme="majorEastAsia"/>
+        </w:rPr>
+        <w:t>forecasting, inventory assessment, intelligent recommendation support, monitoring, and model maintenance</w:t>
+      </w:r>
+      <w:r>
+        <w:t xml:space="preserve"> within the same decision-support environment. As discussed in the literature review, many forecasting studies place substantial emphasis on model development and offline predictive </w:t>
+      </w:r>
+      <w:r>
+        <w:lastRenderedPageBreak/>
+        <w:t>performance. The present study extends this perspective by examining how forecasting outputs can be operationalized to support inventory-related decisions and how forecasting reliability can be maintained when operational data patterns change. This approach is consistent with research emphasizing monitoring and lifecycle management as important considerations for operational machine learning systems (</w:t>
       </w:r>
       <w:proofErr w:type="spellStart"/>
       <w:r>
+        <w:t>Sculley</w:t>
+      </w:r>
+      <w:proofErr w:type="spellEnd"/>
+      <w:r>
+        <w:t xml:space="preserve"> et al., 2015; </w:t>
+      </w:r>
+      <w:proofErr w:type="spellStart"/>
+      <w:r>
+        <w:t>Kreuzberger</w:t>
+      </w:r>
+      <w:proofErr w:type="spellEnd"/>
+      <w:r>
+        <w:t xml:space="preserve"> et al., 2023).</w:t>
+      </w:r>
+    </w:p>
+    <w:p>
+      <w:pPr>
+        <w:pStyle w:val="NormalWeb"/>
+      </w:pPr>
+      <w:r>
+        <w:t xml:space="preserve">The study also extends the forecasting discussion toward </w:t>
+      </w:r>
+      <w:r>
         <w:rPr>
           <w:rStyle w:val="Strong"/>
           <w:rFonts w:eastAsiaTheme="majorEastAsia"/>
         </w:rPr>
-        <w:t>TimeSeriesSplit</w:t>
+        <w:t>inventory-related waste-risk identification</w:t>
+      </w:r>
+      <w:r>
+        <w:t>. Rather than attempting to predict actual food waste, the proposed framework combines demand forecasts with engineered inventory and expiry-related indicators to identify conditions associated with elevated waste risk. This distinction is important because the Walmart dataset does not contain direct observations of food waste, spoilage, or product disposal. The findings therefore complement the broader sustainability literature by demonstrating how forecasting-supported inventory assessment may contribute to earlier identification of inventory conditions that could increase the likelihood of waste.</w:t>
+      </w:r>
+    </w:p>
+    <w:p>
+      <w:pPr>
+        <w:pStyle w:val="NormalWeb"/>
+      </w:pPr>
+      <w:r>
+        <w:t xml:space="preserve">At the same time, direct comparison with previous food-waste studies should be made cautiously because the present research evaluates </w:t>
+      </w:r>
+      <w:r>
+        <w:rPr>
+          <w:rStyle w:val="Strong"/>
+          <w:rFonts w:eastAsiaTheme="majorEastAsia"/>
+        </w:rPr>
+        <w:t>waste risk through engineered indicators rather than observed food-waste outcomes</w:t>
+      </w:r>
+      <w:r>
+        <w:t xml:space="preserve">. Similarly, the study does not directly compare machine learning forecasting with traditional statistical forecasting approaches. Its empirical comparison is specifically between </w:t>
+      </w:r>
+      <w:r>
+        <w:rPr>
+          <w:rStyle w:val="Strong"/>
+          <w:rFonts w:eastAsiaTheme="majorEastAsia"/>
+        </w:rPr>
+        <w:t xml:space="preserve">Random Forest and </w:t>
+      </w:r>
+      <w:proofErr w:type="spellStart"/>
+      <w:r>
+        <w:rPr>
+          <w:rStyle w:val="Strong"/>
+          <w:rFonts w:eastAsiaTheme="majorEastAsia"/>
+        </w:rPr>
+        <w:t>XGBoost</w:t>
       </w:r>
       <w:proofErr w:type="spellEnd"/>
       <w:r>
+        <w:t>. Therefore, the contribution of the study lies primarily in demonstrating how machine learning-based demand forecasting can be connected with inventory assessment, recommendation support, and model-monitoring mechanisms within an integrated retail decision-support framework.</w:t>
+      </w:r>
+    </w:p>
+    <w:p>
+      <w:pPr>
+        <w:pStyle w:val="NormalWeb"/>
+      </w:pPr>
+      <w:r>
+        <w:t xml:space="preserve">Overall, comparison with existing research indicates that the findings are consistent with established work on machine learning-based forecasting and operational model management while extending the analysis toward </w:t>
+      </w:r>
+      <w:r>
         <w:rPr>
           <w:rStyle w:val="Strong"/>
           <w:rFonts w:eastAsiaTheme="majorEastAsia"/>
         </w:rPr>
-        <w:t xml:space="preserve"> cross-validation RMSE of 784.76</w:t>
-      </w:r>
-      <w:r>
-        <w:t xml:space="preserve">, with a standard deviation of </w:t>
+        <w:t>intelligent inventory decision support and inventory-related waste-risk identification</w:t>
+      </w:r>
+      <w:r>
+        <w:t>. The proposed framework therefore illustrates how forecasting can be considered not only as a predictive task but also as one component of a broader operational decision-support process within supermarket environments.</w:t>
+      </w:r>
+    </w:p>
+    <w:p>
+      <w:pPr>
+        <w:pStyle w:val="Heading2"/>
+      </w:pPr>
+      <w:r>
+        <w:t>5.3 Business and Sustainability Implications</w:t>
+      </w:r>
+    </w:p>
+    <w:p>
+      <w:pPr>
+        <w:pStyle w:val="NormalWeb"/>
+      </w:pPr>
+      <w:r>
+        <w:t xml:space="preserve">The findings of this study have practical implications for both </w:t>
       </w:r>
       <w:r>
         <w:rPr>
           <w:rStyle w:val="Strong"/>
           <w:rFonts w:eastAsiaTheme="majorEastAsia"/>
         </w:rPr>
-        <w:t>237.02</w:t>
-      </w:r>
-      <w:r>
-        <w:t>, indicates that forecasting performance varied across different chronological periods. This variation highlights the importance of evaluating retail forecasting models across changing temporal conditions rather than relying solely on a single test result.</w:t>
-      </w:r>
-    </w:p>
-    <w:p>
-      <w:pPr>
-        <w:pStyle w:val="NormalWeb"/>
-      </w:pPr>
-      <w:r>
-        <w:t xml:space="preserve">From an inventory planning perspective, the findings suggest that the value of forecasting extends beyond predictive accuracy. Forecasting outputs provide greater visibility into expected demand, allowing inventory conditions to be assessed in relation to anticipated sales. When predicted demand is considered together with current stock levels, expiry-related conditions, and engineered waste-risk indicators, the framework can identify situations associated with </w:t>
+        <w:t>retail inventory management and sustainability-oriented decision-making</w:t>
+      </w:r>
+      <w:r>
+        <w:t>. From a business perspective, reliable demand forecasting can improve visibility into expected future demand and provide retailers with a stronger basis for inventory planning. This is particularly relevant in supermarket environments, where inventory decisions must balance product availability with the risk of maintaining unnecessary stock.</w:t>
+      </w:r>
+    </w:p>
+    <w:p>
+      <w:pPr>
+        <w:pStyle w:val="NormalWeb"/>
+      </w:pPr>
+      <w:r>
+        <w:t xml:space="preserve">The integration of forecasting outputs with inventory-related information increases the operational usefulness of the proposed framework. By comparing predicted demand with current stock levels and expiry-related conditions, the system can identify situations where inventory may become misaligned with anticipated demand. Early identification of </w:t>
       </w:r>
       <w:proofErr w:type="spellStart"/>
       <w:r>
@@ -10155,100 +10785,235 @@
           <w:rStyle w:val="Strong"/>
           <w:rFonts w:eastAsiaTheme="majorEastAsia"/>
         </w:rPr>
-        <w:t xml:space="preserve"> risk, overstock risk, and elevated inventory-related waste risk</w:t>
-      </w:r>
-      <w:r>
-        <w:t>. This demonstrates how demand forecasting can serve as an analytical foundation for more proactive inventory management rather than functioning solely as a prediction exercise.</w:t>
-      </w:r>
-    </w:p>
-    <w:p>
-      <w:pPr>
-        <w:pStyle w:val="NormalWeb"/>
-      </w:pPr>
-      <w:r>
-        <w:t xml:space="preserve">The findings also demonstrate the importance of translating forecasting outputs into </w:t>
+        <w:t xml:space="preserve"> and overstock conditions</w:t>
+      </w:r>
+      <w:r>
+        <w:t xml:space="preserve"> can support more proactive replenishment and stock-adjustment decisions rather than relying only on reactive inventory management.</w:t>
+      </w:r>
+    </w:p>
+    <w:p>
+      <w:pPr>
+        <w:pStyle w:val="NormalWeb"/>
+      </w:pPr>
+      <w:r>
+        <w:lastRenderedPageBreak/>
+        <w:t xml:space="preserve">The </w:t>
       </w:r>
       <w:r>
         <w:rPr>
           <w:rStyle w:val="Strong"/>
           <w:rFonts w:eastAsiaTheme="majorEastAsia"/>
         </w:rPr>
-        <w:t>actionable inventory recommendations</w:t>
-      </w:r>
-      <w:r>
-        <w:t>. Within the proposed framework, predefined inventory assessment rules convert demand predictions and inventory conditions into recommendations such as increasing replenishment, reducing future ordering, monitoring excess inventory, or considering promotional and stock redistribution actions. This connection between prediction and recommendation improves the practical usefulness of the forecasting system by providing decision-makers with interpretable guidance rather than requiring them to interpret forecasting values independently.</w:t>
-      </w:r>
-    </w:p>
-    <w:p>
-      <w:pPr>
-        <w:pStyle w:val="NormalWeb"/>
-      </w:pPr>
-      <w:r>
-        <w:t xml:space="preserve">Another important finding concerns </w:t>
+        <w:t>intelligent recommendation support</w:t>
+      </w:r>
+      <w:r>
+        <w:t xml:space="preserve"> component further strengthens this business value by translating forecasting and inventory information into actionable guidance. Recommendations related to replenishment, reduced future ordering, inventory monitoring, promotional activity, and stock redistribution provide decision-makers with practical responses to identified inventory conditions. The framework should nevertheless be considered a </w:t>
       </w:r>
       <w:r>
         <w:rPr>
           <w:rStyle w:val="Strong"/>
           <w:rFonts w:eastAsiaTheme="majorEastAsia"/>
         </w:rPr>
-        <w:t>forecasting reliability under changing operational conditions</w:t>
-      </w:r>
-      <w:r>
-        <w:t xml:space="preserve">. The implemented monitoring mechanism identified drift in </w:t>
+        <w:t>decision-support tool rather than an autonomous inventory management system</w:t>
+      </w:r>
+      <w:r>
+        <w:t>. Retail managers would still need to consider additional operational factors, such as supplier availability, procurement constraints, pricing strategies, and business priorities, before implementing inventory actions.</w:t>
+      </w:r>
+    </w:p>
+    <w:p>
+      <w:pPr>
+        <w:pStyle w:val="NormalWeb"/>
+      </w:pPr>
+      <w:r>
+        <w:t>From a sustainability perspective, improved alignment between expected demand and available inventory may help reduce conditions associated with unnecessary inventory accumulation. This is particularly relevant for products with shorter expiry periods, where excess stock can increase the likelihood of spoilage and inventory loss. By identifying elevated waste-risk situations earlier, the framework can support preventive actions such as reducing future replenishment, promoting products, or redistributing available stock.</w:t>
+      </w:r>
+    </w:p>
+    <w:p>
+      <w:pPr>
+        <w:pStyle w:val="NormalWeb"/>
+      </w:pPr>
+      <w:r>
+        <w:t xml:space="preserve">However, the sustainability implications should be interpreted cautiously. The Walmart dataset used in this study does not contain direct observations of </w:t>
       </w:r>
       <w:r>
         <w:rPr>
           <w:rStyle w:val="Strong"/>
           <w:rFonts w:eastAsiaTheme="majorEastAsia"/>
         </w:rPr>
-        <w:t>units sold, current stock, and waste quantity</w:t>
-      </w:r>
-      <w:r>
-        <w:t>, while temperature remained stable during the evaluated drift scenario. The detection of significant drift triggered the automatic retraining process and resulted in the creation of a new versioned forecasting model. This demonstrates how monitoring, drift detection, model versioning, and automatic retraining can be integrated with demand forecasting to support model maintenance when operational data patterns change. The finding is consistent with previous research emphasizing the importance of continuous monitoring and lifecycle management for operational machine learning systems (</w:t>
+        <w:t>food waste, spoilage quantities, or disposal records</w:t>
+      </w:r>
+      <w:r>
+        <w:t xml:space="preserve">. Therefore, the study cannot quantify how much food waste would actually be prevented through use of the proposed framework. Instead, the results demonstrate how demand forecasting and inventory assessment can support the identification of operational conditions associated with </w:t>
+      </w:r>
+      <w:r>
+        <w:rPr>
+          <w:rStyle w:val="Strong"/>
+          <w:rFonts w:eastAsiaTheme="majorEastAsia"/>
+        </w:rPr>
+        <w:t>inventory-related waste risk</w:t>
+      </w:r>
+      <w:r>
+        <w:t>. This represents a potential contribution to more sustainable inventory management rather than direct evidence of measured food-waste reduction.</w:t>
+      </w:r>
+    </w:p>
+    <w:p>
+      <w:pPr>
+        <w:pStyle w:val="NormalWeb"/>
+      </w:pPr>
+      <w:r>
+        <w:t>The monitoring and model-maintenance components also have business implications. Forecasting-based inventory decisions depend on the continued relevance of model outputs, while retail demand conditions may change over time. The integration of drift detection, model versioning, and automatic retraining provides a mechanism for identifying such changes and updating the forecasting model when necessary. This supports the longer-term operational usefulness of the decision-support framework rather than treating model development as a one-time activity.</w:t>
+      </w:r>
+    </w:p>
+    <w:p>
+      <w:pPr>
+        <w:pStyle w:val="NormalWeb"/>
+      </w:pPr>
+      <w:r>
+        <w:t xml:space="preserve">Overall, the study suggests that the business and sustainability value of AI-driven forecasting is created through the </w:t>
+      </w:r>
+      <w:r>
+        <w:rPr>
+          <w:rStyle w:val="Strong"/>
+          <w:rFonts w:eastAsiaTheme="majorEastAsia"/>
+        </w:rPr>
+        <w:t>connection between prediction and action</w:t>
+      </w:r>
+      <w:r>
+        <w:t>. Demand forecasts provide visibility into expected sales, inventory assessment identifies potential imbalances, and intelligent recommendations translate these findings into possible operational responses. Through this integration, the proposed framework can support more informed inventory planning while contributing to the broader objective of reducing conditions associated with inventory-related waste.</w:t>
+      </w:r>
+    </w:p>
+    <w:p>
+      <w:pPr>
+        <w:pStyle w:val="Heading2"/>
+      </w:pPr>
+      <w:r>
+        <w:t>5.4 Limitations of the Study</w:t>
+      </w:r>
+    </w:p>
+    <w:p>
+      <w:pPr>
+        <w:pStyle w:val="NormalWeb"/>
+      </w:pPr>
+      <w:r>
+        <w:t>Although the proposed framework produced promising forecasting and decision-support results, several limitations should be considered when interpreting the findings.</w:t>
+      </w:r>
+    </w:p>
+    <w:p>
+      <w:pPr>
+        <w:pStyle w:val="NormalWeb"/>
+      </w:pPr>
+      <w:r>
+        <w:lastRenderedPageBreak/>
+        <w:t xml:space="preserve">The first limitation concerns the </w:t>
+      </w:r>
+      <w:r>
+        <w:rPr>
+          <w:rStyle w:val="Strong"/>
+          <w:rFonts w:eastAsiaTheme="majorEastAsia"/>
+        </w:rPr>
+        <w:t>availability and suitability of the dataset</w:t>
+      </w:r>
+      <w:r>
+        <w:t>. The study used the Walmart Store Sales Forecasting dataset, which was originally developed for retail sales forecasting rather than food-waste analysis. Consequently, the dataset does not contain direct observations of food waste, product spoilage, disposal quantities, or product-level expiry records. To support the objectives of this research, additional inventory-related variables and waste-risk indicators were engineered to represent conditions associated with inventory imbalance and potential waste. Although these features enabled inventory-related analysis, they should not be interpreted as direct measurements of actual food waste.</w:t>
+      </w:r>
+    </w:p>
+    <w:p>
+      <w:pPr>
+        <w:pStyle w:val="NormalWeb"/>
+      </w:pPr>
+      <w:r>
+        <w:t xml:space="preserve">A second limitation concerns the use of </w:t>
+      </w:r>
+      <w:r>
+        <w:rPr>
+          <w:rStyle w:val="Strong"/>
+          <w:rFonts w:eastAsiaTheme="majorEastAsia"/>
+        </w:rPr>
+        <w:t>engineered and simulated inventory-related variables</w:t>
+      </w:r>
+      <w:r>
+        <w:t>. Variables such as current stock, expiry-related indicators, and waste-related measures were created to support inventory assessment and intelligent recommendation generation. Although these variables were designed to represent plausible retail conditions, they cannot fully reproduce the operational complexity of real supermarket inventory systems. Therefore, the resulting waste-risk assessments represent simulated decision-support scenarios rather than verified outcomes from actual supermarket operations.</w:t>
+      </w:r>
+    </w:p>
+    <w:p>
+      <w:pPr>
+        <w:pStyle w:val="NormalWeb"/>
+      </w:pPr>
+      <w:r>
+        <w:t xml:space="preserve">Another limitation relates to the </w:t>
+      </w:r>
+      <w:r>
+        <w:rPr>
+          <w:rStyle w:val="Strong"/>
+          <w:rFonts w:eastAsiaTheme="majorEastAsia"/>
+        </w:rPr>
+        <w:t>operational evaluation environment</w:t>
+      </w:r>
+      <w:r>
+        <w:t>. Live retail events were simulated and submitted to the implemented FastAPI backend rather than obtained from a real enterprise retail system. Similarly, the framework was evaluated in a local development environment using FastAPI, SQLite, and Streamlit rather than through a large-scale commercial deployment. Consequently, aspects such as scalability, high-volume concurrent requests, enterprise security, cloud infrastructure, and integration with existing retail information systems were outside the scope of the study.</w:t>
+      </w:r>
+    </w:p>
+    <w:p>
+      <w:pPr>
+        <w:pStyle w:val="NormalWeb"/>
+      </w:pPr>
+      <w:r>
+        <w:t xml:space="preserve">The modelling comparison was also limited to </w:t>
+      </w:r>
+      <w:r>
+        <w:rPr>
+          <w:rStyle w:val="Strong"/>
+          <w:rFonts w:eastAsiaTheme="majorEastAsia"/>
+        </w:rPr>
+        <w:t xml:space="preserve">Random Forest and </w:t>
       </w:r>
       <w:proofErr w:type="spellStart"/>
       <w:r>
-        <w:t>Sculley</w:t>
+        <w:rPr>
+          <w:rStyle w:val="Strong"/>
+          <w:rFonts w:eastAsiaTheme="majorEastAsia"/>
+        </w:rPr>
+        <w:t>XGBoost</w:t>
       </w:r>
       <w:proofErr w:type="spellEnd"/>
       <w:r>
-        <w:t xml:space="preserve"> et al., 2015; </w:t>
-      </w:r>
-      <w:proofErr w:type="spellStart"/>
-      <w:r>
-        <w:t>Kreuzberger</w:t>
-      </w:r>
-      <w:proofErr w:type="spellEnd"/>
-      <w:r>
-        <w:t xml:space="preserve"> et al., 2023).</w:t>
-      </w:r>
-    </w:p>
-    <w:p>
-      <w:pPr>
-        <w:pStyle w:val="NormalWeb"/>
-      </w:pPr>
-      <w:r>
-        <w:t xml:space="preserve">The findings should nevertheless be interpreted within the boundaries of the available data. The Walmart dataset does not contain direct observations of </w:t>
+        <w:t>. Although Random Forest achieved the strongest performance within the implemented comparison, this does not establish it as the best forecasting algorithm for all retail forecasting problems. Other approaches, including alternative gradient-boosting methods, time-series models, deep learning architectures, and transformer-based forecasting techniques, may produce different results depending on the dataset, forecasting horizon, and operational context.</w:t>
+      </w:r>
+    </w:p>
+    <w:p>
+      <w:pPr>
+        <w:pStyle w:val="NormalWeb"/>
+      </w:pPr>
+      <w:r>
+        <w:t xml:space="preserve">The monitoring approach also has limitations. Drift detection in the implemented framework is based on a </w:t>
       </w:r>
       <w:r>
         <w:rPr>
           <w:rStyle w:val="Strong"/>
           <w:rFonts w:eastAsiaTheme="majorEastAsia"/>
         </w:rPr>
-        <w:t>food waste, spoilage, or product disposal</w:t>
-      </w:r>
-      <w:r>
-        <w:t xml:space="preserve">. Therefore, this study does not demonstrate that a specific quantity of food waste was actually reduced. Instead, the engineered inventory and waste-risk indicators enable the framework to identify conditions that may be associated with a greater likelihood of inventory-related waste. The contribution should therefore be understood as </w:t>
+        <w:t>relative mean-shift method</w:t>
+      </w:r>
+      <w:r>
+        <w:t xml:space="preserve"> applied to selected variables using predefined reference and current data windows and a fixed threshold. While this provides a practical mechanism for demonstrating data-drift monitoring and triggering automatic retraining, changes in the mean alone may not capture all forms of distributional change. More advanced statistical drift-detection techniques could provide a more comprehensive assessment in future implementations.</w:t>
+      </w:r>
+    </w:p>
+    <w:p>
+      <w:pPr>
+        <w:pStyle w:val="NormalWeb"/>
+      </w:pPr>
+      <w:r>
+        <w:t xml:space="preserve">Furthermore, the </w:t>
       </w:r>
       <w:r>
         <w:rPr>
           <w:rStyle w:val="Strong"/>
           <w:rFonts w:eastAsiaTheme="majorEastAsia"/>
         </w:rPr>
-        <w:t>supporting inventory-related waste-risk identification and preventive decision-making</w:t>
-      </w:r>
-      <w:r>
-        <w:t>, rather than directly measuring food-waste reduction.</w:t>
+        <w:t>intelligent recommendation mechanism is rule-based</w:t>
+      </w:r>
+      <w:r>
+        <w:t>. Recommendations are generated from predefined inventory assessment conditions using predicted demand, stock information, expiry-related conditions, and waste-risk indicators. Although this approach provides interpretable operational guidance, it does not incorporate the wider contextual reasoning that may influence real retail decisions, such as supplier lead times, procurement costs, storage capacity, product margins, or store-specific policies. The current framework therefore supports human decision-making rather than replacing managerial judgement.</w:t>
       </w:r>
     </w:p>
     <w:p>
@@ -10257,451 +11022,6 @@
       </w:pPr>
       <w:r>
         <w:lastRenderedPageBreak/>
-        <w:t xml:space="preserve">Overall, the findings suggest that the greatest value of the proposed framework comes from integrating </w:t>
-      </w:r>
-      <w:r>
-        <w:rPr>
-          <w:rStyle w:val="Strong"/>
-          <w:rFonts w:eastAsiaTheme="majorEastAsia"/>
-        </w:rPr>
-        <w:t>demand forecasting, inventory assessment, intelligent recommendation support, and forecasting reliability mechanisms</w:t>
-      </w:r>
-      <w:r>
-        <w:t xml:space="preserve"> within a single decision-support environment. Rather than treating machine learning forecasting as an isolated predictive task, the framework demonstrates how forecasting outputs can be connected with operational inventory information to support more informed, adaptive, and sustainability-oriented retail decision-making.</w:t>
-      </w:r>
-    </w:p>
-    <w:p>
-      <w:pPr>
-        <w:pStyle w:val="Heading2"/>
-      </w:pPr>
-      <w:r>
-        <w:t>5.2 Comparison with Existing Research</w:t>
-      </w:r>
-    </w:p>
-    <w:p>
-      <w:pPr>
-        <w:pStyle w:val="NormalWeb"/>
-      </w:pPr>
-      <w:r>
-        <w:t>The findings of this study are broadly consistent with existing research on the application of machine learning to retail demand forecasting. Previous studies have demonstrated that machine learning models can capture complex and non-linear relationships within structured data and can incorporate multiple factors that influence demand. The strong test performance achieved by the Random Forest model in this study is consistent with the wider literature suggesting that ensemble-based machine learning methods can be suitable for forecasting problems involving multiple interacting retail variables.</w:t>
-      </w:r>
-    </w:p>
-    <w:p>
-      <w:pPr>
-        <w:pStyle w:val="NormalWeb"/>
-      </w:pPr>
-      <w:r>
-        <w:t xml:space="preserve">The findings also support the broader literature emphasizing the importance of demand forecasting for inventory planning. Improved visibility into expected demand can assist retailers in making more informed decisions regarding replenishment, stock allocation, and inventory management. In the present study, this relationship was extended by combining demand predictions with </w:t>
-      </w:r>
-      <w:r>
-        <w:rPr>
-          <w:rStyle w:val="Strong"/>
-          <w:rFonts w:eastAsiaTheme="majorEastAsia"/>
-        </w:rPr>
-        <w:t>current stock levels, expiry-related conditions, and engineered waste-risk indicators</w:t>
-      </w:r>
-      <w:r>
-        <w:t>. This enabled forecasting outputs to be interpreted in relation to operational inventory conditions rather than being evaluated only through predictive performance metrics.</w:t>
-      </w:r>
-    </w:p>
-    <w:p>
-      <w:pPr>
-        <w:pStyle w:val="NormalWeb"/>
-      </w:pPr>
-      <w:r>
-        <w:t xml:space="preserve">An important distinction of the proposed framework is the integration of </w:t>
-      </w:r>
-      <w:r>
-        <w:rPr>
-          <w:rStyle w:val="Strong"/>
-          <w:rFonts w:eastAsiaTheme="majorEastAsia"/>
-        </w:rPr>
-        <w:t>forecasting, inventory assessment, intelligent recommendation support, monitoring, and model maintenance</w:t>
-      </w:r>
-      <w:r>
-        <w:t xml:space="preserve"> within the same decision-support environment. As discussed in the literature review, many forecasting studies place substantial emphasis on model development and offline predictive performance. The present study extends this perspective by examining how forecasting outputs can be operationalized to support inventory-related decisions and how forecasting reliability can be maintained when operational data patterns change. This approach is consistent with research emphasizing monitoring and lifecycle management as important considerations for operational machine learning systems (</w:t>
-      </w:r>
-      <w:proofErr w:type="spellStart"/>
-      <w:r>
-        <w:t>Sculley</w:t>
-      </w:r>
-      <w:proofErr w:type="spellEnd"/>
-      <w:r>
-        <w:t xml:space="preserve"> et al., 2015; </w:t>
-      </w:r>
-      <w:proofErr w:type="spellStart"/>
-      <w:r>
-        <w:t>Kreuzberger</w:t>
-      </w:r>
-      <w:proofErr w:type="spellEnd"/>
-      <w:r>
-        <w:t xml:space="preserve"> et al., 2023).</w:t>
-      </w:r>
-    </w:p>
-    <w:p>
-      <w:pPr>
-        <w:pStyle w:val="NormalWeb"/>
-      </w:pPr>
-      <w:r>
-        <w:t xml:space="preserve">The study also extends the forecasting discussion toward </w:t>
-      </w:r>
-      <w:r>
-        <w:rPr>
-          <w:rStyle w:val="Strong"/>
-          <w:rFonts w:eastAsiaTheme="majorEastAsia"/>
-        </w:rPr>
-        <w:t>inventory-related waste-risk identification</w:t>
-      </w:r>
-      <w:r>
-        <w:t>. Rather than attempting to predict actual food waste, the proposed framework combines demand forecasts with engineered inventory and expiry-related indicators to identify conditions associated with elevated waste risk. This distinction is important because the Walmart dataset does not contain direct observations of food waste, spoilage, or product disposal. The findings therefore complement the broader sustainability literature by demonstrating how forecasting-supported inventory assessment may contribute to earlier identification of inventory conditions that could increase the likelihood of waste.</w:t>
-      </w:r>
-    </w:p>
-    <w:p>
-      <w:pPr>
-        <w:pStyle w:val="NormalWeb"/>
-      </w:pPr>
-      <w:r>
-        <w:t xml:space="preserve">At the same time, direct comparison with previous food-waste studies should be made cautiously because the present research evaluates </w:t>
-      </w:r>
-      <w:r>
-        <w:rPr>
-          <w:rStyle w:val="Strong"/>
-          <w:rFonts w:eastAsiaTheme="majorEastAsia"/>
-        </w:rPr>
-        <w:t xml:space="preserve">waste risk through engineered indicators rather than </w:t>
-      </w:r>
-      <w:r>
-        <w:rPr>
-          <w:rStyle w:val="Strong"/>
-          <w:rFonts w:eastAsiaTheme="majorEastAsia"/>
-        </w:rPr>
-        <w:lastRenderedPageBreak/>
-        <w:t>observed food-waste outcomes</w:t>
-      </w:r>
-      <w:r>
-        <w:t xml:space="preserve">. Similarly, the study does not directly compare machine learning forecasting with traditional statistical forecasting approaches. Its empirical comparison is specifically between </w:t>
-      </w:r>
-      <w:r>
-        <w:rPr>
-          <w:rStyle w:val="Strong"/>
-          <w:rFonts w:eastAsiaTheme="majorEastAsia"/>
-        </w:rPr>
-        <w:t xml:space="preserve">Random Forest and </w:t>
-      </w:r>
-      <w:proofErr w:type="spellStart"/>
-      <w:r>
-        <w:rPr>
-          <w:rStyle w:val="Strong"/>
-          <w:rFonts w:eastAsiaTheme="majorEastAsia"/>
-        </w:rPr>
-        <w:t>XGBoost</w:t>
-      </w:r>
-      <w:proofErr w:type="spellEnd"/>
-      <w:r>
-        <w:t>. Therefore, the contribution of the study lies primarily in demonstrating how machine learning-based demand forecasting can be connected with inventory assessment, recommendation support, and model-monitoring mechanisms within an integrated retail decision-support framework.</w:t>
-      </w:r>
-    </w:p>
-    <w:p>
-      <w:pPr>
-        <w:pStyle w:val="NormalWeb"/>
-      </w:pPr>
-      <w:r>
-        <w:t xml:space="preserve">Overall, comparison with existing research indicates that the findings are consistent with established work on machine learning-based forecasting and operational model management while extending the analysis toward </w:t>
-      </w:r>
-      <w:r>
-        <w:rPr>
-          <w:rStyle w:val="Strong"/>
-          <w:rFonts w:eastAsiaTheme="majorEastAsia"/>
-        </w:rPr>
-        <w:t>intelligent inventory decision support and inventory-related waste-risk identification</w:t>
-      </w:r>
-      <w:r>
-        <w:t>. The proposed framework therefore illustrates how forecasting can be considered not only as a predictive task but also as one component of a broader operational decision-support process within supermarket environments.</w:t>
-      </w:r>
-    </w:p>
-    <w:p>
-      <w:pPr>
-        <w:pStyle w:val="Heading2"/>
-      </w:pPr>
-      <w:r>
-        <w:t>5.3 Business and Sustainability Implications</w:t>
-      </w:r>
-    </w:p>
-    <w:p>
-      <w:pPr>
-        <w:pStyle w:val="NormalWeb"/>
-      </w:pPr>
-      <w:r>
-        <w:t xml:space="preserve">The findings of this study have practical implications for both </w:t>
-      </w:r>
-      <w:r>
-        <w:rPr>
-          <w:rStyle w:val="Strong"/>
-          <w:rFonts w:eastAsiaTheme="majorEastAsia"/>
-        </w:rPr>
-        <w:t>retail inventory management and sustainability-oriented decision-making</w:t>
-      </w:r>
-      <w:r>
-        <w:t>. From a business perspective, reliable demand forecasting can improve visibility into expected future demand and provide retailers with a stronger basis for inventory planning. This is particularly relevant in supermarket environments, where inventory decisions must balance product availability with the risk of maintaining unnecessary stock.</w:t>
-      </w:r>
-    </w:p>
-    <w:p>
-      <w:pPr>
-        <w:pStyle w:val="NormalWeb"/>
-      </w:pPr>
-      <w:r>
-        <w:t xml:space="preserve">The integration of forecasting outputs with inventory-related information increases the operational usefulness of the proposed framework. By comparing predicted demand with current stock levels and expiry-related conditions, the system can identify situations where inventory may become misaligned with anticipated demand. Early identification of </w:t>
-      </w:r>
-      <w:proofErr w:type="spellStart"/>
-      <w:r>
-        <w:rPr>
-          <w:rStyle w:val="Strong"/>
-          <w:rFonts w:eastAsiaTheme="majorEastAsia"/>
-        </w:rPr>
-        <w:t>stockout</w:t>
-      </w:r>
-      <w:proofErr w:type="spellEnd"/>
-      <w:r>
-        <w:rPr>
-          <w:rStyle w:val="Strong"/>
-          <w:rFonts w:eastAsiaTheme="majorEastAsia"/>
-        </w:rPr>
-        <w:t xml:space="preserve"> and overstock conditions</w:t>
-      </w:r>
-      <w:r>
-        <w:t xml:space="preserve"> can support more proactive replenishment and stock-adjustment decisions rather than relying only on reactive inventory management.</w:t>
-      </w:r>
-    </w:p>
-    <w:p>
-      <w:pPr>
-        <w:pStyle w:val="NormalWeb"/>
-      </w:pPr>
-      <w:r>
-        <w:t xml:space="preserve">The </w:t>
-      </w:r>
-      <w:r>
-        <w:rPr>
-          <w:rStyle w:val="Strong"/>
-          <w:rFonts w:eastAsiaTheme="majorEastAsia"/>
-        </w:rPr>
-        <w:t>intelligent recommendation support</w:t>
-      </w:r>
-      <w:r>
-        <w:t xml:space="preserve"> component further strengthens this business value by translating forecasting and inventory information into actionable guidance. Recommendations related to replenishment, reduced future ordering, inventory monitoring, promotional activity, and stock redistribution provide decision-makers with practical responses to identified inventory conditions. The framework should nevertheless be considered a </w:t>
-      </w:r>
-      <w:r>
-        <w:rPr>
-          <w:rStyle w:val="Strong"/>
-          <w:rFonts w:eastAsiaTheme="majorEastAsia"/>
-        </w:rPr>
-        <w:t>decision-support tool rather than an autonomous inventory management system</w:t>
-      </w:r>
-      <w:r>
-        <w:t>. Retail managers would still need to consider additional operational factors, such as supplier availability, procurement constraints, pricing strategies, and business priorities, before implementing inventory actions.</w:t>
-      </w:r>
-    </w:p>
-    <w:p>
-      <w:pPr>
-        <w:pStyle w:val="NormalWeb"/>
-      </w:pPr>
-      <w:r>
-        <w:t>From a sustainability perspective, improved alignment between expected demand and available inventory may help reduce conditions associated with unnecessary inventory accumulation. This is particularly relevant for products with shorter expiry periods, where excess stock can increase the likelihood of spoilage and inventory loss. By identifying elevated waste-risk situations earlier, the framework can support preventive actions such as reducing future replenishment, promoting products, or redistributing available stock.</w:t>
-      </w:r>
-    </w:p>
-    <w:p>
-      <w:pPr>
-        <w:pStyle w:val="NormalWeb"/>
-      </w:pPr>
-      <w:r>
-        <w:lastRenderedPageBreak/>
-        <w:t xml:space="preserve">However, the sustainability implications should be interpreted cautiously. The Walmart dataset used in this study does not contain direct observations of </w:t>
-      </w:r>
-      <w:r>
-        <w:rPr>
-          <w:rStyle w:val="Strong"/>
-          <w:rFonts w:eastAsiaTheme="majorEastAsia"/>
-        </w:rPr>
-        <w:t>food waste, spoilage quantities, or disposal records</w:t>
-      </w:r>
-      <w:r>
-        <w:t xml:space="preserve">. Therefore, the study cannot quantify how much food waste would actually be prevented through use of the proposed framework. Instead, the results demonstrate how demand forecasting and inventory assessment can support the identification of operational conditions associated with </w:t>
-      </w:r>
-      <w:r>
-        <w:rPr>
-          <w:rStyle w:val="Strong"/>
-          <w:rFonts w:eastAsiaTheme="majorEastAsia"/>
-        </w:rPr>
-        <w:t>inventory-related waste risk</w:t>
-      </w:r>
-      <w:r>
-        <w:t>. This represents a potential contribution to more sustainable inventory management rather than direct evidence of measured food-waste reduction.</w:t>
-      </w:r>
-    </w:p>
-    <w:p>
-      <w:pPr>
-        <w:pStyle w:val="NormalWeb"/>
-      </w:pPr>
-      <w:r>
-        <w:t>The monitoring and model-maintenance components also have business implications. Forecasting-based inventory decisions depend on the continued relevance of model outputs, while retail demand conditions may change over time. The integration of drift detection, model versioning, and automatic retraining provides a mechanism for identifying such changes and updating the forecasting model when necessary. This supports the longer-term operational usefulness of the decision-support framework rather than treating model development as a one-time activity.</w:t>
-      </w:r>
-    </w:p>
-    <w:p>
-      <w:pPr>
-        <w:pStyle w:val="NormalWeb"/>
-      </w:pPr>
-      <w:r>
-        <w:t xml:space="preserve">Overall, the study suggests that the business and sustainability value of AI-driven forecasting is created through the </w:t>
-      </w:r>
-      <w:r>
-        <w:rPr>
-          <w:rStyle w:val="Strong"/>
-          <w:rFonts w:eastAsiaTheme="majorEastAsia"/>
-        </w:rPr>
-        <w:t>connection between prediction and action</w:t>
-      </w:r>
-      <w:r>
-        <w:t>. Demand forecasts provide visibility into expected sales, inventory assessment identifies potential imbalances, and intelligent recommendations translate these findings into possible operational responses. Through this integration, the proposed framework can support more informed inventory planning while contributing to the broader objective of reducing conditions associated with inventory-related waste.</w:t>
-      </w:r>
-    </w:p>
-    <w:p>
-      <w:pPr>
-        <w:pStyle w:val="Heading2"/>
-      </w:pPr>
-      <w:r>
-        <w:t>5.4 Limitations of the Study</w:t>
-      </w:r>
-    </w:p>
-    <w:p>
-      <w:pPr>
-        <w:pStyle w:val="NormalWeb"/>
-      </w:pPr>
-      <w:r>
-        <w:t>Although the proposed framework produced promising forecasting and decision-support results, several limitations should be considered when interpreting the findings.</w:t>
-      </w:r>
-    </w:p>
-    <w:p>
-      <w:pPr>
-        <w:pStyle w:val="NormalWeb"/>
-      </w:pPr>
-      <w:r>
-        <w:t xml:space="preserve">The first limitation concerns the </w:t>
-      </w:r>
-      <w:r>
-        <w:rPr>
-          <w:rStyle w:val="Strong"/>
-          <w:rFonts w:eastAsiaTheme="majorEastAsia"/>
-        </w:rPr>
-        <w:t>availability and suitability of the dataset</w:t>
-      </w:r>
-      <w:r>
-        <w:t>. The study used the Walmart Store Sales Forecasting dataset, which was originally developed for retail sales forecasting rather than food-waste analysis. Consequently, the dataset does not contain direct observations of food waste, product spoilage, disposal quantities, or product-level expiry records. To support the objectives of this research, additional inventory-related variables and waste-risk indicators were engineered to represent conditions associated with inventory imbalance and potential waste. Although these features enabled inventory-related analysis, they should not be interpreted as direct measurements of actual food waste.</w:t>
-      </w:r>
-    </w:p>
-    <w:p>
-      <w:pPr>
-        <w:pStyle w:val="NormalWeb"/>
-      </w:pPr>
-      <w:r>
-        <w:t xml:space="preserve">A second limitation concerns the use of </w:t>
-      </w:r>
-      <w:r>
-        <w:rPr>
-          <w:rStyle w:val="Strong"/>
-          <w:rFonts w:eastAsiaTheme="majorEastAsia"/>
-        </w:rPr>
-        <w:t>engineered and simulated inventory-related variables</w:t>
-      </w:r>
-      <w:r>
-        <w:t>. Variables such as current stock, expiry-related indicators, and waste-related measures were created to support inventory assessment and intelligent recommendation generation. Although these variables were designed to represent plausible retail conditions, they cannot fully reproduce the operational complexity of real supermarket inventory systems. Therefore, the resulting waste-risk assessments represent simulated decision-support scenarios rather than verified outcomes from actual supermarket operations.</w:t>
-      </w:r>
-    </w:p>
-    <w:p>
-      <w:pPr>
-        <w:pStyle w:val="NormalWeb"/>
-      </w:pPr>
-      <w:r>
-        <w:lastRenderedPageBreak/>
-        <w:t xml:space="preserve">Another limitation relates to the </w:t>
-      </w:r>
-      <w:r>
-        <w:rPr>
-          <w:rStyle w:val="Strong"/>
-          <w:rFonts w:eastAsiaTheme="majorEastAsia"/>
-        </w:rPr>
-        <w:t>operational evaluation environment</w:t>
-      </w:r>
-      <w:r>
-        <w:t>. Live retail events were simulated and submitted to the implemented FastAPI backend rather than obtained from a real enterprise retail system. Similarly, the framework was evaluated in a local development environment using FastAPI, SQLite, and Streamlit rather than through a large-scale commercial deployment. Consequently, aspects such as scalability, high-volume concurrent requests, enterprise security, cloud infrastructure, and integration with existing retail information systems were outside the scope of the study.</w:t>
-      </w:r>
-    </w:p>
-    <w:p>
-      <w:pPr>
-        <w:pStyle w:val="NormalWeb"/>
-      </w:pPr>
-      <w:r>
-        <w:t xml:space="preserve">The modelling comparison was also limited to </w:t>
-      </w:r>
-      <w:r>
-        <w:rPr>
-          <w:rStyle w:val="Strong"/>
-          <w:rFonts w:eastAsiaTheme="majorEastAsia"/>
-        </w:rPr>
-        <w:t xml:space="preserve">Random Forest and </w:t>
-      </w:r>
-      <w:proofErr w:type="spellStart"/>
-      <w:r>
-        <w:rPr>
-          <w:rStyle w:val="Strong"/>
-          <w:rFonts w:eastAsiaTheme="majorEastAsia"/>
-        </w:rPr>
-        <w:t>XGBoost</w:t>
-      </w:r>
-      <w:proofErr w:type="spellEnd"/>
-      <w:r>
-        <w:t>. Although Random Forest achieved the strongest performance within the implemented comparison, this does not establish it as the best forecasting algorithm for all retail forecasting problems. Other approaches, including alternative gradient-boosting methods, time-series models, deep learning architectures, and transformer-based forecasting techniques, may produce different results depending on the dataset, forecasting horizon, and operational context.</w:t>
-      </w:r>
-    </w:p>
-    <w:p>
-      <w:pPr>
-        <w:pStyle w:val="NormalWeb"/>
-      </w:pPr>
-      <w:r>
-        <w:t xml:space="preserve">The monitoring approach also has limitations. Drift detection in the implemented framework is based on a </w:t>
-      </w:r>
-      <w:r>
-        <w:rPr>
-          <w:rStyle w:val="Strong"/>
-          <w:rFonts w:eastAsiaTheme="majorEastAsia"/>
-        </w:rPr>
-        <w:t>relative mean-shift method</w:t>
-      </w:r>
-      <w:r>
-        <w:t xml:space="preserve"> applied to selected variables using predefined reference and current data windows and a fixed threshold. While this provides a practical mechanism for demonstrating data-drift monitoring and triggering automatic retraining, changes in the mean alone may not capture all forms of distributional change. More advanced statistical drift-detection techniques could provide a more comprehensive assessment in future implementations.</w:t>
-      </w:r>
-    </w:p>
-    <w:p>
-      <w:pPr>
-        <w:pStyle w:val="NormalWeb"/>
-      </w:pPr>
-      <w:r>
-        <w:t xml:space="preserve">Furthermore, the </w:t>
-      </w:r>
-      <w:r>
-        <w:rPr>
-          <w:rStyle w:val="Strong"/>
-          <w:rFonts w:eastAsiaTheme="majorEastAsia"/>
-        </w:rPr>
-        <w:t>intelligent recommendation mechanism is rule-based</w:t>
-      </w:r>
-      <w:r>
-        <w:t>. Recommendations are generated from predefined inventory assessment conditions using predicted demand, stock information, expiry-related conditions, and waste-risk indicators. Although this approach provides interpretable operational guidance, it does not incorporate the wider contextual reasoning that may influence real retail decisions, such as supplier lead times, procurement costs, storage capacity, product margins, or store-specific policies. The current framework therefore supports human decision-making rather than replacing managerial judgement.</w:t>
-      </w:r>
-    </w:p>
-    <w:p>
-      <w:pPr>
-        <w:pStyle w:val="NormalWeb"/>
-      </w:pPr>
-      <w:r>
         <w:t xml:space="preserve">Finally, the study does not directly quantify the </w:t>
       </w:r>
       <w:r>
@@ -10744,6 +11064,9 @@
         </w:rPr>
       </w:pPr>
       <w:r>
+        <w:rPr>
+          <w:rFonts w:ascii="Times New Roman" w:hAnsi="Times New Roman" w:cs="Times New Roman"/>
+        </w:rPr>
         <w:br w:type="page"/>
       </w:r>
     </w:p>
@@ -10763,8 +11086,6 @@
       <w:r>
         <w:t xml:space="preserve">The use of AI-driven forecasting systems within retail environments introduces several </w:t>
       </w:r>
-      <w:bookmarkStart w:id="0" w:name="_GoBack"/>
-      <w:bookmarkEnd w:id="0"/>
       <w:r>
         <w:rPr>
           <w:rStyle w:val="Strong"/>
@@ -11340,15 +11661,7 @@
         <w:t>not demonstrate a measured reduction in actual food waste</w:t>
       </w:r>
       <w:r>
-        <w:t xml:space="preserve">. Instead, engineered inventory and waste-risk indicators were used to identify conditions that may increase the likelihood of waste. The sustainability contribution of the framework should </w:t>
-      </w:r>
-      <w:proofErr w:type="gramStart"/>
-      <w:r>
-        <w:t>therefore</w:t>
-      </w:r>
-      <w:proofErr w:type="gramEnd"/>
-      <w:r>
-        <w:t xml:space="preserve"> be interpreted as supporting </w:t>
+        <w:t xml:space="preserve">. Instead, engineered inventory and waste-risk indicators were used to identify conditions that may increase the likelihood of waste. The sustainability contribution of the framework should therefore be interpreted as supporting </w:t>
       </w:r>
       <w:r>
         <w:rPr>
@@ -12110,7 +12423,7 @@
           <w:rPr>
             <w:noProof/>
           </w:rPr>
-          <w:t>46</w:t>
+          <w:t>22</w:t>
         </w:r>
         <w:r>
           <w:rPr>
@@ -14493,7 +14806,7 @@
 </file>
 
 <file path=customXml/itemProps1.xml><?xml version="1.0" encoding="utf-8"?>
-<ds:datastoreItem xmlns:ds="http://schemas.openxmlformats.org/officeDocument/2006/customXml" ds:itemID="{D11773ED-CAFD-4811-9660-94ED03F951A9}">
+<ds:datastoreItem xmlns:ds="http://schemas.openxmlformats.org/officeDocument/2006/customXml" ds:itemID="{F29516A1-479F-4FE6-B607-468A3338B673}">
   <ds:schemaRefs>
     <ds:schemaRef ds:uri="http://schemas.openxmlformats.org/officeDocument/2006/bibliography"/>
   </ds:schemaRefs>

</xml_diff>

<commit_message>
Final project submission - LLM recommendation and report updates
</commit_message>
<xml_diff>
--- a/report/AI-Driven Retail Demand Forecasting and Intelligent Inventory Decision Support for Food Waste Reduction.docx
+++ b/report/AI-Driven Retail Demand Forecasting and Intelligent Inventory Decision Support for Food Waste Reduction.docx
@@ -1460,7 +1460,7 @@
         <w:rPr>
           <w:rFonts w:ascii="Times New Roman" w:hAnsi="Times New Roman" w:cs="Times New Roman"/>
         </w:rPr>
-        <w:t>............................. 47</w:t>
+        <w:t>............................. 46</w:t>
       </w:r>
       <w:bookmarkStart w:id="0" w:name="_GoBack"/>
       <w:bookmarkEnd w:id="0"/>
@@ -1490,7 +1490,7 @@
         <w:rPr>
           <w:rFonts w:ascii="Times New Roman" w:hAnsi="Times New Roman" w:cs="Times New Roman"/>
         </w:rPr>
-        <w:t>9</w:t>
+        <w:t>8</w:t>
       </w:r>
     </w:p>
     <w:p>
@@ -1526,7 +1526,7 @@
         <w:rPr>
           <w:rFonts w:ascii="Times New Roman" w:hAnsi="Times New Roman" w:cs="Times New Roman"/>
         </w:rPr>
-        <w:t>50</w:t>
+        <w:t>49</w:t>
       </w:r>
     </w:p>
     <w:p>
@@ -4313,12 +4313,6 @@
     </w:p>
     <w:p>
       <w:pPr>
-        <w:pStyle w:val="NormalWeb"/>
-        <w:jc w:val="both"/>
-      </w:pPr>
-    </w:p>
-    <w:p>
-      <w:pPr>
         <w:jc w:val="both"/>
         <w:rPr>
           <w:rFonts w:ascii="Times New Roman" w:hAnsi="Times New Roman" w:cs="Times New Roman"/>
@@ -4334,6 +4328,7 @@
           <w:sz w:val="36"/>
           <w:szCs w:val="36"/>
         </w:rPr>
+        <w:lastRenderedPageBreak/>
         <w:t>Chapter 3: Research Methodology</w:t>
       </w:r>
     </w:p>
@@ -4495,19 +4490,16 @@
         <w:jc w:val="both"/>
       </w:pPr>
       <w:r>
-        <w:t xml:space="preserve">The Data Understanding phase involves examining the available data, exploring demand patterns, assessing data quality, and identifying variables relevant to forecasting and inventory analysis. The </w:t>
-      </w:r>
+        <w:t>The Data Understanding phase involves examining the available data, exploring demand patterns, assessing data quality, and identifying variables relevant to forecasting and inventory analysis. The Data Preparation phase includes data cleaning, transformation, and feature engineering activities required to prepare the dataset for machine learning modelling.</w:t>
+      </w:r>
+    </w:p>
+    <w:p>
+      <w:pPr>
+        <w:pStyle w:val="NormalWeb"/>
+        <w:jc w:val="both"/>
+      </w:pPr>
       <w:r>
         <w:lastRenderedPageBreak/>
-        <w:t>Data Preparation phase includes data cleaning, transformation, and feature engineering activities required to prepare the dataset for machine learning modelling.</w:t>
-      </w:r>
-    </w:p>
-    <w:p>
-      <w:pPr>
-        <w:pStyle w:val="NormalWeb"/>
-        <w:jc w:val="both"/>
-      </w:pPr>
-      <w:r>
         <w:t>During the Modelling phase, machine learning algorithms are developed and trained to predict future retail demand. The forecasting outputs are subsequently combined with inventory-related indicators to suppo</w:t>
       </w:r>
       <w:r>
@@ -6675,21 +6667,24 @@
         <w:pStyle w:val="NormalWeb"/>
       </w:pPr>
       <w:r>
-        <w:t xml:space="preserve">To maintain forecasting reliability over time, the framework incorporates monitoring, drift detection, model versioning, and automatic retraining mechanisms. These components continuously evaluate changes in retail demand patterns and support model adaptation when significant data drift is detected, helping to maintain reliable forecasting performance under changing operational conditions. </w:t>
-      </w:r>
-    </w:p>
-    <w:p>
-      <w:pPr>
-        <w:jc w:val="both"/>
-        <w:rPr>
-          <w:rFonts w:ascii="Times New Roman" w:eastAsia="Times New Roman" w:hAnsi="Times New Roman" w:cs="Times New Roman"/>
-          <w:sz w:val="24"/>
-          <w:szCs w:val="24"/>
-        </w:rPr>
-      </w:pPr>
-      <w:r>
-        <w:rPr>
-          <w:rFonts w:ascii="Times New Roman" w:hAnsi="Times New Roman" w:cs="Times New Roman"/>
+        <w:t>To maintain forecasting reliability over time, the framework incorporates monitoring, drift detection, model versioning, and automatic retraining mechanisms. These components continuously evaluate changes in retail demand patterns and support model adaptation when significant data drift is detected, helping to maintain reliable forecasting performance under c</w:t>
+      </w:r>
+      <w:r>
+        <w:t>hanging operational conditions.</w:t>
+      </w:r>
+    </w:p>
+    <w:p>
+      <w:pPr>
+        <w:rPr>
+          <w:rFonts w:ascii="Times New Roman" w:eastAsia="Times New Roman" w:hAnsi="Times New Roman" w:cs="Times New Roman"/>
+          <w:b/>
+          <w:sz w:val="24"/>
+          <w:szCs w:val="24"/>
+        </w:rPr>
+      </w:pPr>
+      <w:r>
+        <w:rPr>
+          <w:b/>
         </w:rPr>
         <w:br w:type="page"/>
       </w:r>
@@ -6697,7 +6692,6 @@
     <w:p>
       <w:pPr>
         <w:pStyle w:val="NormalWeb"/>
-        <w:jc w:val="center"/>
         <w:rPr>
           <w:b/>
         </w:rPr>
@@ -6707,1130 +6701,73 @@
           <w:b/>
         </w:rPr>
         <w:lastRenderedPageBreak/>
-        <w:t>The overall forecasting fram</w:t>
-      </w:r>
-      <w:r>
-        <w:rPr>
-          <w:b/>
-        </w:rPr>
-        <w:t>ework is illustrated in below Figure:</w:t>
-      </w:r>
-    </w:p>
-    <w:p>
-      <w:pPr>
-        <w:pBdr>
-          <w:top w:val="single" w:sz="4" w:space="1" w:color="auto"/>
-          <w:left w:val="single" w:sz="4" w:space="4" w:color="auto"/>
-          <w:bottom w:val="single" w:sz="4" w:space="1" w:color="auto"/>
-          <w:right w:val="single" w:sz="4" w:space="4" w:color="auto"/>
-        </w:pBdr>
-        <w:jc w:val="center"/>
-        <w:rPr>
-          <w:rFonts w:ascii="Times New Roman" w:hAnsi="Times New Roman" w:cs="Times New Roman"/>
-          <w:sz w:val="24"/>
-          <w:szCs w:val="24"/>
-        </w:rPr>
-      </w:pPr>
-      <w:r>
-        <w:rPr>
-          <w:rFonts w:ascii="Times New Roman" w:hAnsi="Times New Roman" w:cs="Times New Roman"/>
-          <w:sz w:val="24"/>
-          <w:szCs w:val="24"/>
-        </w:rPr>
-        <w:t>Historical Walmart Store Sales Dataset</w:t>
-      </w:r>
-    </w:p>
-    <w:p>
-      <w:pPr>
-        <w:pBdr>
-          <w:top w:val="single" w:sz="4" w:space="1" w:color="auto"/>
-          <w:left w:val="single" w:sz="4" w:space="4" w:color="auto"/>
-          <w:bottom w:val="single" w:sz="4" w:space="1" w:color="auto"/>
-          <w:right w:val="single" w:sz="4" w:space="4" w:color="auto"/>
-        </w:pBdr>
-        <w:jc w:val="center"/>
-        <w:rPr>
-          <w:rFonts w:ascii="Times New Roman" w:hAnsi="Times New Roman" w:cs="Times New Roman"/>
-          <w:sz w:val="24"/>
-          <w:szCs w:val="24"/>
-        </w:rPr>
-      </w:pPr>
-      <w:r>
-        <w:rPr>
-          <w:rFonts w:ascii="Times New Roman" w:hAnsi="Times New Roman" w:cs="Times New Roman"/>
-          <w:sz w:val="24"/>
-          <w:szCs w:val="24"/>
-        </w:rPr>
-        <w:t xml:space="preserve">                ↓</w:t>
-      </w:r>
-    </w:p>
-    <w:p>
-      <w:pPr>
-        <w:pBdr>
-          <w:top w:val="single" w:sz="4" w:space="1" w:color="auto"/>
-          <w:left w:val="single" w:sz="4" w:space="4" w:color="auto"/>
-          <w:bottom w:val="single" w:sz="4" w:space="1" w:color="auto"/>
-          <w:right w:val="single" w:sz="4" w:space="4" w:color="auto"/>
-        </w:pBdr>
-        <w:jc w:val="center"/>
-        <w:rPr>
-          <w:rFonts w:ascii="Times New Roman" w:hAnsi="Times New Roman" w:cs="Times New Roman"/>
-          <w:sz w:val="24"/>
-          <w:szCs w:val="24"/>
-        </w:rPr>
-      </w:pPr>
-      <w:r>
-        <w:rPr>
-          <w:rFonts w:ascii="Times New Roman" w:hAnsi="Times New Roman" w:cs="Times New Roman"/>
-          <w:sz w:val="24"/>
-          <w:szCs w:val="24"/>
-        </w:rPr>
-        <w:t>Data Preprocessing + Feature Engineering</w:t>
-      </w:r>
-    </w:p>
-    <w:p>
-      <w:pPr>
-        <w:pBdr>
-          <w:top w:val="single" w:sz="4" w:space="1" w:color="auto"/>
-          <w:left w:val="single" w:sz="4" w:space="4" w:color="auto"/>
-          <w:bottom w:val="single" w:sz="4" w:space="1" w:color="auto"/>
-          <w:right w:val="single" w:sz="4" w:space="4" w:color="auto"/>
-        </w:pBdr>
-        <w:jc w:val="center"/>
-        <w:rPr>
-          <w:rFonts w:ascii="Times New Roman" w:hAnsi="Times New Roman" w:cs="Times New Roman"/>
-          <w:sz w:val="24"/>
-          <w:szCs w:val="24"/>
-        </w:rPr>
-      </w:pPr>
-      <w:r>
-        <w:rPr>
-          <w:rFonts w:ascii="Times New Roman" w:hAnsi="Times New Roman" w:cs="Times New Roman"/>
-          <w:sz w:val="24"/>
-          <w:szCs w:val="24"/>
-        </w:rPr>
-        <w:t xml:space="preserve">                ↓</w:t>
-      </w:r>
-    </w:p>
-    <w:p>
-      <w:pPr>
-        <w:pBdr>
-          <w:top w:val="single" w:sz="4" w:space="1" w:color="auto"/>
-          <w:left w:val="single" w:sz="4" w:space="4" w:color="auto"/>
-          <w:bottom w:val="single" w:sz="4" w:space="1" w:color="auto"/>
-          <w:right w:val="single" w:sz="4" w:space="4" w:color="auto"/>
-        </w:pBdr>
-        <w:jc w:val="center"/>
-        <w:rPr>
-          <w:rFonts w:ascii="Times New Roman" w:hAnsi="Times New Roman" w:cs="Times New Roman"/>
-          <w:sz w:val="24"/>
-          <w:szCs w:val="24"/>
-        </w:rPr>
-      </w:pPr>
-      <w:r>
-        <w:rPr>
-          <w:rFonts w:ascii="Times New Roman" w:hAnsi="Times New Roman" w:cs="Times New Roman"/>
-          <w:sz w:val="24"/>
-          <w:szCs w:val="24"/>
-        </w:rPr>
-        <w:t>Model Training + Model Comparison</w:t>
-      </w:r>
-    </w:p>
-    <w:p>
-      <w:pPr>
-        <w:pBdr>
-          <w:top w:val="single" w:sz="4" w:space="1" w:color="auto"/>
-          <w:left w:val="single" w:sz="4" w:space="4" w:color="auto"/>
-          <w:bottom w:val="single" w:sz="4" w:space="1" w:color="auto"/>
-          <w:right w:val="single" w:sz="4" w:space="4" w:color="auto"/>
-        </w:pBdr>
-        <w:jc w:val="center"/>
-        <w:rPr>
-          <w:rFonts w:ascii="Times New Roman" w:hAnsi="Times New Roman" w:cs="Times New Roman"/>
-          <w:sz w:val="24"/>
-          <w:szCs w:val="24"/>
-        </w:rPr>
-      </w:pPr>
-      <w:r>
-        <w:rPr>
-          <w:rFonts w:ascii="Times New Roman" w:hAnsi="Times New Roman" w:cs="Times New Roman"/>
-          <w:sz w:val="24"/>
-          <w:szCs w:val="24"/>
-        </w:rPr>
-        <w:t xml:space="preserve">                ↓</w:t>
-      </w:r>
-    </w:p>
-    <w:p>
-      <w:pPr>
-        <w:pBdr>
-          <w:top w:val="single" w:sz="4" w:space="1" w:color="auto"/>
-          <w:left w:val="single" w:sz="4" w:space="4" w:color="auto"/>
-          <w:bottom w:val="single" w:sz="4" w:space="1" w:color="auto"/>
-          <w:right w:val="single" w:sz="4" w:space="4" w:color="auto"/>
-        </w:pBdr>
-        <w:jc w:val="center"/>
-        <w:rPr>
-          <w:rFonts w:ascii="Times New Roman" w:hAnsi="Times New Roman" w:cs="Times New Roman"/>
-          <w:sz w:val="24"/>
-          <w:szCs w:val="24"/>
-        </w:rPr>
-      </w:pPr>
-      <w:r>
-        <w:rPr>
-          <w:rFonts w:ascii="Times New Roman" w:hAnsi="Times New Roman" w:cs="Times New Roman"/>
-          <w:sz w:val="24"/>
-          <w:szCs w:val="24"/>
-        </w:rPr>
-        <w:t>Best Model Selection (Cross-Validation)</w:t>
-      </w:r>
-    </w:p>
-    <w:p>
-      <w:pPr>
-        <w:pBdr>
-          <w:top w:val="single" w:sz="4" w:space="1" w:color="auto"/>
-          <w:left w:val="single" w:sz="4" w:space="4" w:color="auto"/>
-          <w:bottom w:val="single" w:sz="4" w:space="1" w:color="auto"/>
-          <w:right w:val="single" w:sz="4" w:space="4" w:color="auto"/>
-        </w:pBdr>
-        <w:jc w:val="center"/>
-        <w:rPr>
-          <w:rFonts w:ascii="Times New Roman" w:hAnsi="Times New Roman" w:cs="Times New Roman"/>
-          <w:sz w:val="24"/>
-          <w:szCs w:val="24"/>
-        </w:rPr>
-      </w:pPr>
-      <w:r>
-        <w:rPr>
-          <w:rFonts w:ascii="Times New Roman" w:hAnsi="Times New Roman" w:cs="Times New Roman"/>
-          <w:sz w:val="24"/>
-          <w:szCs w:val="24"/>
-        </w:rPr>
-        <w:t xml:space="preserve">                ↓</w:t>
-      </w:r>
-    </w:p>
-    <w:p>
-      <w:pPr>
-        <w:pBdr>
-          <w:top w:val="single" w:sz="4" w:space="1" w:color="auto"/>
-          <w:left w:val="single" w:sz="4" w:space="4" w:color="auto"/>
-          <w:bottom w:val="single" w:sz="4" w:space="1" w:color="auto"/>
-          <w:right w:val="single" w:sz="4" w:space="4" w:color="auto"/>
-        </w:pBdr>
-        <w:jc w:val="center"/>
-        <w:rPr>
-          <w:rFonts w:ascii="Times New Roman" w:hAnsi="Times New Roman" w:cs="Times New Roman"/>
-          <w:sz w:val="24"/>
-          <w:szCs w:val="24"/>
-        </w:rPr>
-      </w:pPr>
-      <w:r>
-        <w:rPr>
-          <w:rFonts w:ascii="Times New Roman" w:hAnsi="Times New Roman" w:cs="Times New Roman"/>
-          <w:sz w:val="24"/>
-          <w:szCs w:val="24"/>
-        </w:rPr>
-        <w:t>Versioned Model Registry + Saved Model</w:t>
-      </w:r>
-    </w:p>
-    <w:p>
-      <w:pPr>
-        <w:pBdr>
-          <w:top w:val="single" w:sz="4" w:space="1" w:color="auto"/>
-          <w:left w:val="single" w:sz="4" w:space="4" w:color="auto"/>
-          <w:bottom w:val="single" w:sz="4" w:space="1" w:color="auto"/>
-          <w:right w:val="single" w:sz="4" w:space="4" w:color="auto"/>
-        </w:pBdr>
-        <w:jc w:val="center"/>
-        <w:rPr>
-          <w:rFonts w:ascii="Times New Roman" w:hAnsi="Times New Roman" w:cs="Times New Roman"/>
-          <w:sz w:val="24"/>
-          <w:szCs w:val="24"/>
-        </w:rPr>
-      </w:pPr>
-      <w:r>
-        <w:rPr>
-          <w:rFonts w:ascii="Times New Roman" w:hAnsi="Times New Roman" w:cs="Times New Roman"/>
-          <w:sz w:val="24"/>
-          <w:szCs w:val="24"/>
-        </w:rPr>
-        <w:t xml:space="preserve">                ↓</w:t>
-      </w:r>
-    </w:p>
-    <w:p>
-      <w:pPr>
-        <w:pBdr>
-          <w:top w:val="single" w:sz="4" w:space="1" w:color="auto"/>
-          <w:left w:val="single" w:sz="4" w:space="4" w:color="auto"/>
-          <w:bottom w:val="single" w:sz="4" w:space="1" w:color="auto"/>
-          <w:right w:val="single" w:sz="4" w:space="4" w:color="auto"/>
-        </w:pBdr>
-        <w:jc w:val="center"/>
-        <w:rPr>
-          <w:rFonts w:ascii="Times New Roman" w:hAnsi="Times New Roman" w:cs="Times New Roman"/>
-          <w:sz w:val="24"/>
-          <w:szCs w:val="24"/>
-        </w:rPr>
-      </w:pPr>
-      <w:r>
-        <w:rPr>
-          <w:rFonts w:ascii="Times New Roman" w:hAnsi="Times New Roman" w:cs="Times New Roman"/>
-          <w:sz w:val="24"/>
-          <w:szCs w:val="24"/>
-        </w:rPr>
-        <w:t>FastAPI Backend</w:t>
-      </w:r>
-    </w:p>
-    <w:p>
-      <w:pPr>
-        <w:pBdr>
-          <w:top w:val="single" w:sz="4" w:space="1" w:color="auto"/>
-          <w:left w:val="single" w:sz="4" w:space="4" w:color="auto"/>
-          <w:bottom w:val="single" w:sz="4" w:space="1" w:color="auto"/>
-          <w:right w:val="single" w:sz="4" w:space="4" w:color="auto"/>
-        </w:pBdr>
-        <w:jc w:val="center"/>
-        <w:rPr>
-          <w:rFonts w:ascii="Times New Roman" w:hAnsi="Times New Roman" w:cs="Times New Roman"/>
-          <w:sz w:val="24"/>
-          <w:szCs w:val="24"/>
-        </w:rPr>
-      </w:pPr>
-      <w:r>
-        <w:rPr>
-          <w:rFonts w:ascii="Times New Roman" w:hAnsi="Times New Roman" w:cs="Times New Roman"/>
-          <w:sz w:val="24"/>
-          <w:szCs w:val="24"/>
-        </w:rPr>
-        <w:t xml:space="preserve">                ↓</w:t>
-      </w:r>
-    </w:p>
-    <w:p>
-      <w:pPr>
-        <w:pBdr>
-          <w:top w:val="single" w:sz="4" w:space="1" w:color="auto"/>
-          <w:left w:val="single" w:sz="4" w:space="4" w:color="auto"/>
-          <w:bottom w:val="single" w:sz="4" w:space="1" w:color="auto"/>
-          <w:right w:val="single" w:sz="4" w:space="4" w:color="auto"/>
-        </w:pBdr>
-        <w:jc w:val="center"/>
-        <w:rPr>
-          <w:rFonts w:ascii="Times New Roman" w:hAnsi="Times New Roman" w:cs="Times New Roman"/>
-          <w:sz w:val="24"/>
-          <w:szCs w:val="24"/>
-        </w:rPr>
-      </w:pPr>
-      <w:r>
-        <w:rPr>
-          <w:rFonts w:ascii="Times New Roman" w:hAnsi="Times New Roman" w:cs="Times New Roman"/>
-          <w:sz w:val="24"/>
-          <w:szCs w:val="24"/>
-        </w:rPr>
-        <w:t>Prediction Endpoint (/predict-demand)</w:t>
-      </w:r>
-    </w:p>
-    <w:p>
-      <w:pPr>
-        <w:pBdr>
-          <w:top w:val="single" w:sz="4" w:space="1" w:color="auto"/>
-          <w:left w:val="single" w:sz="4" w:space="4" w:color="auto"/>
-          <w:bottom w:val="single" w:sz="4" w:space="1" w:color="auto"/>
-          <w:right w:val="single" w:sz="4" w:space="4" w:color="auto"/>
-        </w:pBdr>
-        <w:jc w:val="center"/>
-        <w:rPr>
-          <w:rFonts w:ascii="Times New Roman" w:hAnsi="Times New Roman" w:cs="Times New Roman"/>
-          <w:sz w:val="24"/>
-          <w:szCs w:val="24"/>
-        </w:rPr>
-      </w:pPr>
-      <w:r>
-        <w:rPr>
-          <w:rFonts w:ascii="Times New Roman" w:hAnsi="Times New Roman" w:cs="Times New Roman"/>
-          <w:sz w:val="24"/>
-          <w:szCs w:val="24"/>
-        </w:rPr>
-        <w:t xml:space="preserve">                ↓</w:t>
-      </w:r>
-    </w:p>
-    <w:p>
-      <w:pPr>
-        <w:pBdr>
-          <w:top w:val="single" w:sz="4" w:space="1" w:color="auto"/>
-          <w:left w:val="single" w:sz="4" w:space="4" w:color="auto"/>
-          <w:bottom w:val="single" w:sz="4" w:space="1" w:color="auto"/>
-          <w:right w:val="single" w:sz="4" w:space="4" w:color="auto"/>
-        </w:pBdr>
-        <w:jc w:val="center"/>
-        <w:rPr>
-          <w:rFonts w:ascii="Times New Roman" w:hAnsi="Times New Roman" w:cs="Times New Roman"/>
-          <w:sz w:val="24"/>
-          <w:szCs w:val="24"/>
-        </w:rPr>
-      </w:pPr>
-      <w:r>
-        <w:rPr>
-          <w:rFonts w:ascii="Times New Roman" w:hAnsi="Times New Roman" w:cs="Times New Roman"/>
-          <w:sz w:val="24"/>
-          <w:szCs w:val="24"/>
-        </w:rPr>
-        <w:t>Demand Prediction</w:t>
-      </w:r>
-    </w:p>
-    <w:p>
-      <w:pPr>
-        <w:pBdr>
-          <w:top w:val="single" w:sz="4" w:space="1" w:color="auto"/>
-          <w:left w:val="single" w:sz="4" w:space="4" w:color="auto"/>
-          <w:bottom w:val="single" w:sz="4" w:space="1" w:color="auto"/>
-          <w:right w:val="single" w:sz="4" w:space="4" w:color="auto"/>
-        </w:pBdr>
-        <w:jc w:val="center"/>
-        <w:rPr>
-          <w:rFonts w:ascii="Times New Roman" w:hAnsi="Times New Roman" w:cs="Times New Roman"/>
-          <w:sz w:val="24"/>
-          <w:szCs w:val="24"/>
-        </w:rPr>
-      </w:pPr>
-      <w:r>
-        <w:rPr>
-          <w:rFonts w:ascii="Times New Roman" w:hAnsi="Times New Roman" w:cs="Times New Roman"/>
-          <w:sz w:val="24"/>
-          <w:szCs w:val="24"/>
-        </w:rPr>
-        <w:t xml:space="preserve">                ↓</w:t>
-      </w:r>
-    </w:p>
-    <w:p>
-      <w:pPr>
-        <w:pBdr>
-          <w:top w:val="single" w:sz="4" w:space="1" w:color="auto"/>
-          <w:left w:val="single" w:sz="4" w:space="4" w:color="auto"/>
-          <w:bottom w:val="single" w:sz="4" w:space="1" w:color="auto"/>
-          <w:right w:val="single" w:sz="4" w:space="4" w:color="auto"/>
-        </w:pBdr>
-        <w:jc w:val="center"/>
-        <w:rPr>
-          <w:rFonts w:ascii="Times New Roman" w:hAnsi="Times New Roman" w:cs="Times New Roman"/>
-          <w:sz w:val="24"/>
-          <w:szCs w:val="24"/>
-        </w:rPr>
-      </w:pPr>
-      <w:r>
-        <w:rPr>
-          <w:rFonts w:ascii="Times New Roman" w:hAnsi="Times New Roman" w:cs="Times New Roman"/>
-          <w:sz w:val="24"/>
-          <w:szCs w:val="24"/>
-        </w:rPr>
-        <w:t>Inventory Assessment</w:t>
-      </w:r>
-    </w:p>
-    <w:p>
-      <w:pPr>
-        <w:pBdr>
-          <w:top w:val="single" w:sz="4" w:space="1" w:color="auto"/>
-          <w:left w:val="single" w:sz="4" w:space="4" w:color="auto"/>
-          <w:bottom w:val="single" w:sz="4" w:space="1" w:color="auto"/>
-          <w:right w:val="single" w:sz="4" w:space="4" w:color="auto"/>
-        </w:pBdr>
-        <w:jc w:val="center"/>
-        <w:rPr>
-          <w:rFonts w:ascii="Times New Roman" w:hAnsi="Times New Roman" w:cs="Times New Roman"/>
-          <w:sz w:val="24"/>
-          <w:szCs w:val="24"/>
-        </w:rPr>
-      </w:pPr>
-      <w:r>
-        <w:rPr>
-          <w:rFonts w:ascii="Times New Roman" w:hAnsi="Times New Roman" w:cs="Times New Roman"/>
-          <w:sz w:val="24"/>
-          <w:szCs w:val="24"/>
-        </w:rPr>
-        <w:t xml:space="preserve">                ↓</w:t>
-      </w:r>
-    </w:p>
-    <w:p>
-      <w:pPr>
-        <w:pBdr>
-          <w:top w:val="single" w:sz="4" w:space="1" w:color="auto"/>
-          <w:left w:val="single" w:sz="4" w:space="4" w:color="auto"/>
-          <w:bottom w:val="single" w:sz="4" w:space="1" w:color="auto"/>
-          <w:right w:val="single" w:sz="4" w:space="4" w:color="auto"/>
-        </w:pBdr>
-        <w:jc w:val="center"/>
-        <w:rPr>
-          <w:rFonts w:ascii="Times New Roman" w:hAnsi="Times New Roman" w:cs="Times New Roman"/>
-          <w:sz w:val="24"/>
-          <w:szCs w:val="24"/>
-        </w:rPr>
-      </w:pPr>
-      <w:r>
-        <w:rPr>
-          <w:rFonts w:ascii="Times New Roman" w:hAnsi="Times New Roman" w:cs="Times New Roman"/>
-          <w:sz w:val="24"/>
-          <w:szCs w:val="24"/>
-        </w:rPr>
-        <w:t>Waste-Risk Classification</w:t>
-      </w:r>
-    </w:p>
-    <w:p>
-      <w:pPr>
-        <w:pBdr>
-          <w:top w:val="single" w:sz="4" w:space="1" w:color="auto"/>
-          <w:left w:val="single" w:sz="4" w:space="4" w:color="auto"/>
-          <w:bottom w:val="single" w:sz="4" w:space="1" w:color="auto"/>
-          <w:right w:val="single" w:sz="4" w:space="4" w:color="auto"/>
-        </w:pBdr>
-        <w:jc w:val="center"/>
-        <w:rPr>
-          <w:rFonts w:ascii="Times New Roman" w:hAnsi="Times New Roman" w:cs="Times New Roman"/>
-          <w:sz w:val="24"/>
-          <w:szCs w:val="24"/>
-        </w:rPr>
-      </w:pPr>
-      <w:r>
-        <w:rPr>
-          <w:rFonts w:ascii="Times New Roman" w:hAnsi="Times New Roman" w:cs="Times New Roman"/>
-          <w:sz w:val="24"/>
-          <w:szCs w:val="24"/>
-        </w:rPr>
-        <w:t xml:space="preserve">                ↓</w:t>
-      </w:r>
-    </w:p>
-    <w:p>
-      <w:pPr>
-        <w:pBdr>
-          <w:top w:val="single" w:sz="4" w:space="1" w:color="auto"/>
-          <w:left w:val="single" w:sz="4" w:space="4" w:color="auto"/>
-          <w:bottom w:val="single" w:sz="4" w:space="1" w:color="auto"/>
-          <w:right w:val="single" w:sz="4" w:space="4" w:color="auto"/>
-        </w:pBdr>
-        <w:jc w:val="center"/>
-        <w:rPr>
-          <w:rFonts w:ascii="Times New Roman" w:hAnsi="Times New Roman" w:cs="Times New Roman"/>
-          <w:sz w:val="24"/>
-          <w:szCs w:val="24"/>
-        </w:rPr>
-      </w:pPr>
-      <w:r>
-        <w:rPr>
-          <w:rFonts w:ascii="Times New Roman" w:hAnsi="Times New Roman" w:cs="Times New Roman"/>
-          <w:sz w:val="24"/>
-          <w:szCs w:val="24"/>
-        </w:rPr>
-        <w:t>Intelligent Recommendation</w:t>
-      </w:r>
-    </w:p>
-    <w:p>
-      <w:pPr>
-        <w:pBdr>
-          <w:top w:val="single" w:sz="4" w:space="1" w:color="auto"/>
-          <w:left w:val="single" w:sz="4" w:space="4" w:color="auto"/>
-          <w:bottom w:val="single" w:sz="4" w:space="1" w:color="auto"/>
-          <w:right w:val="single" w:sz="4" w:space="4" w:color="auto"/>
-        </w:pBdr>
-        <w:jc w:val="center"/>
-        <w:rPr>
-          <w:rFonts w:ascii="Times New Roman" w:hAnsi="Times New Roman" w:cs="Times New Roman"/>
-          <w:sz w:val="24"/>
-          <w:szCs w:val="24"/>
-        </w:rPr>
-      </w:pPr>
-      <w:r>
-        <w:rPr>
-          <w:rFonts w:ascii="Times New Roman" w:hAnsi="Times New Roman" w:cs="Times New Roman"/>
-          <w:sz w:val="24"/>
-          <w:szCs w:val="24"/>
-        </w:rPr>
-        <w:t xml:space="preserve">                ↓</w:t>
-      </w:r>
-    </w:p>
-    <w:p>
-      <w:pPr>
-        <w:pBdr>
-          <w:top w:val="single" w:sz="4" w:space="1" w:color="auto"/>
-          <w:left w:val="single" w:sz="4" w:space="4" w:color="auto"/>
-          <w:bottom w:val="single" w:sz="4" w:space="1" w:color="auto"/>
-          <w:right w:val="single" w:sz="4" w:space="4" w:color="auto"/>
-        </w:pBdr>
-        <w:jc w:val="center"/>
-        <w:rPr>
-          <w:rFonts w:ascii="Times New Roman" w:hAnsi="Times New Roman" w:cs="Times New Roman"/>
-          <w:sz w:val="24"/>
-          <w:szCs w:val="24"/>
-        </w:rPr>
-      </w:pPr>
-      <w:r>
-        <w:rPr>
-          <w:rFonts w:ascii="Times New Roman" w:hAnsi="Times New Roman" w:cs="Times New Roman"/>
-          <w:sz w:val="24"/>
-          <w:szCs w:val="24"/>
-        </w:rPr>
-        <w:t>Prediction Logs</w:t>
-      </w:r>
-    </w:p>
-    <w:p>
-      <w:pPr>
-        <w:pBdr>
-          <w:top w:val="single" w:sz="4" w:space="1" w:color="auto"/>
-          <w:left w:val="single" w:sz="4" w:space="4" w:color="auto"/>
-          <w:bottom w:val="single" w:sz="4" w:space="1" w:color="auto"/>
-          <w:right w:val="single" w:sz="4" w:space="4" w:color="auto"/>
-        </w:pBdr>
-        <w:jc w:val="center"/>
-        <w:rPr>
-          <w:rFonts w:ascii="Times New Roman" w:hAnsi="Times New Roman" w:cs="Times New Roman"/>
-          <w:sz w:val="24"/>
-          <w:szCs w:val="24"/>
-        </w:rPr>
-      </w:pPr>
-      <w:r>
-        <w:rPr>
-          <w:rFonts w:ascii="Times New Roman" w:hAnsi="Times New Roman" w:cs="Times New Roman"/>
-          <w:sz w:val="24"/>
-          <w:szCs w:val="24"/>
-        </w:rPr>
-        <w:t xml:space="preserve">                ↓</w:t>
-      </w:r>
-    </w:p>
-    <w:p>
-      <w:pPr>
-        <w:pBdr>
-          <w:top w:val="single" w:sz="4" w:space="1" w:color="auto"/>
-          <w:left w:val="single" w:sz="4" w:space="4" w:color="auto"/>
-          <w:bottom w:val="single" w:sz="4" w:space="1" w:color="auto"/>
-          <w:right w:val="single" w:sz="4" w:space="4" w:color="auto"/>
-        </w:pBdr>
-        <w:jc w:val="center"/>
-        <w:rPr>
-          <w:rFonts w:ascii="Times New Roman" w:hAnsi="Times New Roman" w:cs="Times New Roman"/>
-          <w:sz w:val="24"/>
-          <w:szCs w:val="24"/>
-        </w:rPr>
-      </w:pPr>
-      <w:r>
-        <w:rPr>
-          <w:rFonts w:ascii="Times New Roman" w:hAnsi="Times New Roman" w:cs="Times New Roman"/>
-          <w:sz w:val="24"/>
-          <w:szCs w:val="24"/>
-        </w:rPr>
-        <w:t>Drift Detection</w:t>
-      </w:r>
-    </w:p>
-    <w:p>
-      <w:pPr>
-        <w:pBdr>
-          <w:top w:val="single" w:sz="4" w:space="1" w:color="auto"/>
-          <w:left w:val="single" w:sz="4" w:space="4" w:color="auto"/>
-          <w:bottom w:val="single" w:sz="4" w:space="1" w:color="auto"/>
-          <w:right w:val="single" w:sz="4" w:space="4" w:color="auto"/>
-        </w:pBdr>
-        <w:jc w:val="center"/>
-        <w:rPr>
-          <w:rFonts w:ascii="Times New Roman" w:hAnsi="Times New Roman" w:cs="Times New Roman"/>
-          <w:sz w:val="24"/>
-          <w:szCs w:val="24"/>
-        </w:rPr>
-      </w:pPr>
-      <w:r>
-        <w:rPr>
-          <w:rFonts w:ascii="Times New Roman" w:hAnsi="Times New Roman" w:cs="Times New Roman"/>
-          <w:sz w:val="24"/>
-          <w:szCs w:val="24"/>
-        </w:rPr>
-        <w:t xml:space="preserve">                ↓</w:t>
-      </w:r>
-    </w:p>
-    <w:p>
-      <w:pPr>
-        <w:pBdr>
-          <w:top w:val="single" w:sz="4" w:space="1" w:color="auto"/>
-          <w:left w:val="single" w:sz="4" w:space="4" w:color="auto"/>
-          <w:bottom w:val="single" w:sz="4" w:space="1" w:color="auto"/>
-          <w:right w:val="single" w:sz="4" w:space="4" w:color="auto"/>
-        </w:pBdr>
-        <w:jc w:val="center"/>
-        <w:rPr>
-          <w:rFonts w:ascii="Times New Roman" w:hAnsi="Times New Roman" w:cs="Times New Roman"/>
-          <w:sz w:val="24"/>
-          <w:szCs w:val="24"/>
-        </w:rPr>
-      </w:pPr>
-      <w:r>
-        <w:rPr>
-          <w:rFonts w:ascii="Times New Roman" w:hAnsi="Times New Roman" w:cs="Times New Roman"/>
-          <w:sz w:val="24"/>
-          <w:szCs w:val="24"/>
-        </w:rPr>
-        <w:t>Automatic Retraining (if drift detected)</w:t>
-      </w:r>
-    </w:p>
-    <w:p>
-      <w:pPr>
-        <w:pBdr>
-          <w:top w:val="single" w:sz="4" w:space="1" w:color="auto"/>
-          <w:left w:val="single" w:sz="4" w:space="4" w:color="auto"/>
-          <w:bottom w:val="single" w:sz="4" w:space="1" w:color="auto"/>
-          <w:right w:val="single" w:sz="4" w:space="4" w:color="auto"/>
-        </w:pBdr>
-        <w:jc w:val="center"/>
-        <w:rPr>
-          <w:rFonts w:ascii="Times New Roman" w:hAnsi="Times New Roman" w:cs="Times New Roman"/>
-          <w:sz w:val="24"/>
-          <w:szCs w:val="24"/>
-        </w:rPr>
-      </w:pPr>
-      <w:r>
-        <w:rPr>
-          <w:rFonts w:ascii="Times New Roman" w:hAnsi="Times New Roman" w:cs="Times New Roman"/>
-          <w:sz w:val="24"/>
-          <w:szCs w:val="24"/>
-        </w:rPr>
-        <w:lastRenderedPageBreak/>
-        <w:t xml:space="preserve">                ↓</w:t>
-      </w:r>
-    </w:p>
-    <w:p>
-      <w:pPr>
-        <w:pBdr>
-          <w:top w:val="single" w:sz="4" w:space="1" w:color="auto"/>
-          <w:left w:val="single" w:sz="4" w:space="4" w:color="auto"/>
-          <w:bottom w:val="single" w:sz="4" w:space="1" w:color="auto"/>
-          <w:right w:val="single" w:sz="4" w:space="4" w:color="auto"/>
-        </w:pBdr>
-        <w:jc w:val="center"/>
-        <w:rPr>
-          <w:rFonts w:ascii="Times New Roman" w:hAnsi="Times New Roman" w:cs="Times New Roman"/>
-          <w:sz w:val="24"/>
-          <w:szCs w:val="24"/>
-        </w:rPr>
-      </w:pPr>
-      <w:r>
-        <w:rPr>
-          <w:rFonts w:ascii="Times New Roman" w:hAnsi="Times New Roman" w:cs="Times New Roman"/>
-          <w:sz w:val="24"/>
-          <w:szCs w:val="24"/>
-        </w:rPr>
-        <w:t>Updated Model Registry</w:t>
-      </w:r>
-    </w:p>
-    <w:p>
-      <w:pPr>
-        <w:pBdr>
-          <w:top w:val="single" w:sz="4" w:space="1" w:color="auto"/>
-          <w:left w:val="single" w:sz="4" w:space="4" w:color="auto"/>
-          <w:bottom w:val="single" w:sz="4" w:space="1" w:color="auto"/>
-          <w:right w:val="single" w:sz="4" w:space="4" w:color="auto"/>
-        </w:pBdr>
-        <w:jc w:val="center"/>
-        <w:rPr>
-          <w:rFonts w:ascii="Times New Roman" w:hAnsi="Times New Roman" w:cs="Times New Roman"/>
-          <w:sz w:val="24"/>
-          <w:szCs w:val="24"/>
-        </w:rPr>
-      </w:pPr>
-    </w:p>
-    <w:p>
-      <w:pPr>
-        <w:pBdr>
-          <w:top w:val="single" w:sz="4" w:space="1" w:color="auto"/>
-          <w:left w:val="single" w:sz="4" w:space="4" w:color="auto"/>
-          <w:bottom w:val="single" w:sz="4" w:space="1" w:color="auto"/>
-          <w:right w:val="single" w:sz="4" w:space="4" w:color="auto"/>
-        </w:pBdr>
-        <w:jc w:val="center"/>
-        <w:rPr>
-          <w:rFonts w:ascii="Times New Roman" w:hAnsi="Times New Roman" w:cs="Times New Roman"/>
-          <w:sz w:val="24"/>
-          <w:szCs w:val="24"/>
-        </w:rPr>
-      </w:pPr>
-      <w:r>
-        <w:rPr>
-          <w:rFonts w:ascii="Times New Roman" w:hAnsi="Times New Roman" w:cs="Times New Roman"/>
-          <w:sz w:val="24"/>
-          <w:szCs w:val="24"/>
-        </w:rPr>
-        <w:t>External Retail System</w:t>
-      </w:r>
-    </w:p>
-    <w:p>
-      <w:pPr>
-        <w:pBdr>
-          <w:top w:val="single" w:sz="4" w:space="1" w:color="auto"/>
-          <w:left w:val="single" w:sz="4" w:space="4" w:color="auto"/>
-          <w:bottom w:val="single" w:sz="4" w:space="1" w:color="auto"/>
-          <w:right w:val="single" w:sz="4" w:space="4" w:color="auto"/>
-        </w:pBdr>
-        <w:jc w:val="center"/>
-        <w:rPr>
-          <w:rFonts w:ascii="Times New Roman" w:hAnsi="Times New Roman" w:cs="Times New Roman"/>
-          <w:sz w:val="24"/>
-          <w:szCs w:val="24"/>
-        </w:rPr>
-      </w:pPr>
-      <w:r>
-        <w:rPr>
-          <w:rFonts w:ascii="Times New Roman" w:hAnsi="Times New Roman" w:cs="Times New Roman"/>
-          <w:sz w:val="24"/>
-          <w:szCs w:val="24"/>
-        </w:rPr>
-        <w:t xml:space="preserve">                ↓</w:t>
-      </w:r>
-    </w:p>
-    <w:p>
-      <w:pPr>
-        <w:pBdr>
-          <w:top w:val="single" w:sz="4" w:space="1" w:color="auto"/>
-          <w:left w:val="single" w:sz="4" w:space="4" w:color="auto"/>
-          <w:bottom w:val="single" w:sz="4" w:space="1" w:color="auto"/>
-          <w:right w:val="single" w:sz="4" w:space="4" w:color="auto"/>
-        </w:pBdr>
-        <w:jc w:val="center"/>
-        <w:rPr>
-          <w:rFonts w:ascii="Times New Roman" w:hAnsi="Times New Roman" w:cs="Times New Roman"/>
-          <w:sz w:val="24"/>
-          <w:szCs w:val="24"/>
-        </w:rPr>
-      </w:pPr>
-      <w:r>
-        <w:rPr>
-          <w:rFonts w:ascii="Times New Roman" w:hAnsi="Times New Roman" w:cs="Times New Roman"/>
-          <w:sz w:val="24"/>
-          <w:szCs w:val="24"/>
-        </w:rPr>
-        <w:t>POST /sales-event</w:t>
-      </w:r>
-    </w:p>
-    <w:p>
-      <w:pPr>
-        <w:pBdr>
-          <w:top w:val="single" w:sz="4" w:space="1" w:color="auto"/>
-          <w:left w:val="single" w:sz="4" w:space="4" w:color="auto"/>
-          <w:bottom w:val="single" w:sz="4" w:space="1" w:color="auto"/>
-          <w:right w:val="single" w:sz="4" w:space="4" w:color="auto"/>
-        </w:pBdr>
-        <w:jc w:val="center"/>
-        <w:rPr>
-          <w:rFonts w:ascii="Times New Roman" w:hAnsi="Times New Roman" w:cs="Times New Roman"/>
-          <w:sz w:val="24"/>
-          <w:szCs w:val="24"/>
-        </w:rPr>
-      </w:pPr>
-      <w:r>
-        <w:rPr>
-          <w:rFonts w:ascii="Times New Roman" w:hAnsi="Times New Roman" w:cs="Times New Roman"/>
-          <w:sz w:val="24"/>
-          <w:szCs w:val="24"/>
-        </w:rPr>
-        <w:t xml:space="preserve">                ↓</w:t>
-      </w:r>
-    </w:p>
-    <w:p>
-      <w:pPr>
-        <w:pBdr>
-          <w:top w:val="single" w:sz="4" w:space="1" w:color="auto"/>
-          <w:left w:val="single" w:sz="4" w:space="4" w:color="auto"/>
-          <w:bottom w:val="single" w:sz="4" w:space="1" w:color="auto"/>
-          <w:right w:val="single" w:sz="4" w:space="4" w:color="auto"/>
-        </w:pBdr>
-        <w:jc w:val="center"/>
-        <w:rPr>
-          <w:rFonts w:ascii="Times New Roman" w:hAnsi="Times New Roman" w:cs="Times New Roman"/>
-          <w:sz w:val="24"/>
-          <w:szCs w:val="24"/>
-        </w:rPr>
-      </w:pPr>
-      <w:r>
-        <w:rPr>
-          <w:rFonts w:ascii="Times New Roman" w:hAnsi="Times New Roman" w:cs="Times New Roman"/>
-          <w:sz w:val="24"/>
-          <w:szCs w:val="24"/>
-        </w:rPr>
-        <w:t>FastAPI Backend</w:t>
-      </w:r>
-    </w:p>
-    <w:p>
-      <w:pPr>
-        <w:pBdr>
-          <w:top w:val="single" w:sz="4" w:space="1" w:color="auto"/>
-          <w:left w:val="single" w:sz="4" w:space="4" w:color="auto"/>
-          <w:bottom w:val="single" w:sz="4" w:space="1" w:color="auto"/>
-          <w:right w:val="single" w:sz="4" w:space="4" w:color="auto"/>
-        </w:pBdr>
-        <w:jc w:val="center"/>
-        <w:rPr>
-          <w:rFonts w:ascii="Times New Roman" w:hAnsi="Times New Roman" w:cs="Times New Roman"/>
-          <w:sz w:val="24"/>
-          <w:szCs w:val="24"/>
-        </w:rPr>
-      </w:pPr>
-      <w:r>
-        <w:rPr>
-          <w:rFonts w:ascii="Times New Roman" w:hAnsi="Times New Roman" w:cs="Times New Roman"/>
-          <w:sz w:val="24"/>
-          <w:szCs w:val="24"/>
-        </w:rPr>
-        <w:t xml:space="preserve">                ↓</w:t>
-      </w:r>
-    </w:p>
-    <w:p>
-      <w:pPr>
-        <w:pBdr>
-          <w:top w:val="single" w:sz="4" w:space="1" w:color="auto"/>
-          <w:left w:val="single" w:sz="4" w:space="4" w:color="auto"/>
-          <w:bottom w:val="single" w:sz="4" w:space="1" w:color="auto"/>
-          <w:right w:val="single" w:sz="4" w:space="4" w:color="auto"/>
-        </w:pBdr>
-        <w:jc w:val="center"/>
-        <w:rPr>
-          <w:rFonts w:ascii="Times New Roman" w:hAnsi="Times New Roman" w:cs="Times New Roman"/>
-          <w:sz w:val="24"/>
-          <w:szCs w:val="24"/>
-        </w:rPr>
-      </w:pPr>
-      <w:r>
-        <w:rPr>
-          <w:rFonts w:ascii="Times New Roman" w:hAnsi="Times New Roman" w:cs="Times New Roman"/>
-          <w:sz w:val="24"/>
-          <w:szCs w:val="24"/>
-        </w:rPr>
-        <w:t>SQLite Operational Database</w:t>
-      </w:r>
-    </w:p>
-    <w:p>
-      <w:pPr>
-        <w:pBdr>
-          <w:top w:val="single" w:sz="4" w:space="1" w:color="auto"/>
-          <w:left w:val="single" w:sz="4" w:space="4" w:color="auto"/>
-          <w:bottom w:val="single" w:sz="4" w:space="1" w:color="auto"/>
-          <w:right w:val="single" w:sz="4" w:space="4" w:color="auto"/>
-        </w:pBdr>
-        <w:jc w:val="center"/>
-        <w:rPr>
-          <w:rFonts w:ascii="Times New Roman" w:hAnsi="Times New Roman" w:cs="Times New Roman"/>
-          <w:sz w:val="24"/>
-          <w:szCs w:val="24"/>
-        </w:rPr>
-      </w:pPr>
-    </w:p>
-    <w:p>
-      <w:pPr>
-        <w:pBdr>
-          <w:top w:val="single" w:sz="4" w:space="1" w:color="auto"/>
-          <w:left w:val="single" w:sz="4" w:space="4" w:color="auto"/>
-          <w:bottom w:val="single" w:sz="4" w:space="1" w:color="auto"/>
-          <w:right w:val="single" w:sz="4" w:space="4" w:color="auto"/>
-        </w:pBdr>
-        <w:jc w:val="center"/>
-        <w:rPr>
-          <w:rFonts w:ascii="Times New Roman" w:hAnsi="Times New Roman" w:cs="Times New Roman"/>
-          <w:sz w:val="24"/>
-          <w:szCs w:val="24"/>
-        </w:rPr>
-      </w:pPr>
-      <w:r>
-        <w:rPr>
-          <w:rFonts w:ascii="Times New Roman" w:hAnsi="Times New Roman" w:cs="Times New Roman"/>
-          <w:sz w:val="24"/>
-          <w:szCs w:val="24"/>
-        </w:rPr>
-        <w:t>Streamlit Dashboard</w:t>
-      </w:r>
-    </w:p>
-    <w:p>
-      <w:pPr>
-        <w:pBdr>
-          <w:top w:val="single" w:sz="4" w:space="1" w:color="auto"/>
-          <w:left w:val="single" w:sz="4" w:space="4" w:color="auto"/>
-          <w:bottom w:val="single" w:sz="4" w:space="1" w:color="auto"/>
-          <w:right w:val="single" w:sz="4" w:space="4" w:color="auto"/>
-        </w:pBdr>
-        <w:jc w:val="center"/>
-        <w:rPr>
-          <w:rFonts w:ascii="Times New Roman" w:hAnsi="Times New Roman" w:cs="Times New Roman"/>
-          <w:sz w:val="24"/>
-          <w:szCs w:val="24"/>
-        </w:rPr>
-      </w:pPr>
-      <w:r>
-        <w:rPr>
-          <w:rFonts w:ascii="Times New Roman" w:hAnsi="Times New Roman" w:cs="Times New Roman"/>
-          <w:sz w:val="24"/>
-          <w:szCs w:val="24"/>
-        </w:rPr>
-        <w:t>• Demand Prediction</w:t>
-      </w:r>
-    </w:p>
-    <w:p>
-      <w:pPr>
-        <w:pBdr>
-          <w:top w:val="single" w:sz="4" w:space="1" w:color="auto"/>
-          <w:left w:val="single" w:sz="4" w:space="4" w:color="auto"/>
-          <w:bottom w:val="single" w:sz="4" w:space="1" w:color="auto"/>
-          <w:right w:val="single" w:sz="4" w:space="4" w:color="auto"/>
-        </w:pBdr>
-        <w:jc w:val="center"/>
-        <w:rPr>
-          <w:rFonts w:ascii="Times New Roman" w:hAnsi="Times New Roman" w:cs="Times New Roman"/>
-          <w:sz w:val="24"/>
-          <w:szCs w:val="24"/>
-        </w:rPr>
-      </w:pPr>
-      <w:r>
-        <w:rPr>
-          <w:rFonts w:ascii="Times New Roman" w:hAnsi="Times New Roman" w:cs="Times New Roman"/>
-          <w:sz w:val="24"/>
-          <w:szCs w:val="24"/>
-        </w:rPr>
-        <w:t>• Latest Sales</w:t>
-      </w:r>
-    </w:p>
-    <w:p>
-      <w:pPr>
-        <w:pBdr>
-          <w:top w:val="single" w:sz="4" w:space="1" w:color="auto"/>
-          <w:left w:val="single" w:sz="4" w:space="4" w:color="auto"/>
-          <w:bottom w:val="single" w:sz="4" w:space="1" w:color="auto"/>
-          <w:right w:val="single" w:sz="4" w:space="4" w:color="auto"/>
-        </w:pBdr>
-        <w:jc w:val="center"/>
-        <w:rPr>
-          <w:rFonts w:ascii="Times New Roman" w:hAnsi="Times New Roman" w:cs="Times New Roman"/>
-          <w:sz w:val="24"/>
-          <w:szCs w:val="24"/>
-        </w:rPr>
-      </w:pPr>
-      <w:r>
-        <w:rPr>
-          <w:rFonts w:ascii="Times New Roman" w:hAnsi="Times New Roman" w:cs="Times New Roman"/>
-          <w:sz w:val="24"/>
-          <w:szCs w:val="24"/>
-        </w:rPr>
-        <w:t>• Model Information</w:t>
-      </w:r>
-    </w:p>
-    <w:p>
-      <w:pPr>
-        <w:pBdr>
-          <w:top w:val="single" w:sz="4" w:space="1" w:color="auto"/>
-          <w:left w:val="single" w:sz="4" w:space="4" w:color="auto"/>
-          <w:bottom w:val="single" w:sz="4" w:space="1" w:color="auto"/>
-          <w:right w:val="single" w:sz="4" w:space="4" w:color="auto"/>
-        </w:pBdr>
-        <w:jc w:val="center"/>
-        <w:rPr>
-          <w:rFonts w:ascii="Times New Roman" w:hAnsi="Times New Roman" w:cs="Times New Roman"/>
-          <w:sz w:val="24"/>
-          <w:szCs w:val="24"/>
-        </w:rPr>
-      </w:pPr>
-      <w:r>
-        <w:rPr>
-          <w:rFonts w:ascii="Times New Roman" w:hAnsi="Times New Roman" w:cs="Times New Roman"/>
-          <w:sz w:val="24"/>
-          <w:szCs w:val="24"/>
-        </w:rPr>
-        <w:t>• Model Comparison</w:t>
-      </w:r>
-    </w:p>
-    <w:p>
-      <w:pPr>
-        <w:pBdr>
-          <w:top w:val="single" w:sz="4" w:space="1" w:color="auto"/>
-          <w:left w:val="single" w:sz="4" w:space="4" w:color="auto"/>
-          <w:bottom w:val="single" w:sz="4" w:space="1" w:color="auto"/>
-          <w:right w:val="single" w:sz="4" w:space="4" w:color="auto"/>
-        </w:pBdr>
-        <w:jc w:val="center"/>
-        <w:rPr>
-          <w:rFonts w:ascii="Times New Roman" w:hAnsi="Times New Roman" w:cs="Times New Roman"/>
-          <w:sz w:val="24"/>
-          <w:szCs w:val="24"/>
-        </w:rPr>
-      </w:pPr>
-      <w:r>
-        <w:rPr>
-          <w:rFonts w:ascii="Times New Roman" w:hAnsi="Times New Roman" w:cs="Times New Roman"/>
-          <w:sz w:val="24"/>
-          <w:szCs w:val="24"/>
-        </w:rPr>
-        <w:t>• Drift Reports</w:t>
-      </w:r>
-    </w:p>
-    <w:p>
-      <w:pPr>
-        <w:pBdr>
-          <w:top w:val="single" w:sz="4" w:space="1" w:color="auto"/>
-          <w:left w:val="single" w:sz="4" w:space="4" w:color="auto"/>
-          <w:bottom w:val="single" w:sz="4" w:space="1" w:color="auto"/>
-          <w:right w:val="single" w:sz="4" w:space="4" w:color="auto"/>
-        </w:pBdr>
-        <w:jc w:val="center"/>
-        <w:rPr>
-          <w:rFonts w:ascii="Times New Roman" w:hAnsi="Times New Roman" w:cs="Times New Roman"/>
-          <w:sz w:val="24"/>
-          <w:szCs w:val="24"/>
-        </w:rPr>
-      </w:pPr>
-      <w:r>
-        <w:rPr>
-          <w:rFonts w:ascii="Times New Roman" w:hAnsi="Times New Roman" w:cs="Times New Roman"/>
-          <w:sz w:val="24"/>
-          <w:szCs w:val="24"/>
-        </w:rPr>
-        <w:t>• Pipeline Actions</w:t>
-      </w:r>
-    </w:p>
-    <w:p>
-      <w:pPr>
-        <w:jc w:val="both"/>
-        <w:rPr>
-          <w:rFonts w:ascii="Times New Roman" w:eastAsia="Times New Roman" w:hAnsi="Times New Roman" w:cs="Times New Roman"/>
-          <w:b/>
-          <w:i/>
-          <w:sz w:val="24"/>
-          <w:szCs w:val="24"/>
-        </w:rPr>
-      </w:pPr>
-      <w:r>
-        <w:rPr>
-          <w:rStyle w:val="Strong"/>
-          <w:rFonts w:ascii="Times New Roman" w:hAnsi="Times New Roman" w:cs="Times New Roman"/>
-          <w:sz w:val="24"/>
-          <w:szCs w:val="24"/>
-        </w:rPr>
-        <w:t>Figure 4.1</w:t>
-      </w:r>
-      <w:r>
-        <w:rPr>
-          <w:rStyle w:val="Strong"/>
-          <w:rFonts w:ascii="Times New Roman" w:hAnsi="Times New Roman" w:cs="Times New Roman"/>
-          <w:b w:val="0"/>
-          <w:sz w:val="24"/>
-          <w:szCs w:val="24"/>
-        </w:rPr>
-        <w:t>.</w:t>
-      </w:r>
-      <w:r>
-        <w:rPr>
-          <w:rFonts w:ascii="Times New Roman" w:hAnsi="Times New Roman" w:cs="Times New Roman"/>
-          <w:b/>
-          <w:i/>
-          <w:sz w:val="24"/>
-          <w:szCs w:val="24"/>
-        </w:rPr>
-        <w:t xml:space="preserve"> </w:t>
-      </w:r>
-      <w:r>
-        <w:rPr>
-          <w:rStyle w:val="Emphasis"/>
-          <w:rFonts w:ascii="Times New Roman" w:hAnsi="Times New Roman" w:cs="Times New Roman"/>
-          <w:b/>
-          <w:i w:val="0"/>
-          <w:sz w:val="24"/>
-          <w:szCs w:val="24"/>
-        </w:rPr>
-        <w:t>Proposed AI-driven demand forecasting and intelligent inventory decision-support framework for inventory planning and inventory-related waste-risk identification.</w:t>
+        <w:t>The overall forecasting framework is illustrated in below Figure:</w:t>
+      </w:r>
+    </w:p>
+    <w:p>
+      <w:pPr>
+        <w:spacing w:before="100" w:beforeAutospacing="1" w:after="100" w:afterAutospacing="1" w:line="240" w:lineRule="auto"/>
+        <w:rPr>
+          <w:rFonts w:ascii="Times New Roman" w:eastAsia="Times New Roman" w:hAnsi="Times New Roman" w:cs="Times New Roman"/>
+          <w:sz w:val="24"/>
+          <w:szCs w:val="24"/>
+        </w:rPr>
+      </w:pPr>
+      <w:r>
+        <w:rPr>
+          <w:rFonts w:ascii="Times New Roman" w:eastAsia="Times New Roman" w:hAnsi="Times New Roman" w:cs="Times New Roman"/>
+          <w:noProof/>
+          <w:sz w:val="24"/>
+          <w:szCs w:val="24"/>
+        </w:rPr>
+        <w:drawing>
+          <wp:inline distT="0" distB="0" distL="0" distR="0">
+            <wp:extent cx="6478728" cy="7807124"/>
+            <wp:effectExtent l="0" t="0" r="0" b="3810"/>
+            <wp:docPr id="2" name="Picture 2" descr="C:\Users\Fusion\Downloads\4.1.png"/>
+            <wp:cNvGraphicFramePr>
+              <a:graphicFrameLocks xmlns:a="http://schemas.openxmlformats.org/drawingml/2006/main" noChangeAspect="1"/>
+            </wp:cNvGraphicFramePr>
+            <a:graphic xmlns:a="http://schemas.openxmlformats.org/drawingml/2006/main">
+              <a:graphicData uri="http://schemas.openxmlformats.org/drawingml/2006/picture">
+                <pic:pic xmlns:pic="http://schemas.openxmlformats.org/drawingml/2006/picture">
+                  <pic:nvPicPr>
+                    <pic:cNvPr id="0" name="Picture 1" descr="C:\Users\Fusion\Downloads\4.1.png"/>
+                    <pic:cNvPicPr>
+                      <a:picLocks noChangeAspect="1" noChangeArrowheads="1"/>
+                    </pic:cNvPicPr>
+                  </pic:nvPicPr>
+                  <pic:blipFill>
+                    <a:blip r:embed="rId10">
+                      <a:extLst>
+                        <a:ext uri="{28A0092B-C50C-407E-A947-70E740481C1C}">
+                          <a14:useLocalDpi xmlns:a14="http://schemas.microsoft.com/office/drawing/2010/main" val="0"/>
+                        </a:ext>
+                      </a:extLst>
+                    </a:blip>
+                    <a:srcRect/>
+                    <a:stretch>
+                      <a:fillRect/>
+                    </a:stretch>
+                  </pic:blipFill>
+                  <pic:spPr bwMode="auto">
+                    <a:xfrm>
+                      <a:off x="0" y="0"/>
+                      <a:ext cx="6527766" cy="7866217"/>
+                    </a:xfrm>
+                    <a:prstGeom prst="rect">
+                      <a:avLst/>
+                    </a:prstGeom>
+                    <a:noFill/>
+                    <a:ln>
+                      <a:noFill/>
+                    </a:ln>
+                  </pic:spPr>
+                </pic:pic>
+              </a:graphicData>
+            </a:graphic>
+          </wp:inline>
+        </w:drawing>
       </w:r>
       <w:r>
         <w:rPr>
@@ -8855,7 +7792,7 @@
                     <pic:cNvPicPr/>
                   </pic:nvPicPr>
                   <pic:blipFill>
-                    <a:blip r:embed="rId10"/>
+                    <a:blip r:embed="rId11"/>
                     <a:stretch>
                       <a:fillRect/>
                     </a:stretch>
@@ -8900,7 +7837,7 @@
                     <pic:cNvPicPr/>
                   </pic:nvPicPr>
                   <pic:blipFill>
-                    <a:blip r:embed="rId11"/>
+                    <a:blip r:embed="rId12"/>
                     <a:stretch>
                       <a:fillRect/>
                     </a:stretch>
@@ -9498,65 +8435,12 @@
         <w:rPr>
           <w:rStyle w:val="Strong"/>
           <w:rFonts w:eastAsiaTheme="majorEastAsia"/>
-          <w:noProof/>
         </w:rPr>
         <w:drawing>
-          <wp:inline distT="0" distB="0" distL="0" distR="0" wp14:anchorId="3A15B268" wp14:editId="3E1F970E">
-            <wp:extent cx="5943600" cy="3304572"/>
-            <wp:effectExtent l="0" t="0" r="0" b="0"/>
-            <wp:docPr id="6" name="Picture 6"/>
-            <wp:cNvGraphicFramePr>
-              <a:graphicFrameLocks xmlns:a="http://schemas.openxmlformats.org/drawingml/2006/main" noChangeAspect="1"/>
-            </wp:cNvGraphicFramePr>
-            <a:graphic xmlns:a="http://schemas.openxmlformats.org/drawingml/2006/main">
-              <a:graphicData uri="http://schemas.openxmlformats.org/drawingml/2006/picture">
-                <pic:pic xmlns:pic="http://schemas.openxmlformats.org/drawingml/2006/picture">
-                  <pic:nvPicPr>
-                    <pic:cNvPr id="1" name=""/>
-                    <pic:cNvPicPr/>
-                  </pic:nvPicPr>
-                  <pic:blipFill>
-                    <a:blip r:embed="rId12"/>
-                    <a:stretch>
-                      <a:fillRect/>
-                    </a:stretch>
-                  </pic:blipFill>
-                  <pic:spPr>
-                    <a:xfrm>
-                      <a:off x="0" y="0"/>
-                      <a:ext cx="5944620" cy="3305139"/>
-                    </a:xfrm>
-                    <a:prstGeom prst="rect">
-                      <a:avLst/>
-                    </a:prstGeom>
-                  </pic:spPr>
-                </pic:pic>
-              </a:graphicData>
-            </a:graphic>
-          </wp:inline>
-        </w:drawing>
-      </w:r>
-    </w:p>
-    <w:p>
-      <w:pPr>
-        <w:pStyle w:val="NormalWeb"/>
-        <w:rPr>
-          <w:rStyle w:val="Strong"/>
-          <w:rFonts w:eastAsiaTheme="majorEastAsia"/>
-        </w:rPr>
-      </w:pPr>
-      <w:r>
-        <w:rPr>
-          <w:rStyle w:val="Strong"/>
-          <w:rFonts w:eastAsiaTheme="majorEastAsia"/>
-          <w:noProof/>
-        </w:rPr>
-        <w:lastRenderedPageBreak/>
-        <w:drawing>
-          <wp:inline distT="0" distB="0" distL="0" distR="0" wp14:anchorId="6BB825ED" wp14:editId="3B7E8D0E">
-            <wp:extent cx="5943600" cy="3298785"/>
-            <wp:effectExtent l="0" t="0" r="0" b="0"/>
-            <wp:docPr id="7" name="Picture 7"/>
+          <wp:inline distT="0" distB="0" distL="0" distR="0" wp14:anchorId="42C9F071" wp14:editId="14601413">
+            <wp:extent cx="5943600" cy="3403159"/>
+            <wp:effectExtent l="0" t="0" r="0" b="6985"/>
+            <wp:docPr id="9" name="Picture 9"/>
             <wp:cNvGraphicFramePr>
               <a:graphicFrameLocks xmlns:a="http://schemas.openxmlformats.org/drawingml/2006/main" noChangeAspect="1"/>
             </wp:cNvGraphicFramePr>
@@ -9576,7 +8460,7 @@
                   <pic:spPr>
                     <a:xfrm>
                       <a:off x="0" y="0"/>
-                      <a:ext cx="5952902" cy="3303948"/>
+                      <a:ext cx="5948578" cy="3406009"/>
                     </a:xfrm>
                     <a:prstGeom prst="rect">
                       <a:avLst/>
@@ -9592,342 +8476,22 @@
     <w:p>
       <w:pPr>
         <w:pStyle w:val="NormalWeb"/>
-      </w:pPr>
-      <w:r>
         <w:rPr>
           <w:rStyle w:val="Strong"/>
           <w:rFonts w:eastAsiaTheme="majorEastAsia"/>
         </w:rPr>
-        <w:t>Figure 4.3. Actual demand prediction and intelligent inventory recommendation output generated by the implemented framework.</w:t>
-      </w:r>
-    </w:p>
-    <w:p>
-      <w:pPr>
-        <w:pStyle w:val="NormalWeb"/>
-      </w:pPr>
-      <w:r>
-        <w:t xml:space="preserve">The intelligent recommendation component extends the forecasting framework beyond demand prediction by transforming forecasting outputs into actionable inventory guidance. Using forecasted demand, stock availability, </w:t>
-      </w:r>
+      </w:pPr>
       <w:r>
         <w:rPr>
           <w:rStyle w:val="Strong"/>
           <w:rFonts w:eastAsiaTheme="majorEastAsia"/>
-        </w:rPr>
-        <w:t>expiry-related conditions</w:t>
-      </w:r>
-      <w:r>
-        <w:t xml:space="preserve">, and </w:t>
-      </w:r>
-      <w:r>
-        <w:rPr>
-          <w:rStyle w:val="Strong"/>
-          <w:rFonts w:eastAsiaTheme="majorEastAsia"/>
-        </w:rPr>
-        <w:t>engineered waste-risk indicators</w:t>
-      </w:r>
-      <w:r>
-        <w:t xml:space="preserve">, the framework generates intelligent inventory recommendations that support replenishment planning, stock adjustment decisions, inventory assessment, and waste-risk mitigation activities. This capability improves the practical usefulness of forecasting outputs by providing </w:t>
-      </w:r>
-      <w:r>
-        <w:rPr>
-          <w:rStyle w:val="Strong"/>
-          <w:rFonts w:eastAsiaTheme="majorEastAsia"/>
-        </w:rPr>
-        <w:t>decision-makers</w:t>
-      </w:r>
-      <w:r>
-        <w:t xml:space="preserve"> with interpretable and operationally relevant recommendations.</w:t>
-      </w:r>
-    </w:p>
-    <w:p>
-      <w:pPr>
-        <w:pStyle w:val="NormalWeb"/>
-      </w:pPr>
-      <w:r>
-        <w:t xml:space="preserve">The current recommendation mechanism is based on predefined inventory assessment rules. Future implementations may explore the integration of </w:t>
-      </w:r>
-      <w:r>
-        <w:rPr>
-          <w:rStyle w:val="Strong"/>
-          <w:rFonts w:eastAsiaTheme="majorEastAsia"/>
-        </w:rPr>
-        <w:t>Large Language Models (LLMs)</w:t>
-      </w:r>
-      <w:r>
-        <w:t xml:space="preserve"> to provide more </w:t>
-      </w:r>
-      <w:r>
-        <w:rPr>
-          <w:rStyle w:val="Strong"/>
-          <w:rFonts w:eastAsiaTheme="majorEastAsia"/>
-        </w:rPr>
-        <w:t>context-aware explanations</w:t>
-      </w:r>
-      <w:r>
-        <w:t xml:space="preserve"> and adaptive decision-support capabilities. Such approaches may improve recommendation interpretability and enhance the usability of forecasting systems for retail managers.</w:t>
-      </w:r>
-    </w:p>
-    <w:p>
-      <w:pPr>
-        <w:pStyle w:val="NormalWeb"/>
-      </w:pPr>
-      <w:r>
-        <w:t xml:space="preserve">By transforming forecasting outputs into practical recommendations, the framework extends beyond traditional demand prediction and provides direct support for </w:t>
-      </w:r>
-      <w:r>
-        <w:rPr>
-          <w:rStyle w:val="Strong"/>
-          <w:rFonts w:eastAsiaTheme="majorEastAsia"/>
-        </w:rPr>
-        <w:t>inventory-related decision-making</w:t>
-      </w:r>
-      <w:r>
-        <w:t>. This approach improves the operational usefulness of forecasting results and helps retailers respond more proactively to changing inventory conditions.</w:t>
-      </w:r>
-    </w:p>
-    <w:p>
-      <w:pPr>
-        <w:pStyle w:val="NormalWeb"/>
-      </w:pPr>
-      <w:r>
-        <w:t xml:space="preserve">The recommendation component is particularly important because reducing </w:t>
-      </w:r>
-      <w:r>
-        <w:rPr>
-          <w:rStyle w:val="Strong"/>
-          <w:rFonts w:eastAsiaTheme="majorEastAsia"/>
-        </w:rPr>
-        <w:t>inventory-related waste risk</w:t>
-      </w:r>
-      <w:r>
-        <w:t xml:space="preserve"> requires more than accurate forecasts. Business value is created when forecasting insights are translated into practical actions that support </w:t>
-      </w:r>
-      <w:r>
-        <w:rPr>
-          <w:rStyle w:val="Strong"/>
-          <w:rFonts w:eastAsiaTheme="majorEastAsia"/>
-        </w:rPr>
-        <w:t xml:space="preserve">inventory planning, improved stock </w:t>
-      </w:r>
-      <w:proofErr w:type="spellStart"/>
-      <w:r>
-        <w:rPr>
-          <w:rStyle w:val="Strong"/>
-          <w:rFonts w:eastAsiaTheme="majorEastAsia"/>
-        </w:rPr>
-        <w:t>utilisation</w:t>
-      </w:r>
-      <w:proofErr w:type="spellEnd"/>
-      <w:r>
-        <w:rPr>
-          <w:rStyle w:val="Strong"/>
-          <w:rFonts w:eastAsiaTheme="majorEastAsia"/>
-        </w:rPr>
-        <w:t>, and reduced inventory-related waste risk</w:t>
-      </w:r>
-      <w:r>
-        <w:t xml:space="preserve">. Consequently, the recommendation </w:t>
-      </w:r>
-      <w:r>
-        <w:lastRenderedPageBreak/>
-        <w:t>component provides the connection between demand forecasting and operational inventory decision-making within the proposed framework.</w:t>
-      </w:r>
-    </w:p>
-    <w:p>
-      <w:pPr>
-        <w:pStyle w:val="Heading2"/>
-      </w:pPr>
-      <w:r>
-        <w:t>4.5 Forecasting Reliability Through Monitoring and Automatic Retraining</w:t>
-      </w:r>
-    </w:p>
-    <w:p>
-      <w:pPr>
-        <w:pStyle w:val="NormalWeb"/>
-      </w:pPr>
-      <w:r>
-        <w:t xml:space="preserve">Forecasting models are typically developed using historical data; however, retail demand patterns are not static. Customer </w:t>
-      </w:r>
-      <w:proofErr w:type="spellStart"/>
-      <w:r>
-        <w:t>behaviour</w:t>
-      </w:r>
-      <w:proofErr w:type="spellEnd"/>
-      <w:r>
-        <w:t xml:space="preserve">, promotional activities, seasonal trends, and operational conditions can change over time, potentially affecting forecasting performance. As a result, forecasting systems require mechanisms that support </w:t>
-      </w:r>
-      <w:r>
-        <w:rPr>
-          <w:rStyle w:val="Strong"/>
-          <w:rFonts w:eastAsiaTheme="majorEastAsia"/>
-        </w:rPr>
-        <w:t>long-term reliability and adaptability</w:t>
-      </w:r>
-      <w:r>
-        <w:t>.</w:t>
-      </w:r>
-    </w:p>
-    <w:p>
-      <w:pPr>
-        <w:pStyle w:val="NormalWeb"/>
-      </w:pPr>
-      <w:r>
-        <w:t xml:space="preserve">To address this challenge, the proposed framework incorporates </w:t>
-      </w:r>
-      <w:r>
-        <w:rPr>
-          <w:rStyle w:val="Strong"/>
-          <w:rFonts w:eastAsiaTheme="majorEastAsia"/>
-        </w:rPr>
-        <w:t>monitoring, drift detection, model versioning, and automatic retraining</w:t>
-      </w:r>
-      <w:r>
-        <w:t xml:space="preserve"> capabilities. These mechanisms are designed to identify changes in operational data patterns and support model updating when current conditions differ substantially from the historical conditions used for model development.</w:t>
-      </w:r>
-    </w:p>
-    <w:p>
-      <w:pPr>
-        <w:pStyle w:val="NormalWeb"/>
-      </w:pPr>
-      <w:r>
-        <w:t xml:space="preserve">The monitoring process evaluates selected retail and </w:t>
-      </w:r>
-      <w:r>
-        <w:rPr>
-          <w:rStyle w:val="Strong"/>
-          <w:rFonts w:eastAsiaTheme="majorEastAsia"/>
-        </w:rPr>
-        <w:t>inventory-related variables</w:t>
-      </w:r>
-      <w:r>
-        <w:t xml:space="preserve">, including </w:t>
-      </w:r>
-      <w:r>
-        <w:rPr>
-          <w:rStyle w:val="Strong"/>
-          <w:rFonts w:eastAsiaTheme="majorEastAsia"/>
-        </w:rPr>
-        <w:t>units sold, current stock, temperature, and waste quantity</w:t>
-      </w:r>
-      <w:r>
-        <w:t xml:space="preserve">. Within the implemented framework, drift is assessed by comparing the mean of a historical </w:t>
-      </w:r>
-      <w:r>
-        <w:rPr>
-          <w:rStyle w:val="Strong"/>
-          <w:rFonts w:eastAsiaTheme="majorEastAsia"/>
-        </w:rPr>
-        <w:t>reference window of 1,000 observations</w:t>
-      </w:r>
-      <w:r>
-        <w:t xml:space="preserve"> with the mean of a </w:t>
-      </w:r>
-      <w:r>
-        <w:rPr>
-          <w:rStyle w:val="Strong"/>
-          <w:rFonts w:eastAsiaTheme="majorEastAsia"/>
-        </w:rPr>
-        <w:t>current window of 300 observations</w:t>
-      </w:r>
-      <w:r>
-        <w:t xml:space="preserve">. A relative mean-shift score is calculated for each monitored variable, and a predefined drift threshold of </w:t>
-      </w:r>
-      <w:r>
-        <w:rPr>
-          <w:rStyle w:val="Strong"/>
-          <w:rFonts w:eastAsiaTheme="majorEastAsia"/>
-        </w:rPr>
-        <w:t>0.15</w:t>
-      </w:r>
-      <w:r>
-        <w:t xml:space="preserve"> is used to determine whether a substantial change has occurred. When the calculated score exceeds this threshold, the corresponding variable is classified as exhibiting drift.</w:t>
-      </w:r>
-    </w:p>
-    <w:p>
-      <w:pPr>
-        <w:pStyle w:val="NormalWeb"/>
-      </w:pPr>
-      <w:r>
-        <w:t xml:space="preserve">To support forecasting reliability, the framework incorporates an </w:t>
-      </w:r>
-      <w:r>
-        <w:rPr>
-          <w:rStyle w:val="Strong"/>
-          <w:rFonts w:eastAsiaTheme="majorEastAsia"/>
-        </w:rPr>
-        <w:t>automatic retraining mechanism</w:t>
-      </w:r>
-      <w:r>
-        <w:t xml:space="preserve">. When drift is detected, the training pipeline is automatically executed and the forecasting models are trained and evaluated again. The selected model is then stored as a </w:t>
-      </w:r>
-      <w:r>
-        <w:rPr>
-          <w:rStyle w:val="Strong"/>
-          <w:rFonts w:eastAsiaTheme="majorEastAsia"/>
-        </w:rPr>
-        <w:t>timestamped versioned model artifact</w:t>
-      </w:r>
-      <w:r>
-        <w:t xml:space="preserve">, while the latest serving model is maintained as </w:t>
-      </w:r>
-      <w:proofErr w:type="spellStart"/>
-      <w:r>
-        <w:rPr>
-          <w:rStyle w:val="HTMLCode"/>
-          <w:rFonts w:ascii="Times New Roman" w:hAnsi="Times New Roman" w:cs="Times New Roman"/>
-        </w:rPr>
-        <w:t>demand_model.pkl</w:t>
-      </w:r>
-      <w:proofErr w:type="spellEnd"/>
-      <w:r>
-        <w:t>. This process provides a reproducible record of model updates and allows the forecasting component to be refreshed when significant changes in monitored data are identified.</w:t>
-      </w:r>
-    </w:p>
-    <w:p>
-      <w:pPr>
-        <w:pStyle w:val="NormalWeb"/>
-      </w:pPr>
-      <w:r>
-        <w:t xml:space="preserve">The implemented drift test demonstrated this process in practice. Drift was detected in </w:t>
-      </w:r>
-      <w:r>
-        <w:rPr>
-          <w:rStyle w:val="Strong"/>
-          <w:rFonts w:eastAsiaTheme="majorEastAsia"/>
-        </w:rPr>
-        <w:t>units sold, current stock, and waste quantity</w:t>
-      </w:r>
-      <w:r>
-        <w:t xml:space="preserve">, while </w:t>
-      </w:r>
-      <w:r>
-        <w:rPr>
-          <w:rStyle w:val="Strong"/>
-          <w:rFonts w:eastAsiaTheme="majorEastAsia"/>
-        </w:rPr>
-        <w:t>temperature remained stable</w:t>
-      </w:r>
-      <w:r>
-        <w:t xml:space="preserve"> under the predefined threshold. The detection of drift triggered the automatic retraining process, after which a new version of the selected forecasting model was generated and stored. This demonstrates the connection between operational monitoring, </w:t>
-      </w:r>
-      <w:r>
-        <w:t>drift identification, and model maintenance within the implemented framework.</w:t>
-      </w:r>
-    </w:p>
-    <w:p>
-      <w:pPr>
-        <w:pStyle w:val="NormalWeb"/>
-      </w:pPr>
-      <w:r>
-        <w:rPr>
-          <w:noProof/>
         </w:rPr>
         <w:lastRenderedPageBreak/>
         <w:drawing>
-          <wp:inline distT="0" distB="0" distL="0" distR="0" wp14:anchorId="57D74EC4" wp14:editId="6176DD73">
-            <wp:extent cx="5943600" cy="3006090"/>
-            <wp:effectExtent l="0" t="0" r="0" b="3810"/>
-            <wp:docPr id="8" name="Picture 8"/>
+          <wp:inline distT="0" distB="0" distL="0" distR="0" wp14:anchorId="3A56CFDB" wp14:editId="7F62C5CB">
+            <wp:extent cx="5943600" cy="2838450"/>
+            <wp:effectExtent l="0" t="0" r="0" b="0"/>
+            <wp:docPr id="10" name="Picture 10"/>
             <wp:cNvGraphicFramePr>
               <a:graphicFrameLocks xmlns:a="http://schemas.openxmlformats.org/drawingml/2006/main" noChangeAspect="1"/>
             </wp:cNvGraphicFramePr>
@@ -9947,6 +8511,446 @@
                   <pic:spPr>
                     <a:xfrm>
                       <a:off x="0" y="0"/>
+                      <a:ext cx="5943600" cy="2838450"/>
+                    </a:xfrm>
+                    <a:prstGeom prst="rect">
+                      <a:avLst/>
+                    </a:prstGeom>
+                  </pic:spPr>
+                </pic:pic>
+              </a:graphicData>
+            </a:graphic>
+          </wp:inline>
+        </w:drawing>
+      </w:r>
+    </w:p>
+    <w:p>
+      <w:pPr>
+        <w:pStyle w:val="NormalWeb"/>
+      </w:pPr>
+      <w:r>
+        <w:rPr>
+          <w:rStyle w:val="Strong"/>
+          <w:rFonts w:eastAsiaTheme="majorEastAsia"/>
+        </w:rPr>
+        <w:t>Figure 4.3. Actual demand prediction and intelligent inventory recommendation output generated by the implemented framework.</w:t>
+      </w:r>
+    </w:p>
+    <w:p>
+      <w:pPr>
+        <w:pStyle w:val="NormalWeb"/>
+      </w:pPr>
+      <w:r>
+        <w:t xml:space="preserve">The intelligent recommendation component extends the forecasting framework beyond demand prediction by transforming forecasting outputs into actionable inventory guidance. Using forecasted demand, stock availability, </w:t>
+      </w:r>
+      <w:r>
+        <w:rPr>
+          <w:rStyle w:val="Strong"/>
+          <w:rFonts w:eastAsiaTheme="majorEastAsia"/>
+        </w:rPr>
+        <w:t>expiry-related conditions</w:t>
+      </w:r>
+      <w:r>
+        <w:t xml:space="preserve">, and </w:t>
+      </w:r>
+      <w:r>
+        <w:rPr>
+          <w:rStyle w:val="Strong"/>
+          <w:rFonts w:eastAsiaTheme="majorEastAsia"/>
+        </w:rPr>
+        <w:t>engineered waste-risk indicators</w:t>
+      </w:r>
+      <w:r>
+        <w:t xml:space="preserve">, the framework generates intelligent inventory recommendations that support replenishment planning, stock adjustment decisions, inventory assessment, and waste-risk mitigation activities. This capability improves the practical usefulness of forecasting outputs by providing </w:t>
+      </w:r>
+      <w:r>
+        <w:rPr>
+          <w:rStyle w:val="Strong"/>
+          <w:rFonts w:eastAsiaTheme="majorEastAsia"/>
+        </w:rPr>
+        <w:t>decision-makers</w:t>
+      </w:r>
+      <w:r>
+        <w:t xml:space="preserve"> with interpretable and operationally relevant recommendations.</w:t>
+      </w:r>
+    </w:p>
+    <w:p>
+      <w:pPr>
+        <w:spacing w:before="100" w:beforeAutospacing="1" w:after="100" w:afterAutospacing="1" w:line="240" w:lineRule="auto"/>
+        <w:rPr>
+          <w:rFonts w:ascii="Times New Roman" w:eastAsia="Times New Roman" w:hAnsi="Times New Roman" w:cs="Times New Roman"/>
+          <w:sz w:val="24"/>
+          <w:szCs w:val="24"/>
+        </w:rPr>
+      </w:pPr>
+      <w:r>
+        <w:rPr>
+          <w:rFonts w:ascii="Times New Roman" w:eastAsia="Times New Roman" w:hAnsi="Times New Roman" w:cs="Times New Roman"/>
+          <w:bCs/>
+          <w:sz w:val="24"/>
+          <w:szCs w:val="24"/>
+        </w:rPr>
+        <w:t xml:space="preserve">The implemented recommendation mechanism combines rule-based inventory assessment with a locally deployed Large Language Model (LLM). The rule-based component first evaluates predicted demand, current stock, expiry conditions, and waste-risk indicators to determine the underlying inventory condition and suggested business action. The resulting information is then provided to a local Qwen2.5:1.5b model through </w:t>
+      </w:r>
+      <w:proofErr w:type="spellStart"/>
+      <w:r>
+        <w:rPr>
+          <w:rFonts w:ascii="Times New Roman" w:eastAsia="Times New Roman" w:hAnsi="Times New Roman" w:cs="Times New Roman"/>
+          <w:bCs/>
+          <w:sz w:val="24"/>
+          <w:szCs w:val="24"/>
+        </w:rPr>
+        <w:t>Ollama</w:t>
+      </w:r>
+      <w:proofErr w:type="spellEnd"/>
+      <w:r>
+        <w:rPr>
+          <w:rFonts w:ascii="Times New Roman" w:eastAsia="Times New Roman" w:hAnsi="Times New Roman" w:cs="Times New Roman"/>
+          <w:bCs/>
+          <w:sz w:val="24"/>
+          <w:szCs w:val="24"/>
+        </w:rPr>
+        <w:t xml:space="preserve"> to generate a more context-aware and human-readable inventory recommendation.</w:t>
+      </w:r>
+    </w:p>
+    <w:p>
+      <w:pPr>
+        <w:spacing w:before="100" w:beforeAutospacing="1" w:after="100" w:afterAutospacing="1" w:line="240" w:lineRule="auto"/>
+        <w:rPr>
+          <w:rFonts w:ascii="Times New Roman" w:eastAsia="Times New Roman" w:hAnsi="Times New Roman" w:cs="Times New Roman"/>
+          <w:sz w:val="24"/>
+          <w:szCs w:val="24"/>
+        </w:rPr>
+      </w:pPr>
+      <w:r>
+        <w:rPr>
+          <w:rFonts w:ascii="Times New Roman" w:eastAsia="Times New Roman" w:hAnsi="Times New Roman" w:cs="Times New Roman"/>
+          <w:bCs/>
+          <w:sz w:val="24"/>
+          <w:szCs w:val="24"/>
+        </w:rPr>
+        <w:t xml:space="preserve">The LLM does not generate the demand forecast and does not replace the Random Forest forecasting model. Instead, Random Forest remains responsible for demand prediction, while the local LLM acts as an explanation and decision-support layer that translates forecasting and inventory-assessment outputs into understandable business recommendations. Running the LLM locally through </w:t>
+      </w:r>
+      <w:proofErr w:type="spellStart"/>
+      <w:r>
+        <w:rPr>
+          <w:rFonts w:ascii="Times New Roman" w:eastAsia="Times New Roman" w:hAnsi="Times New Roman" w:cs="Times New Roman"/>
+          <w:bCs/>
+          <w:sz w:val="24"/>
+          <w:szCs w:val="24"/>
+        </w:rPr>
+        <w:t>Ollama</w:t>
+      </w:r>
+      <w:proofErr w:type="spellEnd"/>
+      <w:r>
+        <w:rPr>
+          <w:rFonts w:ascii="Times New Roman" w:eastAsia="Times New Roman" w:hAnsi="Times New Roman" w:cs="Times New Roman"/>
+          <w:bCs/>
+          <w:sz w:val="24"/>
+          <w:szCs w:val="24"/>
+        </w:rPr>
+        <w:t xml:space="preserve"> also enables the recommendation component to operate without relying on an external paid API.</w:t>
+      </w:r>
+    </w:p>
+    <w:p>
+      <w:pPr>
+        <w:spacing w:before="100" w:beforeAutospacing="1" w:after="100" w:afterAutospacing="1" w:line="240" w:lineRule="auto"/>
+        <w:rPr>
+          <w:rFonts w:ascii="Times New Roman" w:eastAsia="Times New Roman" w:hAnsi="Times New Roman" w:cs="Times New Roman"/>
+          <w:sz w:val="24"/>
+          <w:szCs w:val="24"/>
+        </w:rPr>
+      </w:pPr>
+      <w:r>
+        <w:rPr>
+          <w:rFonts w:ascii="Times New Roman" w:eastAsia="Times New Roman" w:hAnsi="Times New Roman" w:cs="Times New Roman"/>
+          <w:bCs/>
+          <w:sz w:val="24"/>
+          <w:szCs w:val="24"/>
+        </w:rPr>
+        <w:t>This hybrid approach combines the consistency of predefined inventory rules with the explanatory capability of an LLM. The rule-based assessment provides structured inventory logic, while the LLM communicates the identified condition and recommended action in a form that can be more easily interpreted by retail decision-makers.</w:t>
+      </w:r>
+    </w:p>
+    <w:p>
+      <w:pPr>
+        <w:pStyle w:val="NormalWeb"/>
+      </w:pPr>
+      <w:r>
+        <w:lastRenderedPageBreak/>
+        <w:t xml:space="preserve">By transforming forecasting outputs into practical recommendations, the framework extends beyond traditional demand prediction and provides direct support for </w:t>
+      </w:r>
+      <w:r>
+        <w:rPr>
+          <w:rStyle w:val="Strong"/>
+          <w:rFonts w:eastAsiaTheme="majorEastAsia"/>
+        </w:rPr>
+        <w:t>inventory-related decision-making</w:t>
+      </w:r>
+      <w:r>
+        <w:t>. This approach improves the operational usefulness of forecasting results and helps retailers respond more proactively to changing inventory conditions.</w:t>
+      </w:r>
+    </w:p>
+    <w:p>
+      <w:pPr>
+        <w:pStyle w:val="NormalWeb"/>
+      </w:pPr>
+      <w:r>
+        <w:t xml:space="preserve">The recommendation component is particularly important because reducing </w:t>
+      </w:r>
+      <w:r>
+        <w:rPr>
+          <w:rStyle w:val="Strong"/>
+          <w:rFonts w:eastAsiaTheme="majorEastAsia"/>
+        </w:rPr>
+        <w:t>inventory-related waste risk</w:t>
+      </w:r>
+      <w:r>
+        <w:t xml:space="preserve"> requires more than accurate forecasts. Business value is created when forecasting insights are translated into practical actions that support </w:t>
+      </w:r>
+      <w:r>
+        <w:rPr>
+          <w:rStyle w:val="Strong"/>
+          <w:rFonts w:eastAsiaTheme="majorEastAsia"/>
+        </w:rPr>
+        <w:t xml:space="preserve">inventory planning, improved stock </w:t>
+      </w:r>
+      <w:proofErr w:type="spellStart"/>
+      <w:r>
+        <w:rPr>
+          <w:rStyle w:val="Strong"/>
+          <w:rFonts w:eastAsiaTheme="majorEastAsia"/>
+        </w:rPr>
+        <w:t>utilisation</w:t>
+      </w:r>
+      <w:proofErr w:type="spellEnd"/>
+      <w:r>
+        <w:rPr>
+          <w:rStyle w:val="Strong"/>
+          <w:rFonts w:eastAsiaTheme="majorEastAsia"/>
+        </w:rPr>
+        <w:t>, and reduced inventory-related waste risk</w:t>
+      </w:r>
+      <w:r>
+        <w:t>. Consequently, the recommendation component provides the connection between demand forecasting and operational inventory decision-making within the proposed framework.</w:t>
+      </w:r>
+    </w:p>
+    <w:p>
+      <w:pPr>
+        <w:pStyle w:val="Heading2"/>
+      </w:pPr>
+      <w:r>
+        <w:t>4.5 Forecasting Reliability Through Monitoring and Automatic Retraining</w:t>
+      </w:r>
+    </w:p>
+    <w:p>
+      <w:pPr>
+        <w:pStyle w:val="NormalWeb"/>
+      </w:pPr>
+      <w:r>
+        <w:t xml:space="preserve">Forecasting models are typically developed using historical data; however, retail demand patterns are not static. Customer </w:t>
+      </w:r>
+      <w:proofErr w:type="spellStart"/>
+      <w:r>
+        <w:t>behaviour</w:t>
+      </w:r>
+      <w:proofErr w:type="spellEnd"/>
+      <w:r>
+        <w:t xml:space="preserve">, promotional activities, seasonal trends, and operational conditions can change over time, potentially affecting forecasting performance. As a result, forecasting systems require mechanisms that support </w:t>
+      </w:r>
+      <w:r>
+        <w:rPr>
+          <w:rStyle w:val="Strong"/>
+          <w:rFonts w:eastAsiaTheme="majorEastAsia"/>
+        </w:rPr>
+        <w:t>long-term reliability and adaptability</w:t>
+      </w:r>
+      <w:r>
+        <w:t>.</w:t>
+      </w:r>
+    </w:p>
+    <w:p>
+      <w:pPr>
+        <w:pStyle w:val="NormalWeb"/>
+      </w:pPr>
+      <w:r>
+        <w:t xml:space="preserve">To address this challenge, the proposed framework incorporates </w:t>
+      </w:r>
+      <w:r>
+        <w:rPr>
+          <w:rStyle w:val="Strong"/>
+          <w:rFonts w:eastAsiaTheme="majorEastAsia"/>
+        </w:rPr>
+        <w:t>monitoring, drift detection, model versioning, and automatic retraining</w:t>
+      </w:r>
+      <w:r>
+        <w:t xml:space="preserve"> capabilities. These mechanisms are designed to identify changes in operational data patterns and support model updating when current conditions differ substantially from the historical conditions used for model development.</w:t>
+      </w:r>
+    </w:p>
+    <w:p>
+      <w:pPr>
+        <w:pStyle w:val="NormalWeb"/>
+      </w:pPr>
+      <w:r>
+        <w:t xml:space="preserve">The monitoring process evaluates selected retail and </w:t>
+      </w:r>
+      <w:r>
+        <w:rPr>
+          <w:rStyle w:val="Strong"/>
+          <w:rFonts w:eastAsiaTheme="majorEastAsia"/>
+        </w:rPr>
+        <w:t>inventory-related variables</w:t>
+      </w:r>
+      <w:r>
+        <w:t xml:space="preserve">, including </w:t>
+      </w:r>
+      <w:r>
+        <w:rPr>
+          <w:rStyle w:val="Strong"/>
+          <w:rFonts w:eastAsiaTheme="majorEastAsia"/>
+        </w:rPr>
+        <w:t>units sold, current stock, temperature, and waste quantity</w:t>
+      </w:r>
+      <w:r>
+        <w:t xml:space="preserve">. Within the implemented framework, drift is assessed by comparing the mean of a historical </w:t>
+      </w:r>
+      <w:r>
+        <w:rPr>
+          <w:rStyle w:val="Strong"/>
+          <w:rFonts w:eastAsiaTheme="majorEastAsia"/>
+        </w:rPr>
+        <w:t>reference window of 1,000 observations</w:t>
+      </w:r>
+      <w:r>
+        <w:t xml:space="preserve"> with the mean of a </w:t>
+      </w:r>
+      <w:r>
+        <w:rPr>
+          <w:rStyle w:val="Strong"/>
+          <w:rFonts w:eastAsiaTheme="majorEastAsia"/>
+        </w:rPr>
+        <w:t>current window of 300 observations</w:t>
+      </w:r>
+      <w:r>
+        <w:t xml:space="preserve">. A relative mean-shift score is calculated for each monitored variable, and a predefined drift threshold of </w:t>
+      </w:r>
+      <w:r>
+        <w:rPr>
+          <w:rStyle w:val="Strong"/>
+          <w:rFonts w:eastAsiaTheme="majorEastAsia"/>
+        </w:rPr>
+        <w:t>0.15</w:t>
+      </w:r>
+      <w:r>
+        <w:t xml:space="preserve"> is used to determine whether a substantial change has occurred. When the calculated score exceeds this threshold, the corresponding variable is classified as exhibiting drift.</w:t>
+      </w:r>
+    </w:p>
+    <w:p>
+      <w:pPr>
+        <w:pStyle w:val="NormalWeb"/>
+      </w:pPr>
+      <w:r>
+        <w:t xml:space="preserve">To support forecasting reliability, the framework incorporates an </w:t>
+      </w:r>
+      <w:r>
+        <w:rPr>
+          <w:rStyle w:val="Strong"/>
+          <w:rFonts w:eastAsiaTheme="majorEastAsia"/>
+        </w:rPr>
+        <w:t>automatic retraining mechanism</w:t>
+      </w:r>
+      <w:r>
+        <w:t xml:space="preserve">. When drift is detected, the training pipeline is automatically executed and the forecasting models are trained and evaluated again. The selected model is then stored as a </w:t>
+      </w:r>
+      <w:r>
+        <w:rPr>
+          <w:rStyle w:val="Strong"/>
+          <w:rFonts w:eastAsiaTheme="majorEastAsia"/>
+        </w:rPr>
+        <w:t>timestamped versioned model artifact</w:t>
+      </w:r>
+      <w:r>
+        <w:t xml:space="preserve">, while the latest serving model is maintained as </w:t>
+      </w:r>
+      <w:proofErr w:type="spellStart"/>
+      <w:r>
+        <w:rPr>
+          <w:rStyle w:val="HTMLCode"/>
+          <w:rFonts w:ascii="Times New Roman" w:hAnsi="Times New Roman" w:cs="Times New Roman"/>
+        </w:rPr>
+        <w:t>demand_model.pkl</w:t>
+      </w:r>
+      <w:proofErr w:type="spellEnd"/>
+      <w:r>
+        <w:t>. This process provides a reproducible record of model updates and allows the forecasting component to be refreshed when significant changes in monitored data are identified.</w:t>
+      </w:r>
+    </w:p>
+    <w:p>
+      <w:pPr>
+        <w:pStyle w:val="NormalWeb"/>
+      </w:pPr>
+      <w:r>
+        <w:t xml:space="preserve">The implemented drift test demonstrated this process in practice. Drift was detected in </w:t>
+      </w:r>
+      <w:r>
+        <w:rPr>
+          <w:rStyle w:val="Strong"/>
+          <w:rFonts w:eastAsiaTheme="majorEastAsia"/>
+        </w:rPr>
+        <w:t>units sold, current stock, and waste quantity</w:t>
+      </w:r>
+      <w:r>
+        <w:t xml:space="preserve">, while </w:t>
+      </w:r>
+      <w:r>
+        <w:rPr>
+          <w:rStyle w:val="Strong"/>
+          <w:rFonts w:eastAsiaTheme="majorEastAsia"/>
+        </w:rPr>
+        <w:t>temperature remained stable</w:t>
+      </w:r>
+      <w:r>
+        <w:t xml:space="preserve"> under the predefined threshold. The detection of drift triggered the automatic retraining process, after which a new version of the selected forecasting model was generated and stored. This </w:t>
+      </w:r>
+      <w:r>
+        <w:lastRenderedPageBreak/>
+        <w:t xml:space="preserve">demonstrates the connection between operational monitoring, </w:t>
+      </w:r>
+      <w:r>
+        <w:t>drift identification, and model maintenance within the implemented framework.</w:t>
+      </w:r>
+    </w:p>
+    <w:p>
+      <w:pPr>
+        <w:pStyle w:val="NormalWeb"/>
+      </w:pPr>
+      <w:r>
+        <w:rPr>
+          <w:noProof/>
+        </w:rPr>
+        <w:drawing>
+          <wp:inline distT="0" distB="0" distL="0" distR="0" wp14:anchorId="57D74EC4" wp14:editId="6176DD73">
+            <wp:extent cx="5943600" cy="3006090"/>
+            <wp:effectExtent l="0" t="0" r="0" b="3810"/>
+            <wp:docPr id="8" name="Picture 8"/>
+            <wp:cNvGraphicFramePr>
+              <a:graphicFrameLocks xmlns:a="http://schemas.openxmlformats.org/drawingml/2006/main" noChangeAspect="1"/>
+            </wp:cNvGraphicFramePr>
+            <a:graphic xmlns:a="http://schemas.openxmlformats.org/drawingml/2006/main">
+              <a:graphicData uri="http://schemas.openxmlformats.org/drawingml/2006/picture">
+                <pic:pic xmlns:pic="http://schemas.openxmlformats.org/drawingml/2006/picture">
+                  <pic:nvPicPr>
+                    <pic:cNvPr id="1" name=""/>
+                    <pic:cNvPicPr/>
+                  </pic:nvPicPr>
+                  <pic:blipFill>
+                    <a:blip r:embed="rId15"/>
+                    <a:stretch>
+                      <a:fillRect/>
+                    </a:stretch>
+                  </pic:blipFill>
+                  <pic:spPr>
+                    <a:xfrm>
+                      <a:off x="0" y="0"/>
                       <a:ext cx="5943600" cy="3006090"/>
                     </a:xfrm>
                     <a:prstGeom prst="rect">
@@ -10059,6 +9063,7 @@
         <w:pStyle w:val="NormalWeb"/>
       </w:pPr>
       <w:r>
+        <w:lastRenderedPageBreak/>
         <w:t xml:space="preserve">The deployed framework integrates </w:t>
       </w:r>
       <w:r>
@@ -10068,11 +9073,39 @@
         <w:t>FastAPI, SQLite, and Streamlit</w:t>
       </w:r>
       <w:r>
-        <w:t xml:space="preserve"> within a unified workflow. FastAPI provides backend API services for receiving retail sales events, generating demand predictions, accessing model information, performing drift checks, and triggering pipeline </w:t>
-      </w:r>
-      <w:r>
-        <w:lastRenderedPageBreak/>
-        <w:t>operations. SQLite is used as the operational database for storing incoming retail data, prediction logs, drift reports, and model-related information. The Streamlit dashboard provides an interactive interface through which users can access forecasting, inventory assessment, recommendation, and monitoring outputs.</w:t>
+        <w:t xml:space="preserve"> within a unified </w:t>
+      </w:r>
+      <w:proofErr w:type="spellStart"/>
+      <w:proofErr w:type="gramStart"/>
+      <w:r>
+        <w:t>workflow.</w:t>
+      </w:r>
+      <w:r>
+        <w:t>The</w:t>
+      </w:r>
+      <w:proofErr w:type="spellEnd"/>
+      <w:proofErr w:type="gramEnd"/>
+      <w:r>
+        <w:t xml:space="preserve"> deployment also integrates </w:t>
+      </w:r>
+      <w:proofErr w:type="spellStart"/>
+      <w:r>
+        <w:t>Ollama</w:t>
+      </w:r>
+      <w:proofErr w:type="spellEnd"/>
+      <w:r>
+        <w:t xml:space="preserve"> as the local LLM runtime, using Qwen2.5:1.5b to generate explanatory inventory recommendations. After the Random Forest model generates a demand prediction and the inventory-assessment logic determines the relevant inventory condition, these structured results are supplied to the local LLM. The LLM then generates a human-readable recommendation that is returned through the FastAPI response and displayed within the Streamlit dashboard. This separates the forecasting function from the language-model recommendation function while integrating both within the same decision-support workflow.</w:t>
+      </w:r>
+      <w:r>
+        <w:t xml:space="preserve"> </w:t>
+      </w:r>
+      <w:proofErr w:type="gramStart"/>
+      <w:r>
+        <w:t>FastAPI</w:t>
+      </w:r>
+      <w:proofErr w:type="gramEnd"/>
+      <w:r>
+        <w:t xml:space="preserve"> provides backend API services for receiving retail sales events, generating demand predictions, accessing model information, performing drift checks, and triggering pipeline operations. SQLite is used as the operational database for storing incoming retail data, prediction logs, drift reports, and model-related information. The Streamlit dashboard provides an interactive interface through which users can access forecasting, inventory assessment, recommendation, and monitoring outputs.</w:t>
       </w:r>
     </w:p>
     <w:p>
@@ -10147,6 +9180,27 @@
       </w:r>
       <w:r>
         <w:t xml:space="preserve"> rather than remaining an offline forecasting experiment. By integrating API-based data ingestion, demand prediction, inventory assessment, recommendation generation, monitoring, and model maintenance, the framework demonstrates the practical connection between machine learning forecasting and retail inventory decision-making.</w:t>
+      </w:r>
+    </w:p>
+    <w:p>
+      <w:pPr>
+        <w:rPr>
+          <w:rStyle w:val="Strong"/>
+          <w:rFonts w:ascii="Times New Roman" w:eastAsiaTheme="majorEastAsia" w:hAnsi="Times New Roman" w:cs="Times New Roman"/>
+          <w:bCs w:val="0"/>
+          <w:sz w:val="36"/>
+          <w:szCs w:val="36"/>
+        </w:rPr>
+      </w:pPr>
+      <w:r>
+        <w:rPr>
+          <w:rStyle w:val="Strong"/>
+          <w:rFonts w:ascii="Times New Roman" w:hAnsi="Times New Roman" w:cs="Times New Roman"/>
+          <w:bCs w:val="0"/>
+          <w:sz w:val="36"/>
+          <w:szCs w:val="36"/>
+        </w:rPr>
+        <w:br w:type="page"/>
       </w:r>
     </w:p>
     <w:p>
@@ -10168,6 +9222,7 @@
           <w:sz w:val="36"/>
           <w:szCs w:val="36"/>
         </w:rPr>
+        <w:lastRenderedPageBreak/>
         <w:t>4.7 Business and Sustainability Impact</w:t>
       </w:r>
     </w:p>
@@ -10209,11 +9264,7 @@
         <w:pStyle w:val="NormalWeb"/>
       </w:pPr>
       <w:r>
-        <w:t>One of the main contributions of the framework is the integration of demand forecasting with inventory-related information. By comparing predicted demand with current stock levels, expiry-</w:t>
-      </w:r>
-      <w:r>
-        <w:lastRenderedPageBreak/>
-        <w:t xml:space="preserve">related conditions, and engineered waste-risk indicators, the framework can identify potential </w:t>
+        <w:t xml:space="preserve">One of the main contributions of the framework is the integration of demand forecasting with inventory-related information. By comparing predicted demand with current stock levels, expiry-related conditions, and engineered waste-risk indicators, the framework can identify potential </w:t>
       </w:r>
       <w:proofErr w:type="spellStart"/>
       <w:r>
@@ -10300,11 +9351,9 @@
     </w:p>
     <w:p>
       <w:pPr>
-        <w:rPr>
-          <w:rFonts w:ascii="Times New Roman" w:eastAsia="Times New Roman" w:hAnsi="Times New Roman" w:cs="Times New Roman"/>
-          <w:b/>
-          <w:bCs/>
-          <w:kern w:val="36"/>
+        <w:pStyle w:val="Heading1"/>
+        <w:jc w:val="both"/>
+        <w:rPr>
           <w:sz w:val="36"/>
           <w:szCs w:val="36"/>
         </w:rPr>
@@ -10314,32 +9363,271 @@
           <w:sz w:val="36"/>
           <w:szCs w:val="36"/>
         </w:rPr>
-        <w:br w:type="page"/>
-      </w:r>
-    </w:p>
-    <w:p>
-      <w:pPr>
-        <w:pStyle w:val="Heading1"/>
-        <w:jc w:val="both"/>
+        <w:lastRenderedPageBreak/>
+        <w:t xml:space="preserve">Chapter 5: </w:t>
+      </w:r>
+      <w:r>
         <w:rPr>
           <w:sz w:val="36"/>
           <w:szCs w:val="36"/>
         </w:rPr>
-      </w:pPr>
-      <w:r>
-        <w:rPr>
-          <w:sz w:val="36"/>
-          <w:szCs w:val="36"/>
-        </w:rPr>
+        <w:t>Discussion, Conclusion and Future Perspectives</w:t>
+      </w:r>
+    </w:p>
+    <w:p>
+      <w:pPr>
+        <w:pStyle w:val="Heading2"/>
+      </w:pPr>
+      <w:r>
+        <w:t>5.1 Interpretation of Findings</w:t>
+      </w:r>
+    </w:p>
+    <w:p>
+      <w:pPr>
+        <w:pStyle w:val="NormalWeb"/>
+      </w:pPr>
+      <w:r>
+        <w:t xml:space="preserve">The findings of this study demonstrate that </w:t>
+      </w:r>
+      <w:r>
+        <w:rPr>
+          <w:rStyle w:val="Strong"/>
+          <w:rFonts w:eastAsiaTheme="majorEastAsia"/>
+        </w:rPr>
+        <w:t>AI-driven demand forecasting can provide practical support for inventory planning and inventory-related waste-risk identification within supermarket environments</w:t>
+      </w:r>
+      <w:r>
+        <w:t xml:space="preserve">. The results indicate that machine learning can capture meaningful relationships within historical retail data and generate demand estimates that can subsequently be used to support inventory-related decisions. Among the evaluated models, </w:t>
+      </w:r>
+      <w:r>
+        <w:rPr>
+          <w:rStyle w:val="Strong"/>
+          <w:rFonts w:eastAsiaTheme="majorEastAsia"/>
+        </w:rPr>
+        <w:t xml:space="preserve">Random Forest achieved the strongest overall forecasting performance compared with </w:t>
+      </w:r>
+      <w:proofErr w:type="spellStart"/>
+      <w:r>
+        <w:rPr>
+          <w:rStyle w:val="Strong"/>
+          <w:rFonts w:eastAsiaTheme="majorEastAsia"/>
+        </w:rPr>
+        <w:t>XGBoost</w:t>
+      </w:r>
+      <w:proofErr w:type="spellEnd"/>
+      <w:r>
+        <w:t xml:space="preserve"> and was therefore selected as the final forecasting model within the proposed framework.</w:t>
+      </w:r>
+    </w:p>
+    <w:p>
+      <w:pPr>
+        <w:pStyle w:val="NormalWeb"/>
+      </w:pPr>
+      <w:r>
+        <w:t xml:space="preserve">The performance of the selected Random Forest model provides an important basis for interpreting the practical value of the framework. The model achieved a </w:t>
+      </w:r>
+      <w:r>
+        <w:rPr>
+          <w:rStyle w:val="Strong"/>
+          <w:rFonts w:eastAsiaTheme="majorEastAsia"/>
+        </w:rPr>
+        <w:t>Test MAE of 215.36, Test RMSE of 482.89, and Test R² Score of 0.9515</w:t>
+      </w:r>
+      <w:r>
+        <w:t xml:space="preserve">, indicating strong predictive performance on the final test dataset. The relatively small difference between the training RMSE of </w:t>
+      </w:r>
+      <w:r>
+        <w:rPr>
+          <w:rStyle w:val="Strong"/>
+          <w:rFonts w:eastAsiaTheme="majorEastAsia"/>
+        </w:rPr>
+        <w:t>475.98</w:t>
+      </w:r>
+      <w:r>
+        <w:t xml:space="preserve"> and testing RMSE of </w:t>
+      </w:r>
+      <w:r>
+        <w:rPr>
+          <w:rStyle w:val="Strong"/>
+          <w:rFonts w:eastAsiaTheme="majorEastAsia"/>
+        </w:rPr>
+        <w:t>482.89</w:t>
+      </w:r>
+      <w:r>
+        <w:t xml:space="preserve"> also suggests that substantial overfitting was not observed on the final train-test split. However, the higher </w:t>
+      </w:r>
+      <w:proofErr w:type="spellStart"/>
+      <w:r>
+        <w:rPr>
+          <w:rStyle w:val="Strong"/>
+          <w:rFonts w:eastAsiaTheme="majorEastAsia"/>
+        </w:rPr>
+        <w:t>TimeSeriesSplit</w:t>
+      </w:r>
+      <w:proofErr w:type="spellEnd"/>
+      <w:r>
+        <w:rPr>
+          <w:rStyle w:val="Strong"/>
+          <w:rFonts w:eastAsiaTheme="majorEastAsia"/>
+        </w:rPr>
+        <w:t xml:space="preserve"> cross-validation RMSE of 784.76</w:t>
+      </w:r>
+      <w:r>
+        <w:t xml:space="preserve">, with a standard deviation of </w:t>
+      </w:r>
+      <w:r>
+        <w:rPr>
+          <w:rStyle w:val="Strong"/>
+          <w:rFonts w:eastAsiaTheme="majorEastAsia"/>
+        </w:rPr>
+        <w:t>237.02</w:t>
+      </w:r>
+      <w:r>
+        <w:t>, indicates that forecasting performance varied across different chronological periods. This variation highlights the importance of evaluating retail forecasting models across changing temporal conditions rather than relying solely on a single test result.</w:t>
+      </w:r>
+    </w:p>
+    <w:p>
+      <w:pPr>
+        <w:pStyle w:val="NormalWeb"/>
+      </w:pPr>
+      <w:r>
+        <w:t xml:space="preserve">From an inventory planning perspective, the findings suggest that the value of forecasting extends beyond predictive accuracy. Forecasting outputs provide greater visibility into expected demand, allowing inventory conditions to be assessed in relation to anticipated sales. When predicted demand is considered together with current stock levels, expiry-related conditions, and engineered waste-risk indicators, the framework can identify situations associated with </w:t>
+      </w:r>
+      <w:proofErr w:type="spellStart"/>
+      <w:r>
+        <w:rPr>
+          <w:rStyle w:val="Strong"/>
+          <w:rFonts w:eastAsiaTheme="majorEastAsia"/>
+        </w:rPr>
+        <w:t>stockout</w:t>
+      </w:r>
+      <w:proofErr w:type="spellEnd"/>
+      <w:r>
+        <w:rPr>
+          <w:rStyle w:val="Strong"/>
+          <w:rFonts w:eastAsiaTheme="majorEastAsia"/>
+        </w:rPr>
+        <w:t xml:space="preserve"> risk, overstock risk, and elevated inventory-related waste risk</w:t>
+      </w:r>
+      <w:r>
+        <w:t>. This demonstrates how demand forecasting can serve as an analytical foundation for more proactive inventory management rather than functioning solely as a prediction exercise.</w:t>
+      </w:r>
+    </w:p>
+    <w:p>
+      <w:pPr>
+        <w:pStyle w:val="NormalWeb"/>
+      </w:pPr>
+      <w:r>
+        <w:t xml:space="preserve">The findings also demonstrate the importance of translating forecasting outputs into </w:t>
+      </w:r>
+      <w:r>
+        <w:rPr>
+          <w:rStyle w:val="Strong"/>
+          <w:rFonts w:eastAsiaTheme="majorEastAsia"/>
+        </w:rPr>
+        <w:t>actionable inventory recommendations</w:t>
+      </w:r>
+      <w:r>
+        <w:t xml:space="preserve">. Within the proposed framework, </w:t>
+      </w:r>
+      <w:proofErr w:type="gramStart"/>
+      <w:r>
+        <w:t>The</w:t>
+      </w:r>
+      <w:proofErr w:type="gramEnd"/>
+      <w:r>
+        <w:t xml:space="preserve"> findings also demonstrate the importance of translating forecasting outputs into actionable inventory recommendations. Within the proposed framework, predefined inventory assessment rules first interpret demand predictions and inventory conditions to identify appropriate business actions. A locally deployed Qwen2.5:1.5b LLM then uses these structured results to generate more context-aware and human-readable recommendation explanations. This hybrid approach improves the practical usefulness of the forecasting system by combining transparent inventory logic with natural-language decision support, while keeping the Random Forest model responsible for demand prediction.</w:t>
+      </w:r>
+    </w:p>
+    <w:p>
+      <w:pPr>
+        <w:pStyle w:val="NormalWeb"/>
+      </w:pPr>
+      <w:r>
         <w:lastRenderedPageBreak/>
-        <w:t xml:space="preserve">Chapter 5: </w:t>
-      </w:r>
-      <w:r>
-        <w:rPr>
-          <w:sz w:val="36"/>
-          <w:szCs w:val="36"/>
-        </w:rPr>
-        <w:t>Discussion, Conclusion and Future Perspectives</w:t>
+        <w:t xml:space="preserve">Another important finding concerns </w:t>
+      </w:r>
+      <w:r>
+        <w:rPr>
+          <w:rStyle w:val="Strong"/>
+          <w:rFonts w:eastAsiaTheme="majorEastAsia"/>
+        </w:rPr>
+        <w:t>forecasting reliability under changing operational conditions</w:t>
+      </w:r>
+      <w:r>
+        <w:t xml:space="preserve">. The implemented monitoring mechanism identified drift in </w:t>
+      </w:r>
+      <w:r>
+        <w:rPr>
+          <w:rStyle w:val="Strong"/>
+          <w:rFonts w:eastAsiaTheme="majorEastAsia"/>
+        </w:rPr>
+        <w:t>units sold, current stock, and waste quantity</w:t>
+      </w:r>
+      <w:r>
+        <w:t>, while temperature remained stable during the evaluated drift scenario. The detection of significant drift triggered the automatic retraining process and resulted in the creation of a new versioned forecasting model. This demonstrates how monitoring, drift detection, model versioning, and automatic retraining can be integrated with demand forecasting to support model maintenance when operational data patterns change. The finding is consistent with previous research emphasizing the importance of continuous monitoring and lifecycle management for operational machine learning systems (</w:t>
+      </w:r>
+      <w:proofErr w:type="spellStart"/>
+      <w:r>
+        <w:t>Sculley</w:t>
+      </w:r>
+      <w:proofErr w:type="spellEnd"/>
+      <w:r>
+        <w:t xml:space="preserve"> et al., 2015; </w:t>
+      </w:r>
+      <w:proofErr w:type="spellStart"/>
+      <w:r>
+        <w:t>Kreuzberger</w:t>
+      </w:r>
+      <w:proofErr w:type="spellEnd"/>
+      <w:r>
+        <w:t xml:space="preserve"> et al., 2023).</w:t>
+      </w:r>
+    </w:p>
+    <w:p>
+      <w:pPr>
+        <w:pStyle w:val="NormalWeb"/>
+      </w:pPr>
+      <w:r>
+        <w:t xml:space="preserve">The findings should nevertheless be interpreted within the boundaries of the available data. The Walmart dataset does not contain direct observations of </w:t>
+      </w:r>
+      <w:r>
+        <w:rPr>
+          <w:rStyle w:val="Strong"/>
+          <w:rFonts w:eastAsiaTheme="majorEastAsia"/>
+        </w:rPr>
+        <w:t>food waste, spoilage, or product disposal</w:t>
+      </w:r>
+      <w:r>
+        <w:t xml:space="preserve">. Therefore, this study does not demonstrate that a specific quantity of food waste was actually reduced. Instead, the engineered inventory and waste-risk indicators enable the framework to identify conditions that may be associated with a greater likelihood of inventory-related waste. The contribution should therefore be understood as </w:t>
+      </w:r>
+      <w:r>
+        <w:rPr>
+          <w:rStyle w:val="Strong"/>
+          <w:rFonts w:eastAsiaTheme="majorEastAsia"/>
+        </w:rPr>
+        <w:t>supporting inventory-related waste-risk identification and preventive decision-making</w:t>
+      </w:r>
+      <w:r>
+        <w:t>, rather than directly measuring food-waste reduction.</w:t>
+      </w:r>
+    </w:p>
+    <w:p>
+      <w:pPr>
+        <w:pStyle w:val="NormalWeb"/>
+      </w:pPr>
+      <w:r>
+        <w:t xml:space="preserve">Overall, the findings suggest that the greatest value of the proposed framework comes from integrating </w:t>
+      </w:r>
+      <w:r>
+        <w:rPr>
+          <w:rStyle w:val="Strong"/>
+          <w:rFonts w:eastAsiaTheme="majorEastAsia"/>
+        </w:rPr>
+        <w:t>demand forecasting, inventory assessment, intelligent recommendation support, and forecasting reliability mechanisms</w:t>
+      </w:r>
+      <w:r>
+        <w:t xml:space="preserve"> within a single decision-support environment. Rather than treating machine learning forecasting as an isolated predictive task, the framework demonstrates how forecasting outputs can be connected with operational inventory information to support more informed, adaptive, and sustainability-oriented retail decision-making.</w:t>
       </w:r>
     </w:p>
     <w:p>
@@ -10347,710 +9635,288 @@
         <w:pStyle w:val="Heading2"/>
       </w:pPr>
       <w:r>
-        <w:t>5.1 Interpretation of Findings</w:t>
-      </w:r>
-    </w:p>
-    <w:p>
-      <w:pPr>
-        <w:pStyle w:val="NormalWeb"/>
-      </w:pPr>
-      <w:r>
-        <w:t xml:space="preserve">The findings of this study demonstrate that </w:t>
+        <w:t>5.2 Comparison with Existing Research</w:t>
+      </w:r>
+    </w:p>
+    <w:p>
+      <w:pPr>
+        <w:pStyle w:val="NormalWeb"/>
+      </w:pPr>
+      <w:r>
+        <w:t>The findings of this study are broadly consistent with existing research on the application of machine learning to retail demand forecasting. Previous studies have demonstrated that machine learning models can capture complex and non-linear relationships within structured data and can incorporate multiple factors that influence demand. The strong test performance achieved by the Random Forest model in this study is consistent with the wider literature suggesting that ensemble-based machine learning methods can be suitable for forecasting problems involving multiple interacting retail variables.</w:t>
+      </w:r>
+    </w:p>
+    <w:p>
+      <w:pPr>
+        <w:pStyle w:val="NormalWeb"/>
+      </w:pPr>
+      <w:r>
+        <w:t xml:space="preserve">The findings also support the broader literature emphasizing the importance of demand forecasting for inventory planning. Improved visibility into expected demand can assist retailers in making more informed decisions regarding replenishment, stock allocation, and inventory management. In the present study, this relationship was extended by combining demand predictions with </w:t>
       </w:r>
       <w:r>
         <w:rPr>
           <w:rStyle w:val="Strong"/>
           <w:rFonts w:eastAsiaTheme="majorEastAsia"/>
         </w:rPr>
-        <w:t>AI-driven demand forecasting can provide practical support for inventory planning and inventory-related waste-risk identification within supermarket environments</w:t>
-      </w:r>
-      <w:r>
-        <w:t xml:space="preserve">. The results indicate that machine learning can capture meaningful relationships within historical retail data and generate demand estimates that can subsequently be used to support inventory-related decisions. Among the evaluated models, </w:t>
+        <w:t>current stock levels, expiry-related conditions, and engineered waste-risk indicators</w:t>
+      </w:r>
+      <w:r>
+        <w:t>. This enabled forecasting outputs to be interpreted in relation to operational inventory conditions rather than being evaluated only through predictive performance metrics.</w:t>
+      </w:r>
+    </w:p>
+    <w:p>
+      <w:pPr>
+        <w:pStyle w:val="NormalWeb"/>
+      </w:pPr>
+      <w:r>
+        <w:lastRenderedPageBreak/>
+        <w:t xml:space="preserve">An important distinction of the proposed framework is the integration of </w:t>
       </w:r>
       <w:r>
         <w:rPr>
           <w:rStyle w:val="Strong"/>
           <w:rFonts w:eastAsiaTheme="majorEastAsia"/>
         </w:rPr>
-        <w:t xml:space="preserve">Random Forest achieved the strongest overall forecasting performance compared with </w:t>
+        <w:t>forecasting, inventory assessment, intelligent recommendation support, monitoring, and model maintenance</w:t>
+      </w:r>
+      <w:r>
+        <w:t xml:space="preserve"> within the same decision-support environment. As discussed in the literature review, many forecasting studies place substantial emphasis on model development and offline predictive performance. The present study extends this perspective by examining how forecasting outputs can be operationalized to support inventory-related decisions and how forecasting reliability can be maintained when operational data patterns change. This approach is consistent with research emphasizing monitoring and lifecycle management as important considerations for operational machine learning systems (</w:t>
       </w:r>
       <w:proofErr w:type="spellStart"/>
       <w:r>
+        <w:t>Sculley</w:t>
+      </w:r>
+      <w:proofErr w:type="spellEnd"/>
+      <w:r>
+        <w:t xml:space="preserve"> et al., 2015; </w:t>
+      </w:r>
+      <w:proofErr w:type="spellStart"/>
+      <w:r>
+        <w:t>Kreuzberger</w:t>
+      </w:r>
+      <w:proofErr w:type="spellEnd"/>
+      <w:r>
+        <w:t xml:space="preserve"> et al., 2023).</w:t>
+      </w:r>
+    </w:p>
+    <w:p>
+      <w:pPr>
+        <w:pStyle w:val="NormalWeb"/>
+      </w:pPr>
+      <w:r>
+        <w:t xml:space="preserve">The study also extends the forecasting discussion toward </w:t>
+      </w:r>
+      <w:r>
         <w:rPr>
           <w:rStyle w:val="Strong"/>
           <w:rFonts w:eastAsiaTheme="majorEastAsia"/>
         </w:rPr>
+        <w:t>inventory-related waste-risk identification</w:t>
+      </w:r>
+      <w:r>
+        <w:t>. Rather than attempting to predict actual food waste, the proposed framework combines demand forecasts with engineered inventory and expiry-related indicators to identify conditions associated with elevated waste risk. This distinction is important because the Walmart dataset does not contain direct observations of food waste, spoilage, or product disposal. The findings therefore complement the broader sustainability literature by demonstrating how forecasting-supported inventory assessment may contribute to earlier identification of inventory conditions that could increase the likelihood of waste.</w:t>
+      </w:r>
+    </w:p>
+    <w:p>
+      <w:pPr>
+        <w:pStyle w:val="NormalWeb"/>
+      </w:pPr>
+      <w:r>
+        <w:t xml:space="preserve">At the same time, direct comparison with previous food-waste studies should be made cautiously because the present research evaluates </w:t>
+      </w:r>
+      <w:r>
+        <w:rPr>
+          <w:rStyle w:val="Strong"/>
+          <w:rFonts w:eastAsiaTheme="majorEastAsia"/>
+        </w:rPr>
+        <w:t>waste risk through engineered indicators rather than observed food-waste outcomes</w:t>
+      </w:r>
+      <w:r>
+        <w:t xml:space="preserve">. Similarly, the study does not directly compare machine learning forecasting with traditional statistical forecasting approaches. Its empirical comparison is specifically between </w:t>
+      </w:r>
+      <w:r>
+        <w:rPr>
+          <w:rStyle w:val="Strong"/>
+          <w:rFonts w:eastAsiaTheme="majorEastAsia"/>
+        </w:rPr>
+        <w:t xml:space="preserve">Random Forest and </w:t>
+      </w:r>
+      <w:proofErr w:type="spellStart"/>
+      <w:r>
+        <w:rPr>
+          <w:rStyle w:val="Strong"/>
+          <w:rFonts w:eastAsiaTheme="majorEastAsia"/>
+        </w:rPr>
         <w:t>XGBoost</w:t>
       </w:r>
       <w:proofErr w:type="spellEnd"/>
       <w:r>
-        <w:t xml:space="preserve"> and was therefore selected as the final forecasting model within the proposed framework.</w:t>
-      </w:r>
-    </w:p>
-    <w:p>
-      <w:pPr>
-        <w:pStyle w:val="NormalWeb"/>
-      </w:pPr>
-      <w:r>
-        <w:t xml:space="preserve">The performance of the selected Random Forest model provides an important basis for interpreting the practical value of the framework. The model achieved a </w:t>
+        <w:t>. Therefore, the contribution of the study lies primarily in demonstrating how machine learning-based demand forecasting can be connected with inventory assessment, recommendation support, and model-monitoring mechanisms within an integrated retail decision-support framework.</w:t>
+      </w:r>
+    </w:p>
+    <w:p>
+      <w:pPr>
+        <w:pStyle w:val="NormalWeb"/>
+      </w:pPr>
+      <w:r>
+        <w:t xml:space="preserve">Overall, comparison with existing research indicates that the findings are consistent with established work on machine learning-based forecasting and operational model management while extending the analysis toward </w:t>
       </w:r>
       <w:r>
         <w:rPr>
           <w:rStyle w:val="Strong"/>
           <w:rFonts w:eastAsiaTheme="majorEastAsia"/>
         </w:rPr>
-        <w:t>Test MAE of 215.36, Test RMSE of 482.89, and Test R² Score of 0.9515</w:t>
-      </w:r>
-      <w:r>
-        <w:t xml:space="preserve">, indicating strong predictive performance on the final test dataset. The relatively small difference between the training RMSE of </w:t>
+        <w:t>intelligent inventory decision support and inventory-related waste-risk identification</w:t>
+      </w:r>
+      <w:r>
+        <w:t>. The proposed framework therefore illustrates how forecasting can be considered not only as a predictive task but also as one component of a broader operational decision-support process within supermarket environments.</w:t>
+      </w:r>
+    </w:p>
+    <w:p>
+      <w:pPr>
+        <w:pStyle w:val="Heading2"/>
+      </w:pPr>
+      <w:r>
+        <w:t>5.3 Business and Sustainability Implications</w:t>
+      </w:r>
+    </w:p>
+    <w:p>
+      <w:pPr>
+        <w:pStyle w:val="NormalWeb"/>
+      </w:pPr>
+      <w:r>
+        <w:t xml:space="preserve">The findings of this study have practical implications for both </w:t>
       </w:r>
       <w:r>
         <w:rPr>
           <w:rStyle w:val="Strong"/>
           <w:rFonts w:eastAsiaTheme="majorEastAsia"/>
         </w:rPr>
-        <w:t>475.98</w:t>
-      </w:r>
-      <w:r>
-        <w:t xml:space="preserve"> and testing RMSE of </w:t>
-      </w:r>
+        <w:t>retail inventory management and sustainability-oriented decision-making</w:t>
+      </w:r>
+      <w:r>
+        <w:t>. From a business perspective, reliable demand forecasting can improve visibility into expected future demand and provide retailers with a stronger basis for inventory planning. This is particularly relevant in supermarket environments, where inventory decisions must balance product availability with the risk of maintaining unnecessary stock.</w:t>
+      </w:r>
+    </w:p>
+    <w:p>
+      <w:pPr>
+        <w:pStyle w:val="NormalWeb"/>
+      </w:pPr>
+      <w:r>
+        <w:t xml:space="preserve">The integration of forecasting outputs with inventory-related information increases the operational usefulness of the proposed framework. By comparing predicted demand with current </w:t>
+      </w:r>
+      <w:r>
+        <w:lastRenderedPageBreak/>
+        <w:t xml:space="preserve">stock levels and expiry-related conditions, the system can identify situations where inventory may become misaligned with anticipated demand. Early identification of </w:t>
+      </w:r>
+      <w:proofErr w:type="spellStart"/>
       <w:r>
         <w:rPr>
           <w:rStyle w:val="Strong"/>
           <w:rFonts w:eastAsiaTheme="majorEastAsia"/>
         </w:rPr>
-        <w:t>482.89</w:t>
-      </w:r>
-      <w:r>
-        <w:t xml:space="preserve"> also suggests that substantial overfitting was not observed on the final train-test split. However, the higher </w:t>
-      </w:r>
-      <w:proofErr w:type="spellStart"/>
+        <w:t>stockout</w:t>
+      </w:r>
+      <w:proofErr w:type="spellEnd"/>
       <w:r>
         <w:rPr>
           <w:rStyle w:val="Strong"/>
           <w:rFonts w:eastAsiaTheme="majorEastAsia"/>
         </w:rPr>
-        <w:t>TimeSeriesSplit</w:t>
-      </w:r>
-      <w:proofErr w:type="spellEnd"/>
+        <w:t xml:space="preserve"> and overstock conditions</w:t>
+      </w:r>
+      <w:r>
+        <w:t xml:space="preserve"> can support more proactive replenishment and stock-adjustment decisions rather than relying only on reactive inventory management.</w:t>
+      </w:r>
+    </w:p>
+    <w:p>
+      <w:pPr>
+        <w:pStyle w:val="NormalWeb"/>
+      </w:pPr>
+      <w:r>
+        <w:t xml:space="preserve">The </w:t>
+      </w:r>
       <w:r>
         <w:rPr>
           <w:rStyle w:val="Strong"/>
           <w:rFonts w:eastAsiaTheme="majorEastAsia"/>
         </w:rPr>
-        <w:t xml:space="preserve"> cross-validation RMSE of 784.76</w:t>
-      </w:r>
-      <w:r>
-        <w:t xml:space="preserve">, with a standard deviation of </w:t>
+        <w:t>intelligent recommendation support</w:t>
+      </w:r>
+      <w:r>
+        <w:t xml:space="preserve"> component further strengthens this business value by translating forecasting and inventory information into actionable guidance. Recommendations related to replenishment, reduced future ordering, inventory monitoring, promotional activity, and stock redistribution provide decision-makers with practical responses to identified inventory conditions. The framework should nevertheless be considered a </w:t>
       </w:r>
       <w:r>
         <w:rPr>
           <w:rStyle w:val="Strong"/>
           <w:rFonts w:eastAsiaTheme="majorEastAsia"/>
         </w:rPr>
-        <w:t>237.02</w:t>
-      </w:r>
-      <w:r>
-        <w:t>, indicates that forecasting performance varied across different chronological periods. This variation highlights the importance of evaluating retail forecasting models across changing temporal conditions rather than relying solely on a single test result.</w:t>
-      </w:r>
-    </w:p>
-    <w:p>
-      <w:pPr>
-        <w:pStyle w:val="NormalWeb"/>
-      </w:pPr>
-      <w:r>
-        <w:t xml:space="preserve">From an inventory planning perspective, the findings suggest that the value of forecasting extends beyond predictive accuracy. Forecasting outputs provide greater visibility into expected demand, allowing inventory conditions to be assessed in relation to anticipated sales. When predicted demand is considered together with current stock levels, expiry-related conditions, and engineered waste-risk indicators, the framework can identify situations associated with </w:t>
-      </w:r>
-      <w:proofErr w:type="spellStart"/>
+        <w:t>decision-support tool rather than an autonomous inventory management system</w:t>
+      </w:r>
+      <w:r>
+        <w:t>. Retail managers would still need to consider additional operational factors, such as supplier availability, procurement constraints, pricing strategies, and business priorities, before implementing inventory actions.</w:t>
+      </w:r>
+    </w:p>
+    <w:p>
+      <w:pPr>
+        <w:pStyle w:val="NormalWeb"/>
+      </w:pPr>
+      <w:r>
+        <w:t>From a sustainability perspective, improved alignment between expected demand and available inventory may help reduce conditions associated with unnecessary inventory accumulation. This is particularly relevant for products with shorter expiry periods, where excess stock can increase the likelihood of spoilage and inventory loss. By identifying elevated waste-risk situations earlier, the framework can support preventive actions such as reducing future replenishment, promoting products, or redistributing available stock.</w:t>
+      </w:r>
+    </w:p>
+    <w:p>
+      <w:pPr>
+        <w:pStyle w:val="NormalWeb"/>
+      </w:pPr>
+      <w:r>
+        <w:t xml:space="preserve">However, the sustainability implications should be interpreted cautiously. The Walmart dataset used in this study does not contain direct observations of </w:t>
+      </w:r>
       <w:r>
         <w:rPr>
           <w:rStyle w:val="Strong"/>
           <w:rFonts w:eastAsiaTheme="majorEastAsia"/>
         </w:rPr>
-        <w:t>stockout</w:t>
-      </w:r>
-      <w:proofErr w:type="spellEnd"/>
+        <w:t>food waste, spoilage quantities, or disposal records</w:t>
+      </w:r>
+      <w:r>
+        <w:t xml:space="preserve">. Therefore, the study cannot quantify how much food waste would actually be prevented through use of the proposed framework. Instead, the results demonstrate how demand forecasting and inventory assessment can support the identification of operational conditions associated with </w:t>
+      </w:r>
       <w:r>
         <w:rPr>
           <w:rStyle w:val="Strong"/>
           <w:rFonts w:eastAsiaTheme="majorEastAsia"/>
         </w:rPr>
-        <w:t xml:space="preserve"> risk, overstock risk, and elevated inventory-related waste risk</w:t>
-      </w:r>
-      <w:r>
-        <w:t>. This demonstrates how demand forecasting can serve as an analytical foundation for more proactive inventory management rather than functioning solely as a prediction exercise.</w:t>
-      </w:r>
-    </w:p>
-    <w:p>
-      <w:pPr>
-        <w:pStyle w:val="NormalWeb"/>
-      </w:pPr>
-      <w:r>
-        <w:t xml:space="preserve">The findings also demonstrate the importance of translating forecasting outputs into </w:t>
+        <w:t>inventory-related waste risk</w:t>
+      </w:r>
+      <w:r>
+        <w:t>. This represents a potential contribution to more sustainable inventory management rather than direct evidence of measured food-waste reduction.</w:t>
+      </w:r>
+    </w:p>
+    <w:p>
+      <w:pPr>
+        <w:pStyle w:val="NormalWeb"/>
+      </w:pPr>
+      <w:r>
+        <w:t>The monitoring and model-maintenance components also have business implications. Forecasting-based inventory decisions depend on the continued relevance of model outputs, while retail demand conditions may change over time. The integration of drift detection, model versioning, and automatic retraining provides a mechanism for identifying such changes and updating the forecasting model when necessary. This supports the longer-term operational usefulness of the decision-support framework rather than treating model development as a one-time activity.</w:t>
+      </w:r>
+    </w:p>
+    <w:p>
+      <w:pPr>
+        <w:pStyle w:val="NormalWeb"/>
+      </w:pPr>
+      <w:r>
+        <w:t xml:space="preserve">Overall, the study suggests that the business and sustainability value of AI-driven forecasting is created through the </w:t>
       </w:r>
       <w:r>
         <w:rPr>
           <w:rStyle w:val="Strong"/>
           <w:rFonts w:eastAsiaTheme="majorEastAsia"/>
         </w:rPr>
-        <w:t>actionable inventory recommendations</w:t>
-      </w:r>
-      <w:r>
-        <w:t>. Within the proposed framework, predefined inventory assessment rules convert demand predictions and inventory conditions into recommendations such as increasing replenishment, reducing future ordering, monitoring excess inventory, or considering promotional and stock redistribution actions. This connection between prediction and recommendation improves the practical usefulness of the forecasting system by providing decision-makers with interpretable guidance rather than requiring them to interpret forecasting values independently.</w:t>
-      </w:r>
-    </w:p>
-    <w:p>
-      <w:pPr>
-        <w:pStyle w:val="NormalWeb"/>
-      </w:pPr>
-      <w:r>
-        <w:t xml:space="preserve">Another important finding concerns </w:t>
-      </w:r>
-      <w:r>
-        <w:rPr>
-          <w:rStyle w:val="Strong"/>
-          <w:rFonts w:eastAsiaTheme="majorEastAsia"/>
-        </w:rPr>
-        <w:t>forecasting reliability under changing operational conditions</w:t>
-      </w:r>
-      <w:r>
-        <w:t xml:space="preserve">. The implemented monitoring mechanism identified drift in </w:t>
-      </w:r>
-      <w:r>
-        <w:rPr>
-          <w:rStyle w:val="Strong"/>
-          <w:rFonts w:eastAsiaTheme="majorEastAsia"/>
-        </w:rPr>
-        <w:t>units sold, current stock, and waste quantity</w:t>
-      </w:r>
-      <w:r>
-        <w:t xml:space="preserve">, while temperature remained stable during the evaluated drift </w:t>
-      </w:r>
-      <w:r>
-        <w:lastRenderedPageBreak/>
-        <w:t>scenario. The detection of significant drift triggered the automatic retraining process and resulted in the creation of a new versioned forecasting model. This demonstrates how monitoring, drift detection, model versioning, and automatic retraining can be integrated with demand forecasting to support model maintenance when operational data patterns change. The finding is consistent with previous research emphasizing the importance of continuous monitoring and lifecycle management for operational machine learning systems (</w:t>
-      </w:r>
-      <w:proofErr w:type="spellStart"/>
-      <w:r>
-        <w:t>Sculley</w:t>
-      </w:r>
-      <w:proofErr w:type="spellEnd"/>
-      <w:r>
-        <w:t xml:space="preserve"> et al., 2015; </w:t>
-      </w:r>
-      <w:proofErr w:type="spellStart"/>
-      <w:r>
-        <w:t>Kreuzberger</w:t>
-      </w:r>
-      <w:proofErr w:type="spellEnd"/>
-      <w:r>
-        <w:t xml:space="preserve"> et al., 2023).</w:t>
-      </w:r>
-    </w:p>
-    <w:p>
-      <w:pPr>
-        <w:pStyle w:val="NormalWeb"/>
-      </w:pPr>
-      <w:r>
-        <w:t xml:space="preserve">The findings should nevertheless be interpreted within the boundaries of the available data. The Walmart dataset does not contain direct observations of </w:t>
-      </w:r>
-      <w:r>
-        <w:rPr>
-          <w:rStyle w:val="Strong"/>
-          <w:rFonts w:eastAsiaTheme="majorEastAsia"/>
-        </w:rPr>
-        <w:t>food waste, spoilage, or product disposal</w:t>
-      </w:r>
-      <w:r>
-        <w:t xml:space="preserve">. Therefore, this study does not demonstrate that a specific quantity of food waste was actually reduced. Instead, the engineered inventory and waste-risk indicators enable the framework to identify conditions that may be associated with a greater likelihood of inventory-related waste. The contribution should therefore be understood as </w:t>
-      </w:r>
-      <w:r>
-        <w:rPr>
-          <w:rStyle w:val="Strong"/>
-          <w:rFonts w:eastAsiaTheme="majorEastAsia"/>
-        </w:rPr>
-        <w:t>supporting inventory-related waste-risk identification and preventive decision-making</w:t>
-      </w:r>
-      <w:r>
-        <w:t>, rather than directly measuring food-waste reduction.</w:t>
-      </w:r>
-    </w:p>
-    <w:p>
-      <w:pPr>
-        <w:pStyle w:val="NormalWeb"/>
-      </w:pPr>
-      <w:r>
-        <w:t xml:space="preserve">Overall, the findings suggest that the greatest value of the proposed framework comes from integrating </w:t>
-      </w:r>
-      <w:r>
-        <w:rPr>
-          <w:rStyle w:val="Strong"/>
-          <w:rFonts w:eastAsiaTheme="majorEastAsia"/>
-        </w:rPr>
-        <w:t>demand forecasting, inventory assessment, intelligent recommendation support, and forecasting reliability mechanisms</w:t>
-      </w:r>
-      <w:r>
-        <w:t xml:space="preserve"> within a single decision-support environment. Rather than treating machine learning forecasting as an isolated predictive task, the framework demonstrates how forecasting outputs can be connected with operational inventory information to support more informed, adaptive, and sustainability-oriented retail decision-making.</w:t>
-      </w:r>
-    </w:p>
-    <w:p>
-      <w:pPr>
-        <w:pStyle w:val="Heading2"/>
-      </w:pPr>
-      <w:r>
-        <w:t>5.2 Comparison with Existing Research</w:t>
-      </w:r>
-    </w:p>
-    <w:p>
-      <w:pPr>
-        <w:pStyle w:val="NormalWeb"/>
-      </w:pPr>
-      <w:r>
-        <w:t>The findings of this study are broadly consistent with existing research on the application of machine learning to retail demand forecasting. Previous studies have demonstrated that machine learning models can capture complex and non-linear relationships within structured data and can incorporate multiple factors that influence demand. The strong test performance achieved by the Random Forest model in this study is consistent with the wider literature suggesting that ensemble-based machine learning methods can be suitable for forecasting problems involving multiple interacting retail variables.</w:t>
-      </w:r>
-    </w:p>
-    <w:p>
-      <w:pPr>
-        <w:pStyle w:val="NormalWeb"/>
-      </w:pPr>
-      <w:r>
-        <w:t xml:space="preserve">The findings also support the broader literature emphasizing the importance of demand forecasting for inventory planning. Improved visibility into expected demand can assist retailers in making more informed decisions regarding replenishment, stock allocation, and inventory management. In the present study, this relationship was extended by combining demand predictions with </w:t>
-      </w:r>
-      <w:r>
-        <w:rPr>
-          <w:rStyle w:val="Strong"/>
-          <w:rFonts w:eastAsiaTheme="majorEastAsia"/>
-        </w:rPr>
-        <w:t>current stock levels, expiry-related conditions, and engineered waste-risk indicators</w:t>
-      </w:r>
-      <w:r>
-        <w:t>. This enabled forecasting outputs to be interpreted in relation to operational inventory conditions rather than being evaluated only through predictive performance metrics.</w:t>
-      </w:r>
-    </w:p>
-    <w:p>
-      <w:pPr>
-        <w:pStyle w:val="NormalWeb"/>
-      </w:pPr>
-      <w:r>
-        <w:t xml:space="preserve">An important distinction of the proposed framework is the integration of </w:t>
-      </w:r>
-      <w:r>
-        <w:rPr>
-          <w:rStyle w:val="Strong"/>
-          <w:rFonts w:eastAsiaTheme="majorEastAsia"/>
-        </w:rPr>
-        <w:t>forecasting, inventory assessment, intelligent recommendation support, monitoring, and model maintenance</w:t>
-      </w:r>
-      <w:r>
-        <w:t xml:space="preserve"> within the same decision-support environment. As discussed in the literature review, many forecasting studies place substantial emphasis on model development and offline predictive </w:t>
-      </w:r>
-      <w:r>
-        <w:lastRenderedPageBreak/>
-        <w:t>performance. The present study extends this perspective by examining how forecasting outputs can be operationalized to support inventory-related decisions and how forecasting reliability can be maintained when operational data patterns change. This approach is consistent with research emphasizing monitoring and lifecycle management as important considerations for operational machine learning systems (</w:t>
-      </w:r>
-      <w:proofErr w:type="spellStart"/>
-      <w:r>
-        <w:t>Sculley</w:t>
-      </w:r>
-      <w:proofErr w:type="spellEnd"/>
-      <w:r>
-        <w:t xml:space="preserve"> et al., 2015; </w:t>
-      </w:r>
-      <w:proofErr w:type="spellStart"/>
-      <w:r>
-        <w:t>Kreuzberger</w:t>
-      </w:r>
-      <w:proofErr w:type="spellEnd"/>
-      <w:r>
-        <w:t xml:space="preserve"> et al., 2023).</w:t>
-      </w:r>
-    </w:p>
-    <w:p>
-      <w:pPr>
-        <w:pStyle w:val="NormalWeb"/>
-      </w:pPr>
-      <w:r>
-        <w:t xml:space="preserve">The study also extends the forecasting discussion toward </w:t>
-      </w:r>
-      <w:r>
-        <w:rPr>
-          <w:rStyle w:val="Strong"/>
-          <w:rFonts w:eastAsiaTheme="majorEastAsia"/>
-        </w:rPr>
-        <w:t>inventory-related waste-risk identification</w:t>
-      </w:r>
-      <w:r>
-        <w:t>. Rather than attempting to predict actual food waste, the proposed framework combines demand forecasts with engineered inventory and expiry-related indicators to identify conditions associated with elevated waste risk. This distinction is important because the Walmart dataset does not contain direct observations of food waste, spoilage, or product disposal. The findings therefore complement the broader sustainability literature by demonstrating how forecasting-supported inventory assessment may contribute to earlier identification of inventory conditions that could increase the likelihood of waste.</w:t>
-      </w:r>
-    </w:p>
-    <w:p>
-      <w:pPr>
-        <w:pStyle w:val="NormalWeb"/>
-      </w:pPr>
-      <w:r>
-        <w:t xml:space="preserve">At the same time, direct comparison with previous food-waste studies should be made cautiously because the present research evaluates </w:t>
-      </w:r>
-      <w:r>
-        <w:rPr>
-          <w:rStyle w:val="Strong"/>
-          <w:rFonts w:eastAsiaTheme="majorEastAsia"/>
-        </w:rPr>
-        <w:t>waste risk through engineered indicators rather than observed food-waste outcomes</w:t>
-      </w:r>
-      <w:r>
-        <w:t xml:space="preserve">. Similarly, the study does not directly compare machine learning forecasting with traditional statistical forecasting approaches. Its empirical comparison is specifically between </w:t>
-      </w:r>
-      <w:r>
-        <w:rPr>
-          <w:rStyle w:val="Strong"/>
-          <w:rFonts w:eastAsiaTheme="majorEastAsia"/>
-        </w:rPr>
-        <w:t xml:space="preserve">Random Forest and </w:t>
-      </w:r>
-      <w:proofErr w:type="spellStart"/>
-      <w:r>
-        <w:rPr>
-          <w:rStyle w:val="Strong"/>
-          <w:rFonts w:eastAsiaTheme="majorEastAsia"/>
-        </w:rPr>
-        <w:t>XGBoost</w:t>
-      </w:r>
-      <w:proofErr w:type="spellEnd"/>
-      <w:r>
-        <w:t>. Therefore, the contribution of the study lies primarily in demonstrating how machine learning-based demand forecasting can be connected with inventory assessment, recommendation support, and model-monitoring mechanisms within an integrated retail decision-support framework.</w:t>
-      </w:r>
-    </w:p>
-    <w:p>
-      <w:pPr>
-        <w:pStyle w:val="NormalWeb"/>
-      </w:pPr>
-      <w:r>
-        <w:t xml:space="preserve">Overall, comparison with existing research indicates that the findings are consistent with established work on machine learning-based forecasting and operational model management while extending the analysis toward </w:t>
-      </w:r>
-      <w:r>
-        <w:rPr>
-          <w:rStyle w:val="Strong"/>
-          <w:rFonts w:eastAsiaTheme="majorEastAsia"/>
-        </w:rPr>
-        <w:t>intelligent inventory decision support and inventory-related waste-risk identification</w:t>
-      </w:r>
-      <w:r>
-        <w:t>. The proposed framework therefore illustrates how forecasting can be considered not only as a predictive task but also as one component of a broader operational decision-support process within supermarket environments.</w:t>
-      </w:r>
-    </w:p>
-    <w:p>
-      <w:pPr>
-        <w:pStyle w:val="Heading2"/>
-      </w:pPr>
-      <w:r>
-        <w:t>5.3 Business and Sustainability Implications</w:t>
-      </w:r>
-    </w:p>
-    <w:p>
-      <w:pPr>
-        <w:pStyle w:val="NormalWeb"/>
-      </w:pPr>
-      <w:r>
-        <w:t xml:space="preserve">The findings of this study have practical implications for both </w:t>
-      </w:r>
-      <w:r>
-        <w:rPr>
-          <w:rStyle w:val="Strong"/>
-          <w:rFonts w:eastAsiaTheme="majorEastAsia"/>
-        </w:rPr>
-        <w:t>retail inventory management and sustainability-oriented decision-making</w:t>
-      </w:r>
-      <w:r>
-        <w:t>. From a business perspective, reliable demand forecasting can improve visibility into expected future demand and provide retailers with a stronger basis for inventory planning. This is particularly relevant in supermarket environments, where inventory decisions must balance product availability with the risk of maintaining unnecessary stock.</w:t>
-      </w:r>
-    </w:p>
-    <w:p>
-      <w:pPr>
-        <w:pStyle w:val="NormalWeb"/>
-      </w:pPr>
-      <w:r>
-        <w:t xml:space="preserve">The integration of forecasting outputs with inventory-related information increases the operational usefulness of the proposed framework. By comparing predicted demand with current stock levels and expiry-related conditions, the system can identify situations where inventory may become misaligned with anticipated demand. Early identification of </w:t>
-      </w:r>
-      <w:proofErr w:type="spellStart"/>
-      <w:r>
-        <w:rPr>
-          <w:rStyle w:val="Strong"/>
-          <w:rFonts w:eastAsiaTheme="majorEastAsia"/>
-        </w:rPr>
-        <w:t>stockout</w:t>
-      </w:r>
-      <w:proofErr w:type="spellEnd"/>
-      <w:r>
-        <w:rPr>
-          <w:rStyle w:val="Strong"/>
-          <w:rFonts w:eastAsiaTheme="majorEastAsia"/>
-        </w:rPr>
-        <w:t xml:space="preserve"> and overstock conditions</w:t>
-      </w:r>
-      <w:r>
-        <w:t xml:space="preserve"> can support more proactive replenishment and stock-adjustment decisions rather than relying only on reactive inventory management.</w:t>
-      </w:r>
-    </w:p>
-    <w:p>
-      <w:pPr>
-        <w:pStyle w:val="NormalWeb"/>
-      </w:pPr>
-      <w:r>
-        <w:lastRenderedPageBreak/>
-        <w:t xml:space="preserve">The </w:t>
-      </w:r>
-      <w:r>
-        <w:rPr>
-          <w:rStyle w:val="Strong"/>
-          <w:rFonts w:eastAsiaTheme="majorEastAsia"/>
-        </w:rPr>
-        <w:t>intelligent recommendation support</w:t>
-      </w:r>
-      <w:r>
-        <w:t xml:space="preserve"> component further strengthens this business value by translating forecasting and inventory information into actionable guidance. Recommendations related to replenishment, reduced future ordering, inventory monitoring, promotional activity, and stock redistribution provide decision-makers with practical responses to identified inventory conditions. The framework should nevertheless be considered a </w:t>
-      </w:r>
-      <w:r>
-        <w:rPr>
-          <w:rStyle w:val="Strong"/>
-          <w:rFonts w:eastAsiaTheme="majorEastAsia"/>
-        </w:rPr>
-        <w:t>decision-support tool rather than an autonomous inventory management system</w:t>
-      </w:r>
-      <w:r>
-        <w:t>. Retail managers would still need to consider additional operational factors, such as supplier availability, procurement constraints, pricing strategies, and business priorities, before implementing inventory actions.</w:t>
-      </w:r>
-    </w:p>
-    <w:p>
-      <w:pPr>
-        <w:pStyle w:val="NormalWeb"/>
-      </w:pPr>
-      <w:r>
-        <w:t>From a sustainability perspective, improved alignment between expected demand and available inventory may help reduce conditions associated with unnecessary inventory accumulation. This is particularly relevant for products with shorter expiry periods, where excess stock can increase the likelihood of spoilage and inventory loss. By identifying elevated waste-risk situations earlier, the framework can support preventive actions such as reducing future replenishment, promoting products, or redistributing available stock.</w:t>
-      </w:r>
-    </w:p>
-    <w:p>
-      <w:pPr>
-        <w:pStyle w:val="NormalWeb"/>
-      </w:pPr>
-      <w:r>
-        <w:t xml:space="preserve">However, the sustainability implications should be interpreted cautiously. The Walmart dataset used in this study does not contain direct observations of </w:t>
-      </w:r>
-      <w:r>
-        <w:rPr>
-          <w:rStyle w:val="Strong"/>
-          <w:rFonts w:eastAsiaTheme="majorEastAsia"/>
-        </w:rPr>
-        <w:t>food waste, spoilage quantities, or disposal records</w:t>
-      </w:r>
-      <w:r>
-        <w:t xml:space="preserve">. Therefore, the study cannot quantify how much food waste would actually be prevented through use of the proposed framework. Instead, the results demonstrate how demand forecasting and inventory assessment can support the identification of operational conditions associated with </w:t>
-      </w:r>
-      <w:r>
-        <w:rPr>
-          <w:rStyle w:val="Strong"/>
-          <w:rFonts w:eastAsiaTheme="majorEastAsia"/>
-        </w:rPr>
-        <w:t>inventory-related waste risk</w:t>
-      </w:r>
-      <w:r>
-        <w:t>. This represents a potential contribution to more sustainable inventory management rather than direct evidence of measured food-waste reduction.</w:t>
-      </w:r>
-    </w:p>
-    <w:p>
-      <w:pPr>
-        <w:pStyle w:val="NormalWeb"/>
-      </w:pPr>
-      <w:r>
-        <w:t>The monitoring and model-maintenance components also have business implications. Forecasting-based inventory decisions depend on the continued relevance of model outputs, while retail demand conditions may change over time. The integration of drift detection, model versioning, and automatic retraining provides a mechanism for identifying such changes and updating the forecasting model when necessary. This supports the longer-term operational usefulness of the decision-support framework rather than treating model development as a one-time activity.</w:t>
-      </w:r>
-    </w:p>
-    <w:p>
-      <w:pPr>
-        <w:pStyle w:val="NormalWeb"/>
-      </w:pPr>
-      <w:r>
-        <w:t xml:space="preserve">Overall, the study suggests that the business and sustainability value of AI-driven forecasting is created through the </w:t>
-      </w:r>
-      <w:r>
-        <w:rPr>
-          <w:rStyle w:val="Strong"/>
-          <w:rFonts w:eastAsiaTheme="majorEastAsia"/>
-        </w:rPr>
         <w:t>connection between prediction and action</w:t>
       </w:r>
       <w:r>
         <w:t>. Demand forecasts provide visibility into expected sales, inventory assessment identifies potential imbalances, and intelligent recommendations translate these findings into possible operational responses. Through this integration, the proposed framework can support more informed inventory planning while contributing to the broader objective of reducing conditions associated with inventory-related waste.</w:t>
-      </w:r>
-    </w:p>
-    <w:p>
-      <w:pPr>
-        <w:pStyle w:val="Heading2"/>
-      </w:pPr>
-      <w:r>
-        <w:t>5.4 Limitations of the Study</w:t>
-      </w:r>
-    </w:p>
-    <w:p>
-      <w:pPr>
-        <w:pStyle w:val="NormalWeb"/>
-      </w:pPr>
-      <w:r>
-        <w:t>Although the proposed framework produced promising forecasting and decision-support results, several limitations should be considered when interpreting the findings.</w:t>
-      </w:r>
-    </w:p>
-    <w:p>
-      <w:pPr>
-        <w:pStyle w:val="NormalWeb"/>
-      </w:pPr>
-      <w:r>
-        <w:lastRenderedPageBreak/>
-        <w:t xml:space="preserve">The first limitation concerns the </w:t>
-      </w:r>
-      <w:r>
-        <w:rPr>
-          <w:rStyle w:val="Strong"/>
-          <w:rFonts w:eastAsiaTheme="majorEastAsia"/>
-        </w:rPr>
-        <w:t>availability and suitability of the dataset</w:t>
-      </w:r>
-      <w:r>
-        <w:t>. The study used the Walmart Store Sales Forecasting dataset, which was originally developed for retail sales forecasting rather than food-waste analysis. Consequently, the dataset does not contain direct observations of food waste, product spoilage, disposal quantities, or product-level expiry records. To support the objectives of this research, additional inventory-related variables and waste-risk indicators were engineered to represent conditions associated with inventory imbalance and potential waste. Although these features enabled inventory-related analysis, they should not be interpreted as direct measurements of actual food waste.</w:t>
-      </w:r>
-    </w:p>
-    <w:p>
-      <w:pPr>
-        <w:pStyle w:val="NormalWeb"/>
-      </w:pPr>
-      <w:r>
-        <w:t xml:space="preserve">A second limitation concerns the use of </w:t>
-      </w:r>
-      <w:r>
-        <w:rPr>
-          <w:rStyle w:val="Strong"/>
-          <w:rFonts w:eastAsiaTheme="majorEastAsia"/>
-        </w:rPr>
-        <w:t>engineered and simulated inventory-related variables</w:t>
-      </w:r>
-      <w:r>
-        <w:t>. Variables such as current stock, expiry-related indicators, and waste-related measures were created to support inventory assessment and intelligent recommendation generation. Although these variables were designed to represent plausible retail conditions, they cannot fully reproduce the operational complexity of real supermarket inventory systems. Therefore, the resulting waste-risk assessments represent simulated decision-support scenarios rather than verified outcomes from actual supermarket operations.</w:t>
-      </w:r>
-    </w:p>
-    <w:p>
-      <w:pPr>
-        <w:pStyle w:val="NormalWeb"/>
-      </w:pPr>
-      <w:r>
-        <w:t xml:space="preserve">Another limitation relates to the </w:t>
-      </w:r>
-      <w:r>
-        <w:rPr>
-          <w:rStyle w:val="Strong"/>
-          <w:rFonts w:eastAsiaTheme="majorEastAsia"/>
-        </w:rPr>
-        <w:t>operational evaluation environment</w:t>
-      </w:r>
-      <w:r>
-        <w:t>. Live retail events were simulated and submitted to the implemented FastAPI backend rather than obtained from a real enterprise retail system. Similarly, the framework was evaluated in a local development environment using FastAPI, SQLite, and Streamlit rather than through a large-scale commercial deployment. Consequently, aspects such as scalability, high-volume concurrent requests, enterprise security, cloud infrastructure, and integration with existing retail information systems were outside the scope of the study.</w:t>
-      </w:r>
-    </w:p>
-    <w:p>
-      <w:pPr>
-        <w:pStyle w:val="NormalWeb"/>
-      </w:pPr>
-      <w:r>
-        <w:t xml:space="preserve">The modelling comparison was also limited to </w:t>
-      </w:r>
-      <w:r>
-        <w:rPr>
-          <w:rStyle w:val="Strong"/>
-          <w:rFonts w:eastAsiaTheme="majorEastAsia"/>
-        </w:rPr>
-        <w:t xml:space="preserve">Random Forest and </w:t>
-      </w:r>
-      <w:proofErr w:type="spellStart"/>
-      <w:r>
-        <w:rPr>
-          <w:rStyle w:val="Strong"/>
-          <w:rFonts w:eastAsiaTheme="majorEastAsia"/>
-        </w:rPr>
-        <w:t>XGBoost</w:t>
-      </w:r>
-      <w:proofErr w:type="spellEnd"/>
-      <w:r>
-        <w:t>. Although Random Forest achieved the strongest performance within the implemented comparison, this does not establish it as the best forecasting algorithm for all retail forecasting problems. Other approaches, including alternative gradient-boosting methods, time-series models, deep learning architectures, and transformer-based forecasting techniques, may produce different results depending on the dataset, forecasting horizon, and operational context.</w:t>
-      </w:r>
-    </w:p>
-    <w:p>
-      <w:pPr>
-        <w:pStyle w:val="NormalWeb"/>
-      </w:pPr>
-      <w:r>
-        <w:t xml:space="preserve">The monitoring approach also has limitations. Drift detection in the implemented framework is based on a </w:t>
-      </w:r>
-      <w:r>
-        <w:rPr>
-          <w:rStyle w:val="Strong"/>
-          <w:rFonts w:eastAsiaTheme="majorEastAsia"/>
-        </w:rPr>
-        <w:t>relative mean-shift method</w:t>
-      </w:r>
-      <w:r>
-        <w:t xml:space="preserve"> applied to selected variables using predefined reference and current data windows and a fixed threshold. While this provides a practical mechanism for demonstrating data-drift monitoring and triggering automatic retraining, changes in the mean alone may not capture all forms of distributional change. More advanced statistical drift-detection techniques could provide a more comprehensive assessment in future implementations.</w:t>
-      </w:r>
-    </w:p>
-    <w:p>
-      <w:pPr>
-        <w:pStyle w:val="NormalWeb"/>
-      </w:pPr>
-      <w:r>
-        <w:t xml:space="preserve">Furthermore, the </w:t>
-      </w:r>
-      <w:r>
-        <w:rPr>
-          <w:rStyle w:val="Strong"/>
-          <w:rFonts w:eastAsiaTheme="majorEastAsia"/>
-        </w:rPr>
-        <w:t>intelligent recommendation mechanism is rule-based</w:t>
-      </w:r>
-      <w:r>
-        <w:t>. Recommendations are generated from predefined inventory assessment conditions using predicted demand, stock information, expiry-related conditions, and waste-risk indicators. Although this approach provides interpretable operational guidance, it does not incorporate the wider contextual reasoning that may influence real retail decisions, such as supplier lead times, procurement costs, storage capacity, product margins, or store-specific policies. The current framework therefore supports human decision-making rather than replacing managerial judgement.</w:t>
-      </w:r>
-    </w:p>
-    <w:p>
-      <w:pPr>
-        <w:pStyle w:val="NormalWeb"/>
-      </w:pPr>
-      <w:r>
-        <w:lastRenderedPageBreak/>
-        <w:t xml:space="preserve">Finally, the study does not directly quantify the </w:t>
-      </w:r>
-      <w:r>
-        <w:rPr>
-          <w:rStyle w:val="Strong"/>
-          <w:rFonts w:eastAsiaTheme="majorEastAsia"/>
-        </w:rPr>
-        <w:t>economic or environmental impact</w:t>
-      </w:r>
-      <w:r>
-        <w:t xml:space="preserve"> of implementing the framework. Although the results demonstrate the potential to support inventory planning and identify inventory-related waste-risk situations, no actual reduction in food waste, inventory cost, carbon emissions, or financial loss was measured. Such outcomes would require validation using real operational retail and waste data over an extended period.</w:t>
-      </w:r>
-    </w:p>
-    <w:p>
-      <w:pPr>
-        <w:pStyle w:val="NormalWeb"/>
-      </w:pPr>
-      <w:r>
-        <w:t xml:space="preserve">Despite these limitations, the study demonstrates how </w:t>
-      </w:r>
-      <w:r>
-        <w:rPr>
-          <w:rStyle w:val="Strong"/>
-          <w:rFonts w:eastAsiaTheme="majorEastAsia"/>
-        </w:rPr>
-        <w:t>machine learning-based demand forecasting, inventory assessment, intelligent recommendation support, monitoring, automatic retraining, and deployment</w:t>
-      </w:r>
-      <w:r>
-        <w:t xml:space="preserve"> can be integrated within a unified retail decision-support framework. The limitations also identify clear opportunities for further research and real-world validation.</w:t>
       </w:r>
     </w:p>
     <w:p>
@@ -11064,6 +9930,192 @@
         </w:rPr>
       </w:pPr>
       <w:r>
+        <w:br w:type="page"/>
+      </w:r>
+    </w:p>
+    <w:p>
+      <w:pPr>
+        <w:pStyle w:val="Heading2"/>
+      </w:pPr>
+      <w:r>
+        <w:lastRenderedPageBreak/>
+        <w:t>5.4 Limitations of the Study</w:t>
+      </w:r>
+    </w:p>
+    <w:p>
+      <w:pPr>
+        <w:pStyle w:val="NormalWeb"/>
+      </w:pPr>
+      <w:r>
+        <w:t>Although the proposed framework produced promising forecasting and decision-support results, several limitations should be considered when interpreting the findings.</w:t>
+      </w:r>
+    </w:p>
+    <w:p>
+      <w:pPr>
+        <w:pStyle w:val="NormalWeb"/>
+      </w:pPr>
+      <w:r>
+        <w:t xml:space="preserve">The first limitation concerns the </w:t>
+      </w:r>
+      <w:r>
+        <w:rPr>
+          <w:rStyle w:val="Strong"/>
+          <w:rFonts w:eastAsiaTheme="majorEastAsia"/>
+        </w:rPr>
+        <w:t>availability and suitability of the dataset</w:t>
+      </w:r>
+      <w:r>
+        <w:t>. The study used the Walmart Store Sales Forecasting dataset, which was originally developed for retail sales forecasting rather than food-waste analysis. Consequently, the dataset does not contain direct observations of food waste, product spoilage, disposal quantities, or product-level expiry records. To support the objectives of this research, additional inventory-related variables and waste-risk indicators were engineered to represent conditions associated with inventory imbalance and potential waste. Although these features enabled inventory-related analysis, they should not be interpreted as direct measurements of actual food waste.</w:t>
+      </w:r>
+    </w:p>
+    <w:p>
+      <w:pPr>
+        <w:pStyle w:val="NormalWeb"/>
+      </w:pPr>
+      <w:r>
+        <w:t xml:space="preserve">A second limitation concerns the use of </w:t>
+      </w:r>
+      <w:r>
+        <w:rPr>
+          <w:rStyle w:val="Strong"/>
+          <w:rFonts w:eastAsiaTheme="majorEastAsia"/>
+        </w:rPr>
+        <w:t>engineered and simulated inventory-related variables</w:t>
+      </w:r>
+      <w:r>
+        <w:t>. Variables such as current stock, expiry-related indicators, and waste-related measures were created to support inventory assessment and intelligent recommendation generation. Although these variables were designed to represent plausible retail conditions, they cannot fully reproduce the operational complexity of real supermarket inventory systems. Therefore, the resulting waste-risk assessments represent simulated decision-support scenarios rather than verified outcomes from actual supermarket operations.</w:t>
+      </w:r>
+    </w:p>
+    <w:p>
+      <w:pPr>
+        <w:pStyle w:val="NormalWeb"/>
+      </w:pPr>
+      <w:r>
+        <w:t xml:space="preserve">Another limitation relates to the </w:t>
+      </w:r>
+      <w:r>
+        <w:rPr>
+          <w:rStyle w:val="Strong"/>
+          <w:rFonts w:eastAsiaTheme="majorEastAsia"/>
+        </w:rPr>
+        <w:t>operational evaluation environment</w:t>
+      </w:r>
+      <w:r>
+        <w:t>. Live retail events were simulated and submitted to the implemented FastAPI backend rather than obtained from a real enterprise retail system. Similarly, the framework was evaluated in a local development environment using FastAPI, SQLite, and Streamlit rather than through a large-scale commercial deployment. Consequently, aspects such as scalability, high-volume concurrent requests, enterprise security, cloud infrastructure, and integration with existing retail information systems were outside the scope of the study.</w:t>
+      </w:r>
+    </w:p>
+    <w:p>
+      <w:pPr>
+        <w:pStyle w:val="NormalWeb"/>
+      </w:pPr>
+      <w:r>
+        <w:t xml:space="preserve">The modelling comparison was also limited to </w:t>
+      </w:r>
+      <w:r>
+        <w:rPr>
+          <w:rStyle w:val="Strong"/>
+          <w:rFonts w:eastAsiaTheme="majorEastAsia"/>
+        </w:rPr>
+        <w:t xml:space="preserve">Random Forest and </w:t>
+      </w:r>
+      <w:proofErr w:type="spellStart"/>
+      <w:r>
+        <w:rPr>
+          <w:rStyle w:val="Strong"/>
+          <w:rFonts w:eastAsiaTheme="majorEastAsia"/>
+        </w:rPr>
+        <w:t>XGBoost</w:t>
+      </w:r>
+      <w:proofErr w:type="spellEnd"/>
+      <w:r>
+        <w:t>. Although Random Forest achieved the strongest performance within the implemented comparison, this does not establish it as the best forecasting algorithm for all retail forecasting problems. Other approaches, including alternative gradient-boosting methods, time-series models, deep learning architectures, and transformer-based forecasting techniques, may produce different results depending on the dataset, forecasting horizon, and operational context.</w:t>
+      </w:r>
+    </w:p>
+    <w:p>
+      <w:pPr>
+        <w:pStyle w:val="NormalWeb"/>
+      </w:pPr>
+      <w:r>
+        <w:t xml:space="preserve">The monitoring approach also has limitations. Drift detection in the implemented framework is based on a </w:t>
+      </w:r>
+      <w:r>
+        <w:rPr>
+          <w:rStyle w:val="Strong"/>
+          <w:rFonts w:eastAsiaTheme="majorEastAsia"/>
+        </w:rPr>
+        <w:t>relative mean-shift method</w:t>
+      </w:r>
+      <w:r>
+        <w:t xml:space="preserve"> applied to selected variables using predefined reference and current data windows and a fixed threshold. While this provides a practical mechanism for demonstrating data-drift monitoring and triggering automatic retraining, changes in the mean alone may not capture all forms of distributional change. More advanced statistical drift-detection techniques could provide a more comprehensive assessment in future implementations.</w:t>
+      </w:r>
+    </w:p>
+    <w:p>
+      <w:pPr>
+        <w:pStyle w:val="NormalWeb"/>
+      </w:pPr>
+      <w:r>
+        <w:t xml:space="preserve">Furthermore, the intelligent recommendation mechanism uses a hybrid approach that combines predefined inventory assessment rules with a locally deployed Qwen2.5:1.5b Large Language </w:t>
+      </w:r>
+      <w:r>
+        <w:lastRenderedPageBreak/>
+        <w:t xml:space="preserve">Model through </w:t>
+      </w:r>
+      <w:proofErr w:type="spellStart"/>
+      <w:r>
+        <w:t>Ollama</w:t>
+      </w:r>
+      <w:proofErr w:type="spellEnd"/>
+      <w:r>
+        <w:t>. The rule-based component determines inventory conditions and suggested actions using predicted demand, current stock, expiry-related conditions, and waste-risk indicators, while the LLM generates a context-aware and human-readable explanation of those results. However, the recommendation component does not incorporate all factors that may influence real retail decisions, such as supplier lead times, procurement costs, storage capacity, product margins, or store-specific policies. In addition, LLM-generated explanations may vary and should therefore be treated as decision-support information rather than autonomous business decisions. Human review remains necessary before recommendations are applied in real retail operations.</w:t>
+      </w:r>
+    </w:p>
+    <w:p>
+      <w:pPr>
+        <w:pStyle w:val="NormalWeb"/>
+      </w:pPr>
+      <w:r>
+        <w:t xml:space="preserve">Finally, the study does not directly quantify the </w:t>
+      </w:r>
+      <w:r>
+        <w:rPr>
+          <w:rStyle w:val="Strong"/>
+          <w:rFonts w:eastAsiaTheme="majorEastAsia"/>
+        </w:rPr>
+        <w:t>economic or environmental impact</w:t>
+      </w:r>
+      <w:r>
+        <w:t xml:space="preserve"> of implementing the framework. Although the results demonstrate the potential to support inventory planning and identify inventory-related waste-risk situations, no actual reduction in food waste, inventory cost, carbon emissions, or financial loss was measured. Such outcomes would require validation using real operational retail and waste data over an extended period.</w:t>
+      </w:r>
+    </w:p>
+    <w:p>
+      <w:pPr>
+        <w:pStyle w:val="NormalWeb"/>
+      </w:pPr>
+      <w:r>
+        <w:t xml:space="preserve">Despite these limitations, the study demonstrates how </w:t>
+      </w:r>
+      <w:r>
+        <w:rPr>
+          <w:rStyle w:val="Strong"/>
+          <w:rFonts w:eastAsiaTheme="majorEastAsia"/>
+        </w:rPr>
+        <w:t>machine learning-based demand forecasting, inventory assessment, intelligent recommendation support, monitoring, automatic retraining, and deployment</w:t>
+      </w:r>
+      <w:r>
+        <w:t xml:space="preserve"> can be integrated within a unified retail decision-support framework. The limitations also identify clear opportunities for further research and real-world validation.</w:t>
+      </w:r>
+    </w:p>
+    <w:p>
+      <w:pPr>
+        <w:rPr>
+          <w:rFonts w:ascii="Times New Roman" w:eastAsia="Times New Roman" w:hAnsi="Times New Roman" w:cs="Times New Roman"/>
+          <w:b/>
+          <w:bCs/>
+          <w:sz w:val="36"/>
+          <w:szCs w:val="36"/>
+        </w:rPr>
+      </w:pPr>
+      <w:r>
         <w:rPr>
           <w:rFonts w:ascii="Times New Roman" w:hAnsi="Times New Roman" w:cs="Times New Roman"/>
         </w:rPr>
@@ -11211,18 +10263,32 @@
         <w:t>transparency and human oversight</w:t>
       </w:r>
       <w:r>
-        <w:t xml:space="preserve"> are particularly important. The intelligent recommendation component provides operational suggestions based on predefined inventory assessment rules, but these recommendations do not account for every factor that may influence real retail decisions. Supplier constraints, procurement costs, storage capacity, pricing strategies, and unexpected business conditions may require additional managerial judgement. Human decision-makers should therefore retain responsibility for evaluating recommendations within the relevant operational context rather than automatically accepting every system-generated action.</w:t>
-      </w:r>
-    </w:p>
-    <w:p>
-      <w:pPr>
-        <w:pStyle w:val="NormalWeb"/>
-      </w:pPr>
-      <w:r>
-        <w:rPr>
-          <w:rStyle w:val="Strong"/>
-        </w:rPr>
+        <w:t xml:space="preserve"> are particularly important. </w:t>
+      </w:r>
+      <w:r>
+        <w:t xml:space="preserve">From an ethical perspective, transparency and human oversight are particularly important. The intelligent recommendation component combines predefined inventory assessment rules with a locally deployed Qwen2.5:1.5b LLM through </w:t>
+      </w:r>
+      <w:proofErr w:type="spellStart"/>
+      <w:r>
+        <w:t>Ollama</w:t>
+      </w:r>
+      <w:proofErr w:type="spellEnd"/>
+      <w:r>
+        <w:t xml:space="preserve">. The LLM is used to generate understandable explanations and recommendations from forecasting and inventory-assessment results rather than to generate the demand forecast itself. Because LLM-generated responses may vary and do not account for every factor affecting real retail decisions, the recommendations should not be treated as autonomous decisions. Supplier constraints, procurement costs, storage capacity, pricing strategies, and unexpected business conditions may require additional </w:t>
+      </w:r>
+      <w:r>
         <w:lastRenderedPageBreak/>
+        <w:t>managerial judgement. Human decision-makers should therefore retain responsibility for evaluating system-generated recommendations within the relevant operational context.</w:t>
+      </w:r>
+    </w:p>
+    <w:p>
+      <w:pPr>
+        <w:pStyle w:val="NormalWeb"/>
+      </w:pPr>
+      <w:r>
+        <w:rPr>
+          <w:rStyle w:val="Strong"/>
+        </w:rPr>
         <w:t>Traceability and accountability</w:t>
       </w:r>
       <w:r>
@@ -11302,6 +10368,7 @@
         <w:pStyle w:val="NormalWeb"/>
       </w:pPr>
       <w:r>
+        <w:lastRenderedPageBreak/>
         <w:t xml:space="preserve">Future research could also expand the range of </w:t>
       </w:r>
       <w:r>
@@ -11320,314 +10387,316 @@
       </w:r>
       <w:proofErr w:type="spellEnd"/>
       <w:r>
-        <w:t xml:space="preserve">, while alternative approaches such as time-series forecasting models, deep learning architectures, transformer-based forecasting methods, and hybrid forecasting techniques could be investigated. Comparing a broader range of approaches </w:t>
+        <w:t>, while alternative approaches such as time-series forecasting models, deep learning architectures, transformer-based forecasting methods, and hybrid forecasting techniques could be investigated. Comparing a broader range of approaches across multiple chronological periods and forecasting horizons could provide further insight into model suitability under different retail demand conditions.</w:t>
+      </w:r>
+    </w:p>
+    <w:p>
+      <w:pPr>
+        <w:pStyle w:val="NormalWeb"/>
+      </w:pPr>
+      <w:r>
+        <w:t xml:space="preserve">Another important opportunity concerns the development of more advanced </w:t>
+      </w:r>
+      <w:r>
+        <w:rPr>
+          <w:rStyle w:val="Strong"/>
+          <w:rFonts w:eastAsiaTheme="majorEastAsia"/>
+        </w:rPr>
+        <w:t>intelligent inventory recommendation mechanisms</w:t>
+      </w:r>
+      <w:r>
+        <w:t xml:space="preserve">. The current framework uses predefined inventory assessment rules to translate demand forecasts and inventory conditions into operational recommendations. </w:t>
+      </w:r>
+      <w:r>
+        <w:t xml:space="preserve">Another important opportunity concerns further development of the LLM-assisted inventory recommendation mechanism. The current framework integrates a locally deployed Qwen2.5:1.5b model through </w:t>
+      </w:r>
+      <w:proofErr w:type="spellStart"/>
+      <w:r>
+        <w:t>Ollama</w:t>
+      </w:r>
+      <w:proofErr w:type="spellEnd"/>
+      <w:r>
+        <w:t xml:space="preserve"> to generate human-readable explanations based on demand forecasts, inventory conditions, and rule-based assessment results. Future research could evaluate larger or more specialized language models and provide the recommendation component with additional operational context, such as supplier lead times, procurement costs, promotional strategies, storage capacity, product margins, and store-specific policies. Future studies could also systematically evaluate the consistency, accuracy, and business usefulness of LLM-generated recommendations. Appropriate validation, governance, and human oversight would remain necessary before such recommendations could be used in real inventory decisions.</w:t>
+      </w:r>
+    </w:p>
+    <w:p>
+      <w:pPr>
+        <w:pStyle w:val="NormalWeb"/>
+      </w:pPr>
+      <w:r>
+        <w:t xml:space="preserve">Future research could also investigate </w:t>
+      </w:r>
+      <w:r>
+        <w:rPr>
+          <w:rStyle w:val="Strong"/>
+          <w:rFonts w:eastAsiaTheme="majorEastAsia"/>
+        </w:rPr>
+        <w:t>Explainable Artificial Intelligence (XAI)</w:t>
+      </w:r>
+      <w:r>
+        <w:t xml:space="preserve"> techniques to improve transparency and interpretability. Although the current framework provides model information and inventory recommendations, additional explanation mechanisms could help decision-makers understand which variables contributed most strongly to individual demand predictions or recommendation outcomes. Improved </w:t>
+      </w:r>
+      <w:proofErr w:type="spellStart"/>
+      <w:r>
+        <w:t>explainability</w:t>
+      </w:r>
+      <w:proofErr w:type="spellEnd"/>
+      <w:r>
+        <w:t xml:space="preserve"> may increase user confidence and support more informed human evaluation of AI-generated decision support.</w:t>
+      </w:r>
+    </w:p>
+    <w:p>
+      <w:pPr>
+        <w:pStyle w:val="NormalWeb"/>
+      </w:pPr>
+      <w:r>
+        <w:t xml:space="preserve">The </w:t>
+      </w:r>
+      <w:r>
+        <w:rPr>
+          <w:rStyle w:val="Strong"/>
+          <w:rFonts w:eastAsiaTheme="majorEastAsia"/>
+        </w:rPr>
+        <w:t>drift-detection and model-monitoring approach</w:t>
+      </w:r>
+      <w:r>
+        <w:t xml:space="preserve"> could also be extended. The current framework uses relative mean shift with predefined reference and current windows and a fixed threshold. Future implementations could evaluate more advanced statistical and distribution-based drift-detection methods capable of identifying changes beyond differences in feature means. Model-performance monitoring could also be incorporated when verified actual demand outcomes become available, allowing retraining decisions to consider both data drift and changes in predictive performance.</w:t>
+      </w:r>
+    </w:p>
+    <w:p>
+      <w:pPr>
+        <w:pStyle w:val="NormalWeb"/>
+      </w:pPr>
+      <w:r>
+        <w:t xml:space="preserve">From an operational perspective, future studies could evaluate the framework using </w:t>
+      </w:r>
+      <w:r>
+        <w:rPr>
+          <w:rStyle w:val="Strong"/>
+          <w:rFonts w:eastAsiaTheme="majorEastAsia"/>
+        </w:rPr>
+        <w:t>real-time enterprise retail systems and larger-scale deployment environments</w:t>
+      </w:r>
+      <w:r>
+        <w:t>. Integration with cloud infrastructure, enterprise databases, point-of-sale systems, inventory-management platforms, and real-time data streams would provide stronger evidence regarding scalability, reliability, security, and deployment feasibility under realistic business conditions.</w:t>
+      </w:r>
+    </w:p>
+    <w:p>
+      <w:pPr>
+        <w:pStyle w:val="NormalWeb"/>
+      </w:pPr>
+      <w:r>
+        <w:t xml:space="preserve">Future research could additionally investigate </w:t>
+      </w:r>
+      <w:r>
+        <w:rPr>
+          <w:rStyle w:val="Strong"/>
+          <w:rFonts w:eastAsiaTheme="majorEastAsia"/>
+        </w:rPr>
+        <w:t>optimization-based or reinforcement-learning approaches</w:t>
+      </w:r>
+      <w:r>
+        <w:t xml:space="preserve"> for inventory planning. While the current framework provides recommendations based on predefined inventory conditions, optimization techniques could use demand forecasts together with factors such as ordering costs, holding costs, supplier lead times, service levels, </w:t>
       </w:r>
       <w:r>
         <w:lastRenderedPageBreak/>
-        <w:t>across multiple chronological periods and forecasting horizons could provide further insight into model suitability under different retail demand conditions.</w:t>
-      </w:r>
-    </w:p>
-    <w:p>
-      <w:pPr>
-        <w:pStyle w:val="NormalWeb"/>
-      </w:pPr>
-      <w:r>
-        <w:t xml:space="preserve">Another important opportunity concerns the development of more advanced </w:t>
+        <w:t>and spoilage risk to determine inventory actions more systematically. Such extensions could move the framework from recommendation support toward more advanced inventory optimization while maintaining appropriate human oversight.</w:t>
+      </w:r>
+    </w:p>
+    <w:p>
+      <w:pPr>
+        <w:pStyle w:val="NormalWeb"/>
+      </w:pPr>
+      <w:r>
+        <w:t xml:space="preserve">Finally, future studies should evaluate the </w:t>
       </w:r>
       <w:r>
         <w:rPr>
           <w:rStyle w:val="Strong"/>
           <w:rFonts w:eastAsiaTheme="majorEastAsia"/>
         </w:rPr>
-        <w:t>intelligent inventory recommendation mechanisms</w:t>
-      </w:r>
-      <w:r>
-        <w:t xml:space="preserve">. The current framework uses predefined inventory assessment rules to translate demand forecasts and inventory conditions into operational recommendations. Future implementations could incorporate </w:t>
+        <w:t>measurable business and sustainability outcomes</w:t>
+      </w:r>
+      <w:r>
+        <w:t xml:space="preserve"> of forecasting-supported inventory management. Longitudinal evaluation within real supermarket environments could examine whether implementation leads to reductions in excess stock, </w:t>
+      </w:r>
+      <w:proofErr w:type="spellStart"/>
+      <w:r>
+        <w:t>stockouts</w:t>
+      </w:r>
+      <w:proofErr w:type="spellEnd"/>
+      <w:r>
+        <w:t>, inventory losses, operational costs, and actual food waste. Such evidence would provide a stronger basis for assessing the economic and environmental value of AI-driven inventory decision-support systems.</w:t>
+      </w:r>
+    </w:p>
+    <w:p>
+      <w:pPr>
+        <w:pStyle w:val="NormalWeb"/>
+      </w:pPr>
+      <w:r>
+        <w:t xml:space="preserve">Overall, future research can extend the proposed framework through </w:t>
       </w:r>
       <w:r>
         <w:rPr>
           <w:rStyle w:val="Strong"/>
           <w:rFonts w:eastAsiaTheme="majorEastAsia"/>
         </w:rPr>
-        <w:t>Large Language Models (LLMs)</w:t>
-      </w:r>
-      <w:r>
-        <w:t xml:space="preserve"> to generate more context-aware and human-readable explanations of forecasting and inventory conditions. LLM-based decision support could potentially consider additional contextual information, such as supplier constraints, promotional strategies, stock availability, and operational priorities. However, such recommendations would require appropriate validation, governance, and human oversight before being used in real inventory decisions.</w:t>
-      </w:r>
-    </w:p>
-    <w:p>
-      <w:pPr>
-        <w:pStyle w:val="NormalWeb"/>
-      </w:pPr>
-      <w:r>
-        <w:t xml:space="preserve">Future research could also investigate </w:t>
-      </w:r>
-      <w:r>
-        <w:rPr>
-          <w:rStyle w:val="Strong"/>
-          <w:rFonts w:eastAsiaTheme="majorEastAsia"/>
-        </w:rPr>
-        <w:t>Explainable Artificial Intelligence (XAI)</w:t>
-      </w:r>
-      <w:r>
-        <w:t xml:space="preserve"> techniques to improve transparency and interpretability. Although the current framework provides model information and inventory recommendations, additional explanation mechanisms could help decision-makers understand which variables contributed most strongly to individual demand predictions or recommendation outcomes. Improved </w:t>
+        <w:t>real food-waste data, broader forecasting comparisons, LLM-assisted recommendations, explainable AI, advanced drift monitoring, enterprise deployment, and optimization-based inventory planning</w:t>
+      </w:r>
+      <w:r>
+        <w:t>. These developments could provide a more comprehensive understanding of how AI-driven forecasting can support reliable, responsible, and sustainability-oriented inventory management within real supermarket environments.</w:t>
+      </w:r>
+    </w:p>
+    <w:p>
+      <w:pPr>
+        <w:pStyle w:val="Heading2"/>
+      </w:pPr>
+      <w:r>
+        <w:t>5.7 Conclusion</w:t>
+      </w:r>
+    </w:p>
+    <w:p>
+      <w:pPr>
+        <w:pStyle w:val="NormalWeb"/>
+      </w:pPr>
+      <w:r>
+        <w:t xml:space="preserve">This study investigated how </w:t>
+      </w:r>
+      <w:r>
+        <w:rPr>
+          <w:rStyle w:val="Strong"/>
+        </w:rPr>
+        <w:t>AI-driven demand forecasting combined with intelligent inventory decision support can improve inventory planning and support food-waste reduction in supermarket environments</w:t>
+      </w:r>
+      <w:r>
+        <w:t>. To address this research question, an integrated framework was developed that combines machine learning-based demand forecasting, inventory assessment, intelligent recommendation support, monitoring, drift detection, model versioning, automatic retraining, and deployment within a unified decision-support environment.</w:t>
+      </w:r>
+    </w:p>
+    <w:p>
+      <w:pPr>
+        <w:pStyle w:val="NormalWeb"/>
+      </w:pPr>
+      <w:r>
+        <w:t xml:space="preserve">The forecasting results demonstrate that machine learning can provide reliable demand estimates using historical retail and operational data. </w:t>
+      </w:r>
+      <w:r>
+        <w:rPr>
+          <w:rStyle w:val="Strong"/>
+        </w:rPr>
+        <w:t xml:space="preserve">Random Forest and </w:t>
       </w:r>
       <w:proofErr w:type="spellStart"/>
       <w:r>
-        <w:t>explainability</w:t>
+        <w:rPr>
+          <w:rStyle w:val="Strong"/>
+        </w:rPr>
+        <w:t>XGBoost</w:t>
       </w:r>
       <w:proofErr w:type="spellEnd"/>
       <w:r>
-        <w:t xml:space="preserve"> may increase user confidence and support more informed human evaluation of AI-generated decision support.</w:t>
-      </w:r>
-    </w:p>
-    <w:p>
-      <w:pPr>
-        <w:pStyle w:val="NormalWeb"/>
-      </w:pPr>
-      <w:r>
-        <w:t xml:space="preserve">The </w:t>
-      </w:r>
-      <w:r>
-        <w:rPr>
-          <w:rStyle w:val="Strong"/>
-          <w:rFonts w:eastAsiaTheme="majorEastAsia"/>
-        </w:rPr>
-        <w:t>drift-detection and model-monitoring approach</w:t>
-      </w:r>
-      <w:r>
-        <w:t xml:space="preserve"> could also be extended. The current framework uses relative mean shift with predefined reference and current windows and a fixed threshold. Future implementations could evaluate more advanced statistical and distribution-based drift-detection methods capable of identifying changes beyond differences in feature means. Model-performance monitoring could also be incorporated when verified actual demand outcomes become available, allowing retraining decisions to consider both data drift and changes in predictive performance.</w:t>
-      </w:r>
-    </w:p>
-    <w:p>
-      <w:pPr>
-        <w:pStyle w:val="NormalWeb"/>
-      </w:pPr>
-      <w:r>
-        <w:t xml:space="preserve">From an operational perspective, future studies could evaluate the framework using </w:t>
-      </w:r>
-      <w:r>
-        <w:rPr>
-          <w:rStyle w:val="Strong"/>
-          <w:rFonts w:eastAsiaTheme="majorEastAsia"/>
-        </w:rPr>
-        <w:t>real-time enterprise retail systems and larger-scale deployment environments</w:t>
-      </w:r>
-      <w:r>
-        <w:t>. Integration with cloud infrastructure, enterprise databases, point-of-sale systems, inventory-management platforms, and real-time data streams would provide stronger evidence regarding scalability, reliability, security, and deployment feasibility under realistic business conditions.</w:t>
-      </w:r>
-    </w:p>
-    <w:p>
-      <w:pPr>
-        <w:pStyle w:val="NormalWeb"/>
-      </w:pPr>
-      <w:r>
-        <w:t xml:space="preserve">Future research could additionally investigate </w:t>
-      </w:r>
-      <w:r>
-        <w:rPr>
-          <w:rStyle w:val="Strong"/>
-          <w:rFonts w:eastAsiaTheme="majorEastAsia"/>
-        </w:rPr>
-        <w:t>optimization-based or reinforcement-learning approaches</w:t>
-      </w:r>
-      <w:r>
-        <w:t xml:space="preserve"> for inventory planning. While the current framework provides recommendations based on predefined inventory conditions, optimization techniques could use demand forecasts together with factors such as ordering costs, holding costs, supplier lead times, service levels, and spoilage risk to determine inventory actions more systematically. Such extensions could move the framework from recommendation support toward more advanced inventory optimization while maintaining appropriate human oversight.</w:t>
-      </w:r>
-    </w:p>
-    <w:p>
-      <w:pPr>
-        <w:pStyle w:val="NormalWeb"/>
-      </w:pPr>
-      <w:r>
-        <w:t xml:space="preserve">Finally, future studies should evaluate the </w:t>
-      </w:r>
-      <w:r>
-        <w:rPr>
-          <w:rStyle w:val="Strong"/>
-          <w:rFonts w:eastAsiaTheme="majorEastAsia"/>
-        </w:rPr>
-        <w:t>measurable business and sustainability outcomes</w:t>
-      </w:r>
-      <w:r>
-        <w:t xml:space="preserve"> of forecasting-supported inventory management. Longitudinal evaluation within real supermarket environments could examine whether implementation leads to reductions in excess stock, </w:t>
+        <w:t xml:space="preserve"> were evaluated as supervised regression models, with Random Forest achieving the stronger overall performance. The selected Random Forest model achieved a </w:t>
+      </w:r>
+      <w:r>
+        <w:rPr>
+          <w:rStyle w:val="Strong"/>
+        </w:rPr>
+        <w:t>Test MAE of 215.36, Test RMSE of 482.89, and Test R² Score of 0.9515</w:t>
+      </w:r>
+      <w:r>
+        <w:t xml:space="preserve">. The relatively small generalization gap between training and testing RMSE suggested that substantial overfitting was not observed on the final split, although the higher </w:t>
       </w:r>
       <w:proofErr w:type="spellStart"/>
       <w:r>
-        <w:t>stockouts</w:t>
+        <w:t>TimeSeriesSplit</w:t>
       </w:r>
       <w:proofErr w:type="spellEnd"/>
       <w:r>
-        <w:t xml:space="preserve">, inventory losses, operational costs, and actual food waste. Such evidence would </w:t>
-      </w:r>
+        <w:t xml:space="preserve"> cross-validation error indicated variation in forecasting performance across different chronological periods. These findings demonstrate the importance of considering both predictive accuracy and temporal variation when evaluating retail forecasting models.</w:t>
+      </w:r>
+    </w:p>
+    <w:p>
+      <w:pPr>
+        <w:pStyle w:val="NormalWeb"/>
+      </w:pPr>
+      <w:r>
+        <w:t xml:space="preserve">Beyond forecasting performance, the study demonstrates that demand predictions become more operationally useful when they are combined with </w:t>
+      </w:r>
+      <w:r>
+        <w:rPr>
+          <w:rStyle w:val="Strong"/>
+        </w:rPr>
+        <w:t>inventory-related information</w:t>
+      </w:r>
+      <w:r>
+        <w:t xml:space="preserve">. By evaluating predicted demand together with current stock levels, expiry-related conditions, and engineered waste-risk indicators, the proposed framework identifies conditions associated with </w:t>
+      </w:r>
+      <w:proofErr w:type="spellStart"/>
+      <w:r>
+        <w:rPr>
+          <w:rStyle w:val="Strong"/>
+        </w:rPr>
+        <w:t>stockout</w:t>
+      </w:r>
+      <w:proofErr w:type="spellEnd"/>
+      <w:r>
+        <w:rPr>
+          <w:rStyle w:val="Strong"/>
+        </w:rPr>
+        <w:t xml:space="preserve"> risk, overstock risk, and elevated inventory-related waste risk</w:t>
+      </w:r>
+      <w:r>
+        <w:t>. The intelligent recommendation component translates these conditions into practical inventory guidance, including replenishment adjustments, inventory monitoring, promotional actions, and stock redistribution. In this way, the framework connects demand forecasting with operational inventory decision-making rather than treating forecasting as an isolated predictive task.</w:t>
+      </w:r>
+    </w:p>
+    <w:p>
+      <w:pPr>
+        <w:pStyle w:val="NormalWeb"/>
+      </w:pPr>
       <w:r>
         <w:lastRenderedPageBreak/>
-        <w:t>provide a stronger basis for assessing the economic and environmental value of AI-driven inventory decision-support systems.</w:t>
-      </w:r>
-    </w:p>
-    <w:p>
-      <w:pPr>
-        <w:pStyle w:val="NormalWeb"/>
-      </w:pPr>
-      <w:r>
-        <w:t xml:space="preserve">Overall, future research can extend the proposed framework through </w:t>
-      </w:r>
-      <w:r>
-        <w:rPr>
-          <w:rStyle w:val="Strong"/>
-          <w:rFonts w:eastAsiaTheme="majorEastAsia"/>
-        </w:rPr>
-        <w:t>real food-waste data, broader forecasting comparisons, LLM-assisted recommendations, explainable AI, advanced drift monitoring, enterprise deployment, and optimization-based inventory planning</w:t>
-      </w:r>
-      <w:r>
-        <w:t>. These developments could provide a more comprehensive understanding of how AI-driven forecasting can support reliable, responsible, and sustainability-oriented inventory management within real supermarket environments.</w:t>
-      </w:r>
-    </w:p>
-    <w:p>
-      <w:pPr>
-        <w:pStyle w:val="NormalWeb"/>
-        <w:rPr>
-          <w:b/>
-        </w:rPr>
-      </w:pPr>
-    </w:p>
-    <w:p>
-      <w:pPr>
-        <w:pStyle w:val="Heading2"/>
-      </w:pPr>
-      <w:r>
-        <w:t>5.7 Conclusion</w:t>
-      </w:r>
-    </w:p>
-    <w:p>
-      <w:pPr>
-        <w:pStyle w:val="NormalWeb"/>
-      </w:pPr>
-      <w:r>
-        <w:t xml:space="preserve">This study investigated how </w:t>
-      </w:r>
-      <w:r>
-        <w:rPr>
-          <w:rStyle w:val="Strong"/>
-        </w:rPr>
-        <w:t>AI-driven demand forecasting combined with intelligent inventory decision support can improve inventory planning and support food-waste reduction in supermarket environments</w:t>
-      </w:r>
-      <w:r>
-        <w:t>. To address this research question, an integrated framework was developed that combines machine learning-based demand forecasting, inventory assessment, intelligent recommendation support, monitoring, drift detection, model versioning, automatic retraining, and deployment within a unified decision-support environment.</w:t>
-      </w:r>
-    </w:p>
-    <w:p>
-      <w:pPr>
-        <w:pStyle w:val="NormalWeb"/>
-      </w:pPr>
-      <w:r>
-        <w:t xml:space="preserve">The forecasting results demonstrate that machine learning can provide reliable demand estimates using historical retail and operational data. </w:t>
-      </w:r>
-      <w:r>
-        <w:rPr>
-          <w:rStyle w:val="Strong"/>
-        </w:rPr>
-        <w:t xml:space="preserve">Random Forest and </w:t>
+        <w:t xml:space="preserve">The study also demonstrates the importance of maintaining forecasting reliability under changing retail conditions. The implemented monitoring mechanism detected changes in selected operational variables and triggered </w:t>
+      </w:r>
+      <w:r>
+        <w:rPr>
+          <w:rStyle w:val="Strong"/>
+        </w:rPr>
+        <w:t>automatic model retraining</w:t>
+      </w:r>
+      <w:r>
+        <w:t xml:space="preserve"> when the predefined drift threshold was exceeded. Model versioning and monitoring records further support traceability and model maintenance. These capabilities demonstrate how forecasting systems can be designed as adaptive decision-support frameworks rather than static models developed and evaluated only once.</w:t>
+      </w:r>
+    </w:p>
+    <w:p>
+      <w:pPr>
+        <w:pStyle w:val="NormalWeb"/>
+      </w:pPr>
+      <w:r>
+        <w:t xml:space="preserve">From a business perspective, the proposed framework can support retailers by improving demand visibility and providing information for </w:t>
+      </w:r>
+      <w:r>
+        <w:rPr>
+          <w:rStyle w:val="Strong"/>
+        </w:rPr>
+        <w:t>replenishment planning, inventory assessment, stock management, and inventory-related decision-making</w:t>
+      </w:r>
+      <w:r>
+        <w:t>. The integration of forecasting and recommendation support enables decision-makers to identify potential inventory imbalances earlier and consider appropriate operational responses. However, the recommendations are intended to support rather than replace managerial judgement, particularly because real retail decisions may also depend on factors such as supplier constraints, procurement costs, storage capacity, and business priorities.</w:t>
+      </w:r>
+    </w:p>
+    <w:p>
+      <w:pPr>
+        <w:pStyle w:val="NormalWeb"/>
+      </w:pPr>
+      <w:r>
+        <w:t xml:space="preserve">The implemented recommendation component further extends the framework by combining rule-based inventory assessment with a locally deployed Qwen2.5:1.5b Large Language Model through </w:t>
       </w:r>
       <w:proofErr w:type="spellStart"/>
       <w:r>
-        <w:rPr>
-          <w:rStyle w:val="Strong"/>
-        </w:rPr>
-        <w:t>XGBoost</w:t>
+        <w:t>Ollama</w:t>
       </w:r>
       <w:proofErr w:type="spellEnd"/>
       <w:r>
-        <w:t xml:space="preserve"> were evaluated as supervised regression models, with Random Forest achieving the stronger overall performance. The selected Random Forest model achieved a </w:t>
-      </w:r>
-      <w:r>
-        <w:rPr>
-          <w:rStyle w:val="Strong"/>
-        </w:rPr>
-        <w:t>Test MAE of 215.36, Test RMSE of 482.89, and Test R² Score of 0.9515</w:t>
-      </w:r>
-      <w:r>
-        <w:t xml:space="preserve">. The relatively small generalization gap between training and testing RMSE suggested that substantial overfitting was not observed on the final split, although the higher </w:t>
-      </w:r>
-      <w:proofErr w:type="spellStart"/>
-      <w:r>
-        <w:t>TimeSeriesSplit</w:t>
-      </w:r>
-      <w:proofErr w:type="spellEnd"/>
-      <w:r>
-        <w:t xml:space="preserve"> cross-validation error indicated variation in forecasting performance across different chronological periods. These findings demonstrate the importance of considering both predictive accuracy and temporal variation when evaluating retail forecasting models.</w:t>
-      </w:r>
-    </w:p>
-    <w:p>
-      <w:pPr>
-        <w:pStyle w:val="NormalWeb"/>
-      </w:pPr>
-      <w:r>
-        <w:t xml:space="preserve">Beyond forecasting performance, the study demonstrates that demand predictions become more operationally useful when they are combined with </w:t>
-      </w:r>
-      <w:r>
-        <w:rPr>
-          <w:rStyle w:val="Strong"/>
-        </w:rPr>
-        <w:t>inventory-related information</w:t>
-      </w:r>
-      <w:r>
-        <w:t xml:space="preserve">. By evaluating predicted demand together with current stock levels, expiry-related conditions, and engineered waste-risk indicators, the proposed framework identifies conditions associated with </w:t>
-      </w:r>
-      <w:proofErr w:type="spellStart"/>
-      <w:r>
-        <w:rPr>
-          <w:rStyle w:val="Strong"/>
-        </w:rPr>
-        <w:t>stockout</w:t>
-      </w:r>
-      <w:proofErr w:type="spellEnd"/>
-      <w:r>
-        <w:rPr>
-          <w:rStyle w:val="Strong"/>
-        </w:rPr>
-        <w:t xml:space="preserve"> risk, overstock risk, and elevated inventory-related waste risk</w:t>
-      </w:r>
-      <w:r>
-        <w:t>. The intelligent recommendation component translates these conditions into practical inventory guidance, including replenishment adjustments, inventory monitoring, promotional actions, and stock redistribution. In this way, the framework connects demand forecasting with operational inventory decision-making rather than treating forecasting as an isolated predictive task.</w:t>
-      </w:r>
-    </w:p>
-    <w:p>
-      <w:pPr>
-        <w:pStyle w:val="NormalWeb"/>
-      </w:pPr>
-      <w:r>
-        <w:t xml:space="preserve">The study also demonstrates the importance of maintaining forecasting reliability under changing retail conditions. The implemented monitoring mechanism detected changes in selected operational variables and triggered </w:t>
-      </w:r>
-      <w:r>
-        <w:rPr>
-          <w:rStyle w:val="Strong"/>
-        </w:rPr>
-        <w:t>automatic model retraining</w:t>
-      </w:r>
-      <w:r>
-        <w:t xml:space="preserve"> when the predefined drift threshold was exceeded. Model versioning and monitoring records further support traceability and model maintenance. These capabilities demonstrate how forecasting systems can be </w:t>
-      </w:r>
-      <w:r>
-        <w:lastRenderedPageBreak/>
-        <w:t>designed as adaptive decision-support frameworks rather than static models developed and evaluated only once.</w:t>
-      </w:r>
-    </w:p>
-    <w:p>
-      <w:pPr>
-        <w:pStyle w:val="NormalWeb"/>
-      </w:pPr>
-      <w:r>
-        <w:t xml:space="preserve">From a business perspective, the proposed framework can support retailers by improving demand visibility and providing information for </w:t>
-      </w:r>
-      <w:r>
-        <w:rPr>
-          <w:rStyle w:val="Strong"/>
-        </w:rPr>
-        <w:t>replenishment planning, inventory assessment, stock management, and inventory-related decision-making</w:t>
-      </w:r>
-      <w:r>
-        <w:t>. The integration of forecasting and recommendation support enables decision-makers to identify potential inventory imbalances earlier and consider appropriate operational responses. However, the recommendations are intended to support rather than replace managerial judgement, particularly because real retail decisions may also depend on factors such as supplier constraints, procurement costs, storage capacity, and business priorities.</w:t>
+        <w:t>. While Random Forest is responsible for generating demand predictions, the LLM acts as an explanatory decision-support layer that converts forecasting and inventory-assessment results into human-readable recommendations. This demonstrates how predictive machine learning and generative AI can be integrated within the same retail decision-support framework while maintaining human oversight over final inventory decisions.</w:t>
       </w:r>
     </w:p>
     <w:p>
@@ -11689,43 +10758,32 @@
       <w:r>
         <w:t>. The proposed framework demonstrates how demand prediction can be connected with inventory assessment, actionable recommendations, monitoring, and model maintenance within an end-to-end retail decision-support environment. Although further validation using real inventory and food-waste data is required, the study provides a practical foundation for developing more efficient, adaptive, responsible, and sustainability-oriented inventory management systems within supermarket environments.</w:t>
       </w:r>
-    </w:p>
-    <w:p>
-      <w:pPr>
-        <w:rPr>
-          <w:rFonts w:ascii="Times New Roman" w:hAnsi="Times New Roman" w:cs="Times New Roman"/>
+      <w:r>
+        <w:rPr>
           <w:b/>
           <w:sz w:val="36"/>
           <w:szCs w:val="36"/>
         </w:rPr>
-      </w:pPr>
-      <w:r>
+        <w:br w:type="page"/>
+      </w:r>
+    </w:p>
+    <w:p>
+      <w:pPr>
+        <w:jc w:val="both"/>
         <w:rPr>
           <w:rFonts w:ascii="Times New Roman" w:hAnsi="Times New Roman" w:cs="Times New Roman"/>
           <w:b/>
           <w:sz w:val="36"/>
           <w:szCs w:val="36"/>
         </w:rPr>
-        <w:br w:type="page"/>
-      </w:r>
-    </w:p>
-    <w:p>
-      <w:pPr>
-        <w:jc w:val="both"/>
+      </w:pPr>
+      <w:r>
         <w:rPr>
           <w:rFonts w:ascii="Times New Roman" w:hAnsi="Times New Roman" w:cs="Times New Roman"/>
           <w:b/>
           <w:sz w:val="36"/>
           <w:szCs w:val="36"/>
         </w:rPr>
-      </w:pPr>
-      <w:r>
-        <w:rPr>
-          <w:rFonts w:ascii="Times New Roman" w:hAnsi="Times New Roman" w:cs="Times New Roman"/>
-          <w:b/>
-          <w:sz w:val="36"/>
-          <w:szCs w:val="36"/>
-        </w:rPr>
         <w:lastRenderedPageBreak/>
         <w:t>References</w:t>
       </w:r>
@@ -11833,7 +10891,7 @@
       <w:r>
         <w:t xml:space="preserve">Food and Agriculture Organization. (2022). </w:t>
       </w:r>
-      <w:hyperlink r:id="rId15" w:tgtFrame="_blank" w:tooltip="https://www.fao.org/publications/fao-flagship-publications/the-state-of-food-and-agriculture/2022?utm" w:history="1">
+      <w:hyperlink r:id="rId16" w:tgtFrame="_blank" w:tooltip="https://www.fao.org/publications/fao-flagship-publications/the-state-of-food-and-agriculture/2022?utm" w:history="1">
         <w:r>
           <w:rPr>
             <w:rStyle w:val="Hyperlink"/>
@@ -11881,7 +10939,7 @@
       <w:r>
         <w:t xml:space="preserve">, A. (2022). </w:t>
       </w:r>
-      <w:hyperlink r:id="rId16" w:tgtFrame="_blank" w:tooltip="https://www.oreilly.com/library/view/hands-on-machine-learning/9781098125967/?utm" w:history="1">
+      <w:hyperlink r:id="rId17" w:tgtFrame="_blank" w:tooltip="https://www.oreilly.com/library/view/hands-on-machine-learning/9781098125967/?utm" w:history="1">
         <w:r>
           <w:rPr>
             <w:rStyle w:val="Hyperlink"/>
@@ -11965,7 +11023,7 @@
       <w:r>
         <w:t xml:space="preserve">, M., &amp; Pei, J. (2011). </w:t>
       </w:r>
-      <w:hyperlink r:id="rId17" w:tgtFrame="_blank" w:tooltip="https://www.sciencedirect.com/book/monograph/9780123814791/data-mining-concepts-and-techniques?utm" w:history="1">
+      <w:hyperlink r:id="rId18" w:tgtFrame="_blank" w:tooltip="https://www.sciencedirect.com/book/monograph/9780123814791/data-mining-concepts-and-techniques?utm" w:history="1">
         <w:r>
           <w:rPr>
             <w:rStyle w:val="Hyperlink"/>
@@ -12043,7 +11101,7 @@
       <w:r>
         <w:t xml:space="preserve">): </w:t>
       </w:r>
-      <w:hyperlink r:id="rId18" w:tgtFrame="_blank" w:tooltip="https://ieeexplore.ieee.org/document/10081336?utm=" w:history="1">
+      <w:hyperlink r:id="rId19" w:tgtFrame="_blank" w:tooltip="https://ieeexplore.ieee.org/document/10081336?utm=" w:history="1">
         <w:r>
           <w:rPr>
             <w:rStyle w:val="Hyperlink"/>
@@ -12307,52 +11365,93 @@
     </w:p>
     <w:p>
       <w:pPr>
-        <w:pStyle w:val="NormalWeb"/>
-        <w:jc w:val="both"/>
-      </w:pPr>
-      <w:r>
-        <w:t xml:space="preserve">During the preparation of this work, we used </w:t>
+        <w:spacing w:before="100" w:beforeAutospacing="1" w:after="100" w:afterAutospacing="1" w:line="240" w:lineRule="auto"/>
+        <w:rPr>
+          <w:rFonts w:ascii="Times New Roman" w:eastAsia="Times New Roman" w:hAnsi="Times New Roman" w:cs="Times New Roman"/>
+          <w:sz w:val="24"/>
+          <w:szCs w:val="24"/>
+        </w:rPr>
+      </w:pPr>
+      <w:r>
+        <w:rPr>
+          <w:rFonts w:ascii="Times New Roman" w:eastAsia="Times New Roman" w:hAnsi="Times New Roman" w:cs="Times New Roman"/>
+          <w:sz w:val="24"/>
+          <w:szCs w:val="24"/>
+        </w:rPr>
+        <w:t xml:space="preserve">During the preparation of this project, we used </w:t>
       </w:r>
       <w:proofErr w:type="spellStart"/>
       <w:r>
+        <w:rPr>
+          <w:rFonts w:ascii="Times New Roman" w:eastAsia="Times New Roman" w:hAnsi="Times New Roman" w:cs="Times New Roman"/>
+          <w:sz w:val="24"/>
+          <w:szCs w:val="24"/>
+        </w:rPr>
         <w:t>ChatGPT</w:t>
       </w:r>
       <w:proofErr w:type="spellEnd"/>
       <w:r>
-        <w:t xml:space="preserve"> in order to improve grammar, readability and language c</w:t>
-      </w:r>
-      <w:r>
-        <w:t xml:space="preserve">larity. After using </w:t>
+        <w:rPr>
+          <w:rFonts w:ascii="Times New Roman" w:eastAsia="Times New Roman" w:hAnsi="Times New Roman" w:cs="Times New Roman"/>
+          <w:sz w:val="24"/>
+          <w:szCs w:val="24"/>
+        </w:rPr>
+        <w:t xml:space="preserve"> to support language improvement, grammar correction, readability, and clarification of selected technical concepts. AI-generated suggestions were critically reviewed, verified, and edited by the authors before being included in the final work.</w:t>
+      </w:r>
+    </w:p>
+    <w:p>
+      <w:pPr>
+        <w:spacing w:before="100" w:beforeAutospacing="1" w:after="100" w:afterAutospacing="1" w:line="240" w:lineRule="auto"/>
+        <w:rPr>
+          <w:rFonts w:ascii="Times New Roman" w:eastAsia="Times New Roman" w:hAnsi="Times New Roman" w:cs="Times New Roman"/>
+          <w:sz w:val="24"/>
+          <w:szCs w:val="24"/>
+        </w:rPr>
+      </w:pPr>
+      <w:r>
+        <w:rPr>
+          <w:rFonts w:ascii="Times New Roman" w:eastAsia="Times New Roman" w:hAnsi="Times New Roman" w:cs="Times New Roman"/>
+          <w:sz w:val="24"/>
+          <w:szCs w:val="24"/>
+        </w:rPr>
+        <w:t xml:space="preserve">In addition, a locally deployed Qwen2.5:1.5b Large Language Model, accessed through </w:t>
       </w:r>
       <w:proofErr w:type="spellStart"/>
       <w:r>
-        <w:t>ChatGPT</w:t>
+        <w:rPr>
+          <w:rFonts w:ascii="Times New Roman" w:eastAsia="Times New Roman" w:hAnsi="Times New Roman" w:cs="Times New Roman"/>
+          <w:sz w:val="24"/>
+          <w:szCs w:val="24"/>
+        </w:rPr>
+        <w:t>Ollama</w:t>
       </w:r>
       <w:proofErr w:type="spellEnd"/>
       <w:r>
-        <w:t>, we</w:t>
-      </w:r>
-      <w:r>
-        <w:t xml:space="preserve"> reviewed and e</w:t>
-      </w:r>
-      <w:r>
-        <w:t>dited the content as needed.</w:t>
-      </w:r>
-    </w:p>
-    <w:p>
-      <w:pPr>
-        <w:pStyle w:val="NormalWeb"/>
-        <w:jc w:val="both"/>
-      </w:pPr>
-      <w:r>
-        <w:t>All research design, data preparation, feature engineering, model development, implementation, analysis, interpretation of results, and final conclusions were carried out by the authors. The authors critically reviewed, verified, and edited all AI-generated suggestions and take full responsibility for the content of this report.</w:t>
-      </w:r>
-    </w:p>
-    <w:p>
-      <w:pPr>
-        <w:pStyle w:val="NormalWeb"/>
-        <w:jc w:val="both"/>
-      </w:pPr>
+        <w:rPr>
+          <w:rFonts w:ascii="Times New Roman" w:eastAsia="Times New Roman" w:hAnsi="Times New Roman" w:cs="Times New Roman"/>
+          <w:sz w:val="24"/>
+          <w:szCs w:val="24"/>
+        </w:rPr>
+        <w:t>, was implemented as part of the developed inventory decision-support framework. The model is used to transform structured forecasting and inventory-assessment outputs into human-readable inventory recommendations. It does not generate the demand forecasts; demand prediction is performed by the selected Random Forest model.</w:t>
+      </w:r>
+    </w:p>
+    <w:p>
+      <w:pPr>
+        <w:spacing w:before="100" w:beforeAutospacing="1" w:after="100" w:afterAutospacing="1" w:line="240" w:lineRule="auto"/>
+        <w:rPr>
+          <w:rFonts w:ascii="Times New Roman" w:eastAsia="Times New Roman" w:hAnsi="Times New Roman" w:cs="Times New Roman"/>
+          <w:sz w:val="24"/>
+          <w:szCs w:val="24"/>
+        </w:rPr>
+      </w:pPr>
+      <w:r>
+        <w:rPr>
+          <w:rFonts w:ascii="Times New Roman" w:eastAsia="Times New Roman" w:hAnsi="Times New Roman" w:cs="Times New Roman"/>
+          <w:sz w:val="24"/>
+          <w:szCs w:val="24"/>
+        </w:rPr>
+        <w:t>The research design, data preparation, feature engineering, model development and evaluation, system implementation, analysis and interpretation of results, and final conclusions remain the responsibility of the authors. The authors take full responsibility for the content and results presented in this report.</w:t>
+      </w:r>
     </w:p>
     <w:sectPr>
       <w:pgSz w:w="12240" w:h="15840"/>
@@ -14806,7 +13905,7 @@
 </file>
 
 <file path=customXml/itemProps1.xml><?xml version="1.0" encoding="utf-8"?>
-<ds:datastoreItem xmlns:ds="http://schemas.openxmlformats.org/officeDocument/2006/customXml" ds:itemID="{F29516A1-479F-4FE6-B607-468A3338B673}">
+<ds:datastoreItem xmlns:ds="http://schemas.openxmlformats.org/officeDocument/2006/customXml" ds:itemID="{EAE57CC0-CEA8-492B-9CB6-B9CEFC0567DB}">
   <ds:schemaRefs>
     <ds:schemaRef ds:uri="http://schemas.openxmlformats.org/officeDocument/2006/bibliography"/>
   </ds:schemaRefs>

</xml_diff>

<commit_message>
Final project updates and documentation corrections
</commit_message>
<xml_diff>
--- a/report/AI-Driven Retail Demand Forecasting and Intelligent Inventory Decision Support for Food Waste Reduction.docx
+++ b/report/AI-Driven Retail Demand Forecasting and Intelligent Inventory Decision Support for Food Waste Reduction.docx
@@ -1460,7 +1460,7 @@
         <w:rPr>
           <w:rFonts w:ascii="Times New Roman" w:hAnsi="Times New Roman" w:cs="Times New Roman"/>
         </w:rPr>
-        <w:t>............................. 46</w:t>
+        <w:t>............................. 47</w:t>
       </w:r>
       <w:bookmarkStart w:id="0" w:name="_GoBack"/>
       <w:bookmarkEnd w:id="0"/>
@@ -1490,7 +1490,7 @@
         <w:rPr>
           <w:rFonts w:ascii="Times New Roman" w:hAnsi="Times New Roman" w:cs="Times New Roman"/>
         </w:rPr>
-        <w:t>8</w:t>
+        <w:t>9</w:t>
       </w:r>
     </w:p>
     <w:p>
@@ -1526,7 +1526,7 @@
         <w:rPr>
           <w:rFonts w:ascii="Times New Roman" w:hAnsi="Times New Roman" w:cs="Times New Roman"/>
         </w:rPr>
-        <w:t>49</w:t>
+        <w:t>50</w:t>
       </w:r>
     </w:p>
     <w:p>
@@ -8435,6 +8435,7 @@
         <w:rPr>
           <w:rStyle w:val="Strong"/>
           <w:rFonts w:eastAsiaTheme="majorEastAsia"/>
+          <w:noProof/>
         </w:rPr>
         <w:drawing>
           <wp:inline distT="0" distB="0" distL="0" distR="0" wp14:anchorId="42C9F071" wp14:editId="14601413">
@@ -8485,6 +8486,7 @@
         <w:rPr>
           <w:rStyle w:val="Strong"/>
           <w:rFonts w:eastAsiaTheme="majorEastAsia"/>
+          <w:noProof/>
         </w:rPr>
         <w:lastRenderedPageBreak/>
         <w:drawing>
@@ -8657,281 +8659,42 @@
         <w:spacing w:before="100" w:beforeAutospacing="1" w:after="100" w:afterAutospacing="1" w:line="240" w:lineRule="auto"/>
         <w:rPr>
           <w:rFonts w:ascii="Times New Roman" w:eastAsia="Times New Roman" w:hAnsi="Times New Roman" w:cs="Times New Roman"/>
-          <w:sz w:val="24"/>
-          <w:szCs w:val="24"/>
-        </w:rPr>
-      </w:pPr>
-      <w:r>
-        <w:rPr>
-          <w:rFonts w:ascii="Times New Roman" w:eastAsia="Times New Roman" w:hAnsi="Times New Roman" w:cs="Times New Roman"/>
           <w:bCs/>
           <w:sz w:val="24"/>
           <w:szCs w:val="24"/>
         </w:rPr>
+      </w:pPr>
+      <w:r>
+        <w:rPr>
+          <w:rFonts w:ascii="Times New Roman" w:eastAsia="Times New Roman" w:hAnsi="Times New Roman" w:cs="Times New Roman"/>
+          <w:bCs/>
+          <w:sz w:val="24"/>
+          <w:szCs w:val="24"/>
+        </w:rPr>
         <w:t>This hybrid approach combines the consistency of predefined inventory rules with the explanatory capability of an LLM. The rule-based assessment provides structured inventory logic, while the LLM communicates the identified condition and recommended action in a form that can be more easily interpreted by retail decision-makers.</w:t>
       </w:r>
     </w:p>
     <w:p>
       <w:pPr>
-        <w:pStyle w:val="NormalWeb"/>
-      </w:pPr>
-      <w:r>
+        <w:spacing w:before="100" w:beforeAutospacing="1" w:after="100" w:afterAutospacing="1" w:line="240" w:lineRule="auto"/>
+        <w:rPr>
+          <w:rFonts w:ascii="Times New Roman" w:eastAsia="Times New Roman" w:hAnsi="Times New Roman" w:cs="Times New Roman"/>
+          <w:sz w:val="24"/>
+          <w:szCs w:val="24"/>
+        </w:rPr>
+      </w:pPr>
+      <w:r>
+        <w:rPr>
+          <w:rFonts w:ascii="Times New Roman" w:eastAsia="Times New Roman" w:hAnsi="Times New Roman" w:cs="Times New Roman"/>
+          <w:sz w:val="24"/>
+          <w:szCs w:val="24"/>
+        </w:rPr>
         <w:lastRenderedPageBreak/>
-        <w:t xml:space="preserve">By transforming forecasting outputs into practical recommendations, the framework extends beyond traditional demand prediction and provides direct support for </w:t>
-      </w:r>
-      <w:r>
-        <w:rPr>
-          <w:rStyle w:val="Strong"/>
-          <w:rFonts w:eastAsiaTheme="majorEastAsia"/>
-        </w:rPr>
-        <w:t>inventory-related decision-making</w:t>
-      </w:r>
-      <w:r>
-        <w:t>. This approach improves the operational usefulness of forecasting results and helps retailers respond more proactively to changing inventory conditions.</w:t>
-      </w:r>
-    </w:p>
-    <w:p>
-      <w:pPr>
-        <w:pStyle w:val="NormalWeb"/>
-      </w:pPr>
-      <w:r>
-        <w:t xml:space="preserve">The recommendation component is particularly important because reducing </w:t>
-      </w:r>
-      <w:r>
-        <w:rPr>
-          <w:rStyle w:val="Strong"/>
-          <w:rFonts w:eastAsiaTheme="majorEastAsia"/>
-        </w:rPr>
-        <w:t>inventory-related waste risk</w:t>
-      </w:r>
-      <w:r>
-        <w:t xml:space="preserve"> requires more than accurate forecasts. Business value is created when forecasting insights are translated into practical actions that support </w:t>
-      </w:r>
-      <w:r>
-        <w:rPr>
-          <w:rStyle w:val="Strong"/>
-          <w:rFonts w:eastAsiaTheme="majorEastAsia"/>
-        </w:rPr>
-        <w:t xml:space="preserve">inventory planning, improved stock </w:t>
-      </w:r>
-      <w:proofErr w:type="spellStart"/>
-      <w:r>
-        <w:rPr>
-          <w:rStyle w:val="Strong"/>
-          <w:rFonts w:eastAsiaTheme="majorEastAsia"/>
-        </w:rPr>
-        <w:t>utilisation</w:t>
-      </w:r>
-      <w:proofErr w:type="spellEnd"/>
-      <w:r>
-        <w:rPr>
-          <w:rStyle w:val="Strong"/>
-          <w:rFonts w:eastAsiaTheme="majorEastAsia"/>
-        </w:rPr>
-        <w:t>, and reduced inventory-related waste risk</w:t>
-      </w:r>
-      <w:r>
-        <w:t>. Consequently, the recommendation component provides the connection between demand forecasting and operational inventory decision-making within the proposed framework.</w:t>
-      </w:r>
-    </w:p>
-    <w:p>
-      <w:pPr>
-        <w:pStyle w:val="Heading2"/>
-      </w:pPr>
-      <w:r>
-        <w:t>4.5 Forecasting Reliability Through Monitoring and Automatic Retraining</w:t>
-      </w:r>
-    </w:p>
-    <w:p>
-      <w:pPr>
-        <w:pStyle w:val="NormalWeb"/>
-      </w:pPr>
-      <w:r>
-        <w:t xml:space="preserve">Forecasting models are typically developed using historical data; however, retail demand patterns are not static. Customer </w:t>
-      </w:r>
-      <w:proofErr w:type="spellStart"/>
-      <w:r>
-        <w:t>behaviour</w:t>
-      </w:r>
-      <w:proofErr w:type="spellEnd"/>
-      <w:r>
-        <w:t xml:space="preserve">, promotional activities, seasonal trends, and operational conditions can change over time, potentially affecting forecasting performance. As a result, forecasting systems require mechanisms that support </w:t>
-      </w:r>
-      <w:r>
-        <w:rPr>
-          <w:rStyle w:val="Strong"/>
-          <w:rFonts w:eastAsiaTheme="majorEastAsia"/>
-        </w:rPr>
-        <w:t>long-term reliability and adaptability</w:t>
-      </w:r>
-      <w:r>
-        <w:t>.</w:t>
-      </w:r>
-    </w:p>
-    <w:p>
-      <w:pPr>
-        <w:pStyle w:val="NormalWeb"/>
-      </w:pPr>
-      <w:r>
-        <w:t xml:space="preserve">To address this challenge, the proposed framework incorporates </w:t>
-      </w:r>
-      <w:r>
-        <w:rPr>
-          <w:rStyle w:val="Strong"/>
-          <w:rFonts w:eastAsiaTheme="majorEastAsia"/>
-        </w:rPr>
-        <w:t>monitoring, drift detection, model versioning, and automatic retraining</w:t>
-      </w:r>
-      <w:r>
-        <w:t xml:space="preserve"> capabilities. These mechanisms are designed to identify changes in operational data patterns and support model updating when current conditions differ substantially from the historical conditions used for model development.</w:t>
-      </w:r>
-    </w:p>
-    <w:p>
-      <w:pPr>
-        <w:pStyle w:val="NormalWeb"/>
-      </w:pPr>
-      <w:r>
-        <w:t xml:space="preserve">The monitoring process evaluates selected retail and </w:t>
-      </w:r>
-      <w:r>
-        <w:rPr>
-          <w:rStyle w:val="Strong"/>
-          <w:rFonts w:eastAsiaTheme="majorEastAsia"/>
-        </w:rPr>
-        <w:t>inventory-related variables</w:t>
-      </w:r>
-      <w:r>
-        <w:t xml:space="preserve">, including </w:t>
-      </w:r>
-      <w:r>
-        <w:rPr>
-          <w:rStyle w:val="Strong"/>
-          <w:rFonts w:eastAsiaTheme="majorEastAsia"/>
-        </w:rPr>
-        <w:t>units sold, current stock, temperature, and waste quantity</w:t>
-      </w:r>
-      <w:r>
-        <w:t xml:space="preserve">. Within the implemented framework, drift is assessed by comparing the mean of a historical </w:t>
-      </w:r>
-      <w:r>
-        <w:rPr>
-          <w:rStyle w:val="Strong"/>
-          <w:rFonts w:eastAsiaTheme="majorEastAsia"/>
-        </w:rPr>
-        <w:t>reference window of 1,000 observations</w:t>
-      </w:r>
-      <w:r>
-        <w:t xml:space="preserve"> with the mean of a </w:t>
-      </w:r>
-      <w:r>
-        <w:rPr>
-          <w:rStyle w:val="Strong"/>
-          <w:rFonts w:eastAsiaTheme="majorEastAsia"/>
-        </w:rPr>
-        <w:t>current window of 300 observations</w:t>
-      </w:r>
-      <w:r>
-        <w:t xml:space="preserve">. A relative mean-shift score is calculated for each monitored variable, and a predefined drift threshold of </w:t>
-      </w:r>
-      <w:r>
-        <w:rPr>
-          <w:rStyle w:val="Strong"/>
-          <w:rFonts w:eastAsiaTheme="majorEastAsia"/>
-        </w:rPr>
-        <w:t>0.15</w:t>
-      </w:r>
-      <w:r>
-        <w:t xml:space="preserve"> is used to determine whether a substantial change has occurred. When the calculated score exceeds this threshold, the corresponding variable is classified as exhibiting drift.</w:t>
-      </w:r>
-    </w:p>
-    <w:p>
-      <w:pPr>
-        <w:pStyle w:val="NormalWeb"/>
-      </w:pPr>
-      <w:r>
-        <w:t xml:space="preserve">To support forecasting reliability, the framework incorporates an </w:t>
-      </w:r>
-      <w:r>
-        <w:rPr>
-          <w:rStyle w:val="Strong"/>
-          <w:rFonts w:eastAsiaTheme="majorEastAsia"/>
-        </w:rPr>
-        <w:t>automatic retraining mechanism</w:t>
-      </w:r>
-      <w:r>
-        <w:t xml:space="preserve">. When drift is detected, the training pipeline is automatically executed and the forecasting models are trained and evaluated again. The selected model is then stored as a </w:t>
-      </w:r>
-      <w:r>
-        <w:rPr>
-          <w:rStyle w:val="Strong"/>
-          <w:rFonts w:eastAsiaTheme="majorEastAsia"/>
-        </w:rPr>
-        <w:t>timestamped versioned model artifact</w:t>
-      </w:r>
-      <w:r>
-        <w:t xml:space="preserve">, while the latest serving model is maintained as </w:t>
-      </w:r>
-      <w:proofErr w:type="spellStart"/>
-      <w:r>
-        <w:rPr>
-          <w:rStyle w:val="HTMLCode"/>
-          <w:rFonts w:ascii="Times New Roman" w:hAnsi="Times New Roman" w:cs="Times New Roman"/>
-        </w:rPr>
-        <w:t>demand_model.pkl</w:t>
-      </w:r>
-      <w:proofErr w:type="spellEnd"/>
-      <w:r>
-        <w:t>. This process provides a reproducible record of model updates and allows the forecasting component to be refreshed when significant changes in monitored data are identified.</w:t>
-      </w:r>
-    </w:p>
-    <w:p>
-      <w:pPr>
-        <w:pStyle w:val="NormalWeb"/>
-      </w:pPr>
-      <w:r>
-        <w:t xml:space="preserve">The implemented drift test demonstrated this process in practice. Drift was detected in </w:t>
-      </w:r>
-      <w:r>
-        <w:rPr>
-          <w:rStyle w:val="Strong"/>
-          <w:rFonts w:eastAsiaTheme="majorEastAsia"/>
-        </w:rPr>
-        <w:t>units sold, current stock, and waste quantity</w:t>
-      </w:r>
-      <w:r>
-        <w:t xml:space="preserve">, while </w:t>
-      </w:r>
-      <w:r>
-        <w:rPr>
-          <w:rStyle w:val="Strong"/>
-          <w:rFonts w:eastAsiaTheme="majorEastAsia"/>
-        </w:rPr>
-        <w:t>temperature remained stable</w:t>
-      </w:r>
-      <w:r>
-        <w:t xml:space="preserve"> under the predefined threshold. The detection of drift triggered the automatic retraining process, after which a new version of the selected forecasting model was generated and stored. This </w:t>
-      </w:r>
-      <w:r>
-        <w:lastRenderedPageBreak/>
-        <w:t xml:space="preserve">demonstrates the connection between operational monitoring, </w:t>
-      </w:r>
-      <w:r>
-        <w:t>drift identification, and model maintenance within the implemented framework.</w:t>
-      </w:r>
-    </w:p>
-    <w:p>
-      <w:pPr>
-        <w:pStyle w:val="NormalWeb"/>
-      </w:pPr>
-      <w:r>
-        <w:rPr>
-          <w:noProof/>
-        </w:rPr>
         <w:drawing>
-          <wp:inline distT="0" distB="0" distL="0" distR="0" wp14:anchorId="57D74EC4" wp14:editId="6176DD73">
-            <wp:extent cx="5943600" cy="3006090"/>
-            <wp:effectExtent l="0" t="0" r="0" b="3810"/>
-            <wp:docPr id="8" name="Picture 8"/>
+          <wp:inline distT="0" distB="0" distL="0" distR="0" wp14:anchorId="28398A32" wp14:editId="039ABE91">
+            <wp:extent cx="5943600" cy="3030855"/>
+            <wp:effectExtent l="0" t="0" r="0" b="0"/>
+            <wp:docPr id="3" name="Picture 3"/>
             <wp:cNvGraphicFramePr>
               <a:graphicFrameLocks xmlns:a="http://schemas.openxmlformats.org/drawingml/2006/main" noChangeAspect="1"/>
             </wp:cNvGraphicFramePr>
@@ -8951,6 +8714,380 @@
                   <pic:spPr>
                     <a:xfrm>
                       <a:off x="0" y="0"/>
+                      <a:ext cx="5943600" cy="3030855"/>
+                    </a:xfrm>
+                    <a:prstGeom prst="rect">
+                      <a:avLst/>
+                    </a:prstGeom>
+                  </pic:spPr>
+                </pic:pic>
+              </a:graphicData>
+            </a:graphic>
+          </wp:inline>
+        </w:drawing>
+      </w:r>
+    </w:p>
+    <w:p>
+      <w:pPr>
+        <w:spacing w:before="100" w:beforeAutospacing="1" w:after="100" w:afterAutospacing="1" w:line="240" w:lineRule="auto"/>
+        <w:rPr>
+          <w:rFonts w:ascii="Times New Roman" w:eastAsia="Times New Roman" w:hAnsi="Times New Roman" w:cs="Times New Roman"/>
+          <w:sz w:val="24"/>
+          <w:szCs w:val="24"/>
+        </w:rPr>
+      </w:pPr>
+      <w:r>
+        <w:rPr>
+          <w:rFonts w:ascii="Times New Roman" w:eastAsia="Times New Roman" w:hAnsi="Times New Roman" w:cs="Times New Roman"/>
+          <w:sz w:val="24"/>
+          <w:szCs w:val="24"/>
+        </w:rPr>
+        <w:drawing>
+          <wp:inline distT="0" distB="0" distL="0" distR="0" wp14:anchorId="780F8A34" wp14:editId="756AFD84">
+            <wp:extent cx="5943600" cy="2782570"/>
+            <wp:effectExtent l="0" t="0" r="0" b="0"/>
+            <wp:docPr id="4" name="Picture 4"/>
+            <wp:cNvGraphicFramePr>
+              <a:graphicFrameLocks xmlns:a="http://schemas.openxmlformats.org/drawingml/2006/main" noChangeAspect="1"/>
+            </wp:cNvGraphicFramePr>
+            <a:graphic xmlns:a="http://schemas.openxmlformats.org/drawingml/2006/main">
+              <a:graphicData uri="http://schemas.openxmlformats.org/drawingml/2006/picture">
+                <pic:pic xmlns:pic="http://schemas.openxmlformats.org/drawingml/2006/picture">
+                  <pic:nvPicPr>
+                    <pic:cNvPr id="1" name=""/>
+                    <pic:cNvPicPr/>
+                  </pic:nvPicPr>
+                  <pic:blipFill>
+                    <a:blip r:embed="rId16"/>
+                    <a:stretch>
+                      <a:fillRect/>
+                    </a:stretch>
+                  </pic:blipFill>
+                  <pic:spPr>
+                    <a:xfrm>
+                      <a:off x="0" y="0"/>
+                      <a:ext cx="5943600" cy="2782570"/>
+                    </a:xfrm>
+                    <a:prstGeom prst="rect">
+                      <a:avLst/>
+                    </a:prstGeom>
+                  </pic:spPr>
+                </pic:pic>
+              </a:graphicData>
+            </a:graphic>
+          </wp:inline>
+        </w:drawing>
+      </w:r>
+    </w:p>
+    <w:p>
+      <w:pPr>
+        <w:spacing w:before="100" w:beforeAutospacing="1" w:after="100" w:afterAutospacing="1" w:line="240" w:lineRule="auto"/>
+        <w:rPr>
+          <w:rFonts w:ascii="Times New Roman" w:eastAsia="Times New Roman" w:hAnsi="Times New Roman" w:cs="Times New Roman"/>
+          <w:b/>
+          <w:sz w:val="24"/>
+          <w:szCs w:val="24"/>
+        </w:rPr>
+      </w:pPr>
+      <w:r>
+        <w:rPr>
+          <w:rFonts w:ascii="Times New Roman" w:hAnsi="Times New Roman" w:cs="Times New Roman"/>
+          <w:b/>
+          <w:sz w:val="24"/>
+          <w:szCs w:val="24"/>
+        </w:rPr>
+        <w:t>Figure 4.4</w:t>
+      </w:r>
+      <w:r>
+        <w:rPr>
+          <w:rFonts w:ascii="Times New Roman" w:hAnsi="Times New Roman" w:cs="Times New Roman"/>
+          <w:b/>
+          <w:sz w:val="24"/>
+          <w:szCs w:val="24"/>
+        </w:rPr>
+        <w:t>. Streamlit dashboard showing demand prediction, inventory assessment, waste-risk classification, rule-based business action, and LLM-powered intelligent recommendation using the local Qwen2.5 model.</w:t>
+      </w:r>
+    </w:p>
+    <w:p>
+      <w:pPr>
+        <w:pStyle w:val="NormalWeb"/>
+      </w:pPr>
+      <w:r>
+        <w:t xml:space="preserve">By transforming forecasting outputs into practical recommendations, the framework extends beyond traditional demand prediction and provides direct support for </w:t>
+      </w:r>
+      <w:r>
+        <w:rPr>
+          <w:rStyle w:val="Strong"/>
+          <w:rFonts w:eastAsiaTheme="majorEastAsia"/>
+        </w:rPr>
+        <w:t>inventory-related decision-making</w:t>
+      </w:r>
+      <w:r>
+        <w:t>. This approach improves the operational usefulness of forecasting results and helps retailers respond more proactively to changing inventory conditions.</w:t>
+      </w:r>
+    </w:p>
+    <w:p>
+      <w:pPr>
+        <w:pStyle w:val="NormalWeb"/>
+      </w:pPr>
+      <w:r>
+        <w:t xml:space="preserve">The recommendation component is particularly important because reducing </w:t>
+      </w:r>
+      <w:r>
+        <w:rPr>
+          <w:rStyle w:val="Strong"/>
+          <w:rFonts w:eastAsiaTheme="majorEastAsia"/>
+        </w:rPr>
+        <w:t>inventory-related waste risk</w:t>
+      </w:r>
+      <w:r>
+        <w:t xml:space="preserve"> requires more than accurate forecasts. Business value is created when forecasting </w:t>
+      </w:r>
+      <w:r>
+        <w:lastRenderedPageBreak/>
+        <w:t xml:space="preserve">insights are translated into practical actions that support </w:t>
+      </w:r>
+      <w:r>
+        <w:rPr>
+          <w:rStyle w:val="Strong"/>
+          <w:rFonts w:eastAsiaTheme="majorEastAsia"/>
+        </w:rPr>
+        <w:t xml:space="preserve">inventory planning, improved stock </w:t>
+      </w:r>
+      <w:proofErr w:type="spellStart"/>
+      <w:r>
+        <w:rPr>
+          <w:rStyle w:val="Strong"/>
+          <w:rFonts w:eastAsiaTheme="majorEastAsia"/>
+        </w:rPr>
+        <w:t>utilisation</w:t>
+      </w:r>
+      <w:proofErr w:type="spellEnd"/>
+      <w:r>
+        <w:rPr>
+          <w:rStyle w:val="Strong"/>
+          <w:rFonts w:eastAsiaTheme="majorEastAsia"/>
+        </w:rPr>
+        <w:t>, and reduced inventory-related waste risk</w:t>
+      </w:r>
+      <w:r>
+        <w:t>. Consequently, the recommendation component provides the connection between demand forecasting and operational inventory decision-making within the proposed framework.</w:t>
+      </w:r>
+    </w:p>
+    <w:p>
+      <w:pPr>
+        <w:pStyle w:val="Heading2"/>
+      </w:pPr>
+      <w:r>
+        <w:t>4.5 Forecasting Reliability Through Monitoring and Automatic Retraining</w:t>
+      </w:r>
+    </w:p>
+    <w:p>
+      <w:pPr>
+        <w:pStyle w:val="NormalWeb"/>
+      </w:pPr>
+      <w:r>
+        <w:t xml:space="preserve">Forecasting models are typically developed using historical data; however, retail demand patterns are not static. Customer </w:t>
+      </w:r>
+      <w:proofErr w:type="spellStart"/>
+      <w:r>
+        <w:t>behaviour</w:t>
+      </w:r>
+      <w:proofErr w:type="spellEnd"/>
+      <w:r>
+        <w:t xml:space="preserve">, promotional activities, seasonal trends, and operational conditions can change over time, potentially affecting forecasting performance. As a result, forecasting systems require mechanisms that support </w:t>
+      </w:r>
+      <w:r>
+        <w:rPr>
+          <w:rStyle w:val="Strong"/>
+          <w:rFonts w:eastAsiaTheme="majorEastAsia"/>
+        </w:rPr>
+        <w:t>long-term reliability and adaptability</w:t>
+      </w:r>
+      <w:r>
+        <w:t>.</w:t>
+      </w:r>
+    </w:p>
+    <w:p>
+      <w:pPr>
+        <w:pStyle w:val="NormalWeb"/>
+      </w:pPr>
+      <w:r>
+        <w:t xml:space="preserve">To address this challenge, the proposed framework incorporates </w:t>
+      </w:r>
+      <w:r>
+        <w:rPr>
+          <w:rStyle w:val="Strong"/>
+          <w:rFonts w:eastAsiaTheme="majorEastAsia"/>
+        </w:rPr>
+        <w:t>monitoring, drift detection, model versioning, and automatic retraining</w:t>
+      </w:r>
+      <w:r>
+        <w:t xml:space="preserve"> capabilities. These mechanisms are designed to identify changes in operational data patterns and support model updating when current conditions differ substantially from the historical conditions used for model development.</w:t>
+      </w:r>
+    </w:p>
+    <w:p>
+      <w:pPr>
+        <w:pStyle w:val="NormalWeb"/>
+      </w:pPr>
+      <w:r>
+        <w:t xml:space="preserve">The monitoring process evaluates selected retail and </w:t>
+      </w:r>
+      <w:r>
+        <w:rPr>
+          <w:rStyle w:val="Strong"/>
+          <w:rFonts w:eastAsiaTheme="majorEastAsia"/>
+        </w:rPr>
+        <w:t>inventory-related variables</w:t>
+      </w:r>
+      <w:r>
+        <w:t xml:space="preserve">, including </w:t>
+      </w:r>
+      <w:r>
+        <w:rPr>
+          <w:rStyle w:val="Strong"/>
+          <w:rFonts w:eastAsiaTheme="majorEastAsia"/>
+        </w:rPr>
+        <w:t>units sold, current stock, temperature, and waste quantity</w:t>
+      </w:r>
+      <w:r>
+        <w:t xml:space="preserve">. Within the implemented framework, drift is assessed by comparing the mean of a historical </w:t>
+      </w:r>
+      <w:r>
+        <w:rPr>
+          <w:rStyle w:val="Strong"/>
+          <w:rFonts w:eastAsiaTheme="majorEastAsia"/>
+        </w:rPr>
+        <w:t>reference window of 1,000 observations</w:t>
+      </w:r>
+      <w:r>
+        <w:t xml:space="preserve"> with the mean of a </w:t>
+      </w:r>
+      <w:r>
+        <w:rPr>
+          <w:rStyle w:val="Strong"/>
+          <w:rFonts w:eastAsiaTheme="majorEastAsia"/>
+        </w:rPr>
+        <w:t>current window of 300 observations</w:t>
+      </w:r>
+      <w:r>
+        <w:t xml:space="preserve">. A relative mean-shift score is calculated for each monitored variable, and a predefined drift threshold of </w:t>
+      </w:r>
+      <w:r>
+        <w:rPr>
+          <w:rStyle w:val="Strong"/>
+          <w:rFonts w:eastAsiaTheme="majorEastAsia"/>
+        </w:rPr>
+        <w:t>0.15</w:t>
+      </w:r>
+      <w:r>
+        <w:t xml:space="preserve"> is used to determine whether a substantial change has occurred. When the calculated score exceeds this threshold, the corresponding variable is classified as exhibiting drift.</w:t>
+      </w:r>
+    </w:p>
+    <w:p>
+      <w:pPr>
+        <w:pStyle w:val="NormalWeb"/>
+      </w:pPr>
+      <w:r>
+        <w:t xml:space="preserve">To support forecasting reliability, the framework incorporates an </w:t>
+      </w:r>
+      <w:r>
+        <w:rPr>
+          <w:rStyle w:val="Strong"/>
+          <w:rFonts w:eastAsiaTheme="majorEastAsia"/>
+        </w:rPr>
+        <w:t>automatic retraining mechanism</w:t>
+      </w:r>
+      <w:r>
+        <w:t xml:space="preserve">. When drift is detected, the training pipeline is automatically executed and the forecasting models are trained and evaluated again. The selected model is then stored as a </w:t>
+      </w:r>
+      <w:r>
+        <w:rPr>
+          <w:rStyle w:val="Strong"/>
+          <w:rFonts w:eastAsiaTheme="majorEastAsia"/>
+        </w:rPr>
+        <w:t>timestamped versioned model artifact</w:t>
+      </w:r>
+      <w:r>
+        <w:t xml:space="preserve">, while the latest serving model is maintained as </w:t>
+      </w:r>
+      <w:proofErr w:type="spellStart"/>
+      <w:r>
+        <w:rPr>
+          <w:rStyle w:val="HTMLCode"/>
+          <w:rFonts w:ascii="Times New Roman" w:hAnsi="Times New Roman" w:cs="Times New Roman"/>
+        </w:rPr>
+        <w:t>demand_model.pkl</w:t>
+      </w:r>
+      <w:proofErr w:type="spellEnd"/>
+      <w:r>
+        <w:t>. This process provides a reproducible record of model updates and allows the forecasting component to be refreshed when significant changes in monitored data are identified.</w:t>
+      </w:r>
+    </w:p>
+    <w:p>
+      <w:pPr>
+        <w:pStyle w:val="NormalWeb"/>
+      </w:pPr>
+      <w:r>
+        <w:t xml:space="preserve">The implemented drift test demonstrated this process in practice. Drift was detected in </w:t>
+      </w:r>
+      <w:r>
+        <w:rPr>
+          <w:rStyle w:val="Strong"/>
+          <w:rFonts w:eastAsiaTheme="majorEastAsia"/>
+        </w:rPr>
+        <w:t>units sold, current stock, and waste quantity</w:t>
+      </w:r>
+      <w:r>
+        <w:t xml:space="preserve">, while </w:t>
+      </w:r>
+      <w:r>
+        <w:rPr>
+          <w:rStyle w:val="Strong"/>
+          <w:rFonts w:eastAsiaTheme="majorEastAsia"/>
+        </w:rPr>
+        <w:t>temperature remained stable</w:t>
+      </w:r>
+      <w:r>
+        <w:t xml:space="preserve"> under the predefined threshold. The detection of drift triggered the automatic retraining process, after which a new version of the selected forecasting model was generated and stored. This demonstrates the connection between operational monitoring, </w:t>
+      </w:r>
+      <w:r>
+        <w:t>drift identification, and model maintenance within the implemented framework.</w:t>
+      </w:r>
+    </w:p>
+    <w:p>
+      <w:pPr>
+        <w:pStyle w:val="NormalWeb"/>
+      </w:pPr>
+      <w:r>
+        <w:rPr>
+          <w:noProof/>
+        </w:rPr>
+        <w:lastRenderedPageBreak/>
+        <w:drawing>
+          <wp:inline distT="0" distB="0" distL="0" distR="0" wp14:anchorId="57D74EC4" wp14:editId="6176DD73">
+            <wp:extent cx="5943600" cy="3006090"/>
+            <wp:effectExtent l="0" t="0" r="0" b="3810"/>
+            <wp:docPr id="8" name="Picture 8"/>
+            <wp:cNvGraphicFramePr>
+              <a:graphicFrameLocks xmlns:a="http://schemas.openxmlformats.org/drawingml/2006/main" noChangeAspect="1"/>
+            </wp:cNvGraphicFramePr>
+            <a:graphic xmlns:a="http://schemas.openxmlformats.org/drawingml/2006/main">
+              <a:graphicData uri="http://schemas.openxmlformats.org/drawingml/2006/picture">
+                <pic:pic xmlns:pic="http://schemas.openxmlformats.org/drawingml/2006/picture">
+                  <pic:nvPicPr>
+                    <pic:cNvPr id="1" name=""/>
+                    <pic:cNvPicPr/>
+                  </pic:nvPicPr>
+                  <pic:blipFill>
+                    <a:blip r:embed="rId17"/>
+                    <a:stretch>
+                      <a:fillRect/>
+                    </a:stretch>
+                  </pic:blipFill>
+                  <pic:spPr>
+                    <a:xfrm>
+                      <a:off x="0" y="0"/>
                       <a:ext cx="5943600" cy="3006090"/>
                     </a:xfrm>
                     <a:prstGeom prst="rect">
@@ -9063,7 +9200,6 @@
         <w:pStyle w:val="NormalWeb"/>
       </w:pPr>
       <w:r>
-        <w:lastRenderedPageBreak/>
         <w:t xml:space="preserve">The deployed framework integrates </w:t>
       </w:r>
       <w:r>
@@ -9078,10 +9214,7 @@
       <w:proofErr w:type="spellStart"/>
       <w:proofErr w:type="gramStart"/>
       <w:r>
-        <w:t>workflow.</w:t>
-      </w:r>
-      <w:r>
-        <w:t>The</w:t>
+        <w:t>workflow.The</w:t>
       </w:r>
       <w:proofErr w:type="spellEnd"/>
       <w:proofErr w:type="gramEnd"/>
@@ -9094,18 +9227,17 @@
       </w:r>
       <w:proofErr w:type="spellEnd"/>
       <w:r>
-        <w:t xml:space="preserve"> as the local LLM runtime, using Qwen2.5:1.5b to generate explanatory inventory recommendations. After the Random Forest model generates a demand prediction and the inventory-assessment logic determines the relevant inventory condition, these structured results are supplied to the local LLM. The LLM then generates a human-readable recommendation that is returned through the FastAPI response and displayed within the Streamlit dashboard. This separates the forecasting function from the language-model recommendation function while integrating both within the same decision-support workflow.</w:t>
+        <w:t xml:space="preserve"> as the local LLM runtime, using Qwen2.5:1.5b to generate explanatory inventory recommendations. After the Random Forest model generates a </w:t>
+      </w:r>
+      <w:r>
+        <w:lastRenderedPageBreak/>
+        <w:t>demand prediction and the inventory-assessment logic determines the relevant inventory condition, these structured results are supplied to the local LLM. The LLM then generates a human-readable recommendation that is returned through the FastAPI response and displayed within the Streamlit dashboard. This separates the forecasting function from the language-model recommendation function while integrating both within the same decision-support workflow.</w:t>
       </w:r>
       <w:r>
         <w:t xml:space="preserve"> </w:t>
       </w:r>
-      <w:proofErr w:type="gramStart"/>
-      <w:r>
-        <w:t>FastAPI</w:t>
-      </w:r>
-      <w:proofErr w:type="gramEnd"/>
-      <w:r>
-        <w:t xml:space="preserve"> provides backend API services for receiving retail sales events, generating demand predictions, accessing model information, performing drift checks, and triggering pipeline operations. SQLite is used as the operational database for storing incoming retail data, prediction logs, drift reports, and model-related information. The Streamlit dashboard provides an interactive interface through which users can access forecasting, inventory assessment, recommendation, and monitoring outputs.</w:t>
+      <w:r>
+        <w:t>FastAPI provides backend API services for receiving retail sales events, generating demand predictions, accessing model information, performing drift checks, and triggering pipeline operations. SQLite is used as the operational database for storing incoming retail data, prediction logs, drift reports, and model-related information. The Streamlit dashboard provides an interactive interface through which users can access forecasting, inventory assessment, recommendation, and monitoring outputs.</w:t>
       </w:r>
     </w:p>
     <w:p>
@@ -10891,7 +11023,7 @@
       <w:r>
         <w:t xml:space="preserve">Food and Agriculture Organization. (2022). </w:t>
       </w:r>
-      <w:hyperlink r:id="rId16" w:tgtFrame="_blank" w:tooltip="https://www.fao.org/publications/fao-flagship-publications/the-state-of-food-and-agriculture/2022?utm" w:history="1">
+      <w:hyperlink r:id="rId18" w:tgtFrame="_blank" w:tooltip="https://www.fao.org/publications/fao-flagship-publications/the-state-of-food-and-agriculture/2022?utm" w:history="1">
         <w:r>
           <w:rPr>
             <w:rStyle w:val="Hyperlink"/>
@@ -10939,7 +11071,7 @@
       <w:r>
         <w:t xml:space="preserve">, A. (2022). </w:t>
       </w:r>
-      <w:hyperlink r:id="rId17" w:tgtFrame="_blank" w:tooltip="https://www.oreilly.com/library/view/hands-on-machine-learning/9781098125967/?utm" w:history="1">
+      <w:hyperlink r:id="rId19" w:tgtFrame="_blank" w:tooltip="https://www.oreilly.com/library/view/hands-on-machine-learning/9781098125967/?utm" w:history="1">
         <w:r>
           <w:rPr>
             <w:rStyle w:val="Hyperlink"/>
@@ -11023,7 +11155,7 @@
       <w:r>
         <w:t xml:space="preserve">, M., &amp; Pei, J. (2011). </w:t>
       </w:r>
-      <w:hyperlink r:id="rId18" w:tgtFrame="_blank" w:tooltip="https://www.sciencedirect.com/book/monograph/9780123814791/data-mining-concepts-and-techniques?utm" w:history="1">
+      <w:hyperlink r:id="rId20" w:tgtFrame="_blank" w:tooltip="https://www.sciencedirect.com/book/monograph/9780123814791/data-mining-concepts-and-techniques?utm" w:history="1">
         <w:r>
           <w:rPr>
             <w:rStyle w:val="Hyperlink"/>
@@ -11101,7 +11233,7 @@
       <w:r>
         <w:t xml:space="preserve">): </w:t>
       </w:r>
-      <w:hyperlink r:id="rId19" w:tgtFrame="_blank" w:tooltip="https://ieeexplore.ieee.org/document/10081336?utm=" w:history="1">
+      <w:hyperlink r:id="rId21" w:tgtFrame="_blank" w:tooltip="https://ieeexplore.ieee.org/document/10081336?utm=" w:history="1">
         <w:r>
           <w:rPr>
             <w:rStyle w:val="Hyperlink"/>
@@ -11522,7 +11654,7 @@
           <w:rPr>
             <w:noProof/>
           </w:rPr>
-          <w:t>22</w:t>
+          <w:t>21</w:t>
         </w:r>
         <w:r>
           <w:rPr>
@@ -13905,7 +14037,7 @@
 </file>
 
 <file path=customXml/itemProps1.xml><?xml version="1.0" encoding="utf-8"?>
-<ds:datastoreItem xmlns:ds="http://schemas.openxmlformats.org/officeDocument/2006/customXml" ds:itemID="{EAE57CC0-CEA8-492B-9CB6-B9CEFC0567DB}">
+<ds:datastoreItem xmlns:ds="http://schemas.openxmlformats.org/officeDocument/2006/customXml" ds:itemID="{085C1DE6-2670-4D68-B224-78AC7FCCD9AE}">
   <ds:schemaRefs>
     <ds:schemaRef ds:uri="http://schemas.openxmlformats.org/officeDocument/2006/bibliography"/>
   </ds:schemaRefs>

</xml_diff>